<commit_message>
Fix: remove duplicate bullet markers in ebook DOCX
</commit_message>
<xml_diff>
--- a/kdp-files/difficult_conversations_ebook.docx
+++ b/kdp-files/difficult_conversations_ebook.docx
@@ -682,7 +682,7 @@
           <w:color w:val="333333"/>
           <w:sz w:val="24"/>
         </w:rPr>
-        <w:t>• Status</w:t>
+        <w:t>Status</w:t>
       </w:r>
       <w:r>
         <w:rPr>
@@ -707,7 +707,7 @@
           <w:color w:val="333333"/>
           <w:sz w:val="24"/>
         </w:rPr>
-        <w:t>• Certainty</w:t>
+        <w:t>Certainty</w:t>
       </w:r>
       <w:r>
         <w:rPr>
@@ -732,7 +732,7 @@
           <w:color w:val="333333"/>
           <w:sz w:val="24"/>
         </w:rPr>
-        <w:t>• Autonomy</w:t>
+        <w:t>Autonomy</w:t>
       </w:r>
       <w:r>
         <w:rPr>
@@ -757,7 +757,7 @@
           <w:color w:val="333333"/>
           <w:sz w:val="24"/>
         </w:rPr>
-        <w:t>• Relatedness</w:t>
+        <w:t>Relatedness</w:t>
       </w:r>
       <w:r>
         <w:rPr>
@@ -782,7 +782,7 @@
           <w:color w:val="333333"/>
           <w:sz w:val="24"/>
         </w:rPr>
-        <w:t>• Fairness</w:t>
+        <w:t>Fairness</w:t>
       </w:r>
       <w:r>
         <w:rPr>
@@ -1016,7 +1016,7 @@
           <w:color w:val="333333"/>
           <w:sz w:val="24"/>
         </w:rPr>
-        <w:t>• The problem gets worse.</w:t>
+        <w:t>The problem gets worse.</w:t>
       </w:r>
       <w:r>
         <w:rPr>
@@ -1041,7 +1041,7 @@
           <w:color w:val="333333"/>
           <w:sz w:val="24"/>
         </w:rPr>
-        <w:t>• Other team members notice.</w:t>
+        <w:t>Other team members notice.</w:t>
       </w:r>
       <w:r>
         <w:rPr>
@@ -1066,7 +1066,7 @@
           <w:color w:val="333333"/>
           <w:sz w:val="24"/>
         </w:rPr>
-        <w:t>• You lose credibility.</w:t>
+        <w:t>You lose credibility.</w:t>
       </w:r>
       <w:r>
         <w:rPr>
@@ -1091,7 +1091,7 @@
           <w:color w:val="333333"/>
           <w:sz w:val="24"/>
         </w:rPr>
-        <w:t>• The eventual conversation is ten times harder.</w:t>
+        <w:t>The eventual conversation is ten times harder.</w:t>
       </w:r>
       <w:r>
         <w:rPr>
@@ -1150,7 +1150,7 @@
           <w:color w:val="333333"/>
           <w:sz w:val="24"/>
         </w:rPr>
-        <w:t>• Context</w:t>
+        <w:t>Context</w:t>
       </w:r>
       <w:r>
         <w:rPr>
@@ -1175,7 +1175,7 @@
           <w:color w:val="333333"/>
           <w:sz w:val="24"/>
         </w:rPr>
-        <w:t>• What to Say</w:t>
+        <w:t>What to Say</w:t>
       </w:r>
       <w:r>
         <w:rPr>
@@ -1200,7 +1200,7 @@
           <w:color w:val="333333"/>
           <w:sz w:val="24"/>
         </w:rPr>
-        <w:t>• What NOT to Say</w:t>
+        <w:t>What NOT to Say</w:t>
       </w:r>
       <w:r>
         <w:rPr>
@@ -1225,7 +1225,7 @@
           <w:color w:val="333333"/>
           <w:sz w:val="24"/>
         </w:rPr>
-        <w:t>• What's Happening in Their Brain</w:t>
+        <w:t>What's Happening in Their Brain</w:t>
       </w:r>
       <w:r>
         <w:rPr>
@@ -1250,7 +1250,7 @@
           <w:color w:val="333333"/>
           <w:sz w:val="24"/>
         </w:rPr>
-        <w:t>• Follow-up Steps</w:t>
+        <w:t>Follow-up Steps</w:t>
       </w:r>
       <w:r>
         <w:rPr>
@@ -1479,7 +1479,7 @@
           <w:color w:val="333333"/>
           <w:sz w:val="24"/>
         </w:rPr>
-        <w:t>• Box breathing:</w:t>
+        <w:t>Box breathing:</w:t>
       </w:r>
       <w:r>
         <w:rPr>
@@ -1504,7 +1504,7 @@
           <w:color w:val="333333"/>
           <w:sz w:val="24"/>
         </w:rPr>
-        <w:t>• Name your emotion:</w:t>
+        <w:t>Name your emotion:</w:t>
       </w:r>
       <w:r>
         <w:rPr>
@@ -1549,7 +1549,7 @@
           <w:color w:val="333333"/>
           <w:sz w:val="24"/>
         </w:rPr>
-        <w:t>• Clarify your intention:</w:t>
+        <w:t>Clarify your intention:</w:t>
       </w:r>
       <w:r>
         <w:rPr>
@@ -1589,7 +1589,7 @@
           <w:color w:val="333333"/>
           <w:sz w:val="24"/>
         </w:rPr>
-        <w:t>• Speak at 70% of your normal pace. Slower speech signals safety to the listener's brain.</w:t>
+        <w:t>Speak at 70% of your normal pace. Slower speech signals safety to the listener's brain.</w:t>
       </w:r>
     </w:p>
     <w:p>
@@ -1604,7 +1604,7 @@
           <w:color w:val="333333"/>
           <w:sz w:val="24"/>
         </w:rPr>
-        <w:t>• Keep your hands visible and relaxed. Hidden or clenched hands trigger unconscious threat detection.</w:t>
+        <w:t>Keep your hands visible and relaxed. Hidden or clenched hands trigger unconscious threat detection.</w:t>
       </w:r>
     </w:p>
     <w:p>
@@ -1619,7 +1619,7 @@
           <w:color w:val="333333"/>
           <w:sz w:val="24"/>
         </w:rPr>
-        <w:t>• If you feel your own amygdala hijack coming on (racing heart, rising anger), pause. Say, "Let me take a moment to think about that." This is not weakness. It's leadership.</w:t>
+        <w:t>If you feel your own amygdala hijack coming on (racing heart, rising anger), pause. Say, "Let me take a moment to think about that." This is not weakness. It's leadership.</w:t>
       </w:r>
     </w:p>
     <w:p>
@@ -1683,7 +1683,7 @@
           <w:color w:val="333333"/>
           <w:sz w:val="24"/>
         </w:rPr>
-        <w:t>• Reflect content:</w:t>
+        <w:t>Reflect content:</w:t>
       </w:r>
       <w:r>
         <w:rPr>
@@ -1708,7 +1708,7 @@
           <w:color w:val="333333"/>
           <w:sz w:val="24"/>
         </w:rPr>
-        <w:t>• Reflect emotion:</w:t>
+        <w:t>Reflect emotion:</w:t>
       </w:r>
       <w:r>
         <w:rPr>
@@ -1733,7 +1733,7 @@
           <w:color w:val="333333"/>
           <w:sz w:val="24"/>
         </w:rPr>
-        <w:t>• Use silence:</w:t>
+        <w:t>Use silence:</w:t>
       </w:r>
       <w:r>
         <w:rPr>
@@ -1758,7 +1758,7 @@
           <w:color w:val="333333"/>
           <w:sz w:val="24"/>
         </w:rPr>
-        <w:t>• Ask, don't assume:</w:t>
+        <w:t>Ask, don't assume:</w:t>
       </w:r>
       <w:r>
         <w:rPr>
@@ -1905,7 +1905,7 @@
           <w:color w:val="333333"/>
           <w:sz w:val="24"/>
         </w:rPr>
-        <w:t>• "I imagine this is hard to hear."</w:t>
+        <w:t>"I imagine this is hard to hear."</w:t>
       </w:r>
     </w:p>
     <w:p>
@@ -1920,7 +1920,7 @@
           <w:color w:val="333333"/>
           <w:sz w:val="24"/>
         </w:rPr>
-        <w:t>• "I can see this matters to you, and I respect that."</w:t>
+        <w:t>"I can see this matters to you, and I respect that."</w:t>
       </w:r>
     </w:p>
     <w:p>
@@ -1935,7 +1935,7 @@
           <w:color w:val="333333"/>
           <w:sz w:val="24"/>
         </w:rPr>
-        <w:t>• "If I were in your position, I'd probably feel the same way."</w:t>
+        <w:t>"If I were in your position, I'd probably feel the same way."</w:t>
       </w:r>
     </w:p>
     <w:p>
@@ -1965,7 +1965,7 @@
           <w:color w:val="333333"/>
           <w:sz w:val="24"/>
         </w:rPr>
-        <w:t>• "I know exactly how you feel." (You don't.)</w:t>
+        <w:t>"I know exactly how you feel." (You don't.)</w:t>
       </w:r>
     </w:p>
     <w:p>
@@ -1980,7 +1980,7 @@
           <w:color w:val="333333"/>
           <w:sz w:val="24"/>
         </w:rPr>
-        <w:t>• "Don't worry about it." (Dismisses their experience.)</w:t>
+        <w:t>"Don't worry about it." (Dismisses their experience.)</w:t>
       </w:r>
     </w:p>
     <w:p>
@@ -1995,7 +1995,7 @@
           <w:color w:val="333333"/>
           <w:sz w:val="24"/>
         </w:rPr>
-        <w:t>• "It's not personal." (Everything about their job feels personal.)</w:t>
+        <w:t>"It's not personal." (Everything about their job feels personal.)</w:t>
       </w:r>
     </w:p>
     <w:p>
@@ -2348,7 +2348,7 @@
           <w:color w:val="333333"/>
           <w:sz w:val="24"/>
         </w:rPr>
-        <w:t>• "What do you think would help you get back on track?"</w:t>
+        <w:t>"What do you think would help you get back on track?"</w:t>
       </w:r>
     </w:p>
     <w:p>
@@ -2363,7 +2363,7 @@
           <w:color w:val="333333"/>
           <w:sz w:val="24"/>
         </w:rPr>
-        <w:t>• "What support do you need from me?"</w:t>
+        <w:t>"What support do you need from me?"</w:t>
       </w:r>
     </w:p>
     <w:p>
@@ -2378,7 +2378,7 @@
           <w:color w:val="333333"/>
           <w:sz w:val="24"/>
         </w:rPr>
-        <w:t>• "What does success look like for you in the next 30 days?"</w:t>
+        <w:t>"What does success look like for you in the next 30 days?"</w:t>
       </w:r>
     </w:p>
     <w:p>
@@ -2393,7 +2393,7 @@
           <w:color w:val="333333"/>
           <w:sz w:val="24"/>
         </w:rPr>
-        <w:t>• "How would you like me to follow up — weekly check-ins, or would you prefer to come to me?"</w:t>
+        <w:t>"How would you like me to follow up — weekly check-ins, or would you prefer to come to me?"</w:t>
       </w:r>
     </w:p>
     <w:p>
@@ -2722,7 +2722,7 @@
           <w:color w:val="333333"/>
           <w:sz w:val="24"/>
         </w:rPr>
-        <w:t>• ❌ "You've really been dropping the ball lately." → Character judgment, triggers shame.</w:t>
+        <w:t>❌ "You've really been dropping the ball lately." → Character judgment, triggers shame.</w:t>
       </w:r>
     </w:p>
     <w:p>
@@ -2737,7 +2737,7 @@
           <w:color w:val="333333"/>
           <w:sz w:val="24"/>
         </w:rPr>
-        <w:t>• ❌ "Everyone on the team has noticed." → Social threat, implies gossip.</w:t>
+        <w:t>❌ "Everyone on the team has noticed." → Social threat, implies gossip.</w:t>
       </w:r>
     </w:p>
     <w:p>
@@ -2752,7 +2752,7 @@
           <w:color w:val="333333"/>
           <w:sz w:val="24"/>
         </w:rPr>
-        <w:t>• ❌ "I don't know what's going on with you." → Sounds like you've given up.</w:t>
+        <w:t>❌ "I don't know what's going on with you." → Sounds like you've given up.</w:t>
       </w:r>
     </w:p>
     <w:p>
@@ -2767,7 +2767,7 @@
           <w:color w:val="333333"/>
           <w:sz w:val="24"/>
         </w:rPr>
-        <w:t>• ❌ "This is your last chance." → Unless it literally is a final warning with HR documentation. Empty threats destroy trust.</w:t>
+        <w:t>❌ "This is your last chance." → Unless it literally is a final warning with HR documentation. Empty threats destroy trust.</w:t>
       </w:r>
     </w:p>
     <w:p>
@@ -2782,7 +2782,7 @@
           <w:color w:val="333333"/>
           <w:sz w:val="24"/>
         </w:rPr>
-        <w:t>• ❌ "I'm not sure you're cut out for this role." → Nuclear-level status threat. Almost impossible to recover from.</w:t>
+        <w:t>❌ "I'm not sure you're cut out for this role." → Nuclear-level status threat. Almost impossible to recover from.</w:t>
       </w:r>
     </w:p>
     <w:p>
@@ -3157,7 +3157,7 @@
           <w:color w:val="333333"/>
           <w:sz w:val="24"/>
         </w:rPr>
-        <w:t>• ❌ "That presentation was a disaster." → Global, catastrophic language. Triggers shame spiral.</w:t>
+        <w:t>❌ "That presentation was a disaster." → Global, catastrophic language. Triggers shame spiral.</w:t>
       </w:r>
     </w:p>
     <w:p>
@@ -3172,7 +3172,7 @@
           <w:color w:val="333333"/>
           <w:sz w:val="24"/>
         </w:rPr>
-        <w:t>• ❌ "The client was really upset." → Amplifying third-party disapproval feels like social exile.</w:t>
+        <w:t>❌ "The client was really upset." → Amplifying third-party disapproval feels like social exile.</w:t>
       </w:r>
     </w:p>
     <w:p>
@@ -3187,7 +3187,7 @@
           <w:color w:val="333333"/>
           <w:sz w:val="24"/>
         </w:rPr>
-        <w:t>• ❌ "You should have been more prepared." → Hindsight judgment. They already know.</w:t>
+        <w:t>❌ "You should have been more prepared." → Hindsight judgment. They already know.</w:t>
       </w:r>
     </w:p>
     <w:p>
@@ -3202,7 +3202,7 @@
           <w:color w:val="333333"/>
           <w:sz w:val="24"/>
         </w:rPr>
-        <w:t>• ❌ "I'm disappointed in you." → "In you" makes it about identity, not behavior. Say "in the outcome" if you must.</w:t>
+        <w:t>❌ "I'm disappointed in you." → "In you" makes it about identity, not behavior. Say "in the outcome" if you must.</w:t>
       </w:r>
     </w:p>
     <w:p>
@@ -3217,7 +3217,7 @@
           <w:color w:val="333333"/>
           <w:sz w:val="24"/>
         </w:rPr>
-        <w:t>• ❌ Starting with a compliment sandwich ("Great energy, but...") → People see through it. It makes every future compliment suspect.</w:t>
+        <w:t>❌ Starting with a compliment sandwich ("Great energy, but...") → People see through it. It makes every future compliment suspect.</w:t>
       </w:r>
     </w:p>
     <w:p>
@@ -3555,7 +3555,7 @@
           <w:color w:val="333333"/>
           <w:sz w:val="24"/>
         </w:rPr>
-        <w:t>• A health issue (theirs or a family member's)</w:t>
+        <w:t>A health issue (theirs or a family member's)</w:t>
       </w:r>
     </w:p>
     <w:p>
@@ -3570,7 +3570,7 @@
           <w:color w:val="333333"/>
           <w:sz w:val="24"/>
         </w:rPr>
-        <w:t>• A childcare or eldercare situation</w:t>
+        <w:t>A childcare or eldercare situation</w:t>
       </w:r>
     </w:p>
     <w:p>
@@ -3585,7 +3585,7 @@
           <w:color w:val="333333"/>
           <w:sz w:val="24"/>
         </w:rPr>
-        <w:t>• A mental health struggle</w:t>
+        <w:t>A mental health struggle</w:t>
       </w:r>
     </w:p>
     <w:p>
@@ -3600,7 +3600,7 @@
           <w:color w:val="333333"/>
           <w:sz w:val="24"/>
         </w:rPr>
-        <w:t>• Digital fatigue or always-on burnout</w:t>
+        <w:t>Digital fatigue or always-on burnout</w:t>
       </w:r>
     </w:p>
     <w:p>
@@ -3615,7 +3615,7 @@
           <w:color w:val="333333"/>
           <w:sz w:val="24"/>
         </w:rPr>
-        <w:t>• A conflict with a teammate that's causing them to disengage from shared spaces</w:t>
+        <w:t>A conflict with a teammate that's causing them to disengage from shared spaces</w:t>
       </w:r>
     </w:p>
     <w:p>
@@ -3630,7 +3630,7 @@
           <w:color w:val="333333"/>
           <w:sz w:val="24"/>
         </w:rPr>
-        <w:t>• Timezone misalignment they haven't raised</w:t>
+        <w:t>Timezone misalignment they haven't raised</w:t>
       </w:r>
     </w:p>
     <w:p>
@@ -3698,7 +3698,7 @@
           <w:color w:val="333333"/>
           <w:sz w:val="24"/>
         </w:rPr>
-        <w:t>• ❌ "Are you even committed to this job?" → Questioning someone's commitment is a profound status and identity threat.</w:t>
+        <w:t>❌ "Are you even committed to this job?" → Questioning someone's commitment is a profound status and identity threat.</w:t>
       </w:r>
     </w:p>
     <w:p>
@@ -3713,7 +3713,7 @@
           <w:color w:val="333333"/>
           <w:sz w:val="24"/>
         </w:rPr>
-        <w:t>• ❌ "Other people have complained about you." → Anonymous criticism feels like betrayal. If there are complaints, own the feedback as the manager.</w:t>
+        <w:t>❌ "Other people have complained about you." → Anonymous criticism feels like betrayal. If there are complaints, own the feedback as the manager.</w:t>
       </w:r>
     </w:p>
     <w:p>
@@ -3728,7 +3728,7 @@
           <w:color w:val="333333"/>
           <w:sz w:val="24"/>
         </w:rPr>
-        <w:t>• ❌ "You need to be here at 9, period." → Starting with the demand before understanding the context makes you an adversary, not a partner.</w:t>
+        <w:t>❌ "You need to be here at 9, period." → Starting with the demand before understanding the context makes you an adversary, not a partner.</w:t>
       </w:r>
     </w:p>
     <w:p>
@@ -3743,7 +3743,7 @@
           <w:color w:val="333333"/>
           <w:sz w:val="24"/>
         </w:rPr>
-        <w:t>• ❌ "I've been keeping track." → Makes it sound like surveillance. Say "I've noticed" — it's softer and equally honest.</w:t>
+        <w:t>❌ "I've been keeping track." → Makes it sound like surveillance. Say "I've noticed" — it's softer and equally honest.</w:t>
       </w:r>
     </w:p>
     <w:p>
@@ -3758,7 +3758,7 @@
           <w:color w:val="333333"/>
           <w:sz w:val="24"/>
         </w:rPr>
-        <w:t>• ❌ "This is really unfair to the rest of the team." → Guilt-based manipulation. State the impact neutrally.</w:t>
+        <w:t>❌ "This is really unfair to the rest of the team." → Guilt-based manipulation. State the impact neutrally.</w:t>
       </w:r>
     </w:p>
     <w:p>
@@ -4196,7 +4196,7 @@
           <w:color w:val="333333"/>
           <w:sz w:val="24"/>
         </w:rPr>
-        <w:t>• ❌ "It's not in the budget." (Full stop, with no further context.) → Feels like a wall, not an explanation.</w:t>
+        <w:t>❌ "It's not in the budget." (Full stop, with no further context.) → Feels like a wall, not an explanation.</w:t>
       </w:r>
     </w:p>
     <w:p>
@@ -4211,7 +4211,7 @@
           <w:color w:val="333333"/>
           <w:sz w:val="24"/>
         </w:rPr>
-        <w:t>• ❌ "Maybe next year." → Vague. Creates uncertainty, which the brain processes as threat.</w:t>
+        <w:t>❌ "Maybe next year." → Vague. Creates uncertainty, which the brain processes as threat.</w:t>
       </w:r>
     </w:p>
     <w:p>
@@ -4226,7 +4226,7 @@
           <w:color w:val="333333"/>
           <w:sz w:val="24"/>
         </w:rPr>
-        <w:t>• ❌ "You're doing great, it's just timing." → If they're "doing great," why no promotion? This creates cognitive dissonance.</w:t>
+        <w:t>❌ "You're doing great, it's just timing." → If they're "doing great," why no promotion? This creates cognitive dissonance.</w:t>
       </w:r>
     </w:p>
     <w:p>
@@ -4241,7 +4241,7 @@
           <w:color w:val="333333"/>
           <w:sz w:val="24"/>
         </w:rPr>
-        <w:t>• ❌ "Lots of people don't get promoted this cycle." → Minimizing. They don't care about lots of people right now.</w:t>
+        <w:t>❌ "Lots of people don't get promoted this cycle." → Minimizing. They don't care about lots of people right now.</w:t>
       </w:r>
     </w:p>
     <w:p>
@@ -4256,7 +4256,7 @@
           <w:color w:val="333333"/>
           <w:sz w:val="24"/>
         </w:rPr>
-        <w:t>• ❌ "You should be grateful for what you have." → Patronizing and tone-deaf. Shuts down the conversation immediately.</w:t>
+        <w:t>❌ "You should be grateful for what you have." → Patronizing and tone-deaf. Shuts down the conversation immediately.</w:t>
       </w:r>
     </w:p>
     <w:p>
@@ -4271,7 +4271,7 @@
           <w:color w:val="333333"/>
           <w:sz w:val="24"/>
         </w:rPr>
-        <w:t>• ❌ "I fought for you but leadership said no." → Throwing leadership under the bus undermines the organization and your own authority.</w:t>
+        <w:t>❌ "I fought for you but leadership said no." → Throwing leadership under the bus undermines the organization and your own authority.</w:t>
       </w:r>
     </w:p>
     <w:p>
@@ -4772,7 +4772,7 @@
           <w:color w:val="333333"/>
           <w:sz w:val="24"/>
         </w:rPr>
-        <w:t>• ❌ "This is really hard for me too." → It's exponentially harder for them. Don't center your discomfort.</w:t>
+        <w:t>❌ "This is really hard for me too." → It's exponentially harder for them. Don't center your discomfort.</w:t>
       </w:r>
     </w:p>
     <w:p>
@@ -4787,7 +4787,7 @@
           <w:color w:val="333333"/>
           <w:sz w:val="24"/>
         </w:rPr>
-        <w:t>• ❌ "We're going in a different direction." → Corporate jargon that dehumanizes the moment. Be real.</w:t>
+        <w:t>❌ "We're going in a different direction." → Corporate jargon that dehumanizes the moment. Be real.</w:t>
       </w:r>
     </w:p>
     <w:p>
@@ -4802,7 +4802,7 @@
           <w:color w:val="333333"/>
           <w:sz w:val="24"/>
         </w:rPr>
-        <w:t>• ❌ "I'm sure you'll land on your feet." → Premature optimism. They haven't processed the loss yet.</w:t>
+        <w:t>❌ "I'm sure you'll land on your feet." → Premature optimism. They haven't processed the loss yet.</w:t>
       </w:r>
     </w:p>
     <w:p>
@@ -4817,7 +4817,7 @@
           <w:color w:val="333333"/>
           <w:sz w:val="24"/>
         </w:rPr>
-        <w:t>• ❌ "If it were up to me..." → You're the manager. As far as they're concerned, it was up to you. Don't deflect.</w:t>
+        <w:t>❌ "If it were up to me..." → You're the manager. As far as they're concerned, it was up to you. Don't deflect.</w:t>
       </w:r>
     </w:p>
     <w:p>
@@ -4832,7 +4832,7 @@
           <w:color w:val="333333"/>
           <w:sz w:val="24"/>
         </w:rPr>
-        <w:t>• ❌ "We can still be friends." → Inappropriate. The power dynamic makes this uncomfortable.</w:t>
+        <w:t>❌ "We can still be friends." → Inappropriate. The power dynamic makes this uncomfortable.</w:t>
       </w:r>
     </w:p>
     <w:p>
@@ -4847,7 +4847,7 @@
           <w:color w:val="333333"/>
           <w:sz w:val="24"/>
         </w:rPr>
-        <w:t>• ❌ Any criticism of their work in this moment. → The feedback phase is over. This is not a teaching moment. This is a human moment.</w:t>
+        <w:t>❌ Any criticism of their work in this moment. → The feedback phase is over. This is not a teaching moment. This is a human moment.</w:t>
       </w:r>
     </w:p>
     <w:p>
@@ -4896,7 +4896,7 @@
           <w:color w:val="333333"/>
           <w:sz w:val="24"/>
         </w:rPr>
-        <w:t>• Dorsal vagal shutdown:</w:t>
+        <w:t>Dorsal vagal shutdown:</w:t>
       </w:r>
       <w:r>
         <w:rPr>
@@ -4921,7 +4921,7 @@
           <w:color w:val="333333"/>
           <w:sz w:val="24"/>
         </w:rPr>
-        <w:t>• Sympathetic activation:</w:t>
+        <w:t>Sympathetic activation:</w:t>
       </w:r>
       <w:r>
         <w:rPr>
@@ -4946,7 +4946,7 @@
           <w:color w:val="333333"/>
           <w:sz w:val="24"/>
         </w:rPr>
-        <w:t>• Cognitive flooding:</w:t>
+        <w:t>Cognitive flooding:</w:t>
       </w:r>
       <w:r>
         <w:rPr>
@@ -5374,7 +5374,7 @@
           <w:color w:val="333333"/>
           <w:sz w:val="24"/>
         </w:rPr>
-        <w:t>• ❌ "You two need to figure this out." → Abdicating your role. They've already tried and failed.</w:t>
+        <w:t>❌ "You two need to figure this out." → Abdicating your role. They've already tried and failed.</w:t>
       </w:r>
     </w:p>
     <w:p>
@@ -5389,7 +5389,7 @@
           <w:color w:val="333333"/>
           <w:sz w:val="24"/>
         </w:rPr>
-        <w:t>• ❌ "I'm sure it's a misunderstanding." → Minimizing. The conflict is real to them.</w:t>
+        <w:t>❌ "I'm sure it's a misunderstanding." → Minimizing. The conflict is real to them.</w:t>
       </w:r>
     </w:p>
     <w:p>
@@ -5404,7 +5404,7 @@
           <w:color w:val="333333"/>
           <w:sz w:val="24"/>
         </w:rPr>
-        <w:t>• ❌ "Taylor says you did X — is that true?" → Playing prosecutor. This isn't a deposition.</w:t>
+        <w:t>❌ "Taylor says you did X — is that true?" → Playing prosecutor. This isn't a deposition.</w:t>
       </w:r>
     </w:p>
     <w:p>
@@ -5419,7 +5419,7 @@
           <w:color w:val="333333"/>
           <w:sz w:val="24"/>
         </w:rPr>
-        <w:t>• ❌ "Who started this?" → Irrelevant and childish framing. It doesn't matter who started it.</w:t>
+        <w:t>❌ "Who started this?" → Irrelevant and childish framing. It doesn't matter who started it.</w:t>
       </w:r>
     </w:p>
     <w:p>
@@ -5434,7 +5434,7 @@
           <w:color w:val="333333"/>
           <w:sz w:val="24"/>
         </w:rPr>
-        <w:t>• ❌ "You're both professionals, act like it." → Shaming. This guarantees the conflict goes underground instead of resolving.</w:t>
+        <w:t>❌ "You're both professionals, act like it." → Shaming. This guarantees the conflict goes underground instead of resolving.</w:t>
       </w:r>
     </w:p>
     <w:p>
@@ -5954,7 +5954,7 @@
           <w:color w:val="333333"/>
           <w:sz w:val="24"/>
         </w:rPr>
-        <w:t>• ❌ "You seem off." → Vague and slightly clinical. Makes them feel observed like a specimen.</w:t>
+        <w:t>❌ "You seem off." → Vague and slightly clinical. Makes them feel observed like a specimen.</w:t>
       </w:r>
     </w:p>
     <w:p>
@@ -5969,7 +5969,7 @@
           <w:color w:val="333333"/>
           <w:sz w:val="24"/>
         </w:rPr>
-        <w:t>• ❌ "Is everything okay at home?" → Too invasive. Let them volunteer personal details.</w:t>
+        <w:t>❌ "Is everything okay at home?" → Too invasive. Let them volunteer personal details.</w:t>
       </w:r>
     </w:p>
     <w:p>
@@ -5984,7 +5984,7 @@
           <w:color w:val="333333"/>
           <w:sz w:val="24"/>
         </w:rPr>
-        <w:t>• ❌ "You need to take better care of yourself." → Patronizing. They know. That's like telling someone with insomnia to just sleep.</w:t>
+        <w:t>❌ "You need to take better care of yourself." → Patronizing. They know. That's like telling someone with insomnia to just sleep.</w:t>
       </w:r>
     </w:p>
     <w:p>
@@ -5999,7 +5999,7 @@
           <w:color w:val="333333"/>
           <w:sz w:val="24"/>
         </w:rPr>
-        <w:t>• ❌ "We all go through tough times." → Minimizing. This dismisses their specific experience.</w:t>
+        <w:t>❌ "We all go through tough times." → Minimizing. This dismisses their specific experience.</w:t>
       </w:r>
     </w:p>
     <w:p>
@@ -6014,7 +6014,7 @@
           <w:color w:val="333333"/>
           <w:sz w:val="24"/>
         </w:rPr>
-        <w:t>• ❌ "I need you at 100%." → Makes it about your needs, not theirs. This is the opposite of what this conversation should be.</w:t>
+        <w:t>❌ "I need you at 100%." → Makes it about your needs, not theirs. This is the opposite of what this conversation should be.</w:t>
       </w:r>
     </w:p>
     <w:p>
@@ -6029,7 +6029,7 @@
           <w:color w:val="333333"/>
           <w:sz w:val="24"/>
         </w:rPr>
-        <w:t>• ❌ "You're not going to have a breakdown on me, are you?" → Just... no.</w:t>
+        <w:t>❌ "You're not going to have a breakdown on me, are you?" → Just... no.</w:t>
       </w:r>
     </w:p>
     <w:p>
@@ -6627,7 +6627,7 @@
           <w:color w:val="333333"/>
           <w:sz w:val="24"/>
         </w:rPr>
-        <w:t>• "We need to talk about something." - Activates maximum threat response. They will assume they are being fired.</w:t>
+        <w:t>"We need to talk about something." - Activates maximum threat response. They will assume they are being fired.</w:t>
       </w:r>
     </w:p>
     <w:p>
@@ -6642,7 +6642,7 @@
           <w:color w:val="333333"/>
           <w:sz w:val="24"/>
         </w:rPr>
-        <w:t>• "I've noticed a pattern of..." - In text, "pattern" reads as an indictment. Save pattern conversations for video.</w:t>
+        <w:t>"I've noticed a pattern of..." - In text, "pattern" reads as an indictment. Save pattern conversations for video.</w:t>
       </w:r>
     </w:p>
     <w:p>
@@ -6657,7 +6657,7 @@
           <w:color w:val="333333"/>
           <w:sz w:val="24"/>
         </w:rPr>
-        <w:t>• "Going forward, I need you to..." - The word "need" in written feedback creates a power-dominance frame that triggers the brain's status-threat response.</w:t>
+        <w:t>"Going forward, I need you to..." - The word "need" in written feedback creates a power-dominance frame that triggers the brain's status-threat response.</w:t>
       </w:r>
     </w:p>
     <w:p>
@@ -6672,7 +6672,7 @@
           <w:color w:val="333333"/>
           <w:sz w:val="24"/>
         </w:rPr>
-        <w:t>• "I don't want to make a big deal of this, but..." - Their brain deletes everything before "but" and amplifies everything after it.</w:t>
+        <w:t>"I don't want to make a big deal of this, but..." - Their brain deletes everything before "but" and amplifies everything after it.</w:t>
       </w:r>
     </w:p>
     <w:p>
@@ -6687,7 +6687,7 @@
           <w:color w:val="333333"/>
           <w:sz w:val="24"/>
         </w:rPr>
-        <w:t>• Sending it at 6pm on Friday. They will ruminate all weekend with no ability to respond.</w:t>
+        <w:t>Sending it at 6pm on Friday. They will ruminate all weekend with no ability to respond.</w:t>
       </w:r>
     </w:p>
     <w:p>
@@ -6879,7 +6879,7 @@
           <w:color w:val="333333"/>
           <w:sz w:val="24"/>
         </w:rPr>
-        <w:t>• Turn off self-view.</w:t>
+        <w:t>Turn off self-view.</w:t>
       </w:r>
       <w:r>
         <w:rPr>
@@ -6904,7 +6904,7 @@
           <w:color w:val="333333"/>
           <w:sz w:val="24"/>
         </w:rPr>
-        <w:t>• Position your camera at eye level</w:t>
+        <w:t>Position your camera at eye level</w:t>
       </w:r>
       <w:r>
         <w:rPr>
@@ -6929,7 +6929,7 @@
           <w:color w:val="333333"/>
           <w:sz w:val="24"/>
         </w:rPr>
-        <w:t>• Close every other tab.</w:t>
+        <w:t>Close every other tab.</w:t>
       </w:r>
       <w:r>
         <w:rPr>
@@ -7090,7 +7090,7 @@
           <w:color w:val="333333"/>
           <w:sz w:val="24"/>
         </w:rPr>
-        <w:t>• Jaw tightening or lip pressing</w:t>
+        <w:t>Jaw tightening or lip pressing</w:t>
       </w:r>
       <w:r>
         <w:rPr>
@@ -7115,7 +7115,7 @@
           <w:color w:val="333333"/>
           <w:sz w:val="24"/>
         </w:rPr>
-        <w:t>• Eyes shifting up and to the right</w:t>
+        <w:t>Eyes shifting up and to the right</w:t>
       </w:r>
       <w:r>
         <w:rPr>
@@ -7140,7 +7140,7 @@
           <w:color w:val="333333"/>
           <w:sz w:val="24"/>
         </w:rPr>
-        <w:t>• Sudden stillness</w:t>
+        <w:t>Sudden stillness</w:t>
       </w:r>
       <w:r>
         <w:rPr>
@@ -7165,7 +7165,7 @@
           <w:color w:val="333333"/>
           <w:sz w:val="24"/>
         </w:rPr>
-        <w:t>• Camera angle shift</w:t>
+        <w:t>Camera angle shift</w:t>
       </w:r>
       <w:r>
         <w:rPr>
@@ -7263,7 +7263,7 @@
           <w:color w:val="333333"/>
           <w:sz w:val="24"/>
         </w:rPr>
-        <w:t>• "I'll share my screen to show you the data." - Sharing your screen during an emotional conversation removes their face from your view. You lose the only empathy channel you have.</w:t>
+        <w:t>"I'll share my screen to show you the data." - Sharing your screen during an emotional conversation removes their face from your view. You lose the only empathy channel you have.</w:t>
       </w:r>
     </w:p>
     <w:p>
@@ -7278,7 +7278,7 @@
           <w:color w:val="333333"/>
           <w:sz w:val="24"/>
         </w:rPr>
-        <w:t>• "I know this is awkward over Zoom..." - Naming the medium's limitations makes them more salient.</w:t>
+        <w:t>"I know this is awkward over Zoom..." - Naming the medium's limitations makes them more salient.</w:t>
       </w:r>
     </w:p>
     <w:p>
@@ -7293,7 +7293,7 @@
           <w:color w:val="333333"/>
           <w:sz w:val="24"/>
         </w:rPr>
-        <w:t>• "Let me know if you have questions." - This is a closing line for a webinar, not a difficult conversation.</w:t>
+        <w:t>"Let me know if you have questions." - This is a closing line for a webinar, not a difficult conversation.</w:t>
       </w:r>
     </w:p>
     <w:p>
@@ -7542,7 +7542,7 @@
           <w:color w:val="333333"/>
           <w:sz w:val="24"/>
         </w:rPr>
-        <w:t>• "You need to improve in..." - Opens with deficit framing. The brain reads this as "you are broken."</w:t>
+        <w:t>"You need to improve in..." - Opens with deficit framing. The brain reads this as "you are broken."</w:t>
       </w:r>
     </w:p>
     <w:p>
@@ -7557,7 +7557,7 @@
           <w:color w:val="333333"/>
           <w:sz w:val="24"/>
         </w:rPr>
-        <w:t>• "Sometimes you..." - Vague frequency words create uncertainty. How often? When? The brain fills in "always."</w:t>
+        <w:t>"Sometimes you..." - Vague frequency words create uncertainty. How often? When? The brain fills in "always."</w:t>
       </w:r>
     </w:p>
     <w:p>
@@ -7572,7 +7572,7 @@
           <w:color w:val="333333"/>
           <w:sz w:val="24"/>
         </w:rPr>
-        <w:t>• "Compared to others on the team..." - Social comparison is the fastest path to status threat.</w:t>
+        <w:t>"Compared to others on the team..." - Social comparison is the fastest path to status threat.</w:t>
       </w:r>
     </w:p>
     <w:p>
@@ -7587,7 +7587,7 @@
           <w:color w:val="333333"/>
           <w:sz w:val="24"/>
         </w:rPr>
-        <w:t>• "I would rate this a 3 out of 5." - Numbers without narrative feel like a verdict without a trial.</w:t>
+        <w:t>"I would rate this a 3 out of 5." - Numbers without narrative feel like a verdict without a trial.</w:t>
       </w:r>
     </w:p>
     <w:p>
@@ -7889,7 +7889,7 @@
           <w:color w:val="333333"/>
           <w:sz w:val="24"/>
         </w:rPr>
-        <w:t>• "I need everyone to turn their cameras on." - Mandating cameras creates compliance, not engagement. It also triggers autonomy threat.</w:t>
+        <w:t>"I need everyone to turn their cameras on." - Mandating cameras creates compliance, not engagement. It also triggers autonomy threat.</w:t>
       </w:r>
     </w:p>
     <w:p>
@@ -7904,7 +7904,7 @@
           <w:color w:val="333333"/>
           <w:sz w:val="24"/>
         </w:rPr>
-        <w:t>• "This team used to be more collaborative." - Nostalgia shaming. Comparing the team to a past version implies they have degraded.</w:t>
+        <w:t>"This team used to be more collaborative." - Nostalgia shaming. Comparing the team to a past version implies they have degraded.</w:t>
       </w:r>
     </w:p>
     <w:p>
@@ -7919,7 +7919,7 @@
           <w:color w:val="333333"/>
           <w:sz w:val="24"/>
         </w:rPr>
-        <w:t>• "I feel like nobody cares anymore." - Making it about your feelings puts the emotional burden on them.</w:t>
+        <w:t>"I feel like nobody cares anymore." - Making it about your feelings puts the emotional burden on them.</w:t>
       </w:r>
     </w:p>
     <w:p>
@@ -7934,7 +7934,7 @@
           <w:color w:val="333333"/>
           <w:sz w:val="24"/>
         </w:rPr>
-        <w:t>• "Is everyone burned out or something?" - Even if true, this framing pathologizes the team.</w:t>
+        <w:t>"Is everyone burned out or something?" - Even if true, this framing pathologizes the team.</w:t>
       </w:r>
     </w:p>
     <w:p>
@@ -8418,7 +8418,7 @@
           <w:color w:val="333333"/>
           <w:sz w:val="24"/>
         </w:rPr>
-        <w:t>• What was discussed (factual, not emotional)</w:t>
+        <w:t>What was discussed (factual, not emotional)</w:t>
       </w:r>
     </w:p>
     <w:p>
@@ -8433,7 +8433,7 @@
           <w:color w:val="333333"/>
           <w:sz w:val="24"/>
         </w:rPr>
-        <w:t>• What was agreed upon</w:t>
+        <w:t>What was agreed upon</w:t>
       </w:r>
     </w:p>
     <w:p>
@@ -8448,7 +8448,7 @@
           <w:color w:val="333333"/>
           <w:sz w:val="24"/>
         </w:rPr>
-        <w:t>• What the next steps are</w:t>
+        <w:t>What the next steps are</w:t>
       </w:r>
     </w:p>
     <w:p>
@@ -8463,7 +8463,7 @@
           <w:color w:val="333333"/>
           <w:sz w:val="24"/>
         </w:rPr>
-        <w:t>• When you'll follow up</w:t>
+        <w:t>When you'll follow up</w:t>
       </w:r>
     </w:p>
     <w:p>
@@ -8547,7 +8547,7 @@
           <w:color w:val="333333"/>
           <w:sz w:val="24"/>
         </w:rPr>
-        <w:t>• Did I listen more than I spoke?</w:t>
+        <w:t>Did I listen more than I spoke?</w:t>
       </w:r>
     </w:p>
     <w:p>
@@ -8562,7 +8562,7 @@
           <w:color w:val="333333"/>
           <w:sz w:val="24"/>
         </w:rPr>
-        <w:t>• Did I stay calm, or did I get reactive at any point?</w:t>
+        <w:t>Did I stay calm, or did I get reactive at any point?</w:t>
       </w:r>
     </w:p>
     <w:p>
@@ -8577,7 +8577,7 @@
           <w:color w:val="333333"/>
           <w:sz w:val="24"/>
         </w:rPr>
-        <w:t>• Was I clear about the expectations and next steps?</w:t>
+        <w:t>Was I clear about the expectations and next steps?</w:t>
       </w:r>
     </w:p>
     <w:p>
@@ -8592,7 +8592,7 @@
           <w:color w:val="333333"/>
           <w:sz w:val="24"/>
         </w:rPr>
-        <w:t>• Did I show genuine empathy?</w:t>
+        <w:t>Did I show genuine empathy?</w:t>
       </w:r>
     </w:p>
     <w:p>
@@ -8607,7 +8607,7 @@
           <w:color w:val="333333"/>
           <w:sz w:val="24"/>
         </w:rPr>
-        <w:t>• Is there anything I wish I'd said differently?</w:t>
+        <w:t>Is there anything I wish I'd said differently?</w:t>
       </w:r>
     </w:p>
     <w:p>
@@ -9590,7 +9590,7 @@
           <w:color w:val="333333"/>
           <w:sz w:val="24"/>
         </w:rPr>
-        <w:t>• "I want to have an honest conversation because I respect you."</w:t>
+        <w:t>"I want to have an honest conversation because I respect you."</w:t>
       </w:r>
     </w:p>
     <w:p>
@@ -9605,7 +9605,7 @@
           <w:color w:val="333333"/>
           <w:sz w:val="24"/>
         </w:rPr>
-        <w:t>• "I've been noticing something I want to talk through with you."</w:t>
+        <w:t>"I've been noticing something I want to talk through with you."</w:t>
       </w:r>
     </w:p>
     <w:p>
@@ -9620,7 +9620,7 @@
           <w:color w:val="333333"/>
           <w:sz w:val="24"/>
         </w:rPr>
-        <w:t>• "This might be uncomfortable, but my intention is to help."</w:t>
+        <w:t>"This might be uncomfortable, but my intention is to help."</w:t>
       </w:r>
     </w:p>
     <w:p>
@@ -9650,7 +9650,7 @@
           <w:color w:val="333333"/>
           <w:sz w:val="24"/>
         </w:rPr>
-        <w:t>• "Help me understand your perspective."</w:t>
+        <w:t>"Help me understand your perspective."</w:t>
       </w:r>
     </w:p>
     <w:p>
@@ -9665,7 +9665,7 @@
           <w:color w:val="333333"/>
           <w:sz w:val="24"/>
         </w:rPr>
-        <w:t>• "Tell me more about that."</w:t>
+        <w:t>"Tell me more about that."</w:t>
       </w:r>
     </w:p>
     <w:p>
@@ -9680,7 +9680,7 @@
           <w:color w:val="333333"/>
           <w:sz w:val="24"/>
         </w:rPr>
-        <w:t>• "What else should I know?"</w:t>
+        <w:t>"What else should I know?"</w:t>
       </w:r>
     </w:p>
     <w:p>
@@ -9710,7 +9710,7 @@
           <w:color w:val="333333"/>
           <w:sz w:val="24"/>
         </w:rPr>
-        <w:t>• "I imagine this is hard to hear."</w:t>
+        <w:t>"I imagine this is hard to hear."</w:t>
       </w:r>
     </w:p>
     <w:p>
@@ -9725,7 +9725,7 @@
           <w:color w:val="333333"/>
           <w:sz w:val="24"/>
         </w:rPr>
-        <w:t>• "I can see this matters to you."</w:t>
+        <w:t>"I can see this matters to you."</w:t>
       </w:r>
     </w:p>
     <w:p>
@@ -9740,7 +9740,7 @@
           <w:color w:val="333333"/>
           <w:sz w:val="24"/>
         </w:rPr>
-        <w:t>• "Your feelings make sense to me."</w:t>
+        <w:t>"Your feelings make sense to me."</w:t>
       </w:r>
     </w:p>
     <w:p>
@@ -9770,7 +9770,7 @@
           <w:color w:val="333333"/>
           <w:sz w:val="24"/>
         </w:rPr>
-        <w:t>• "When [specific behavior], it creates [specific impact]."</w:t>
+        <w:t>"When [specific behavior], it creates [specific impact]."</w:t>
       </w:r>
     </w:p>
     <w:p>
@@ -9785,7 +9785,7 @@
           <w:color w:val="333333"/>
           <w:sz w:val="24"/>
         </w:rPr>
-        <w:t>• "I need to see [specific change] by [specific date]."</w:t>
+        <w:t>"I need to see [specific change] by [specific date]."</w:t>
       </w:r>
     </w:p>
     <w:p>
@@ -9800,7 +9800,7 @@
           <w:color w:val="333333"/>
           <w:sz w:val="24"/>
         </w:rPr>
-        <w:t>• "I'm telling you this now because I want us to address it while it's still manageable."</w:t>
+        <w:t>"I'm telling you this now because I want us to address it while it's still manageable."</w:t>
       </w:r>
     </w:p>
     <w:p>
@@ -9830,7 +9830,7 @@
           <w:color w:val="333333"/>
           <w:sz w:val="24"/>
         </w:rPr>
-        <w:t>• "What do you think would help?"</w:t>
+        <w:t>"What do you think would help?"</w:t>
       </w:r>
     </w:p>
     <w:p>
@@ -9845,7 +9845,7 @@
           <w:color w:val="333333"/>
           <w:sz w:val="24"/>
         </w:rPr>
-        <w:t>• "What support do you need from me?"</w:t>
+        <w:t>"What support do you need from me?"</w:t>
       </w:r>
     </w:p>
     <w:p>
@@ -9860,7 +9860,7 @@
           <w:color w:val="333333"/>
           <w:sz w:val="24"/>
         </w:rPr>
-        <w:t>• "Let's check in on [date]. I'm committed to working through this with you."</w:t>
+        <w:t>"Let's check in on [date]. I'm committed to working through this with you."</w:t>
       </w:r>
     </w:p>
     <w:p>
@@ -10024,7 +10024,7 @@
           <w:color w:val="333333"/>
           <w:sz w:val="24"/>
         </w:rPr>
-        <w:t>• The issue involves harassment, discrimination, or safety</w:t>
+        <w:t>The issue involves harassment, discrimination, or safety</w:t>
       </w:r>
     </w:p>
     <w:p>
@@ -10039,7 +10039,7 @@
           <w:color w:val="333333"/>
           <w:sz w:val="24"/>
         </w:rPr>
-        <w:t>• You're considering termination</w:t>
+        <w:t>You're considering termination</w:t>
       </w:r>
     </w:p>
     <w:p>
@@ -10054,7 +10054,7 @@
           <w:color w:val="333333"/>
           <w:sz w:val="24"/>
         </w:rPr>
-        <w:t>• The employee mentions legal action</w:t>
+        <w:t>The employee mentions legal action</w:t>
       </w:r>
     </w:p>
     <w:p>
@@ -10069,7 +10069,7 @@
           <w:color w:val="333333"/>
           <w:sz w:val="24"/>
         </w:rPr>
-        <w:t>• You've had two clear conversations and the behavior hasn't changed</w:t>
+        <w:t>You've had two clear conversations and the behavior hasn't changed</w:t>
       </w:r>
     </w:p>
     <w:p>
@@ -10084,7 +10084,7 @@
           <w:color w:val="333333"/>
           <w:sz w:val="24"/>
         </w:rPr>
-        <w:t>• The employee discloses a health, mental health, or personal crisis that requires accommodation</w:t>
+        <w:t>The employee discloses a health, mental health, or personal crisis that requires accommodation</w:t>
       </w:r>
     </w:p>
     <w:p>
@@ -10099,7 +10099,7 @@
           <w:color w:val="333333"/>
           <w:sz w:val="24"/>
         </w:rPr>
-        <w:t>• You're unsure about the right approach (HR is a resource, not just a last resort)</w:t>
+        <w:t>You're unsure about the right approach (HR is a resource, not just a last resort)</w:t>
       </w:r>
     </w:p>
     <w:p>

</xml_diff>

<commit_message>
Fix: numbered lists use List Number style instead of List Bullet
</commit_message>
<xml_diff>
--- a/kdp-files/difficult_conversations_ebook.docx
+++ b/kdp-files/difficult_conversations_ebook.docx
@@ -2151,269 +2151,269 @@
     </w:p>
     <w:p>
       <w:pPr>
+        <w:pStyle w:val="ListNumber"/>
+      </w:pPr>
+      <w:r>
+        <w:rPr>
+          <w:rFonts w:ascii="Georgia" w:hAnsi="Georgia"/>
+          <w:b/>
+          <w:i w:val="0"/>
+          <w:color w:val="333333"/>
+          <w:sz w:val="24"/>
+        </w:rPr>
+        <w:t>1. State the observation</w:t>
+      </w:r>
+      <w:r>
+        <w:rPr>
+          <w:rFonts w:ascii="Georgia" w:hAnsi="Georgia"/>
+          <w:b w:val="0"/>
+          <w:i w:val="0"/>
+          <w:color w:val="333333"/>
+          <w:sz w:val="24"/>
+        </w:rPr>
+        <w:t xml:space="preserve"> (behavior, not character): "In the last three weeks, three project deliverables were submitted after the deadline."</w:t>
+      </w:r>
+    </w:p>
+    <w:p>
+      <w:pPr>
+        <w:pStyle w:val="ListNumber"/>
+      </w:pPr>
+      <w:r>
+        <w:rPr>
+          <w:rFonts w:ascii="Georgia" w:hAnsi="Georgia"/>
+          <w:b/>
+          <w:i w:val="0"/>
+          <w:color w:val="333333"/>
+          <w:sz w:val="24"/>
+        </w:rPr>
+        <w:t>2. State the impact:</w:t>
+      </w:r>
+      <w:r>
+        <w:rPr>
+          <w:rFonts w:ascii="Georgia" w:hAnsi="Georgia"/>
+          <w:b w:val="0"/>
+          <w:i w:val="0"/>
+          <w:color w:val="333333"/>
+          <w:sz w:val="24"/>
+        </w:rPr>
+        <w:t xml:space="preserve"> "This caused the client team to miss their own milestones, and it created extra work for your colleagues."</w:t>
+      </w:r>
+    </w:p>
+    <w:p>
+      <w:pPr>
+        <w:pStyle w:val="ListNumber"/>
+      </w:pPr>
+      <w:r>
+        <w:rPr>
+          <w:rFonts w:ascii="Georgia" w:hAnsi="Georgia"/>
+          <w:b/>
+          <w:i w:val="0"/>
+          <w:color w:val="333333"/>
+          <w:sz w:val="24"/>
+        </w:rPr>
+        <w:t>3. State the expectation:</w:t>
+      </w:r>
+      <w:r>
+        <w:rPr>
+          <w:rFonts w:ascii="Georgia" w:hAnsi="Georgia"/>
+          <w:b w:val="0"/>
+          <w:i w:val="0"/>
+          <w:color w:val="333333"/>
+          <w:sz w:val="24"/>
+        </w:rPr>
+        <w:t xml:space="preserve"> "Going forward, I need all deliverables submitted by the agreed date, or flagged at least 48 hours in advance if there's a risk."</w:t>
+      </w:r>
+    </w:p>
+    <w:p>
+      <w:pPr/>
+      <w:r>
+        <w:rPr>
+          <w:rFonts w:ascii="Georgia" w:hAnsi="Georgia"/>
+          <w:b/>
+          <w:i w:val="0"/>
+          <w:color w:val="333333"/>
+          <w:sz w:val="24"/>
+        </w:rPr>
+        <w:t>Notice what's absent:</w:t>
+      </w:r>
+      <w:r>
+        <w:rPr>
+          <w:rFonts w:ascii="Georgia" w:hAnsi="Georgia"/>
+          <w:b w:val="0"/>
+          <w:i w:val="0"/>
+          <w:color w:val="333333"/>
+          <w:sz w:val="24"/>
+        </w:rPr>
+        <w:t xml:space="preserve"> judgment, labels, and mind-reading. Not "You're unreliable" (character judgment). Not "You obviously don't care" (mind-reading). Just observable behavior, its impact, and the clear expectation.</w:t>
+      </w:r>
+    </w:p>
+    <w:p>
+      <w:pPr/>
+      <w:r>
+        <w:rPr>
+          <w:rFonts w:ascii="Georgia" w:hAnsi="Georgia"/>
+          <w:b w:val="0"/>
+          <w:i w:val="0"/>
+          <w:color w:val="333333"/>
+          <w:sz w:val="24"/>
+        </w:rPr>
+        <w:t xml:space="preserve">This approach aligns with what neuroscientists call </w:t>
+      </w:r>
+      <w:r>
+        <w:rPr>
+          <w:rFonts w:ascii="Georgia" w:hAnsi="Georgia"/>
+          <w:b/>
+          <w:i w:val="0"/>
+          <w:color w:val="333333"/>
+          <w:sz w:val="24"/>
+        </w:rPr>
+        <w:t>specific feedback processing</w:t>
+      </w:r>
+      <w:r>
+        <w:rPr>
+          <w:rFonts w:ascii="Georgia" w:hAnsi="Georgia"/>
+          <w:b w:val="0"/>
+          <w:i w:val="0"/>
+          <w:color w:val="333333"/>
+          <w:sz w:val="24"/>
+        </w:rPr>
+        <w:t>. The brain can act on specific, behavioral feedback. It cannot act on vague or character-based feedback — it can only defend against it.</w:t>
+      </w:r>
+    </w:p>
+    <w:p>
+      <w:pPr>
+        <w:pStyle w:val="Heading2"/>
+      </w:pPr>
+      <w:r>
+        <w:t>R — Resolve: Co-Create the Path Forward</w:t>
+      </w:r>
+    </w:p>
+    <w:p>
+      <w:pPr/>
+      <w:r>
+        <w:rPr>
+          <w:rFonts w:ascii="Georgia" w:hAnsi="Georgia"/>
+          <w:b w:val="0"/>
+          <w:i w:val="0"/>
+          <w:color w:val="333333"/>
+          <w:sz w:val="24"/>
+        </w:rPr>
+        <w:t xml:space="preserve">The conversation should end with a plan — ideally one the employee has helped create. Research on </w:t>
+      </w:r>
+      <w:r>
+        <w:rPr>
+          <w:rFonts w:ascii="Georgia" w:hAnsi="Georgia"/>
+          <w:b/>
+          <w:i w:val="0"/>
+          <w:color w:val="333333"/>
+          <w:sz w:val="24"/>
+        </w:rPr>
+        <w:t>self-determination theory</w:t>
+      </w:r>
+      <w:r>
+        <w:rPr>
+          <w:rFonts w:ascii="Georgia" w:hAnsi="Georgia"/>
+          <w:b w:val="0"/>
+          <w:i w:val="0"/>
+          <w:color w:val="333333"/>
+          <w:sz w:val="24"/>
+        </w:rPr>
+        <w:t xml:space="preserve"> (Deci &amp; Ryan, 1985) shows that people are more committed to plans they've had a hand in shaping, because it preserves their sense of autonomy.</w:t>
+      </w:r>
+    </w:p>
+    <w:p>
+      <w:pPr>
+        <w:ind w:firstLine="0"/>
+      </w:pPr>
+      <w:r>
+        <w:rPr>
+          <w:rFonts w:ascii="Georgia" w:hAnsi="Georgia"/>
+          <w:b/>
+          <w:i w:val="0"/>
+          <w:color w:val="333333"/>
+          <w:sz w:val="24"/>
+        </w:rPr>
+        <w:t>Resolution questions:</w:t>
+      </w:r>
+    </w:p>
+    <w:p>
+      <w:pPr>
         <w:pStyle w:val="ListBullet"/>
       </w:pPr>
       <w:r>
         <w:rPr>
           <w:rFonts w:ascii="Georgia" w:hAnsi="Georgia"/>
+          <w:b w:val="0"/>
+          <w:i w:val="0"/>
+          <w:color w:val="333333"/>
+          <w:sz w:val="24"/>
+        </w:rPr>
+        <w:t>"What do you think would help you get back on track?"</w:t>
+      </w:r>
+    </w:p>
+    <w:p>
+      <w:pPr>
+        <w:pStyle w:val="ListBullet"/>
+      </w:pPr>
+      <w:r>
+        <w:rPr>
+          <w:rFonts w:ascii="Georgia" w:hAnsi="Georgia"/>
+          <w:b w:val="0"/>
+          <w:i w:val="0"/>
+          <w:color w:val="333333"/>
+          <w:sz w:val="24"/>
+        </w:rPr>
+        <w:t>"What support do you need from me?"</w:t>
+      </w:r>
+    </w:p>
+    <w:p>
+      <w:pPr>
+        <w:pStyle w:val="ListBullet"/>
+      </w:pPr>
+      <w:r>
+        <w:rPr>
+          <w:rFonts w:ascii="Georgia" w:hAnsi="Georgia"/>
+          <w:b w:val="0"/>
+          <w:i w:val="0"/>
+          <w:color w:val="333333"/>
+          <w:sz w:val="24"/>
+        </w:rPr>
+        <w:t>"What does success look like for you in the next 30 days?"</w:t>
+      </w:r>
+    </w:p>
+    <w:p>
+      <w:pPr>
+        <w:pStyle w:val="ListBullet"/>
+      </w:pPr>
+      <w:r>
+        <w:rPr>
+          <w:rFonts w:ascii="Georgia" w:hAnsi="Georgia"/>
+          <w:b w:val="0"/>
+          <w:i w:val="0"/>
+          <w:color w:val="333333"/>
+          <w:sz w:val="24"/>
+        </w:rPr>
+        <w:t>"How would you like me to follow up — weekly check-ins, or would you prefer to come to me?"</w:t>
+      </w:r>
+    </w:p>
+    <w:p>
+      <w:pPr>
+        <w:ind w:firstLine="0"/>
+      </w:pPr>
+      <w:r>
+        <w:rPr>
+          <w:rFonts w:ascii="Georgia" w:hAnsi="Georgia"/>
           <w:b/>
           <w:i w:val="0"/>
           <w:color w:val="333333"/>
           <w:sz w:val="24"/>
         </w:rPr>
-        <w:t>1. State the observation</w:t>
-      </w:r>
-      <w:r>
-        <w:rPr>
-          <w:rFonts w:ascii="Georgia" w:hAnsi="Georgia"/>
-          <w:b w:val="0"/>
-          <w:i w:val="0"/>
-          <w:color w:val="333333"/>
-          <w:sz w:val="24"/>
-        </w:rPr>
-        <w:t xml:space="preserve"> (behavior, not character): "In the last three weeks, three project deliverables were submitted after the deadline."</w:t>
-      </w:r>
-    </w:p>
-    <w:p>
-      <w:pPr>
-        <w:pStyle w:val="ListBullet"/>
-      </w:pPr>
-      <w:r>
-        <w:rPr>
-          <w:rFonts w:ascii="Georgia" w:hAnsi="Georgia"/>
-          <w:b/>
-          <w:i w:val="0"/>
-          <w:color w:val="333333"/>
-          <w:sz w:val="24"/>
-        </w:rPr>
-        <w:t>2. State the impact:</w:t>
-      </w:r>
-      <w:r>
-        <w:rPr>
-          <w:rFonts w:ascii="Georgia" w:hAnsi="Georgia"/>
-          <w:b w:val="0"/>
-          <w:i w:val="0"/>
-          <w:color w:val="333333"/>
-          <w:sz w:val="24"/>
-        </w:rPr>
-        <w:t xml:space="preserve"> "This caused the client team to miss their own milestones, and it created extra work for your colleagues."</w:t>
-      </w:r>
-    </w:p>
-    <w:p>
-      <w:pPr>
-        <w:pStyle w:val="ListBullet"/>
-      </w:pPr>
-      <w:r>
-        <w:rPr>
-          <w:rFonts w:ascii="Georgia" w:hAnsi="Georgia"/>
-          <w:b/>
-          <w:i w:val="0"/>
-          <w:color w:val="333333"/>
-          <w:sz w:val="24"/>
-        </w:rPr>
-        <w:t>3. State the expectation:</w:t>
-      </w:r>
-      <w:r>
-        <w:rPr>
-          <w:rFonts w:ascii="Georgia" w:hAnsi="Georgia"/>
-          <w:b w:val="0"/>
-          <w:i w:val="0"/>
-          <w:color w:val="333333"/>
-          <w:sz w:val="24"/>
-        </w:rPr>
-        <w:t xml:space="preserve"> "Going forward, I need all deliverables submitted by the agreed date, or flagged at least 48 hours in advance if there's a risk."</w:t>
-      </w:r>
-    </w:p>
-    <w:p>
-      <w:pPr/>
-      <w:r>
-        <w:rPr>
-          <w:rFonts w:ascii="Georgia" w:hAnsi="Georgia"/>
-          <w:b/>
-          <w:i w:val="0"/>
-          <w:color w:val="333333"/>
-          <w:sz w:val="24"/>
-        </w:rPr>
-        <w:t>Notice what's absent:</w:t>
-      </w:r>
-      <w:r>
-        <w:rPr>
-          <w:rFonts w:ascii="Georgia" w:hAnsi="Georgia"/>
-          <w:b w:val="0"/>
-          <w:i w:val="0"/>
-          <w:color w:val="333333"/>
-          <w:sz w:val="24"/>
-        </w:rPr>
-        <w:t xml:space="preserve"> judgment, labels, and mind-reading. Not "You're unreliable" (character judgment). Not "You obviously don't care" (mind-reading). Just observable behavior, its impact, and the clear expectation.</w:t>
-      </w:r>
-    </w:p>
-    <w:p>
-      <w:pPr/>
-      <w:r>
-        <w:rPr>
-          <w:rFonts w:ascii="Georgia" w:hAnsi="Georgia"/>
-          <w:b w:val="0"/>
-          <w:i w:val="0"/>
-          <w:color w:val="333333"/>
-          <w:sz w:val="24"/>
-        </w:rPr>
-        <w:t xml:space="preserve">This approach aligns with what neuroscientists call </w:t>
-      </w:r>
-      <w:r>
-        <w:rPr>
-          <w:rFonts w:ascii="Georgia" w:hAnsi="Georgia"/>
-          <w:b/>
-          <w:i w:val="0"/>
-          <w:color w:val="333333"/>
-          <w:sz w:val="24"/>
-        </w:rPr>
-        <w:t>specific feedback processing</w:t>
-      </w:r>
-      <w:r>
-        <w:rPr>
-          <w:rFonts w:ascii="Georgia" w:hAnsi="Georgia"/>
-          <w:b w:val="0"/>
-          <w:i w:val="0"/>
-          <w:color w:val="333333"/>
-          <w:sz w:val="24"/>
-        </w:rPr>
-        <w:t>. The brain can act on specific, behavioral feedback. It cannot act on vague or character-based feedback — it can only defend against it.</w:t>
-      </w:r>
-    </w:p>
-    <w:p>
-      <w:pPr>
-        <w:pStyle w:val="Heading2"/>
-      </w:pPr>
-      <w:r>
-        <w:t>R — Resolve: Co-Create the Path Forward</w:t>
-      </w:r>
-    </w:p>
-    <w:p>
-      <w:pPr/>
-      <w:r>
-        <w:rPr>
-          <w:rFonts w:ascii="Georgia" w:hAnsi="Georgia"/>
-          <w:b w:val="0"/>
-          <w:i w:val="0"/>
-          <w:color w:val="333333"/>
-          <w:sz w:val="24"/>
-        </w:rPr>
-        <w:t xml:space="preserve">The conversation should end with a plan — ideally one the employee has helped create. Research on </w:t>
-      </w:r>
-      <w:r>
-        <w:rPr>
-          <w:rFonts w:ascii="Georgia" w:hAnsi="Georgia"/>
-          <w:b/>
-          <w:i w:val="0"/>
-          <w:color w:val="333333"/>
-          <w:sz w:val="24"/>
-        </w:rPr>
-        <w:t>self-determination theory</w:t>
-      </w:r>
-      <w:r>
-        <w:rPr>
-          <w:rFonts w:ascii="Georgia" w:hAnsi="Georgia"/>
-          <w:b w:val="0"/>
-          <w:i w:val="0"/>
-          <w:color w:val="333333"/>
-          <w:sz w:val="24"/>
-        </w:rPr>
-        <w:t xml:space="preserve"> (Deci &amp; Ryan, 1985) shows that people are more committed to plans they've had a hand in shaping, because it preserves their sense of autonomy.</w:t>
-      </w:r>
-    </w:p>
-    <w:p>
-      <w:pPr>
-        <w:ind w:firstLine="0"/>
-      </w:pPr>
-      <w:r>
-        <w:rPr>
-          <w:rFonts w:ascii="Georgia" w:hAnsi="Georgia"/>
-          <w:b/>
-          <w:i w:val="0"/>
-          <w:color w:val="333333"/>
-          <w:sz w:val="24"/>
-        </w:rPr>
-        <w:t>Resolution questions:</w:t>
-      </w:r>
-    </w:p>
-    <w:p>
-      <w:pPr>
-        <w:pStyle w:val="ListBullet"/>
-      </w:pPr>
-      <w:r>
-        <w:rPr>
-          <w:rFonts w:ascii="Georgia" w:hAnsi="Georgia"/>
-          <w:b w:val="0"/>
-          <w:i w:val="0"/>
-          <w:color w:val="333333"/>
-          <w:sz w:val="24"/>
-        </w:rPr>
-        <w:t>"What do you think would help you get back on track?"</w:t>
-      </w:r>
-    </w:p>
-    <w:p>
-      <w:pPr>
-        <w:pStyle w:val="ListBullet"/>
-      </w:pPr>
-      <w:r>
-        <w:rPr>
-          <w:rFonts w:ascii="Georgia" w:hAnsi="Georgia"/>
-          <w:b w:val="0"/>
-          <w:i w:val="0"/>
-          <w:color w:val="333333"/>
-          <w:sz w:val="24"/>
-        </w:rPr>
-        <w:t>"What support do you need from me?"</w:t>
-      </w:r>
-    </w:p>
-    <w:p>
-      <w:pPr>
-        <w:pStyle w:val="ListBullet"/>
-      </w:pPr>
-      <w:r>
-        <w:rPr>
-          <w:rFonts w:ascii="Georgia" w:hAnsi="Georgia"/>
-          <w:b w:val="0"/>
-          <w:i w:val="0"/>
-          <w:color w:val="333333"/>
-          <w:sz w:val="24"/>
-        </w:rPr>
-        <w:t>"What does success look like for you in the next 30 days?"</w:t>
-      </w:r>
-    </w:p>
-    <w:p>
-      <w:pPr>
-        <w:pStyle w:val="ListBullet"/>
-      </w:pPr>
-      <w:r>
-        <w:rPr>
-          <w:rFonts w:ascii="Georgia" w:hAnsi="Georgia"/>
-          <w:b w:val="0"/>
-          <w:i w:val="0"/>
-          <w:color w:val="333333"/>
-          <w:sz w:val="24"/>
-        </w:rPr>
-        <w:t>"How would you like me to follow up — weekly check-ins, or would you prefer to come to me?"</w:t>
-      </w:r>
-    </w:p>
-    <w:p>
-      <w:pPr>
-        <w:ind w:firstLine="0"/>
-      </w:pPr>
-      <w:r>
-        <w:rPr>
-          <w:rFonts w:ascii="Georgia" w:hAnsi="Georgia"/>
-          <w:b/>
-          <w:i w:val="0"/>
-          <w:color w:val="333333"/>
-          <w:sz w:val="24"/>
-        </w:rPr>
         <w:t>Always end with:</w:t>
       </w:r>
     </w:p>
     <w:p>
       <w:pPr>
-        <w:pStyle w:val="ListBullet"/>
+        <w:pStyle w:val="ListNumber"/>
       </w:pPr>
       <w:r>
         <w:rPr>
@@ -2428,7 +2428,7 @@
     </w:p>
     <w:p>
       <w:pPr>
-        <w:pStyle w:val="ListBullet"/>
+        <w:pStyle w:val="ListNumber"/>
       </w:pPr>
       <w:r>
         <w:rPr>
@@ -2443,7 +2443,7 @@
     </w:p>
     <w:p>
       <w:pPr>
-        <w:pStyle w:val="ListBullet"/>
+        <w:pStyle w:val="ListNumber"/>
       </w:pPr>
       <w:r>
         <w:rPr>
@@ -2852,7 +2852,7 @@
     </w:p>
     <w:p>
       <w:pPr>
-        <w:pStyle w:val="ListBullet"/>
+        <w:pStyle w:val="ListNumber"/>
       </w:pPr>
       <w:r>
         <w:rPr>
@@ -2877,7 +2877,7 @@
     </w:p>
     <w:p>
       <w:pPr>
-        <w:pStyle w:val="ListBullet"/>
+        <w:pStyle w:val="ListNumber"/>
       </w:pPr>
       <w:r>
         <w:rPr>
@@ -2902,7 +2902,7 @@
     </w:p>
     <w:p>
       <w:pPr>
-        <w:pStyle w:val="ListBullet"/>
+        <w:pStyle w:val="ListNumber"/>
       </w:pPr>
       <w:r>
         <w:rPr>
@@ -2927,7 +2927,7 @@
     </w:p>
     <w:p>
       <w:pPr>
-        <w:pStyle w:val="ListBullet"/>
+        <w:pStyle w:val="ListNumber"/>
       </w:pPr>
       <w:r>
         <w:rPr>
@@ -3317,7 +3317,7 @@
     </w:p>
     <w:p>
       <w:pPr>
-        <w:pStyle w:val="ListBullet"/>
+        <w:pStyle w:val="ListNumber"/>
       </w:pPr>
       <w:r>
         <w:rPr>
@@ -3342,7 +3342,7 @@
     </w:p>
     <w:p>
       <w:pPr>
-        <w:pStyle w:val="ListBullet"/>
+        <w:pStyle w:val="ListNumber"/>
       </w:pPr>
       <w:r>
         <w:rPr>
@@ -3367,7 +3367,7 @@
     </w:p>
     <w:p>
       <w:pPr>
-        <w:pStyle w:val="ListBullet"/>
+        <w:pStyle w:val="ListNumber"/>
       </w:pPr>
       <w:r>
         <w:rPr>
@@ -3891,7 +3891,7 @@
     </w:p>
     <w:p>
       <w:pPr>
-        <w:pStyle w:val="ListBullet"/>
+        <w:pStyle w:val="ListNumber"/>
       </w:pPr>
       <w:r>
         <w:rPr>
@@ -3916,7 +3916,7 @@
     </w:p>
     <w:p>
       <w:pPr>
-        <w:pStyle w:val="ListBullet"/>
+        <w:pStyle w:val="ListNumber"/>
       </w:pPr>
       <w:r>
         <w:rPr>
@@ -3941,7 +3941,7 @@
     </w:p>
     <w:p>
       <w:pPr>
-        <w:pStyle w:val="ListBullet"/>
+        <w:pStyle w:val="ListNumber"/>
       </w:pPr>
       <w:r>
         <w:rPr>
@@ -3966,7 +3966,7 @@
     </w:p>
     <w:p>
       <w:pPr>
-        <w:pStyle w:val="ListBullet"/>
+        <w:pStyle w:val="ListNumber"/>
       </w:pPr>
       <w:r>
         <w:rPr>
@@ -4431,7 +4431,7 @@
     </w:p>
     <w:p>
       <w:pPr>
-        <w:pStyle w:val="ListBullet"/>
+        <w:pStyle w:val="ListNumber"/>
       </w:pPr>
       <w:r>
         <w:rPr>
@@ -4456,7 +4456,7 @@
     </w:p>
     <w:p>
       <w:pPr>
-        <w:pStyle w:val="ListBullet"/>
+        <w:pStyle w:val="ListNumber"/>
       </w:pPr>
       <w:r>
         <w:rPr>
@@ -4481,7 +4481,7 @@
     </w:p>
     <w:p>
       <w:pPr>
-        <w:pStyle w:val="ListBullet"/>
+        <w:pStyle w:val="ListNumber"/>
       </w:pPr>
       <w:r>
         <w:rPr>
@@ -4506,7 +4506,7 @@
     </w:p>
     <w:p>
       <w:pPr>
-        <w:pStyle w:val="ListBullet"/>
+        <w:pStyle w:val="ListNumber"/>
       </w:pPr>
       <w:r>
         <w:rPr>
@@ -4982,7 +4982,7 @@
     </w:p>
     <w:p>
       <w:pPr>
-        <w:pStyle w:val="ListBullet"/>
+        <w:pStyle w:val="ListNumber"/>
       </w:pPr>
       <w:r>
         <w:rPr>
@@ -5007,7 +5007,7 @@
     </w:p>
     <w:p>
       <w:pPr>
-        <w:pStyle w:val="ListBullet"/>
+        <w:pStyle w:val="ListNumber"/>
       </w:pPr>
       <w:r>
         <w:rPr>
@@ -5032,7 +5032,7 @@
     </w:p>
     <w:p>
       <w:pPr>
-        <w:pStyle w:val="ListBullet"/>
+        <w:pStyle w:val="ListNumber"/>
       </w:pPr>
       <w:r>
         <w:rPr>
@@ -5077,7 +5077,7 @@
     </w:p>
     <w:p>
       <w:pPr>
-        <w:pStyle w:val="ListBullet"/>
+        <w:pStyle w:val="ListNumber"/>
       </w:pPr>
       <w:r>
         <w:rPr>
@@ -5574,7 +5574,7 @@
     </w:p>
     <w:p>
       <w:pPr>
-        <w:pStyle w:val="ListBullet"/>
+        <w:pStyle w:val="ListNumber"/>
       </w:pPr>
       <w:r>
         <w:rPr>
@@ -5599,7 +5599,7 @@
     </w:p>
     <w:p>
       <w:pPr>
-        <w:pStyle w:val="ListBullet"/>
+        <w:pStyle w:val="ListNumber"/>
       </w:pPr>
       <w:r>
         <w:rPr>
@@ -5624,7 +5624,7 @@
     </w:p>
     <w:p>
       <w:pPr>
-        <w:pStyle w:val="ListBullet"/>
+        <w:pStyle w:val="ListNumber"/>
       </w:pPr>
       <w:r>
         <w:rPr>
@@ -5649,7 +5649,7 @@
     </w:p>
     <w:p>
       <w:pPr>
-        <w:pStyle w:val="ListBullet"/>
+        <w:pStyle w:val="ListNumber"/>
       </w:pPr>
       <w:r>
         <w:rPr>
@@ -6169,7 +6169,7 @@
     </w:p>
     <w:p>
       <w:pPr>
-        <w:pStyle w:val="ListBullet"/>
+        <w:pStyle w:val="ListNumber"/>
       </w:pPr>
       <w:r>
         <w:rPr>
@@ -6194,7 +6194,7 @@
     </w:p>
     <w:p>
       <w:pPr>
-        <w:pStyle w:val="ListBullet"/>
+        <w:pStyle w:val="ListNumber"/>
       </w:pPr>
       <w:r>
         <w:rPr>
@@ -6219,7 +6219,7 @@
     </w:p>
     <w:p>
       <w:pPr>
-        <w:pStyle w:val="ListBullet"/>
+        <w:pStyle w:val="ListNumber"/>
       </w:pPr>
       <w:r>
         <w:rPr>
@@ -6244,7 +6244,7 @@
     </w:p>
     <w:p>
       <w:pPr>
-        <w:pStyle w:val="ListBullet"/>
+        <w:pStyle w:val="ListNumber"/>
       </w:pPr>
       <w:r>
         <w:rPr>
@@ -6269,7 +6269,7 @@
     </w:p>
     <w:p>
       <w:pPr>
-        <w:pStyle w:val="ListBullet"/>
+        <w:pStyle w:val="ListNumber"/>
       </w:pPr>
       <w:r>
         <w:rPr>
@@ -6284,7 +6284,7 @@
     </w:p>
     <w:p>
       <w:pPr>
-        <w:pStyle w:val="ListBullet"/>
+        <w:pStyle w:val="ListNumber"/>
       </w:pPr>
       <w:r>
         <w:rPr>
@@ -6748,7 +6748,7 @@
     </w:p>
     <w:p>
       <w:pPr>
-        <w:pStyle w:val="ListBullet"/>
+        <w:pStyle w:val="ListNumber"/>
       </w:pPr>
       <w:r>
         <w:rPr>
@@ -6773,7 +6773,7 @@
     </w:p>
     <w:p>
       <w:pPr>
-        <w:pStyle w:val="ListBullet"/>
+        <w:pStyle w:val="ListNumber"/>
       </w:pPr>
       <w:r>
         <w:rPr>
@@ -6798,7 +6798,7 @@
     </w:p>
     <w:p>
       <w:pPr>
-        <w:pStyle w:val="ListBullet"/>
+        <w:pStyle w:val="ListNumber"/>
       </w:pPr>
       <w:r>
         <w:rPr>
@@ -7313,7 +7313,7 @@
     </w:p>
     <w:p>
       <w:pPr>
-        <w:pStyle w:val="ListBullet"/>
+        <w:pStyle w:val="ListNumber"/>
       </w:pPr>
       <w:r>
         <w:rPr>
@@ -7338,7 +7338,7 @@
     </w:p>
     <w:p>
       <w:pPr>
-        <w:pStyle w:val="ListBullet"/>
+        <w:pStyle w:val="ListNumber"/>
       </w:pPr>
       <w:r>
         <w:rPr>
@@ -7668,7 +7668,7 @@
     </w:p>
     <w:p>
       <w:pPr>
-        <w:pStyle w:val="ListBullet"/>
+        <w:pStyle w:val="ListNumber"/>
       </w:pPr>
       <w:r>
         <w:rPr>
@@ -7693,7 +7693,7 @@
     </w:p>
     <w:p>
       <w:pPr>
-        <w:pStyle w:val="ListBullet"/>
+        <w:pStyle w:val="ListNumber"/>
       </w:pPr>
       <w:r>
         <w:rPr>
@@ -7718,7 +7718,7 @@
     </w:p>
     <w:p>
       <w:pPr>
-        <w:pStyle w:val="ListBullet"/>
+        <w:pStyle w:val="ListNumber"/>
       </w:pPr>
       <w:r>
         <w:rPr>
@@ -8055,7 +8055,7 @@
     </w:p>
     <w:p>
       <w:pPr>
-        <w:pStyle w:val="ListBullet"/>
+        <w:pStyle w:val="ListNumber"/>
       </w:pPr>
       <w:r>
         <w:rPr>
@@ -8080,7 +8080,7 @@
     </w:p>
     <w:p>
       <w:pPr>
-        <w:pStyle w:val="ListBullet"/>
+        <w:pStyle w:val="ListNumber"/>
       </w:pPr>
       <w:r>
         <w:rPr>
@@ -8105,7 +8105,7 @@
     </w:p>
     <w:p>
       <w:pPr>
-        <w:pStyle w:val="ListBullet"/>
+        <w:pStyle w:val="ListNumber"/>
       </w:pPr>
       <w:r>
         <w:rPr>
@@ -8130,7 +8130,7 @@
     </w:p>
     <w:p>
       <w:pPr>
-        <w:pStyle w:val="ListBullet"/>
+        <w:pStyle w:val="ListNumber"/>
       </w:pPr>
       <w:r>
         <w:rPr>

</xml_diff>

<commit_message>
Fix: remove duplicate numbers from List Number items in ebook
</commit_message>
<xml_diff>
--- a/kdp-files/difficult_conversations_ebook.docx
+++ b/kdp-files/difficult_conversations_ebook.docx
@@ -2161,7 +2161,7 @@
           <w:color w:val="333333"/>
           <w:sz w:val="24"/>
         </w:rPr>
-        <w:t>1. State the observation</w:t>
+        <w:t>State the observation</w:t>
       </w:r>
       <w:r>
         <w:rPr>
@@ -2186,7 +2186,7 @@
           <w:color w:val="333333"/>
           <w:sz w:val="24"/>
         </w:rPr>
-        <w:t>2. State the impact:</w:t>
+        <w:t>State the impact:</w:t>
       </w:r>
       <w:r>
         <w:rPr>
@@ -2211,7 +2211,7 @@
           <w:color w:val="333333"/>
           <w:sz w:val="24"/>
         </w:rPr>
-        <w:t>3. State the expectation:</w:t>
+        <w:t>State the expectation:</w:t>
       </w:r>
       <w:r>
         <w:rPr>
@@ -2423,7 +2423,7 @@
           <w:color w:val="333333"/>
           <w:sz w:val="24"/>
         </w:rPr>
-        <w:t>1. A summary of what was agreed</w:t>
+        <w:t>A summary of what was agreed</w:t>
       </w:r>
     </w:p>
     <w:p>
@@ -2438,7 +2438,7 @@
           <w:color w:val="333333"/>
           <w:sz w:val="24"/>
         </w:rPr>
-        <w:t>2. A specific follow-up date</w:t>
+        <w:t>A specific follow-up date</w:t>
       </w:r>
     </w:p>
     <w:p>
@@ -2453,7 +2453,7 @@
           <w:color w:val="333333"/>
           <w:sz w:val="24"/>
         </w:rPr>
-        <w:t>3. An expression of confidence: "I believe you can do this, and I'm here to support you."</w:t>
+        <w:t>An expression of confidence: "I believe you can do this, and I'm here to support you."</w:t>
       </w:r>
     </w:p>
     <w:p>
@@ -2862,7 +2862,7 @@
           <w:color w:val="333333"/>
           <w:sz w:val="24"/>
         </w:rPr>
-        <w:t>1. Within 24 hours:</w:t>
+        <w:t>Within 24 hours:</w:t>
       </w:r>
       <w:r>
         <w:rPr>
@@ -2887,7 +2887,7 @@
           <w:color w:val="333333"/>
           <w:sz w:val="24"/>
         </w:rPr>
-        <w:t>2. Weekly check-ins:</w:t>
+        <w:t>Weekly check-ins:</w:t>
       </w:r>
       <w:r>
         <w:rPr>
@@ -2912,7 +2912,7 @@
           <w:color w:val="333333"/>
           <w:sz w:val="24"/>
         </w:rPr>
-        <w:t>3. 30-day review:</w:t>
+        <w:t>30-day review:</w:t>
       </w:r>
       <w:r>
         <w:rPr>
@@ -2937,7 +2937,7 @@
           <w:color w:val="333333"/>
           <w:sz w:val="24"/>
         </w:rPr>
-        <w:t>4. Document everything:</w:t>
+        <w:t>Document everything:</w:t>
       </w:r>
       <w:r>
         <w:rPr>
@@ -3327,7 +3327,7 @@
           <w:color w:val="333333"/>
           <w:sz w:val="24"/>
         </w:rPr>
-        <w:t>1. Same day or next morning:</w:t>
+        <w:t>Same day or next morning:</w:t>
       </w:r>
       <w:r>
         <w:rPr>
@@ -3352,7 +3352,7 @@
           <w:color w:val="333333"/>
           <w:sz w:val="24"/>
         </w:rPr>
-        <w:t>2. Before the next similar event:</w:t>
+        <w:t>Before the next similar event:</w:t>
       </w:r>
       <w:r>
         <w:rPr>
@@ -3377,7 +3377,7 @@
           <w:color w:val="333333"/>
           <w:sz w:val="24"/>
         </w:rPr>
-        <w:t>3. After the next similar event:</w:t>
+        <w:t>After the next similar event:</w:t>
       </w:r>
       <w:r>
         <w:rPr>
@@ -3901,7 +3901,7 @@
           <w:color w:val="333333"/>
           <w:sz w:val="24"/>
         </w:rPr>
-        <w:t>1. If there's a personal issue:</w:t>
+        <w:t>If there's a personal issue:</w:t>
       </w:r>
       <w:r>
         <w:rPr>
@@ -3926,7 +3926,7 @@
           <w:color w:val="333333"/>
           <w:sz w:val="24"/>
         </w:rPr>
-        <w:t>2. If it's a behavioral pattern without clear cause:</w:t>
+        <w:t>If it's a behavioral pattern without clear cause:</w:t>
       </w:r>
       <w:r>
         <w:rPr>
@@ -3951,7 +3951,7 @@
           <w:color w:val="333333"/>
           <w:sz w:val="24"/>
         </w:rPr>
-        <w:t>3. Two-week check-in:</w:t>
+        <w:t>Two-week check-in:</w:t>
       </w:r>
       <w:r>
         <w:rPr>
@@ -3976,7 +3976,7 @@
           <w:color w:val="333333"/>
           <w:sz w:val="24"/>
         </w:rPr>
-        <w:t>4. If the pattern continues:</w:t>
+        <w:t>If the pattern continues:</w:t>
       </w:r>
       <w:r>
         <w:rPr>
@@ -4441,7 +4441,7 @@
           <w:color w:val="333333"/>
           <w:sz w:val="24"/>
         </w:rPr>
-        <w:t>1. Within one week:</w:t>
+        <w:t>Within one week:</w:t>
       </w:r>
       <w:r>
         <w:rPr>
@@ -4466,7 +4466,7 @@
           <w:color w:val="333333"/>
           <w:sz w:val="24"/>
         </w:rPr>
-        <w:t>2. Monthly touchpoints:</w:t>
+        <w:t>Monthly touchpoints:</w:t>
       </w:r>
       <w:r>
         <w:rPr>
@@ -4491,7 +4491,7 @@
           <w:color w:val="333333"/>
           <w:sz w:val="24"/>
         </w:rPr>
-        <w:t>3. At the six-month mark:</w:t>
+        <w:t>At the six-month mark:</w:t>
       </w:r>
       <w:r>
         <w:rPr>
@@ -4516,7 +4516,7 @@
           <w:color w:val="333333"/>
           <w:sz w:val="24"/>
         </w:rPr>
-        <w:t>4. Watch for disengagement:</w:t>
+        <w:t>Watch for disengagement:</w:t>
       </w:r>
       <w:r>
         <w:rPr>
@@ -4992,7 +4992,7 @@
           <w:color w:val="333333"/>
           <w:sz w:val="24"/>
         </w:rPr>
-        <w:t>1. In the meeting:</w:t>
+        <w:t>In the meeting:</w:t>
       </w:r>
       <w:r>
         <w:rPr>
@@ -5017,7 +5017,7 @@
           <w:color w:val="333333"/>
           <w:sz w:val="24"/>
         </w:rPr>
-        <w:t>2. Team communication:</w:t>
+        <w:t>Team communication:</w:t>
       </w:r>
       <w:r>
         <w:rPr>
@@ -5042,7 +5042,7 @@
           <w:color w:val="333333"/>
           <w:sz w:val="24"/>
         </w:rPr>
-        <w:t>3. Team morale:</w:t>
+        <w:t>Team morale:</w:t>
       </w:r>
       <w:r>
         <w:rPr>
@@ -5087,7 +5087,7 @@
           <w:color w:val="333333"/>
           <w:sz w:val="24"/>
         </w:rPr>
-        <w:t>4. Your own processing:</w:t>
+        <w:t>Your own processing:</w:t>
       </w:r>
       <w:r>
         <w:rPr>
@@ -5584,7 +5584,7 @@
           <w:color w:val="333333"/>
           <w:sz w:val="24"/>
         </w:rPr>
-        <w:t>1. Write down the agreed changes.</w:t>
+        <w:t>Write down the agreed changes.</w:t>
       </w:r>
       <w:r>
         <w:rPr>
@@ -5609,7 +5609,7 @@
           <w:color w:val="333333"/>
           <w:sz w:val="24"/>
         </w:rPr>
-        <w:t>2. One-on-one check-ins</w:t>
+        <w:t>One-on-one check-ins</w:t>
       </w:r>
       <w:r>
         <w:rPr>
@@ -5634,7 +5634,7 @@
           <w:color w:val="333333"/>
           <w:sz w:val="24"/>
         </w:rPr>
-        <w:t>3. Joint check-in</w:t>
+        <w:t>Joint check-in</w:t>
       </w:r>
       <w:r>
         <w:rPr>
@@ -5659,7 +5659,7 @@
           <w:color w:val="333333"/>
           <w:sz w:val="24"/>
         </w:rPr>
-        <w:t>4. If the conflict continues:</w:t>
+        <w:t>If the conflict continues:</w:t>
       </w:r>
       <w:r>
         <w:rPr>
@@ -6179,7 +6179,7 @@
           <w:color w:val="333333"/>
           <w:sz w:val="24"/>
         </w:rPr>
-        <w:t>1. Send the EAP information</w:t>
+        <w:t>Send the EAP information</w:t>
       </w:r>
       <w:r>
         <w:rPr>
@@ -6204,7 +6204,7 @@
           <w:color w:val="333333"/>
           <w:sz w:val="24"/>
         </w:rPr>
-        <w:t>2. If you agreed to reduce workload:</w:t>
+        <w:t>If you agreed to reduce workload:</w:t>
       </w:r>
       <w:r>
         <w:rPr>
@@ -6229,7 +6229,7 @@
           <w:color w:val="333333"/>
           <w:sz w:val="24"/>
         </w:rPr>
-        <w:t>3. Check in again in one week.</w:t>
+        <w:t>Check in again in one week.</w:t>
       </w:r>
       <w:r>
         <w:rPr>
@@ -6254,7 +6254,7 @@
           <w:color w:val="333333"/>
           <w:sz w:val="24"/>
         </w:rPr>
-        <w:t>4. Watch for improvement or deterioration.</w:t>
+        <w:t>Watch for improvement or deterioration.</w:t>
       </w:r>
       <w:r>
         <w:rPr>
@@ -6279,7 +6279,7 @@
           <w:color w:val="333333"/>
           <w:sz w:val="24"/>
         </w:rPr>
-        <w:t>5. If you ever have any concern about self-harm or safety, involve HR immediately and follow your company's crisis escalation policy. You are not a therapist — your role is to notice, ask, provide resources, and escalate when needed.</w:t>
+        <w:t>If you ever have any concern about self-harm or safety, involve HR immediately and follow your company's crisis escalation policy. You are not a therapist — your role is to notice, ask, provide resources, and escalate when needed.</w:t>
       </w:r>
     </w:p>
     <w:p>
@@ -6294,7 +6294,7 @@
           <w:color w:val="333333"/>
           <w:sz w:val="24"/>
         </w:rPr>
-        <w:t>6. Protect their privacy.</w:t>
+        <w:t>Protect their privacy.</w:t>
       </w:r>
       <w:r>
         <w:rPr>
@@ -6758,7 +6758,7 @@
           <w:color w:val="333333"/>
           <w:sz w:val="24"/>
         </w:rPr>
-        <w:t>1. Send Tuesday through Thursday, morning their time.</w:t>
+        <w:t>Send Tuesday through Thursday, morning their time.</w:t>
       </w:r>
       <w:r>
         <w:rPr>
@@ -6783,7 +6783,7 @@
           <w:color w:val="333333"/>
           <w:sz w:val="24"/>
         </w:rPr>
-        <w:t>2. Do not follow up the same day.</w:t>
+        <w:t>Do not follow up the same day.</w:t>
       </w:r>
       <w:r>
         <w:rPr>
@@ -6808,7 +6808,7 @@
           <w:color w:val="333333"/>
           <w:sz w:val="24"/>
         </w:rPr>
-        <w:t>3. If they respond defensively</w:t>
+        <w:t>If they respond defensively</w:t>
       </w:r>
       <w:r>
         <w:rPr>
@@ -7323,7 +7323,7 @@
           <w:color w:val="333333"/>
           <w:sz w:val="24"/>
         </w:rPr>
-        <w:t>1. Send a brief written summary within 2 hours.</w:t>
+        <w:t>Send a brief written summary within 2 hours.</w:t>
       </w:r>
       <w:r>
         <w:rPr>
@@ -7348,7 +7348,7 @@
           <w:color w:val="333333"/>
           <w:sz w:val="24"/>
         </w:rPr>
-        <w:t>2. Check in within 48 hours</w:t>
+        <w:t>Check in within 48 hours</w:t>
       </w:r>
       <w:r>
         <w:rPr>
@@ -7678,7 +7678,7 @@
           <w:color w:val="333333"/>
           <w:sz w:val="24"/>
         </w:rPr>
-        <w:t>1. Schedule a live conversation</w:t>
+        <w:t>Schedule a live conversation</w:t>
       </w:r>
       <w:r>
         <w:rPr>
@@ -7703,7 +7703,7 @@
           <w:color w:val="333333"/>
           <w:sz w:val="24"/>
         </w:rPr>
-        <w:t>2. Open with:</w:t>
+        <w:t>Open with:</w:t>
       </w:r>
       <w:r>
         <w:rPr>
@@ -7728,7 +7728,7 @@
           <w:color w:val="333333"/>
           <w:sz w:val="24"/>
         </w:rPr>
-        <w:t>3. Never let written feedback be the final word.</w:t>
+        <w:t>Never let written feedback be the final word.</w:t>
       </w:r>
       <w:r>
         <w:rPr>
@@ -8065,7 +8065,7 @@
           <w:color w:val="333333"/>
           <w:sz w:val="24"/>
         </w:rPr>
-        <w:t>1. Actually change something.</w:t>
+        <w:t>Actually change something.</w:t>
       </w:r>
       <w:r>
         <w:rPr>
@@ -8090,7 +8090,7 @@
           <w:color w:val="333333"/>
           <w:sz w:val="24"/>
         </w:rPr>
-        <w:t>2. Make the next meeting noticeably different.</w:t>
+        <w:t>Make the next meeting noticeably different.</w:t>
       </w:r>
       <w:r>
         <w:rPr>
@@ -8115,7 +8115,7 @@
           <w:color w:val="333333"/>
           <w:sz w:val="24"/>
         </w:rPr>
-        <w:t>3. Acknowledge cameras-on when it happens naturally.</w:t>
+        <w:t>Acknowledge cameras-on when it happens naturally.</w:t>
       </w:r>
       <w:r>
         <w:rPr>
@@ -8140,7 +8140,7 @@
           <w:color w:val="333333"/>
           <w:sz w:val="24"/>
         </w:rPr>
-        <w:t>4. Do not track or report on camera usage.</w:t>
+        <w:t>Do not track or report on camera usage.</w:t>
       </w:r>
       <w:r>
         <w:rPr>

</xml_diff>

<commit_message>
Fix: replace List Number with Normal+indent - no more duplicate numbering
</commit_message>
<xml_diff>
--- a/kdp-files/difficult_conversations_ebook.docx
+++ b/kdp-files/difficult_conversations_ebook.docx
@@ -2151,7 +2151,7 @@
     </w:p>
     <w:p>
       <w:pPr>
-        <w:pStyle w:val="ListNumber"/>
+        <w:ind w:left="576" w:firstLine="0"/>
       </w:pPr>
       <w:r>
         <w:rPr>
@@ -2161,7 +2161,7 @@
           <w:color w:val="333333"/>
           <w:sz w:val="24"/>
         </w:rPr>
-        <w:t>State the observation</w:t>
+        <w:t>1. State the observation</w:t>
       </w:r>
       <w:r>
         <w:rPr>
@@ -2176,7 +2176,7 @@
     </w:p>
     <w:p>
       <w:pPr>
-        <w:pStyle w:val="ListNumber"/>
+        <w:ind w:left="576" w:firstLine="0"/>
       </w:pPr>
       <w:r>
         <w:rPr>
@@ -2186,7 +2186,7 @@
           <w:color w:val="333333"/>
           <w:sz w:val="24"/>
         </w:rPr>
-        <w:t>State the impact:</w:t>
+        <w:t>2. State the impact:</w:t>
       </w:r>
       <w:r>
         <w:rPr>
@@ -2201,7 +2201,7 @@
     </w:p>
     <w:p>
       <w:pPr>
-        <w:pStyle w:val="ListNumber"/>
+        <w:ind w:left="576" w:firstLine="0"/>
       </w:pPr>
       <w:r>
         <w:rPr>
@@ -2211,7 +2211,7 @@
           <w:color w:val="333333"/>
           <w:sz w:val="24"/>
         </w:rPr>
-        <w:t>State the expectation:</w:t>
+        <w:t>3. State the expectation:</w:t>
       </w:r>
       <w:r>
         <w:rPr>
@@ -2413,47 +2413,47 @@
     </w:p>
     <w:p>
       <w:pPr>
-        <w:pStyle w:val="ListNumber"/>
-      </w:pPr>
-      <w:r>
-        <w:rPr>
-          <w:rFonts w:ascii="Georgia" w:hAnsi="Georgia"/>
-          <w:b w:val="0"/>
-          <w:i w:val="0"/>
-          <w:color w:val="333333"/>
-          <w:sz w:val="24"/>
-        </w:rPr>
-        <w:t>A summary of what was agreed</w:t>
-      </w:r>
-    </w:p>
-    <w:p>
-      <w:pPr>
-        <w:pStyle w:val="ListNumber"/>
-      </w:pPr>
-      <w:r>
-        <w:rPr>
-          <w:rFonts w:ascii="Georgia" w:hAnsi="Georgia"/>
-          <w:b w:val="0"/>
-          <w:i w:val="0"/>
-          <w:color w:val="333333"/>
-          <w:sz w:val="24"/>
-        </w:rPr>
-        <w:t>A specific follow-up date</w:t>
-      </w:r>
-    </w:p>
-    <w:p>
-      <w:pPr>
-        <w:pStyle w:val="ListNumber"/>
-      </w:pPr>
-      <w:r>
-        <w:rPr>
-          <w:rFonts w:ascii="Georgia" w:hAnsi="Georgia"/>
-          <w:b w:val="0"/>
-          <w:i w:val="0"/>
-          <w:color w:val="333333"/>
-          <w:sz w:val="24"/>
-        </w:rPr>
-        <w:t>An expression of confidence: "I believe you can do this, and I'm here to support you."</w:t>
+        <w:ind w:left="576" w:firstLine="0"/>
+      </w:pPr>
+      <w:r>
+        <w:rPr>
+          <w:rFonts w:ascii="Georgia" w:hAnsi="Georgia"/>
+          <w:b w:val="0"/>
+          <w:i w:val="0"/>
+          <w:color w:val="333333"/>
+          <w:sz w:val="24"/>
+        </w:rPr>
+        <w:t>1. A summary of what was agreed</w:t>
+      </w:r>
+    </w:p>
+    <w:p>
+      <w:pPr>
+        <w:ind w:left="576" w:firstLine="0"/>
+      </w:pPr>
+      <w:r>
+        <w:rPr>
+          <w:rFonts w:ascii="Georgia" w:hAnsi="Georgia"/>
+          <w:b w:val="0"/>
+          <w:i w:val="0"/>
+          <w:color w:val="333333"/>
+          <w:sz w:val="24"/>
+        </w:rPr>
+        <w:t>2. A specific follow-up date</w:t>
+      </w:r>
+    </w:p>
+    <w:p>
+      <w:pPr>
+        <w:ind w:left="576" w:firstLine="0"/>
+      </w:pPr>
+      <w:r>
+        <w:rPr>
+          <w:rFonts w:ascii="Georgia" w:hAnsi="Georgia"/>
+          <w:b w:val="0"/>
+          <w:i w:val="0"/>
+          <w:color w:val="333333"/>
+          <w:sz w:val="24"/>
+        </w:rPr>
+        <w:t>3. An expression of confidence: "I believe you can do this, and I'm here to support you."</w:t>
       </w:r>
     </w:p>
     <w:p>
@@ -2852,7 +2852,7 @@
     </w:p>
     <w:p>
       <w:pPr>
-        <w:pStyle w:val="ListNumber"/>
+        <w:ind w:left="576" w:firstLine="0"/>
       </w:pPr>
       <w:r>
         <w:rPr>
@@ -2862,7 +2862,7 @@
           <w:color w:val="333333"/>
           <w:sz w:val="24"/>
         </w:rPr>
-        <w:t>Within 24 hours:</w:t>
+        <w:t>1. Within 24 hours:</w:t>
       </w:r>
       <w:r>
         <w:rPr>
@@ -2877,7 +2877,7 @@
     </w:p>
     <w:p>
       <w:pPr>
-        <w:pStyle w:val="ListNumber"/>
+        <w:ind w:left="576" w:firstLine="0"/>
       </w:pPr>
       <w:r>
         <w:rPr>
@@ -2887,7 +2887,7 @@
           <w:color w:val="333333"/>
           <w:sz w:val="24"/>
         </w:rPr>
-        <w:t>Weekly check-ins:</w:t>
+        <w:t>2. Weekly check-ins:</w:t>
       </w:r>
       <w:r>
         <w:rPr>
@@ -2902,7 +2902,7 @@
     </w:p>
     <w:p>
       <w:pPr>
-        <w:pStyle w:val="ListNumber"/>
+        <w:ind w:left="576" w:firstLine="0"/>
       </w:pPr>
       <w:r>
         <w:rPr>
@@ -2912,7 +2912,7 @@
           <w:color w:val="333333"/>
           <w:sz w:val="24"/>
         </w:rPr>
-        <w:t>30-day review:</w:t>
+        <w:t>3. 30-day review:</w:t>
       </w:r>
       <w:r>
         <w:rPr>
@@ -2927,7 +2927,7 @@
     </w:p>
     <w:p>
       <w:pPr>
-        <w:pStyle w:val="ListNumber"/>
+        <w:ind w:left="576" w:firstLine="0"/>
       </w:pPr>
       <w:r>
         <w:rPr>
@@ -2937,7 +2937,7 @@
           <w:color w:val="333333"/>
           <w:sz w:val="24"/>
         </w:rPr>
-        <w:t>Document everything:</w:t>
+        <w:t>4. Document everything:</w:t>
       </w:r>
       <w:r>
         <w:rPr>
@@ -3317,7 +3317,7 @@
     </w:p>
     <w:p>
       <w:pPr>
-        <w:pStyle w:val="ListNumber"/>
+        <w:ind w:left="576" w:firstLine="0"/>
       </w:pPr>
       <w:r>
         <w:rPr>
@@ -3327,7 +3327,7 @@
           <w:color w:val="333333"/>
           <w:sz w:val="24"/>
         </w:rPr>
-        <w:t>Same day or next morning:</w:t>
+        <w:t>1. Same day or next morning:</w:t>
       </w:r>
       <w:r>
         <w:rPr>
@@ -3342,7 +3342,7 @@
     </w:p>
     <w:p>
       <w:pPr>
-        <w:pStyle w:val="ListNumber"/>
+        <w:ind w:left="576" w:firstLine="0"/>
       </w:pPr>
       <w:r>
         <w:rPr>
@@ -3352,7 +3352,7 @@
           <w:color w:val="333333"/>
           <w:sz w:val="24"/>
         </w:rPr>
-        <w:t>Before the next similar event:</w:t>
+        <w:t>2. Before the next similar event:</w:t>
       </w:r>
       <w:r>
         <w:rPr>
@@ -3367,7 +3367,7 @@
     </w:p>
     <w:p>
       <w:pPr>
-        <w:pStyle w:val="ListNumber"/>
+        <w:ind w:left="576" w:firstLine="0"/>
       </w:pPr>
       <w:r>
         <w:rPr>
@@ -3377,7 +3377,7 @@
           <w:color w:val="333333"/>
           <w:sz w:val="24"/>
         </w:rPr>
-        <w:t>After the next similar event:</w:t>
+        <w:t>3. After the next similar event:</w:t>
       </w:r>
       <w:r>
         <w:rPr>
@@ -3891,7 +3891,7 @@
     </w:p>
     <w:p>
       <w:pPr>
-        <w:pStyle w:val="ListNumber"/>
+        <w:ind w:left="576" w:firstLine="0"/>
       </w:pPr>
       <w:r>
         <w:rPr>
@@ -3901,7 +3901,7 @@
           <w:color w:val="333333"/>
           <w:sz w:val="24"/>
         </w:rPr>
-        <w:t>If there's a personal issue:</w:t>
+        <w:t>1. If there's a personal issue:</w:t>
       </w:r>
       <w:r>
         <w:rPr>
@@ -3916,7 +3916,7 @@
     </w:p>
     <w:p>
       <w:pPr>
-        <w:pStyle w:val="ListNumber"/>
+        <w:ind w:left="576" w:firstLine="0"/>
       </w:pPr>
       <w:r>
         <w:rPr>
@@ -3926,7 +3926,7 @@
           <w:color w:val="333333"/>
           <w:sz w:val="24"/>
         </w:rPr>
-        <w:t>If it's a behavioral pattern without clear cause:</w:t>
+        <w:t>2. If it's a behavioral pattern without clear cause:</w:t>
       </w:r>
       <w:r>
         <w:rPr>
@@ -3941,7 +3941,7 @@
     </w:p>
     <w:p>
       <w:pPr>
-        <w:pStyle w:val="ListNumber"/>
+        <w:ind w:left="576" w:firstLine="0"/>
       </w:pPr>
       <w:r>
         <w:rPr>
@@ -3951,7 +3951,7 @@
           <w:color w:val="333333"/>
           <w:sz w:val="24"/>
         </w:rPr>
-        <w:t>Two-week check-in:</w:t>
+        <w:t>3. Two-week check-in:</w:t>
       </w:r>
       <w:r>
         <w:rPr>
@@ -3966,7 +3966,7 @@
     </w:p>
     <w:p>
       <w:pPr>
-        <w:pStyle w:val="ListNumber"/>
+        <w:ind w:left="576" w:firstLine="0"/>
       </w:pPr>
       <w:r>
         <w:rPr>
@@ -3976,7 +3976,7 @@
           <w:color w:val="333333"/>
           <w:sz w:val="24"/>
         </w:rPr>
-        <w:t>If the pattern continues:</w:t>
+        <w:t>4. If the pattern continues:</w:t>
       </w:r>
       <w:r>
         <w:rPr>
@@ -4431,7 +4431,7 @@
     </w:p>
     <w:p>
       <w:pPr>
-        <w:pStyle w:val="ListNumber"/>
+        <w:ind w:left="576" w:firstLine="0"/>
       </w:pPr>
       <w:r>
         <w:rPr>
@@ -4441,7 +4441,7 @@
           <w:color w:val="333333"/>
           <w:sz w:val="24"/>
         </w:rPr>
-        <w:t>Within one week:</w:t>
+        <w:t>1. Within one week:</w:t>
       </w:r>
       <w:r>
         <w:rPr>
@@ -4456,7 +4456,7 @@
     </w:p>
     <w:p>
       <w:pPr>
-        <w:pStyle w:val="ListNumber"/>
+        <w:ind w:left="576" w:firstLine="0"/>
       </w:pPr>
       <w:r>
         <w:rPr>
@@ -4466,7 +4466,7 @@
           <w:color w:val="333333"/>
           <w:sz w:val="24"/>
         </w:rPr>
-        <w:t>Monthly touchpoints:</w:t>
+        <w:t>2. Monthly touchpoints:</w:t>
       </w:r>
       <w:r>
         <w:rPr>
@@ -4481,7 +4481,7 @@
     </w:p>
     <w:p>
       <w:pPr>
-        <w:pStyle w:val="ListNumber"/>
+        <w:ind w:left="576" w:firstLine="0"/>
       </w:pPr>
       <w:r>
         <w:rPr>
@@ -4491,7 +4491,7 @@
           <w:color w:val="333333"/>
           <w:sz w:val="24"/>
         </w:rPr>
-        <w:t>At the six-month mark:</w:t>
+        <w:t>3. At the six-month mark:</w:t>
       </w:r>
       <w:r>
         <w:rPr>
@@ -4506,7 +4506,7 @@
     </w:p>
     <w:p>
       <w:pPr>
-        <w:pStyle w:val="ListNumber"/>
+        <w:ind w:left="576" w:firstLine="0"/>
       </w:pPr>
       <w:r>
         <w:rPr>
@@ -4516,7 +4516,7 @@
           <w:color w:val="333333"/>
           <w:sz w:val="24"/>
         </w:rPr>
-        <w:t>Watch for disengagement:</w:t>
+        <w:t>4. Watch for disengagement:</w:t>
       </w:r>
       <w:r>
         <w:rPr>
@@ -4982,7 +4982,7 @@
     </w:p>
     <w:p>
       <w:pPr>
-        <w:pStyle w:val="ListNumber"/>
+        <w:ind w:left="576" w:firstLine="0"/>
       </w:pPr>
       <w:r>
         <w:rPr>
@@ -4992,7 +4992,7 @@
           <w:color w:val="333333"/>
           <w:sz w:val="24"/>
         </w:rPr>
-        <w:t>In the meeting:</w:t>
+        <w:t>1. In the meeting:</w:t>
       </w:r>
       <w:r>
         <w:rPr>
@@ -5007,7 +5007,7 @@
     </w:p>
     <w:p>
       <w:pPr>
-        <w:pStyle w:val="ListNumber"/>
+        <w:ind w:left="576" w:firstLine="0"/>
       </w:pPr>
       <w:r>
         <w:rPr>
@@ -5017,7 +5017,7 @@
           <w:color w:val="333333"/>
           <w:sz w:val="24"/>
         </w:rPr>
-        <w:t>Team communication:</w:t>
+        <w:t>2. Team communication:</w:t>
       </w:r>
       <w:r>
         <w:rPr>
@@ -5032,7 +5032,7 @@
     </w:p>
     <w:p>
       <w:pPr>
-        <w:pStyle w:val="ListNumber"/>
+        <w:ind w:left="576" w:firstLine="0"/>
       </w:pPr>
       <w:r>
         <w:rPr>
@@ -5042,7 +5042,7 @@
           <w:color w:val="333333"/>
           <w:sz w:val="24"/>
         </w:rPr>
-        <w:t>Team morale:</w:t>
+        <w:t>3. Team morale:</w:t>
       </w:r>
       <w:r>
         <w:rPr>
@@ -5077,7 +5077,7 @@
     </w:p>
     <w:p>
       <w:pPr>
-        <w:pStyle w:val="ListNumber"/>
+        <w:ind w:left="576" w:firstLine="0"/>
       </w:pPr>
       <w:r>
         <w:rPr>
@@ -5087,7 +5087,7 @@
           <w:color w:val="333333"/>
           <w:sz w:val="24"/>
         </w:rPr>
-        <w:t>Your own processing:</w:t>
+        <w:t>4. Your own processing:</w:t>
       </w:r>
       <w:r>
         <w:rPr>
@@ -5574,7 +5574,7 @@
     </w:p>
     <w:p>
       <w:pPr>
-        <w:pStyle w:val="ListNumber"/>
+        <w:ind w:left="576" w:firstLine="0"/>
       </w:pPr>
       <w:r>
         <w:rPr>
@@ -5584,7 +5584,7 @@
           <w:color w:val="333333"/>
           <w:sz w:val="24"/>
         </w:rPr>
-        <w:t>Write down the agreed changes.</w:t>
+        <w:t>1. Write down the agreed changes.</w:t>
       </w:r>
       <w:r>
         <w:rPr>
@@ -5599,7 +5599,7 @@
     </w:p>
     <w:p>
       <w:pPr>
-        <w:pStyle w:val="ListNumber"/>
+        <w:ind w:left="576" w:firstLine="0"/>
       </w:pPr>
       <w:r>
         <w:rPr>
@@ -5609,7 +5609,7 @@
           <w:color w:val="333333"/>
           <w:sz w:val="24"/>
         </w:rPr>
-        <w:t>One-on-one check-ins</w:t>
+        <w:t>2. One-on-one check-ins</w:t>
       </w:r>
       <w:r>
         <w:rPr>
@@ -5624,7 +5624,7 @@
     </w:p>
     <w:p>
       <w:pPr>
-        <w:pStyle w:val="ListNumber"/>
+        <w:ind w:left="576" w:firstLine="0"/>
       </w:pPr>
       <w:r>
         <w:rPr>
@@ -5634,7 +5634,7 @@
           <w:color w:val="333333"/>
           <w:sz w:val="24"/>
         </w:rPr>
-        <w:t>Joint check-in</w:t>
+        <w:t>3. Joint check-in</w:t>
       </w:r>
       <w:r>
         <w:rPr>
@@ -5649,7 +5649,7 @@
     </w:p>
     <w:p>
       <w:pPr>
-        <w:pStyle w:val="ListNumber"/>
+        <w:ind w:left="576" w:firstLine="0"/>
       </w:pPr>
       <w:r>
         <w:rPr>
@@ -5659,7 +5659,7 @@
           <w:color w:val="333333"/>
           <w:sz w:val="24"/>
         </w:rPr>
-        <w:t>If the conflict continues:</w:t>
+        <w:t>4. If the conflict continues:</w:t>
       </w:r>
       <w:r>
         <w:rPr>
@@ -6169,7 +6169,7 @@
     </w:p>
     <w:p>
       <w:pPr>
-        <w:pStyle w:val="ListNumber"/>
+        <w:ind w:left="576" w:firstLine="0"/>
       </w:pPr>
       <w:r>
         <w:rPr>
@@ -6179,7 +6179,7 @@
           <w:color w:val="333333"/>
           <w:sz w:val="24"/>
         </w:rPr>
-        <w:t>Send the EAP information</w:t>
+        <w:t>1. Send the EAP information</w:t>
       </w:r>
       <w:r>
         <w:rPr>
@@ -6194,7 +6194,7 @@
     </w:p>
     <w:p>
       <w:pPr>
-        <w:pStyle w:val="ListNumber"/>
+        <w:ind w:left="576" w:firstLine="0"/>
       </w:pPr>
       <w:r>
         <w:rPr>
@@ -6204,7 +6204,7 @@
           <w:color w:val="333333"/>
           <w:sz w:val="24"/>
         </w:rPr>
-        <w:t>If you agreed to reduce workload:</w:t>
+        <w:t>2. If you agreed to reduce workload:</w:t>
       </w:r>
       <w:r>
         <w:rPr>
@@ -6219,7 +6219,7 @@
     </w:p>
     <w:p>
       <w:pPr>
-        <w:pStyle w:val="ListNumber"/>
+        <w:ind w:left="576" w:firstLine="0"/>
       </w:pPr>
       <w:r>
         <w:rPr>
@@ -6229,7 +6229,7 @@
           <w:color w:val="333333"/>
           <w:sz w:val="24"/>
         </w:rPr>
-        <w:t>Check in again in one week.</w:t>
+        <w:t>3. Check in again in one week.</w:t>
       </w:r>
       <w:r>
         <w:rPr>
@@ -6244,7 +6244,7 @@
     </w:p>
     <w:p>
       <w:pPr>
-        <w:pStyle w:val="ListNumber"/>
+        <w:ind w:left="576" w:firstLine="0"/>
       </w:pPr>
       <w:r>
         <w:rPr>
@@ -6254,7 +6254,7 @@
           <w:color w:val="333333"/>
           <w:sz w:val="24"/>
         </w:rPr>
-        <w:t>Watch for improvement or deterioration.</w:t>
+        <w:t>4. Watch for improvement or deterioration.</w:t>
       </w:r>
       <w:r>
         <w:rPr>
@@ -6269,7 +6269,7 @@
     </w:p>
     <w:p>
       <w:pPr>
-        <w:pStyle w:val="ListNumber"/>
+        <w:ind w:left="576" w:firstLine="0"/>
       </w:pPr>
       <w:r>
         <w:rPr>
@@ -6279,12 +6279,12 @@
           <w:color w:val="333333"/>
           <w:sz w:val="24"/>
         </w:rPr>
-        <w:t>If you ever have any concern about self-harm or safety, involve HR immediately and follow your company's crisis escalation policy. You are not a therapist — your role is to notice, ask, provide resources, and escalate when needed.</w:t>
-      </w:r>
-    </w:p>
-    <w:p>
-      <w:pPr>
-        <w:pStyle w:val="ListNumber"/>
+        <w:t>5. If you ever have any concern about self-harm or safety, involve HR immediately and follow your company's crisis escalation policy. You are not a therapist — your role is to notice, ask, provide resources, and escalate when needed.</w:t>
+      </w:r>
+    </w:p>
+    <w:p>
+      <w:pPr>
+        <w:ind w:left="576" w:firstLine="0"/>
       </w:pPr>
       <w:r>
         <w:rPr>
@@ -6294,7 +6294,7 @@
           <w:color w:val="333333"/>
           <w:sz w:val="24"/>
         </w:rPr>
-        <w:t>Protect their privacy.</w:t>
+        <w:t>6. Protect their privacy.</w:t>
       </w:r>
       <w:r>
         <w:rPr>
@@ -6748,7 +6748,7 @@
     </w:p>
     <w:p>
       <w:pPr>
-        <w:pStyle w:val="ListNumber"/>
+        <w:ind w:left="576" w:firstLine="0"/>
       </w:pPr>
       <w:r>
         <w:rPr>
@@ -6758,7 +6758,7 @@
           <w:color w:val="333333"/>
           <w:sz w:val="24"/>
         </w:rPr>
-        <w:t>Send Tuesday through Thursday, morning their time.</w:t>
+        <w:t>1. Send Tuesday through Thursday, morning their time.</w:t>
       </w:r>
       <w:r>
         <w:rPr>
@@ -6773,7 +6773,7 @@
     </w:p>
     <w:p>
       <w:pPr>
-        <w:pStyle w:val="ListNumber"/>
+        <w:ind w:left="576" w:firstLine="0"/>
       </w:pPr>
       <w:r>
         <w:rPr>
@@ -6783,7 +6783,7 @@
           <w:color w:val="333333"/>
           <w:sz w:val="24"/>
         </w:rPr>
-        <w:t>Do not follow up the same day.</w:t>
+        <w:t>2. Do not follow up the same day.</w:t>
       </w:r>
       <w:r>
         <w:rPr>
@@ -6798,7 +6798,7 @@
     </w:p>
     <w:p>
       <w:pPr>
-        <w:pStyle w:val="ListNumber"/>
+        <w:ind w:left="576" w:firstLine="0"/>
       </w:pPr>
       <w:r>
         <w:rPr>
@@ -6808,7 +6808,7 @@
           <w:color w:val="333333"/>
           <w:sz w:val="24"/>
         </w:rPr>
-        <w:t>If they respond defensively</w:t>
+        <w:t>3. If they respond defensively</w:t>
       </w:r>
       <w:r>
         <w:rPr>
@@ -7313,7 +7313,7 @@
     </w:p>
     <w:p>
       <w:pPr>
-        <w:pStyle w:val="ListNumber"/>
+        <w:ind w:left="576" w:firstLine="0"/>
       </w:pPr>
       <w:r>
         <w:rPr>
@@ -7323,7 +7323,7 @@
           <w:color w:val="333333"/>
           <w:sz w:val="24"/>
         </w:rPr>
-        <w:t>Send a brief written summary within 2 hours.</w:t>
+        <w:t>1. Send a brief written summary within 2 hours.</w:t>
       </w:r>
       <w:r>
         <w:rPr>
@@ -7338,7 +7338,7 @@
     </w:p>
     <w:p>
       <w:pPr>
-        <w:pStyle w:val="ListNumber"/>
+        <w:ind w:left="576" w:firstLine="0"/>
       </w:pPr>
       <w:r>
         <w:rPr>
@@ -7348,7 +7348,7 @@
           <w:color w:val="333333"/>
           <w:sz w:val="24"/>
         </w:rPr>
-        <w:t>Check in within 48 hours</w:t>
+        <w:t>2. Check in within 48 hours</w:t>
       </w:r>
       <w:r>
         <w:rPr>
@@ -7668,7 +7668,7 @@
     </w:p>
     <w:p>
       <w:pPr>
-        <w:pStyle w:val="ListNumber"/>
+        <w:ind w:left="576" w:firstLine="0"/>
       </w:pPr>
       <w:r>
         <w:rPr>
@@ -7678,7 +7678,7 @@
           <w:color w:val="333333"/>
           <w:sz w:val="24"/>
         </w:rPr>
-        <w:t>Schedule a live conversation</w:t>
+        <w:t>1. Schedule a live conversation</w:t>
       </w:r>
       <w:r>
         <w:rPr>
@@ -7693,7 +7693,7 @@
     </w:p>
     <w:p>
       <w:pPr>
-        <w:pStyle w:val="ListNumber"/>
+        <w:ind w:left="576" w:firstLine="0"/>
       </w:pPr>
       <w:r>
         <w:rPr>
@@ -7703,7 +7703,7 @@
           <w:color w:val="333333"/>
           <w:sz w:val="24"/>
         </w:rPr>
-        <w:t>Open with:</w:t>
+        <w:t>2. Open with:</w:t>
       </w:r>
       <w:r>
         <w:rPr>
@@ -7718,7 +7718,7 @@
     </w:p>
     <w:p>
       <w:pPr>
-        <w:pStyle w:val="ListNumber"/>
+        <w:ind w:left="576" w:firstLine="0"/>
       </w:pPr>
       <w:r>
         <w:rPr>
@@ -7728,7 +7728,7 @@
           <w:color w:val="333333"/>
           <w:sz w:val="24"/>
         </w:rPr>
-        <w:t>Never let written feedback be the final word.</w:t>
+        <w:t>3. Never let written feedback be the final word.</w:t>
       </w:r>
       <w:r>
         <w:rPr>
@@ -8055,7 +8055,7 @@
     </w:p>
     <w:p>
       <w:pPr>
-        <w:pStyle w:val="ListNumber"/>
+        <w:ind w:left="576" w:firstLine="0"/>
       </w:pPr>
       <w:r>
         <w:rPr>
@@ -8065,7 +8065,7 @@
           <w:color w:val="333333"/>
           <w:sz w:val="24"/>
         </w:rPr>
-        <w:t>Actually change something.</w:t>
+        <w:t>1. Actually change something.</w:t>
       </w:r>
       <w:r>
         <w:rPr>
@@ -8080,7 +8080,7 @@
     </w:p>
     <w:p>
       <w:pPr>
-        <w:pStyle w:val="ListNumber"/>
+        <w:ind w:left="576" w:firstLine="0"/>
       </w:pPr>
       <w:r>
         <w:rPr>
@@ -8090,7 +8090,7 @@
           <w:color w:val="333333"/>
           <w:sz w:val="24"/>
         </w:rPr>
-        <w:t>Make the next meeting noticeably different.</w:t>
+        <w:t>2. Make the next meeting noticeably different.</w:t>
       </w:r>
       <w:r>
         <w:rPr>
@@ -8105,7 +8105,7 @@
     </w:p>
     <w:p>
       <w:pPr>
-        <w:pStyle w:val="ListNumber"/>
+        <w:ind w:left="576" w:firstLine="0"/>
       </w:pPr>
       <w:r>
         <w:rPr>
@@ -8115,7 +8115,7 @@
           <w:color w:val="333333"/>
           <w:sz w:val="24"/>
         </w:rPr>
-        <w:t>Acknowledge cameras-on when it happens naturally.</w:t>
+        <w:t>3. Acknowledge cameras-on when it happens naturally.</w:t>
       </w:r>
       <w:r>
         <w:rPr>
@@ -8130,7 +8130,7 @@
     </w:p>
     <w:p>
       <w:pPr>
-        <w:pStyle w:val="ListNumber"/>
+        <w:ind w:left="576" w:firstLine="0"/>
       </w:pPr>
       <w:r>
         <w:rPr>
@@ -8140,7 +8140,7 @@
           <w:color w:val="333333"/>
           <w:sz w:val="24"/>
         </w:rPr>
-        <w:t>Do not track or report on camera usage.</w:t>
+        <w:t>4. Do not track or report on camera usage.</w:t>
       </w:r>
       <w:r>
         <w:rPr>

</xml_diff>

<commit_message>
Fix: remove bullet markers from ❌ What NOT to Say items
</commit_message>
<xml_diff>
--- a/kdp-files/difficult_conversations_ebook.docx
+++ b/kdp-files/difficult_conversations_ebook.docx
@@ -2712,7 +2712,7 @@
     </w:p>
     <w:p>
       <w:pPr>
-        <w:pStyle w:val="ListBullet"/>
+        <w:ind w:left="576" w:firstLine="0"/>
       </w:pPr>
       <w:r>
         <w:rPr>
@@ -2727,7 +2727,7 @@
     </w:p>
     <w:p>
       <w:pPr>
-        <w:pStyle w:val="ListBullet"/>
+        <w:ind w:left="576" w:firstLine="0"/>
       </w:pPr>
       <w:r>
         <w:rPr>
@@ -2742,7 +2742,7 @@
     </w:p>
     <w:p>
       <w:pPr>
-        <w:pStyle w:val="ListBullet"/>
+        <w:ind w:left="576" w:firstLine="0"/>
       </w:pPr>
       <w:r>
         <w:rPr>
@@ -2757,7 +2757,7 @@
     </w:p>
     <w:p>
       <w:pPr>
-        <w:pStyle w:val="ListBullet"/>
+        <w:ind w:left="576" w:firstLine="0"/>
       </w:pPr>
       <w:r>
         <w:rPr>
@@ -2772,7 +2772,7 @@
     </w:p>
     <w:p>
       <w:pPr>
-        <w:pStyle w:val="ListBullet"/>
+        <w:ind w:left="576" w:firstLine="0"/>
       </w:pPr>
       <w:r>
         <w:rPr>
@@ -3147,7 +3147,7 @@
     </w:p>
     <w:p>
       <w:pPr>
-        <w:pStyle w:val="ListBullet"/>
+        <w:ind w:left="576" w:firstLine="0"/>
       </w:pPr>
       <w:r>
         <w:rPr>
@@ -3162,7 +3162,7 @@
     </w:p>
     <w:p>
       <w:pPr>
-        <w:pStyle w:val="ListBullet"/>
+        <w:ind w:left="576" w:firstLine="0"/>
       </w:pPr>
       <w:r>
         <w:rPr>
@@ -3177,7 +3177,7 @@
     </w:p>
     <w:p>
       <w:pPr>
-        <w:pStyle w:val="ListBullet"/>
+        <w:ind w:left="576" w:firstLine="0"/>
       </w:pPr>
       <w:r>
         <w:rPr>
@@ -3192,7 +3192,7 @@
     </w:p>
     <w:p>
       <w:pPr>
-        <w:pStyle w:val="ListBullet"/>
+        <w:ind w:left="576" w:firstLine="0"/>
       </w:pPr>
       <w:r>
         <w:rPr>
@@ -3207,7 +3207,7 @@
     </w:p>
     <w:p>
       <w:pPr>
-        <w:pStyle w:val="ListBullet"/>
+        <w:ind w:left="576" w:firstLine="0"/>
       </w:pPr>
       <w:r>
         <w:rPr>
@@ -3688,7 +3688,7 @@
     </w:p>
     <w:p>
       <w:pPr>
-        <w:pStyle w:val="ListBullet"/>
+        <w:ind w:left="576" w:firstLine="0"/>
       </w:pPr>
       <w:r>
         <w:rPr>
@@ -3703,7 +3703,7 @@
     </w:p>
     <w:p>
       <w:pPr>
-        <w:pStyle w:val="ListBullet"/>
+        <w:ind w:left="576" w:firstLine="0"/>
       </w:pPr>
       <w:r>
         <w:rPr>
@@ -3718,7 +3718,7 @@
     </w:p>
     <w:p>
       <w:pPr>
-        <w:pStyle w:val="ListBullet"/>
+        <w:ind w:left="576" w:firstLine="0"/>
       </w:pPr>
       <w:r>
         <w:rPr>
@@ -3733,7 +3733,7 @@
     </w:p>
     <w:p>
       <w:pPr>
-        <w:pStyle w:val="ListBullet"/>
+        <w:ind w:left="576" w:firstLine="0"/>
       </w:pPr>
       <w:r>
         <w:rPr>
@@ -3748,7 +3748,7 @@
     </w:p>
     <w:p>
       <w:pPr>
-        <w:pStyle w:val="ListBullet"/>
+        <w:ind w:left="576" w:firstLine="0"/>
       </w:pPr>
       <w:r>
         <w:rPr>
@@ -4186,7 +4186,7 @@
     </w:p>
     <w:p>
       <w:pPr>
-        <w:pStyle w:val="ListBullet"/>
+        <w:ind w:left="576" w:firstLine="0"/>
       </w:pPr>
       <w:r>
         <w:rPr>
@@ -4201,7 +4201,7 @@
     </w:p>
     <w:p>
       <w:pPr>
-        <w:pStyle w:val="ListBullet"/>
+        <w:ind w:left="576" w:firstLine="0"/>
       </w:pPr>
       <w:r>
         <w:rPr>
@@ -4216,7 +4216,7 @@
     </w:p>
     <w:p>
       <w:pPr>
-        <w:pStyle w:val="ListBullet"/>
+        <w:ind w:left="576" w:firstLine="0"/>
       </w:pPr>
       <w:r>
         <w:rPr>
@@ -4231,7 +4231,7 @@
     </w:p>
     <w:p>
       <w:pPr>
-        <w:pStyle w:val="ListBullet"/>
+        <w:ind w:left="576" w:firstLine="0"/>
       </w:pPr>
       <w:r>
         <w:rPr>
@@ -4246,7 +4246,7 @@
     </w:p>
     <w:p>
       <w:pPr>
-        <w:pStyle w:val="ListBullet"/>
+        <w:ind w:left="576" w:firstLine="0"/>
       </w:pPr>
       <w:r>
         <w:rPr>
@@ -4261,7 +4261,7 @@
     </w:p>
     <w:p>
       <w:pPr>
-        <w:pStyle w:val="ListBullet"/>
+        <w:ind w:left="576" w:firstLine="0"/>
       </w:pPr>
       <w:r>
         <w:rPr>
@@ -4762,7 +4762,7 @@
     </w:p>
     <w:p>
       <w:pPr>
-        <w:pStyle w:val="ListBullet"/>
+        <w:ind w:left="576" w:firstLine="0"/>
       </w:pPr>
       <w:r>
         <w:rPr>
@@ -4777,7 +4777,7 @@
     </w:p>
     <w:p>
       <w:pPr>
-        <w:pStyle w:val="ListBullet"/>
+        <w:ind w:left="576" w:firstLine="0"/>
       </w:pPr>
       <w:r>
         <w:rPr>
@@ -4792,7 +4792,7 @@
     </w:p>
     <w:p>
       <w:pPr>
-        <w:pStyle w:val="ListBullet"/>
+        <w:ind w:left="576" w:firstLine="0"/>
       </w:pPr>
       <w:r>
         <w:rPr>
@@ -4807,7 +4807,7 @@
     </w:p>
     <w:p>
       <w:pPr>
-        <w:pStyle w:val="ListBullet"/>
+        <w:ind w:left="576" w:firstLine="0"/>
       </w:pPr>
       <w:r>
         <w:rPr>
@@ -4822,7 +4822,7 @@
     </w:p>
     <w:p>
       <w:pPr>
-        <w:pStyle w:val="ListBullet"/>
+        <w:ind w:left="576" w:firstLine="0"/>
       </w:pPr>
       <w:r>
         <w:rPr>
@@ -4837,7 +4837,7 @@
     </w:p>
     <w:p>
       <w:pPr>
-        <w:pStyle w:val="ListBullet"/>
+        <w:ind w:left="576" w:firstLine="0"/>
       </w:pPr>
       <w:r>
         <w:rPr>
@@ -5364,7 +5364,7 @@
     </w:p>
     <w:p>
       <w:pPr>
-        <w:pStyle w:val="ListBullet"/>
+        <w:ind w:left="576" w:firstLine="0"/>
       </w:pPr>
       <w:r>
         <w:rPr>
@@ -5379,7 +5379,7 @@
     </w:p>
     <w:p>
       <w:pPr>
-        <w:pStyle w:val="ListBullet"/>
+        <w:ind w:left="576" w:firstLine="0"/>
       </w:pPr>
       <w:r>
         <w:rPr>
@@ -5394,7 +5394,7 @@
     </w:p>
     <w:p>
       <w:pPr>
-        <w:pStyle w:val="ListBullet"/>
+        <w:ind w:left="576" w:firstLine="0"/>
       </w:pPr>
       <w:r>
         <w:rPr>
@@ -5409,7 +5409,7 @@
     </w:p>
     <w:p>
       <w:pPr>
-        <w:pStyle w:val="ListBullet"/>
+        <w:ind w:left="576" w:firstLine="0"/>
       </w:pPr>
       <w:r>
         <w:rPr>
@@ -5424,7 +5424,7 @@
     </w:p>
     <w:p>
       <w:pPr>
-        <w:pStyle w:val="ListBullet"/>
+        <w:ind w:left="576" w:firstLine="0"/>
       </w:pPr>
       <w:r>
         <w:rPr>
@@ -5944,7 +5944,7 @@
     </w:p>
     <w:p>
       <w:pPr>
-        <w:pStyle w:val="ListBullet"/>
+        <w:ind w:left="576" w:firstLine="0"/>
       </w:pPr>
       <w:r>
         <w:rPr>
@@ -5959,7 +5959,7 @@
     </w:p>
     <w:p>
       <w:pPr>
-        <w:pStyle w:val="ListBullet"/>
+        <w:ind w:left="576" w:firstLine="0"/>
       </w:pPr>
       <w:r>
         <w:rPr>
@@ -5974,7 +5974,7 @@
     </w:p>
     <w:p>
       <w:pPr>
-        <w:pStyle w:val="ListBullet"/>
+        <w:ind w:left="576" w:firstLine="0"/>
       </w:pPr>
       <w:r>
         <w:rPr>
@@ -5989,7 +5989,7 @@
     </w:p>
     <w:p>
       <w:pPr>
-        <w:pStyle w:val="ListBullet"/>
+        <w:ind w:left="576" w:firstLine="0"/>
       </w:pPr>
       <w:r>
         <w:rPr>
@@ -6004,7 +6004,7 @@
     </w:p>
     <w:p>
       <w:pPr>
-        <w:pStyle w:val="ListBullet"/>
+        <w:ind w:left="576" w:firstLine="0"/>
       </w:pPr>
       <w:r>
         <w:rPr>
@@ -6019,7 +6019,7 @@
     </w:p>
     <w:p>
       <w:pPr>
-        <w:pStyle w:val="ListBullet"/>
+        <w:ind w:left="576" w:firstLine="0"/>
       </w:pPr>
       <w:r>
         <w:rPr>

</xml_diff>

<commit_message>
Fix: clean bullet XML from ❌ items, reduce indents for numbered/quotes
</commit_message>
<xml_diff>
--- a/kdp-files/difficult_conversations_ebook.docx
+++ b/kdp-files/difficult_conversations_ebook.docx
@@ -2151,7 +2151,7 @@
     </w:p>
     <w:p>
       <w:pPr>
-        <w:ind w:left="576" w:firstLine="0"/>
+        <w:ind w:left="288" w:firstLine="0"/>
       </w:pPr>
       <w:r>
         <w:rPr>
@@ -2176,7 +2176,7 @@
     </w:p>
     <w:p>
       <w:pPr>
-        <w:ind w:left="576" w:firstLine="0"/>
+        <w:ind w:left="288" w:firstLine="0"/>
       </w:pPr>
       <w:r>
         <w:rPr>
@@ -2201,7 +2201,7 @@
     </w:p>
     <w:p>
       <w:pPr>
-        <w:ind w:left="576" w:firstLine="0"/>
+        <w:ind w:left="288" w:firstLine="0"/>
       </w:pPr>
       <w:r>
         <w:rPr>
@@ -2413,7 +2413,7 @@
     </w:p>
     <w:p>
       <w:pPr>
-        <w:ind w:left="576" w:firstLine="0"/>
+        <w:ind w:left="288" w:firstLine="0"/>
       </w:pPr>
       <w:r>
         <w:rPr>
@@ -2428,7 +2428,7 @@
     </w:p>
     <w:p>
       <w:pPr>
-        <w:ind w:left="576" w:firstLine="0"/>
+        <w:ind w:left="288" w:firstLine="0"/>
       </w:pPr>
       <w:r>
         <w:rPr>
@@ -2443,7 +2443,7 @@
     </w:p>
     <w:p>
       <w:pPr>
-        <w:ind w:left="576" w:firstLine="0"/>
+        <w:ind w:left="288" w:firstLine="0"/>
       </w:pPr>
       <w:r>
         <w:rPr>
@@ -2557,6 +2557,7 @@
     <w:p>
       <w:pPr>
         <w:pStyle w:val="BlockQuote"/>
+        <w:ind w:left="432" w:right="216"/>
       </w:pPr>
       <w:r>
         <w:rPr>
@@ -2587,6 +2588,7 @@
     <w:p>
       <w:pPr>
         <w:pStyle w:val="BlockQuote"/>
+        <w:ind w:left="432" w:right="216"/>
       </w:pPr>
       <w:r>
         <w:rPr>
@@ -2630,6 +2632,7 @@
     <w:p>
       <w:pPr>
         <w:pStyle w:val="BlockQuote"/>
+        <w:ind w:left="432" w:right="216"/>
       </w:pPr>
       <w:r>
         <w:rPr>
@@ -2660,6 +2663,7 @@
     <w:p>
       <w:pPr>
         <w:pStyle w:val="BlockQuote"/>
+        <w:ind w:left="432" w:right="216"/>
       </w:pPr>
       <w:r>
         <w:rPr>
@@ -2690,6 +2694,7 @@
     <w:p>
       <w:pPr>
         <w:pStyle w:val="BlockQuote"/>
+        <w:ind w:left="432" w:right="216"/>
       </w:pPr>
       <w:r>
         <w:rPr>
@@ -2712,7 +2717,7 @@
     </w:p>
     <w:p>
       <w:pPr>
-        <w:ind w:left="576" w:firstLine="0"/>
+        <w:ind w:left="288" w:firstLine="0"/>
       </w:pPr>
       <w:r>
         <w:rPr>
@@ -2727,7 +2732,7 @@
     </w:p>
     <w:p>
       <w:pPr>
-        <w:ind w:left="576" w:firstLine="0"/>
+        <w:ind w:left="288" w:firstLine="0"/>
       </w:pPr>
       <w:r>
         <w:rPr>
@@ -2742,7 +2747,7 @@
     </w:p>
     <w:p>
       <w:pPr>
-        <w:ind w:left="576" w:firstLine="0"/>
+        <w:ind w:left="288" w:firstLine="0"/>
       </w:pPr>
       <w:r>
         <w:rPr>
@@ -2757,7 +2762,7 @@
     </w:p>
     <w:p>
       <w:pPr>
-        <w:ind w:left="576" w:firstLine="0"/>
+        <w:ind w:left="288" w:firstLine="0"/>
       </w:pPr>
       <w:r>
         <w:rPr>
@@ -2772,7 +2777,7 @@
     </w:p>
     <w:p>
       <w:pPr>
-        <w:ind w:left="576" w:firstLine="0"/>
+        <w:ind w:left="288" w:firstLine="0"/>
       </w:pPr>
       <w:r>
         <w:rPr>
@@ -2852,7 +2857,7 @@
     </w:p>
     <w:p>
       <w:pPr>
-        <w:ind w:left="576" w:firstLine="0"/>
+        <w:ind w:left="288" w:firstLine="0"/>
       </w:pPr>
       <w:r>
         <w:rPr>
@@ -2877,7 +2882,7 @@
     </w:p>
     <w:p>
       <w:pPr>
-        <w:ind w:left="576" w:firstLine="0"/>
+        <w:ind w:left="288" w:firstLine="0"/>
       </w:pPr>
       <w:r>
         <w:rPr>
@@ -2902,7 +2907,7 @@
     </w:p>
     <w:p>
       <w:pPr>
-        <w:ind w:left="576" w:firstLine="0"/>
+        <w:ind w:left="288" w:firstLine="0"/>
       </w:pPr>
       <w:r>
         <w:rPr>
@@ -2927,7 +2932,7 @@
     </w:p>
     <w:p>
       <w:pPr>
-        <w:ind w:left="576" w:firstLine="0"/>
+        <w:ind w:left="288" w:firstLine="0"/>
       </w:pPr>
       <w:r>
         <w:rPr>
@@ -3005,6 +3010,7 @@
     <w:p>
       <w:pPr>
         <w:pStyle w:val="BlockQuote"/>
+        <w:ind w:left="432" w:right="216"/>
       </w:pPr>
       <w:r>
         <w:rPr>
@@ -3035,6 +3041,7 @@
     <w:p>
       <w:pPr>
         <w:pStyle w:val="BlockQuote"/>
+        <w:ind w:left="432" w:right="216"/>
       </w:pPr>
       <w:r>
         <w:rPr>
@@ -3065,6 +3072,7 @@
     <w:p>
       <w:pPr>
         <w:pStyle w:val="BlockQuote"/>
+        <w:ind w:left="432" w:right="216"/>
       </w:pPr>
       <w:r>
         <w:rPr>
@@ -3095,6 +3103,7 @@
     <w:p>
       <w:pPr>
         <w:pStyle w:val="BlockQuote"/>
+        <w:ind w:left="432" w:right="216"/>
       </w:pPr>
       <w:r>
         <w:rPr>
@@ -3125,6 +3134,7 @@
     <w:p>
       <w:pPr>
         <w:pStyle w:val="BlockQuote"/>
+        <w:ind w:left="432" w:right="216"/>
       </w:pPr>
       <w:r>
         <w:rPr>
@@ -3147,7 +3157,7 @@
     </w:p>
     <w:p>
       <w:pPr>
-        <w:ind w:left="576" w:firstLine="0"/>
+        <w:ind w:left="288" w:firstLine="0"/>
       </w:pPr>
       <w:r>
         <w:rPr>
@@ -3162,7 +3172,7 @@
     </w:p>
     <w:p>
       <w:pPr>
-        <w:ind w:left="576" w:firstLine="0"/>
+        <w:ind w:left="288" w:firstLine="0"/>
       </w:pPr>
       <w:r>
         <w:rPr>
@@ -3177,7 +3187,7 @@
     </w:p>
     <w:p>
       <w:pPr>
-        <w:ind w:left="576" w:firstLine="0"/>
+        <w:ind w:left="288" w:firstLine="0"/>
       </w:pPr>
       <w:r>
         <w:rPr>
@@ -3192,7 +3202,7 @@
     </w:p>
     <w:p>
       <w:pPr>
-        <w:ind w:left="576" w:firstLine="0"/>
+        <w:ind w:left="288" w:firstLine="0"/>
       </w:pPr>
       <w:r>
         <w:rPr>
@@ -3207,7 +3217,7 @@
     </w:p>
     <w:p>
       <w:pPr>
-        <w:ind w:left="576" w:firstLine="0"/>
+        <w:ind w:left="288" w:firstLine="0"/>
       </w:pPr>
       <w:r>
         <w:rPr>
@@ -3317,7 +3327,7 @@
     </w:p>
     <w:p>
       <w:pPr>
-        <w:ind w:left="576" w:firstLine="0"/>
+        <w:ind w:left="288" w:firstLine="0"/>
       </w:pPr>
       <w:r>
         <w:rPr>
@@ -3342,7 +3352,7 @@
     </w:p>
     <w:p>
       <w:pPr>
-        <w:ind w:left="576" w:firstLine="0"/>
+        <w:ind w:left="288" w:firstLine="0"/>
       </w:pPr>
       <w:r>
         <w:rPr>
@@ -3367,7 +3377,7 @@
     </w:p>
     <w:p>
       <w:pPr>
-        <w:ind w:left="576" w:firstLine="0"/>
+        <w:ind w:left="288" w:firstLine="0"/>
       </w:pPr>
       <w:r>
         <w:rPr>
@@ -3478,6 +3488,7 @@
     <w:p>
       <w:pPr>
         <w:pStyle w:val="BlockQuote"/>
+        <w:ind w:left="432" w:right="216"/>
       </w:pPr>
       <w:r>
         <w:rPr>
@@ -3508,6 +3519,7 @@
     <w:p>
       <w:pPr>
         <w:pStyle w:val="BlockQuote"/>
+        <w:ind w:left="432" w:right="216"/>
       </w:pPr>
       <w:r>
         <w:rPr>
@@ -3636,6 +3648,7 @@
     <w:p>
       <w:pPr>
         <w:pStyle w:val="BlockQuote"/>
+        <w:ind w:left="432" w:right="216"/>
       </w:pPr>
       <w:r>
         <w:rPr>
@@ -3666,6 +3679,7 @@
     <w:p>
       <w:pPr>
         <w:pStyle w:val="BlockQuote"/>
+        <w:ind w:left="432" w:right="216"/>
       </w:pPr>
       <w:r>
         <w:rPr>
@@ -3688,7 +3702,7 @@
     </w:p>
     <w:p>
       <w:pPr>
-        <w:ind w:left="576" w:firstLine="0"/>
+        <w:ind w:left="288" w:firstLine="0"/>
       </w:pPr>
       <w:r>
         <w:rPr>
@@ -3703,7 +3717,7 @@
     </w:p>
     <w:p>
       <w:pPr>
-        <w:ind w:left="576" w:firstLine="0"/>
+        <w:ind w:left="288" w:firstLine="0"/>
       </w:pPr>
       <w:r>
         <w:rPr>
@@ -3718,7 +3732,7 @@
     </w:p>
     <w:p>
       <w:pPr>
-        <w:ind w:left="576" w:firstLine="0"/>
+        <w:ind w:left="288" w:firstLine="0"/>
       </w:pPr>
       <w:r>
         <w:rPr>
@@ -3733,7 +3747,7 @@
     </w:p>
     <w:p>
       <w:pPr>
-        <w:ind w:left="576" w:firstLine="0"/>
+        <w:ind w:left="288" w:firstLine="0"/>
       </w:pPr>
       <w:r>
         <w:rPr>
@@ -3748,7 +3762,7 @@
     </w:p>
     <w:p>
       <w:pPr>
-        <w:ind w:left="576" w:firstLine="0"/>
+        <w:ind w:left="288" w:firstLine="0"/>
       </w:pPr>
       <w:r>
         <w:rPr>
@@ -3891,7 +3905,7 @@
     </w:p>
     <w:p>
       <w:pPr>
-        <w:ind w:left="576" w:firstLine="0"/>
+        <w:ind w:left="288" w:firstLine="0"/>
       </w:pPr>
       <w:r>
         <w:rPr>
@@ -3916,7 +3930,7 @@
     </w:p>
     <w:p>
       <w:pPr>
-        <w:ind w:left="576" w:firstLine="0"/>
+        <w:ind w:left="288" w:firstLine="0"/>
       </w:pPr>
       <w:r>
         <w:rPr>
@@ -3941,7 +3955,7 @@
     </w:p>
     <w:p>
       <w:pPr>
-        <w:ind w:left="576" w:firstLine="0"/>
+        <w:ind w:left="288" w:firstLine="0"/>
       </w:pPr>
       <w:r>
         <w:rPr>
@@ -3966,7 +3980,7 @@
     </w:p>
     <w:p>
       <w:pPr>
-        <w:ind w:left="576" w:firstLine="0"/>
+        <w:ind w:left="288" w:firstLine="0"/>
       </w:pPr>
       <w:r>
         <w:rPr>
@@ -4044,6 +4058,7 @@
     <w:p>
       <w:pPr>
         <w:pStyle w:val="BlockQuote"/>
+        <w:ind w:left="432" w:right="216"/>
       </w:pPr>
       <w:r>
         <w:rPr>
@@ -4074,6 +4089,7 @@
     <w:p>
       <w:pPr>
         <w:pStyle w:val="BlockQuote"/>
+        <w:ind w:left="432" w:right="216"/>
       </w:pPr>
       <w:r>
         <w:rPr>
@@ -4104,6 +4120,7 @@
     <w:p>
       <w:pPr>
         <w:pStyle w:val="BlockQuote"/>
+        <w:ind w:left="432" w:right="216"/>
       </w:pPr>
       <w:r>
         <w:rPr>
@@ -4134,6 +4151,7 @@
     <w:p>
       <w:pPr>
         <w:pStyle w:val="BlockQuote"/>
+        <w:ind w:left="432" w:right="216"/>
       </w:pPr>
       <w:r>
         <w:rPr>
@@ -4164,6 +4182,7 @@
     <w:p>
       <w:pPr>
         <w:pStyle w:val="BlockQuote"/>
+        <w:ind w:left="432" w:right="216"/>
       </w:pPr>
       <w:r>
         <w:rPr>
@@ -4186,7 +4205,7 @@
     </w:p>
     <w:p>
       <w:pPr>
-        <w:ind w:left="576" w:firstLine="0"/>
+        <w:ind w:left="288" w:firstLine="0"/>
       </w:pPr>
       <w:r>
         <w:rPr>
@@ -4201,7 +4220,7 @@
     </w:p>
     <w:p>
       <w:pPr>
-        <w:ind w:left="576" w:firstLine="0"/>
+        <w:ind w:left="288" w:firstLine="0"/>
       </w:pPr>
       <w:r>
         <w:rPr>
@@ -4216,7 +4235,7 @@
     </w:p>
     <w:p>
       <w:pPr>
-        <w:ind w:left="576" w:firstLine="0"/>
+        <w:ind w:left="288" w:firstLine="0"/>
       </w:pPr>
       <w:r>
         <w:rPr>
@@ -4231,7 +4250,7 @@
     </w:p>
     <w:p>
       <w:pPr>
-        <w:ind w:left="576" w:firstLine="0"/>
+        <w:ind w:left="288" w:firstLine="0"/>
       </w:pPr>
       <w:r>
         <w:rPr>
@@ -4246,7 +4265,7 @@
     </w:p>
     <w:p>
       <w:pPr>
-        <w:ind w:left="576" w:firstLine="0"/>
+        <w:ind w:left="288" w:firstLine="0"/>
       </w:pPr>
       <w:r>
         <w:rPr>
@@ -4261,7 +4280,7 @@
     </w:p>
     <w:p>
       <w:pPr>
-        <w:ind w:left="576" w:firstLine="0"/>
+        <w:ind w:left="288" w:firstLine="0"/>
       </w:pPr>
       <w:r>
         <w:rPr>
@@ -4431,7 +4450,7 @@
     </w:p>
     <w:p>
       <w:pPr>
-        <w:ind w:left="576" w:firstLine="0"/>
+        <w:ind w:left="288" w:firstLine="0"/>
       </w:pPr>
       <w:r>
         <w:rPr>
@@ -4456,7 +4475,7 @@
     </w:p>
     <w:p>
       <w:pPr>
-        <w:ind w:left="576" w:firstLine="0"/>
+        <w:ind w:left="288" w:firstLine="0"/>
       </w:pPr>
       <w:r>
         <w:rPr>
@@ -4481,7 +4500,7 @@
     </w:p>
     <w:p>
       <w:pPr>
-        <w:ind w:left="576" w:firstLine="0"/>
+        <w:ind w:left="288" w:firstLine="0"/>
       </w:pPr>
       <w:r>
         <w:rPr>
@@ -4506,7 +4525,7 @@
     </w:p>
     <w:p>
       <w:pPr>
-        <w:ind w:left="576" w:firstLine="0"/>
+        <w:ind w:left="288" w:firstLine="0"/>
       </w:pPr>
       <w:r>
         <w:rPr>
@@ -4607,6 +4626,7 @@
     <w:p>
       <w:pPr>
         <w:pStyle w:val="BlockQuote"/>
+        <w:ind w:left="432" w:right="216"/>
       </w:pPr>
       <w:r>
         <w:rPr>
@@ -4650,6 +4670,7 @@
     <w:p>
       <w:pPr>
         <w:pStyle w:val="BlockQuote"/>
+        <w:ind w:left="432" w:right="216"/>
       </w:pPr>
       <w:r>
         <w:rPr>
@@ -4680,6 +4701,7 @@
     <w:p>
       <w:pPr>
         <w:pStyle w:val="BlockQuote"/>
+        <w:ind w:left="432" w:right="216"/>
       </w:pPr>
       <w:r>
         <w:rPr>
@@ -4710,6 +4732,7 @@
     <w:p>
       <w:pPr>
         <w:pStyle w:val="BlockQuote"/>
+        <w:ind w:left="432" w:right="216"/>
       </w:pPr>
       <w:r>
         <w:rPr>
@@ -4740,6 +4763,7 @@
     <w:p>
       <w:pPr>
         <w:pStyle w:val="BlockQuote"/>
+        <w:ind w:left="432" w:right="216"/>
       </w:pPr>
       <w:r>
         <w:rPr>
@@ -4762,7 +4786,7 @@
     </w:p>
     <w:p>
       <w:pPr>
-        <w:ind w:left="576" w:firstLine="0"/>
+        <w:ind w:left="288" w:firstLine="0"/>
       </w:pPr>
       <w:r>
         <w:rPr>
@@ -4777,7 +4801,7 @@
     </w:p>
     <w:p>
       <w:pPr>
-        <w:ind w:left="576" w:firstLine="0"/>
+        <w:ind w:left="288" w:firstLine="0"/>
       </w:pPr>
       <w:r>
         <w:rPr>
@@ -4792,7 +4816,7 @@
     </w:p>
     <w:p>
       <w:pPr>
-        <w:ind w:left="576" w:firstLine="0"/>
+        <w:ind w:left="288" w:firstLine="0"/>
       </w:pPr>
       <w:r>
         <w:rPr>
@@ -4807,7 +4831,7 @@
     </w:p>
     <w:p>
       <w:pPr>
-        <w:ind w:left="576" w:firstLine="0"/>
+        <w:ind w:left="288" w:firstLine="0"/>
       </w:pPr>
       <w:r>
         <w:rPr>
@@ -4822,7 +4846,7 @@
     </w:p>
     <w:p>
       <w:pPr>
-        <w:ind w:left="576" w:firstLine="0"/>
+        <w:ind w:left="288" w:firstLine="0"/>
       </w:pPr>
       <w:r>
         <w:rPr>
@@ -4837,7 +4861,7 @@
     </w:p>
     <w:p>
       <w:pPr>
-        <w:ind w:left="576" w:firstLine="0"/>
+        <w:ind w:left="288" w:firstLine="0"/>
       </w:pPr>
       <w:r>
         <w:rPr>
@@ -4982,7 +5006,7 @@
     </w:p>
     <w:p>
       <w:pPr>
-        <w:ind w:left="576" w:firstLine="0"/>
+        <w:ind w:left="288" w:firstLine="0"/>
       </w:pPr>
       <w:r>
         <w:rPr>
@@ -5007,7 +5031,7 @@
     </w:p>
     <w:p>
       <w:pPr>
-        <w:ind w:left="576" w:firstLine="0"/>
+        <w:ind w:left="288" w:firstLine="0"/>
       </w:pPr>
       <w:r>
         <w:rPr>
@@ -5032,7 +5056,7 @@
     </w:p>
     <w:p>
       <w:pPr>
-        <w:ind w:left="576" w:firstLine="0"/>
+        <w:ind w:left="288" w:firstLine="0"/>
       </w:pPr>
       <w:r>
         <w:rPr>
@@ -5077,7 +5101,7 @@
     </w:p>
     <w:p>
       <w:pPr>
-        <w:ind w:left="576" w:firstLine="0"/>
+        <w:ind w:left="288" w:firstLine="0"/>
       </w:pPr>
       <w:r>
         <w:rPr>
@@ -5168,6 +5192,7 @@
     <w:p>
       <w:pPr>
         <w:pStyle w:val="BlockQuote"/>
+        <w:ind w:left="432" w:right="216"/>
       </w:pPr>
       <w:r>
         <w:rPr>
@@ -5196,6 +5221,7 @@
     <w:p>
       <w:pPr>
         <w:pStyle w:val="BlockQuote"/>
+        <w:ind w:left="432" w:right="216"/>
       </w:pPr>
       <w:r>
         <w:rPr>
@@ -5226,6 +5252,7 @@
     <w:p>
       <w:pPr>
         <w:pStyle w:val="BlockQuote"/>
+        <w:ind w:left="432" w:right="216"/>
       </w:pPr>
       <w:r>
         <w:rPr>
@@ -5241,6 +5268,7 @@
     <w:p>
       <w:pPr>
         <w:pStyle w:val="BlockQuote"/>
+        <w:ind w:left="432" w:right="216"/>
       </w:pPr>
       <w:r>
         <w:rPr>
@@ -5269,6 +5297,7 @@
     <w:p>
       <w:pPr>
         <w:pStyle w:val="BlockQuote"/>
+        <w:ind w:left="432" w:right="216"/>
       </w:pPr>
       <w:r>
         <w:rPr>
@@ -5312,6 +5341,7 @@
     <w:p>
       <w:pPr>
         <w:pStyle w:val="BlockQuote"/>
+        <w:ind w:left="432" w:right="216"/>
       </w:pPr>
       <w:r>
         <w:rPr>
@@ -5342,6 +5372,7 @@
     <w:p>
       <w:pPr>
         <w:pStyle w:val="BlockQuote"/>
+        <w:ind w:left="432" w:right="216"/>
       </w:pPr>
       <w:r>
         <w:rPr>
@@ -5364,7 +5395,7 @@
     </w:p>
     <w:p>
       <w:pPr>
-        <w:ind w:left="576" w:firstLine="0"/>
+        <w:ind w:left="288" w:firstLine="0"/>
       </w:pPr>
       <w:r>
         <w:rPr>
@@ -5379,7 +5410,7 @@
     </w:p>
     <w:p>
       <w:pPr>
-        <w:ind w:left="576" w:firstLine="0"/>
+        <w:ind w:left="288" w:firstLine="0"/>
       </w:pPr>
       <w:r>
         <w:rPr>
@@ -5394,7 +5425,7 @@
     </w:p>
     <w:p>
       <w:pPr>
-        <w:ind w:left="576" w:firstLine="0"/>
+        <w:ind w:left="288" w:firstLine="0"/>
       </w:pPr>
       <w:r>
         <w:rPr>
@@ -5409,7 +5440,7 @@
     </w:p>
     <w:p>
       <w:pPr>
-        <w:ind w:left="576" w:firstLine="0"/>
+        <w:ind w:left="288" w:firstLine="0"/>
       </w:pPr>
       <w:r>
         <w:rPr>
@@ -5424,7 +5455,7 @@
     </w:p>
     <w:p>
       <w:pPr>
-        <w:ind w:left="576" w:firstLine="0"/>
+        <w:ind w:left="288" w:firstLine="0"/>
       </w:pPr>
       <w:r>
         <w:rPr>
@@ -5574,7 +5605,7 @@
     </w:p>
     <w:p>
       <w:pPr>
-        <w:ind w:left="576" w:firstLine="0"/>
+        <w:ind w:left="288" w:firstLine="0"/>
       </w:pPr>
       <w:r>
         <w:rPr>
@@ -5599,7 +5630,7 @@
     </w:p>
     <w:p>
       <w:pPr>
-        <w:ind w:left="576" w:firstLine="0"/>
+        <w:ind w:left="288" w:firstLine="0"/>
       </w:pPr>
       <w:r>
         <w:rPr>
@@ -5624,7 +5655,7 @@
     </w:p>
     <w:p>
       <w:pPr>
-        <w:ind w:left="576" w:firstLine="0"/>
+        <w:ind w:left="288" w:firstLine="0"/>
       </w:pPr>
       <w:r>
         <w:rPr>
@@ -5649,7 +5680,7 @@
     </w:p>
     <w:p>
       <w:pPr>
-        <w:ind w:left="576" w:firstLine="0"/>
+        <w:ind w:left="288" w:firstLine="0"/>
       </w:pPr>
       <w:r>
         <w:rPr>
@@ -5740,6 +5771,7 @@
     <w:p>
       <w:pPr>
         <w:pStyle w:val="BlockQuote"/>
+        <w:ind w:left="432" w:right="216"/>
       </w:pPr>
       <w:r>
         <w:rPr>
@@ -5793,6 +5825,7 @@
     <w:p>
       <w:pPr>
         <w:pStyle w:val="BlockQuote"/>
+        <w:ind w:left="432" w:right="216"/>
       </w:pPr>
       <w:r>
         <w:rPr>
@@ -5823,6 +5856,7 @@
     <w:p>
       <w:pPr>
         <w:pStyle w:val="BlockQuote"/>
+        <w:ind w:left="432" w:right="216"/>
       </w:pPr>
       <w:r>
         <w:rPr>
@@ -5866,6 +5900,7 @@
     <w:p>
       <w:pPr>
         <w:pStyle w:val="BlockQuote"/>
+        <w:ind w:left="432" w:right="216"/>
       </w:pPr>
       <w:r>
         <w:rPr>
@@ -5894,6 +5929,7 @@
     <w:p>
       <w:pPr>
         <w:pStyle w:val="BlockQuote"/>
+        <w:ind w:left="432" w:right="216"/>
       </w:pPr>
       <w:r>
         <w:rPr>
@@ -5922,6 +5958,7 @@
     <w:p>
       <w:pPr>
         <w:pStyle w:val="BlockQuote"/>
+        <w:ind w:left="432" w:right="216"/>
       </w:pPr>
       <w:r>
         <w:rPr>
@@ -5944,7 +5981,7 @@
     </w:p>
     <w:p>
       <w:pPr>
-        <w:ind w:left="576" w:firstLine="0"/>
+        <w:ind w:left="288" w:firstLine="0"/>
       </w:pPr>
       <w:r>
         <w:rPr>
@@ -5959,7 +5996,7 @@
     </w:p>
     <w:p>
       <w:pPr>
-        <w:ind w:left="576" w:firstLine="0"/>
+        <w:ind w:left="288" w:firstLine="0"/>
       </w:pPr>
       <w:r>
         <w:rPr>
@@ -5974,7 +6011,7 @@
     </w:p>
     <w:p>
       <w:pPr>
-        <w:ind w:left="576" w:firstLine="0"/>
+        <w:ind w:left="288" w:firstLine="0"/>
       </w:pPr>
       <w:r>
         <w:rPr>
@@ -5989,7 +6026,7 @@
     </w:p>
     <w:p>
       <w:pPr>
-        <w:ind w:left="576" w:firstLine="0"/>
+        <w:ind w:left="288" w:firstLine="0"/>
       </w:pPr>
       <w:r>
         <w:rPr>
@@ -6004,7 +6041,7 @@
     </w:p>
     <w:p>
       <w:pPr>
-        <w:ind w:left="576" w:firstLine="0"/>
+        <w:ind w:left="288" w:firstLine="0"/>
       </w:pPr>
       <w:r>
         <w:rPr>
@@ -6019,7 +6056,7 @@
     </w:p>
     <w:p>
       <w:pPr>
-        <w:ind w:left="576" w:firstLine="0"/>
+        <w:ind w:left="288" w:firstLine="0"/>
       </w:pPr>
       <w:r>
         <w:rPr>
@@ -6169,7 +6206,7 @@
     </w:p>
     <w:p>
       <w:pPr>
-        <w:ind w:left="576" w:firstLine="0"/>
+        <w:ind w:left="288" w:firstLine="0"/>
       </w:pPr>
       <w:r>
         <w:rPr>
@@ -6194,7 +6231,7 @@
     </w:p>
     <w:p>
       <w:pPr>
-        <w:ind w:left="576" w:firstLine="0"/>
+        <w:ind w:left="288" w:firstLine="0"/>
       </w:pPr>
       <w:r>
         <w:rPr>
@@ -6219,7 +6256,7 @@
     </w:p>
     <w:p>
       <w:pPr>
-        <w:ind w:left="576" w:firstLine="0"/>
+        <w:ind w:left="288" w:firstLine="0"/>
       </w:pPr>
       <w:r>
         <w:rPr>
@@ -6244,7 +6281,7 @@
     </w:p>
     <w:p>
       <w:pPr>
-        <w:ind w:left="576" w:firstLine="0"/>
+        <w:ind w:left="288" w:firstLine="0"/>
       </w:pPr>
       <w:r>
         <w:rPr>
@@ -6269,7 +6306,7 @@
     </w:p>
     <w:p>
       <w:pPr>
-        <w:ind w:left="576" w:firstLine="0"/>
+        <w:ind w:left="288" w:firstLine="0"/>
       </w:pPr>
       <w:r>
         <w:rPr>
@@ -6284,7 +6321,7 @@
     </w:p>
     <w:p>
       <w:pPr>
-        <w:ind w:left="576" w:firstLine="0"/>
+        <w:ind w:left="288" w:firstLine="0"/>
       </w:pPr>
       <w:r>
         <w:rPr>
@@ -6503,6 +6540,7 @@
     <w:p>
       <w:pPr>
         <w:pStyle w:val="BlockQuote"/>
+        <w:ind w:left="432" w:right="216"/>
       </w:pPr>
       <w:r>
         <w:rPr>
@@ -6528,6 +6566,7 @@
     <w:p>
       <w:pPr>
         <w:pStyle w:val="BlockQuote"/>
+        <w:ind w:left="432" w:right="216"/>
       </w:pPr>
       <w:r>
         <w:rPr>
@@ -6553,6 +6592,7 @@
     <w:p>
       <w:pPr>
         <w:pStyle w:val="BlockQuote"/>
+        <w:ind w:left="432" w:right="216"/>
       </w:pPr>
       <w:r>
         <w:rPr>
@@ -6578,6 +6618,7 @@
     <w:p>
       <w:pPr>
         <w:pStyle w:val="BlockQuote"/>
+        <w:ind w:left="432" w:right="216"/>
       </w:pPr>
       <w:r>
         <w:rPr>
@@ -6748,7 +6789,7 @@
     </w:p>
     <w:p>
       <w:pPr>
-        <w:ind w:left="576" w:firstLine="0"/>
+        <w:ind w:left="288" w:firstLine="0"/>
       </w:pPr>
       <w:r>
         <w:rPr>
@@ -6773,7 +6814,7 @@
     </w:p>
     <w:p>
       <w:pPr>
-        <w:ind w:left="576" w:firstLine="0"/>
+        <w:ind w:left="288" w:firstLine="0"/>
       </w:pPr>
       <w:r>
         <w:rPr>
@@ -6798,7 +6839,7 @@
     </w:p>
     <w:p>
       <w:pPr>
-        <w:ind w:left="576" w:firstLine="0"/>
+        <w:ind w:left="288" w:firstLine="0"/>
       </w:pPr>
       <w:r>
         <w:rPr>
@@ -6975,6 +7016,7 @@
     <w:p>
       <w:pPr>
         <w:pStyle w:val="BlockQuote"/>
+        <w:ind w:left="432" w:right="216"/>
       </w:pPr>
       <w:r>
         <w:rPr>
@@ -7028,6 +7070,7 @@
     <w:p>
       <w:pPr>
         <w:pStyle w:val="BlockQuote"/>
+        <w:ind w:left="432" w:right="216"/>
       </w:pPr>
       <w:r>
         <w:rPr>
@@ -7194,6 +7237,7 @@
     <w:p>
       <w:pPr>
         <w:pStyle w:val="BlockQuote"/>
+        <w:ind w:left="432" w:right="216"/>
       </w:pPr>
       <w:r>
         <w:rPr>
@@ -7224,6 +7268,7 @@
     <w:p>
       <w:pPr>
         <w:pStyle w:val="BlockQuote"/>
+        <w:ind w:left="432" w:right="216"/>
       </w:pPr>
       <w:r>
         <w:rPr>
@@ -7313,7 +7358,7 @@
     </w:p>
     <w:p>
       <w:pPr>
-        <w:ind w:left="576" w:firstLine="0"/>
+        <w:ind w:left="288" w:firstLine="0"/>
       </w:pPr>
       <w:r>
         <w:rPr>
@@ -7338,7 +7383,7 @@
     </w:p>
     <w:p>
       <w:pPr>
-        <w:ind w:left="576" w:firstLine="0"/>
+        <w:ind w:left="288" w:firstLine="0"/>
       </w:pPr>
       <w:r>
         <w:rPr>
@@ -7443,6 +7488,7 @@
     <w:p>
       <w:pPr>
         <w:pStyle w:val="BlockQuote"/>
+        <w:ind w:left="432" w:right="216"/>
       </w:pPr>
       <w:r>
         <w:rPr>
@@ -7468,6 +7514,7 @@
     <w:p>
       <w:pPr>
         <w:pStyle w:val="BlockQuote"/>
+        <w:ind w:left="432" w:right="216"/>
       </w:pPr>
       <w:r>
         <w:rPr>
@@ -7493,6 +7540,7 @@
     <w:p>
       <w:pPr>
         <w:pStyle w:val="BlockQuote"/>
+        <w:ind w:left="432" w:right="216"/>
       </w:pPr>
       <w:r>
         <w:rPr>
@@ -7668,7 +7716,7 @@
     </w:p>
     <w:p>
       <w:pPr>
-        <w:ind w:left="576" w:firstLine="0"/>
+        <w:ind w:left="288" w:firstLine="0"/>
       </w:pPr>
       <w:r>
         <w:rPr>
@@ -7693,7 +7741,7 @@
     </w:p>
     <w:p>
       <w:pPr>
-        <w:ind w:left="576" w:firstLine="0"/>
+        <w:ind w:left="288" w:firstLine="0"/>
       </w:pPr>
       <w:r>
         <w:rPr>
@@ -7718,7 +7766,7 @@
     </w:p>
     <w:p>
       <w:pPr>
-        <w:ind w:left="576" w:firstLine="0"/>
+        <w:ind w:left="288" w:firstLine="0"/>
       </w:pPr>
       <w:r>
         <w:rPr>
@@ -7805,6 +7853,7 @@
     <w:p>
       <w:pPr>
         <w:pStyle w:val="BlockQuote"/>
+        <w:ind w:left="432" w:right="216"/>
       </w:pPr>
       <w:r>
         <w:rPr>
@@ -7820,6 +7869,7 @@
     <w:p>
       <w:pPr>
         <w:pStyle w:val="BlockQuote"/>
+        <w:ind w:left="432" w:right="216"/>
       </w:pPr>
       <w:r>
         <w:rPr>
@@ -7850,6 +7900,7 @@
     <w:p>
       <w:pPr>
         <w:pStyle w:val="BlockQuote"/>
+        <w:ind w:left="432" w:right="216"/>
       </w:pPr>
       <w:r>
         <w:rPr>
@@ -8055,7 +8106,7 @@
     </w:p>
     <w:p>
       <w:pPr>
-        <w:ind w:left="576" w:firstLine="0"/>
+        <w:ind w:left="288" w:firstLine="0"/>
       </w:pPr>
       <w:r>
         <w:rPr>
@@ -8080,7 +8131,7 @@
     </w:p>
     <w:p>
       <w:pPr>
-        <w:ind w:left="576" w:firstLine="0"/>
+        <w:ind w:left="288" w:firstLine="0"/>
       </w:pPr>
       <w:r>
         <w:rPr>
@@ -8105,7 +8156,7 @@
     </w:p>
     <w:p>
       <w:pPr>
-        <w:ind w:left="576" w:firstLine="0"/>
+        <w:ind w:left="288" w:firstLine="0"/>
       </w:pPr>
       <w:r>
         <w:rPr>
@@ -8130,7 +8181,7 @@
     </w:p>
     <w:p>
       <w:pPr>
-        <w:ind w:left="576" w:firstLine="0"/>
+        <w:ind w:left="288" w:firstLine="0"/>
       </w:pPr>
       <w:r>
         <w:rPr>
@@ -8380,7 +8431,7 @@
     </w:p>
     <w:p>
       <w:pPr>
-        <w:ind w:firstLine="0"/>
+        <w:ind w:left="288" w:firstLine="0"/>
       </w:pPr>
       <w:r>
         <w:rPr>
@@ -8495,6 +8546,7 @@
     <w:p>
       <w:pPr>
         <w:pStyle w:val="BlockQuote"/>
+        <w:ind w:left="432" w:right="216"/>
       </w:pPr>
       <w:r>
         <w:rPr>
@@ -8509,7 +8561,7 @@
     </w:p>
     <w:p>
       <w:pPr>
-        <w:ind w:firstLine="0"/>
+        <w:ind w:left="288" w:firstLine="0"/>
       </w:pPr>
       <w:r>
         <w:rPr>
@@ -8625,7 +8677,7 @@
     </w:p>
     <w:p>
       <w:pPr>
-        <w:ind w:firstLine="0"/>
+        <w:ind w:left="288" w:firstLine="0"/>
       </w:pPr>
       <w:r>
         <w:rPr>

</xml_diff>

<commit_message>
Fix: nuclear rebuild ❌ items - removed all bullet XML at element level
</commit_message>
<xml_diff>
--- a/kdp-files/difficult_conversations_ebook.docx
+++ b/kdp-files/difficult_conversations_ebook.docx
@@ -2717,6 +2717,7 @@
     </w:p>
     <w:p>
       <w:pPr>
+        <w:pStyle w:val="Normal"/>
         <w:ind w:left="288" w:firstLine="0"/>
       </w:pPr>
       <w:r>
@@ -2732,6 +2733,7 @@
     </w:p>
     <w:p>
       <w:pPr>
+        <w:pStyle w:val="Normal"/>
         <w:ind w:left="288" w:firstLine="0"/>
       </w:pPr>
       <w:r>
@@ -2747,6 +2749,7 @@
     </w:p>
     <w:p>
       <w:pPr>
+        <w:pStyle w:val="Normal"/>
         <w:ind w:left="288" w:firstLine="0"/>
       </w:pPr>
       <w:r>
@@ -2762,6 +2765,7 @@
     </w:p>
     <w:p>
       <w:pPr>
+        <w:pStyle w:val="Normal"/>
         <w:ind w:left="288" w:firstLine="0"/>
       </w:pPr>
       <w:r>
@@ -2777,6 +2781,7 @@
     </w:p>
     <w:p>
       <w:pPr>
+        <w:pStyle w:val="Normal"/>
         <w:ind w:left="288" w:firstLine="0"/>
       </w:pPr>
       <w:r>
@@ -3157,6 +3162,7 @@
     </w:p>
     <w:p>
       <w:pPr>
+        <w:pStyle w:val="Normal"/>
         <w:ind w:left="288" w:firstLine="0"/>
       </w:pPr>
       <w:r>
@@ -3172,6 +3178,7 @@
     </w:p>
     <w:p>
       <w:pPr>
+        <w:pStyle w:val="Normal"/>
         <w:ind w:left="288" w:firstLine="0"/>
       </w:pPr>
       <w:r>
@@ -3187,6 +3194,7 @@
     </w:p>
     <w:p>
       <w:pPr>
+        <w:pStyle w:val="Normal"/>
         <w:ind w:left="288" w:firstLine="0"/>
       </w:pPr>
       <w:r>
@@ -3202,6 +3210,7 @@
     </w:p>
     <w:p>
       <w:pPr>
+        <w:pStyle w:val="Normal"/>
         <w:ind w:left="288" w:firstLine="0"/>
       </w:pPr>
       <w:r>
@@ -3217,6 +3226,7 @@
     </w:p>
     <w:p>
       <w:pPr>
+        <w:pStyle w:val="Normal"/>
         <w:ind w:left="288" w:firstLine="0"/>
       </w:pPr>
       <w:r>
@@ -3702,6 +3712,7 @@
     </w:p>
     <w:p>
       <w:pPr>
+        <w:pStyle w:val="Normal"/>
         <w:ind w:left="288" w:firstLine="0"/>
       </w:pPr>
       <w:r>
@@ -3717,6 +3728,7 @@
     </w:p>
     <w:p>
       <w:pPr>
+        <w:pStyle w:val="Normal"/>
         <w:ind w:left="288" w:firstLine="0"/>
       </w:pPr>
       <w:r>
@@ -3732,6 +3744,7 @@
     </w:p>
     <w:p>
       <w:pPr>
+        <w:pStyle w:val="Normal"/>
         <w:ind w:left="288" w:firstLine="0"/>
       </w:pPr>
       <w:r>
@@ -3747,6 +3760,7 @@
     </w:p>
     <w:p>
       <w:pPr>
+        <w:pStyle w:val="Normal"/>
         <w:ind w:left="288" w:firstLine="0"/>
       </w:pPr>
       <w:r>
@@ -3762,6 +3776,7 @@
     </w:p>
     <w:p>
       <w:pPr>
+        <w:pStyle w:val="Normal"/>
         <w:ind w:left="288" w:firstLine="0"/>
       </w:pPr>
       <w:r>
@@ -4205,6 +4220,7 @@
     </w:p>
     <w:p>
       <w:pPr>
+        <w:pStyle w:val="Normal"/>
         <w:ind w:left="288" w:firstLine="0"/>
       </w:pPr>
       <w:r>
@@ -4220,6 +4236,7 @@
     </w:p>
     <w:p>
       <w:pPr>
+        <w:pStyle w:val="Normal"/>
         <w:ind w:left="288" w:firstLine="0"/>
       </w:pPr>
       <w:r>
@@ -4235,6 +4252,7 @@
     </w:p>
     <w:p>
       <w:pPr>
+        <w:pStyle w:val="Normal"/>
         <w:ind w:left="288" w:firstLine="0"/>
       </w:pPr>
       <w:r>
@@ -4250,6 +4268,7 @@
     </w:p>
     <w:p>
       <w:pPr>
+        <w:pStyle w:val="Normal"/>
         <w:ind w:left="288" w:firstLine="0"/>
       </w:pPr>
       <w:r>
@@ -4265,6 +4284,7 @@
     </w:p>
     <w:p>
       <w:pPr>
+        <w:pStyle w:val="Normal"/>
         <w:ind w:left="288" w:firstLine="0"/>
       </w:pPr>
       <w:r>
@@ -4280,6 +4300,7 @@
     </w:p>
     <w:p>
       <w:pPr>
+        <w:pStyle w:val="Normal"/>
         <w:ind w:left="288" w:firstLine="0"/>
       </w:pPr>
       <w:r>
@@ -4786,6 +4807,7 @@
     </w:p>
     <w:p>
       <w:pPr>
+        <w:pStyle w:val="Normal"/>
         <w:ind w:left="288" w:firstLine="0"/>
       </w:pPr>
       <w:r>
@@ -4801,6 +4823,7 @@
     </w:p>
     <w:p>
       <w:pPr>
+        <w:pStyle w:val="Normal"/>
         <w:ind w:left="288" w:firstLine="0"/>
       </w:pPr>
       <w:r>
@@ -4816,6 +4839,7 @@
     </w:p>
     <w:p>
       <w:pPr>
+        <w:pStyle w:val="Normal"/>
         <w:ind w:left="288" w:firstLine="0"/>
       </w:pPr>
       <w:r>
@@ -4831,6 +4855,7 @@
     </w:p>
     <w:p>
       <w:pPr>
+        <w:pStyle w:val="Normal"/>
         <w:ind w:left="288" w:firstLine="0"/>
       </w:pPr>
       <w:r>
@@ -4846,6 +4871,7 @@
     </w:p>
     <w:p>
       <w:pPr>
+        <w:pStyle w:val="Normal"/>
         <w:ind w:left="288" w:firstLine="0"/>
       </w:pPr>
       <w:r>
@@ -4861,6 +4887,7 @@
     </w:p>
     <w:p>
       <w:pPr>
+        <w:pStyle w:val="Normal"/>
         <w:ind w:left="288" w:firstLine="0"/>
       </w:pPr>
       <w:r>
@@ -5395,6 +5422,7 @@
     </w:p>
     <w:p>
       <w:pPr>
+        <w:pStyle w:val="Normal"/>
         <w:ind w:left="288" w:firstLine="0"/>
       </w:pPr>
       <w:r>
@@ -5410,6 +5438,7 @@
     </w:p>
     <w:p>
       <w:pPr>
+        <w:pStyle w:val="Normal"/>
         <w:ind w:left="288" w:firstLine="0"/>
       </w:pPr>
       <w:r>
@@ -5425,6 +5454,7 @@
     </w:p>
     <w:p>
       <w:pPr>
+        <w:pStyle w:val="Normal"/>
         <w:ind w:left="288" w:firstLine="0"/>
       </w:pPr>
       <w:r>
@@ -5440,6 +5470,7 @@
     </w:p>
     <w:p>
       <w:pPr>
+        <w:pStyle w:val="Normal"/>
         <w:ind w:left="288" w:firstLine="0"/>
       </w:pPr>
       <w:r>
@@ -5455,6 +5486,7 @@
     </w:p>
     <w:p>
       <w:pPr>
+        <w:pStyle w:val="Normal"/>
         <w:ind w:left="288" w:firstLine="0"/>
       </w:pPr>
       <w:r>
@@ -5981,6 +6013,7 @@
     </w:p>
     <w:p>
       <w:pPr>
+        <w:pStyle w:val="Normal"/>
         <w:ind w:left="288" w:firstLine="0"/>
       </w:pPr>
       <w:r>
@@ -5996,6 +6029,7 @@
     </w:p>
     <w:p>
       <w:pPr>
+        <w:pStyle w:val="Normal"/>
         <w:ind w:left="288" w:firstLine="0"/>
       </w:pPr>
       <w:r>
@@ -6011,6 +6045,7 @@
     </w:p>
     <w:p>
       <w:pPr>
+        <w:pStyle w:val="Normal"/>
         <w:ind w:left="288" w:firstLine="0"/>
       </w:pPr>
       <w:r>
@@ -6026,6 +6061,7 @@
     </w:p>
     <w:p>
       <w:pPr>
+        <w:pStyle w:val="Normal"/>
         <w:ind w:left="288" w:firstLine="0"/>
       </w:pPr>
       <w:r>
@@ -6041,6 +6077,7 @@
     </w:p>
     <w:p>
       <w:pPr>
+        <w:pStyle w:val="Normal"/>
         <w:ind w:left="288" w:firstLine="0"/>
       </w:pPr>
       <w:r>
@@ -6056,6 +6093,7 @@
     </w:p>
     <w:p>
       <w:pPr>
+        <w:pStyle w:val="Normal"/>
         <w:ind w:left="288" w:firstLine="0"/>
       </w:pPr>
       <w:r>

</xml_diff>

<commit_message>
Unify all indents: bullets, numbers, ❌, quotes at 0.2 inches
</commit_message>
<xml_diff>
--- a/kdp-files/difficult_conversations_ebook.docx
+++ b/kdp-files/difficult_conversations_ebook.docx
@@ -673,6 +673,7 @@
     <w:p>
       <w:pPr>
         <w:pStyle w:val="ListBullet"/>
+        <w:ind w:left="288"/>
       </w:pPr>
       <w:r>
         <w:rPr>
@@ -698,6 +699,7 @@
     <w:p>
       <w:pPr>
         <w:pStyle w:val="ListBullet"/>
+        <w:ind w:left="288"/>
       </w:pPr>
       <w:r>
         <w:rPr>
@@ -723,6 +725,7 @@
     <w:p>
       <w:pPr>
         <w:pStyle w:val="ListBullet"/>
+        <w:ind w:left="288"/>
       </w:pPr>
       <w:r>
         <w:rPr>
@@ -748,6 +751,7 @@
     <w:p>
       <w:pPr>
         <w:pStyle w:val="ListBullet"/>
+        <w:ind w:left="288"/>
       </w:pPr>
       <w:r>
         <w:rPr>
@@ -773,6 +777,7 @@
     <w:p>
       <w:pPr>
         <w:pStyle w:val="ListBullet"/>
+        <w:ind w:left="288"/>
       </w:pPr>
       <w:r>
         <w:rPr>
@@ -1007,6 +1012,7 @@
     <w:p>
       <w:pPr>
         <w:pStyle w:val="ListBullet"/>
+        <w:ind w:left="288"/>
       </w:pPr>
       <w:r>
         <w:rPr>
@@ -1032,6 +1038,7 @@
     <w:p>
       <w:pPr>
         <w:pStyle w:val="ListBullet"/>
+        <w:ind w:left="288"/>
       </w:pPr>
       <w:r>
         <w:rPr>
@@ -1057,6 +1064,7 @@
     <w:p>
       <w:pPr>
         <w:pStyle w:val="ListBullet"/>
+        <w:ind w:left="288"/>
       </w:pPr>
       <w:r>
         <w:rPr>
@@ -1082,6 +1090,7 @@
     <w:p>
       <w:pPr>
         <w:pStyle w:val="ListBullet"/>
+        <w:ind w:left="288"/>
       </w:pPr>
       <w:r>
         <w:rPr>
@@ -1141,6 +1150,7 @@
     <w:p>
       <w:pPr>
         <w:pStyle w:val="ListBullet"/>
+        <w:ind w:left="288"/>
       </w:pPr>
       <w:r>
         <w:rPr>
@@ -1166,6 +1176,7 @@
     <w:p>
       <w:pPr>
         <w:pStyle w:val="ListBullet"/>
+        <w:ind w:left="288"/>
       </w:pPr>
       <w:r>
         <w:rPr>
@@ -1191,6 +1202,7 @@
     <w:p>
       <w:pPr>
         <w:pStyle w:val="ListBullet"/>
+        <w:ind w:left="288"/>
       </w:pPr>
       <w:r>
         <w:rPr>
@@ -1216,6 +1228,7 @@
     <w:p>
       <w:pPr>
         <w:pStyle w:val="ListBullet"/>
+        <w:ind w:left="288"/>
       </w:pPr>
       <w:r>
         <w:rPr>
@@ -1241,6 +1254,7 @@
     <w:p>
       <w:pPr>
         <w:pStyle w:val="ListBullet"/>
+        <w:ind w:left="288"/>
       </w:pPr>
       <w:r>
         <w:rPr>
@@ -1470,6 +1484,7 @@
     <w:p>
       <w:pPr>
         <w:pStyle w:val="ListBullet"/>
+        <w:ind w:left="288"/>
       </w:pPr>
       <w:r>
         <w:rPr>
@@ -1495,6 +1510,7 @@
     <w:p>
       <w:pPr>
         <w:pStyle w:val="ListBullet"/>
+        <w:ind w:left="288"/>
       </w:pPr>
       <w:r>
         <w:rPr>
@@ -1540,6 +1556,7 @@
     <w:p>
       <w:pPr>
         <w:pStyle w:val="ListBullet"/>
+        <w:ind w:left="288"/>
       </w:pPr>
       <w:r>
         <w:rPr>
@@ -1580,6 +1597,7 @@
     <w:p>
       <w:pPr>
         <w:pStyle w:val="ListBullet"/>
+        <w:ind w:left="288"/>
       </w:pPr>
       <w:r>
         <w:rPr>
@@ -1595,6 +1613,7 @@
     <w:p>
       <w:pPr>
         <w:pStyle w:val="ListBullet"/>
+        <w:ind w:left="288"/>
       </w:pPr>
       <w:r>
         <w:rPr>
@@ -1610,6 +1629,7 @@
     <w:p>
       <w:pPr>
         <w:pStyle w:val="ListBullet"/>
+        <w:ind w:left="288"/>
       </w:pPr>
       <w:r>
         <w:rPr>
@@ -1674,6 +1694,7 @@
     <w:p>
       <w:pPr>
         <w:pStyle w:val="ListBullet"/>
+        <w:ind w:left="288"/>
       </w:pPr>
       <w:r>
         <w:rPr>
@@ -1699,6 +1720,7 @@
     <w:p>
       <w:pPr>
         <w:pStyle w:val="ListBullet"/>
+        <w:ind w:left="288"/>
       </w:pPr>
       <w:r>
         <w:rPr>
@@ -1724,6 +1746,7 @@
     <w:p>
       <w:pPr>
         <w:pStyle w:val="ListBullet"/>
+        <w:ind w:left="288"/>
       </w:pPr>
       <w:r>
         <w:rPr>
@@ -1749,6 +1772,7 @@
     <w:p>
       <w:pPr>
         <w:pStyle w:val="ListBullet"/>
+        <w:ind w:left="288"/>
       </w:pPr>
       <w:r>
         <w:rPr>
@@ -1896,6 +1920,7 @@
     <w:p>
       <w:pPr>
         <w:pStyle w:val="ListBullet"/>
+        <w:ind w:left="288"/>
       </w:pPr>
       <w:r>
         <w:rPr>
@@ -1911,6 +1936,7 @@
     <w:p>
       <w:pPr>
         <w:pStyle w:val="ListBullet"/>
+        <w:ind w:left="288"/>
       </w:pPr>
       <w:r>
         <w:rPr>
@@ -1926,6 +1952,7 @@
     <w:p>
       <w:pPr>
         <w:pStyle w:val="ListBullet"/>
+        <w:ind w:left="288"/>
       </w:pPr>
       <w:r>
         <w:rPr>
@@ -1956,6 +1983,7 @@
     <w:p>
       <w:pPr>
         <w:pStyle w:val="ListBullet"/>
+        <w:ind w:left="288"/>
       </w:pPr>
       <w:r>
         <w:rPr>
@@ -1971,6 +1999,7 @@
     <w:p>
       <w:pPr>
         <w:pStyle w:val="ListBullet"/>
+        <w:ind w:left="288"/>
       </w:pPr>
       <w:r>
         <w:rPr>
@@ -1986,6 +2015,7 @@
     <w:p>
       <w:pPr>
         <w:pStyle w:val="ListBullet"/>
+        <w:ind w:left="288"/>
       </w:pPr>
       <w:r>
         <w:rPr>
@@ -2339,6 +2369,7 @@
     <w:p>
       <w:pPr>
         <w:pStyle w:val="ListBullet"/>
+        <w:ind w:left="288"/>
       </w:pPr>
       <w:r>
         <w:rPr>
@@ -2354,6 +2385,7 @@
     <w:p>
       <w:pPr>
         <w:pStyle w:val="ListBullet"/>
+        <w:ind w:left="288"/>
       </w:pPr>
       <w:r>
         <w:rPr>
@@ -2369,6 +2401,7 @@
     <w:p>
       <w:pPr>
         <w:pStyle w:val="ListBullet"/>
+        <w:ind w:left="288"/>
       </w:pPr>
       <w:r>
         <w:rPr>
@@ -2384,6 +2417,7 @@
     <w:p>
       <w:pPr>
         <w:pStyle w:val="ListBullet"/>
+        <w:ind w:left="288"/>
       </w:pPr>
       <w:r>
         <w:rPr>
@@ -2557,7 +2591,7 @@
     <w:p>
       <w:pPr>
         <w:pStyle w:val="BlockQuote"/>
-        <w:ind w:left="432" w:right="216"/>
+        <w:ind w:left="288" w:right="0"/>
       </w:pPr>
       <w:r>
         <w:rPr>
@@ -2588,7 +2622,7 @@
     <w:p>
       <w:pPr>
         <w:pStyle w:val="BlockQuote"/>
-        <w:ind w:left="432" w:right="216"/>
+        <w:ind w:left="288" w:right="0"/>
       </w:pPr>
       <w:r>
         <w:rPr>
@@ -2632,7 +2666,7 @@
     <w:p>
       <w:pPr>
         <w:pStyle w:val="BlockQuote"/>
-        <w:ind w:left="432" w:right="216"/>
+        <w:ind w:left="288" w:right="0"/>
       </w:pPr>
       <w:r>
         <w:rPr>
@@ -2663,7 +2697,7 @@
     <w:p>
       <w:pPr>
         <w:pStyle w:val="BlockQuote"/>
-        <w:ind w:left="432" w:right="216"/>
+        <w:ind w:left="288" w:right="0"/>
       </w:pPr>
       <w:r>
         <w:rPr>
@@ -2694,7 +2728,7 @@
     <w:p>
       <w:pPr>
         <w:pStyle w:val="BlockQuote"/>
-        <w:ind w:left="432" w:right="216"/>
+        <w:ind w:left="288" w:right="0"/>
       </w:pPr>
       <w:r>
         <w:rPr>
@@ -3015,7 +3049,7 @@
     <w:p>
       <w:pPr>
         <w:pStyle w:val="BlockQuote"/>
-        <w:ind w:left="432" w:right="216"/>
+        <w:ind w:left="288" w:right="0"/>
       </w:pPr>
       <w:r>
         <w:rPr>
@@ -3046,7 +3080,7 @@
     <w:p>
       <w:pPr>
         <w:pStyle w:val="BlockQuote"/>
-        <w:ind w:left="432" w:right="216"/>
+        <w:ind w:left="288" w:right="0"/>
       </w:pPr>
       <w:r>
         <w:rPr>
@@ -3077,7 +3111,7 @@
     <w:p>
       <w:pPr>
         <w:pStyle w:val="BlockQuote"/>
-        <w:ind w:left="432" w:right="216"/>
+        <w:ind w:left="288" w:right="0"/>
       </w:pPr>
       <w:r>
         <w:rPr>
@@ -3108,7 +3142,7 @@
     <w:p>
       <w:pPr>
         <w:pStyle w:val="BlockQuote"/>
-        <w:ind w:left="432" w:right="216"/>
+        <w:ind w:left="288" w:right="0"/>
       </w:pPr>
       <w:r>
         <w:rPr>
@@ -3139,7 +3173,7 @@
     <w:p>
       <w:pPr>
         <w:pStyle w:val="BlockQuote"/>
-        <w:ind w:left="432" w:right="216"/>
+        <w:ind w:left="288" w:right="0"/>
       </w:pPr>
       <w:r>
         <w:rPr>
@@ -3498,7 +3532,7 @@
     <w:p>
       <w:pPr>
         <w:pStyle w:val="BlockQuote"/>
-        <w:ind w:left="432" w:right="216"/>
+        <w:ind w:left="288" w:right="0"/>
       </w:pPr>
       <w:r>
         <w:rPr>
@@ -3529,7 +3563,7 @@
     <w:p>
       <w:pPr>
         <w:pStyle w:val="BlockQuote"/>
-        <w:ind w:left="432" w:right="216"/>
+        <w:ind w:left="288" w:right="0"/>
       </w:pPr>
       <w:r>
         <w:rPr>
@@ -3568,6 +3602,7 @@
     <w:p>
       <w:pPr>
         <w:pStyle w:val="ListBullet"/>
+        <w:ind w:left="288"/>
       </w:pPr>
       <w:r>
         <w:rPr>
@@ -3583,6 +3618,7 @@
     <w:p>
       <w:pPr>
         <w:pStyle w:val="ListBullet"/>
+        <w:ind w:left="288"/>
       </w:pPr>
       <w:r>
         <w:rPr>
@@ -3598,6 +3634,7 @@
     <w:p>
       <w:pPr>
         <w:pStyle w:val="ListBullet"/>
+        <w:ind w:left="288"/>
       </w:pPr>
       <w:r>
         <w:rPr>
@@ -3613,6 +3650,7 @@
     <w:p>
       <w:pPr>
         <w:pStyle w:val="ListBullet"/>
+        <w:ind w:left="288"/>
       </w:pPr>
       <w:r>
         <w:rPr>
@@ -3628,6 +3666,7 @@
     <w:p>
       <w:pPr>
         <w:pStyle w:val="ListBullet"/>
+        <w:ind w:left="288"/>
       </w:pPr>
       <w:r>
         <w:rPr>
@@ -3643,6 +3682,7 @@
     <w:p>
       <w:pPr>
         <w:pStyle w:val="ListBullet"/>
+        <w:ind w:left="288"/>
       </w:pPr>
       <w:r>
         <w:rPr>
@@ -3658,7 +3698,7 @@
     <w:p>
       <w:pPr>
         <w:pStyle w:val="BlockQuote"/>
-        <w:ind w:left="432" w:right="216"/>
+        <w:ind w:left="288" w:right="0"/>
       </w:pPr>
       <w:r>
         <w:rPr>
@@ -3689,7 +3729,7 @@
     <w:p>
       <w:pPr>
         <w:pStyle w:val="BlockQuote"/>
-        <w:ind w:left="432" w:right="216"/>
+        <w:ind w:left="288" w:right="0"/>
       </w:pPr>
       <w:r>
         <w:rPr>
@@ -4073,7 +4113,7 @@
     <w:p>
       <w:pPr>
         <w:pStyle w:val="BlockQuote"/>
-        <w:ind w:left="432" w:right="216"/>
+        <w:ind w:left="288" w:right="0"/>
       </w:pPr>
       <w:r>
         <w:rPr>
@@ -4104,7 +4144,7 @@
     <w:p>
       <w:pPr>
         <w:pStyle w:val="BlockQuote"/>
-        <w:ind w:left="432" w:right="216"/>
+        <w:ind w:left="288" w:right="0"/>
       </w:pPr>
       <w:r>
         <w:rPr>
@@ -4135,7 +4175,7 @@
     <w:p>
       <w:pPr>
         <w:pStyle w:val="BlockQuote"/>
-        <w:ind w:left="432" w:right="216"/>
+        <w:ind w:left="288" w:right="0"/>
       </w:pPr>
       <w:r>
         <w:rPr>
@@ -4166,7 +4206,7 @@
     <w:p>
       <w:pPr>
         <w:pStyle w:val="BlockQuote"/>
-        <w:ind w:left="432" w:right="216"/>
+        <w:ind w:left="288" w:right="0"/>
       </w:pPr>
       <w:r>
         <w:rPr>
@@ -4197,7 +4237,7 @@
     <w:p>
       <w:pPr>
         <w:pStyle w:val="BlockQuote"/>
-        <w:ind w:left="432" w:right="216"/>
+        <w:ind w:left="288" w:right="0"/>
       </w:pPr>
       <w:r>
         <w:rPr>
@@ -4647,7 +4687,7 @@
     <w:p>
       <w:pPr>
         <w:pStyle w:val="BlockQuote"/>
-        <w:ind w:left="432" w:right="216"/>
+        <w:ind w:left="288" w:right="0"/>
       </w:pPr>
       <w:r>
         <w:rPr>
@@ -4691,7 +4731,7 @@
     <w:p>
       <w:pPr>
         <w:pStyle w:val="BlockQuote"/>
-        <w:ind w:left="432" w:right="216"/>
+        <w:ind w:left="288" w:right="0"/>
       </w:pPr>
       <w:r>
         <w:rPr>
@@ -4722,7 +4762,7 @@
     <w:p>
       <w:pPr>
         <w:pStyle w:val="BlockQuote"/>
-        <w:ind w:left="432" w:right="216"/>
+        <w:ind w:left="288" w:right="0"/>
       </w:pPr>
       <w:r>
         <w:rPr>
@@ -4753,7 +4793,7 @@
     <w:p>
       <w:pPr>
         <w:pStyle w:val="BlockQuote"/>
-        <w:ind w:left="432" w:right="216"/>
+        <w:ind w:left="288" w:right="0"/>
       </w:pPr>
       <w:r>
         <w:rPr>
@@ -4784,7 +4824,7 @@
     <w:p>
       <w:pPr>
         <w:pStyle w:val="BlockQuote"/>
-        <w:ind w:left="432" w:right="216"/>
+        <w:ind w:left="288" w:right="0"/>
       </w:pPr>
       <w:r>
         <w:rPr>
@@ -4938,6 +4978,7 @@
     <w:p>
       <w:pPr>
         <w:pStyle w:val="ListBullet"/>
+        <w:ind w:left="288"/>
       </w:pPr>
       <w:r>
         <w:rPr>
@@ -4963,6 +5004,7 @@
     <w:p>
       <w:pPr>
         <w:pStyle w:val="ListBullet"/>
+        <w:ind w:left="288"/>
       </w:pPr>
       <w:r>
         <w:rPr>
@@ -4988,6 +5030,7 @@
     <w:p>
       <w:pPr>
         <w:pStyle w:val="ListBullet"/>
+        <w:ind w:left="288"/>
       </w:pPr>
       <w:r>
         <w:rPr>
@@ -5219,7 +5262,7 @@
     <w:p>
       <w:pPr>
         <w:pStyle w:val="BlockQuote"/>
-        <w:ind w:left="432" w:right="216"/>
+        <w:ind w:left="288" w:right="0"/>
       </w:pPr>
       <w:r>
         <w:rPr>
@@ -5248,7 +5291,7 @@
     <w:p>
       <w:pPr>
         <w:pStyle w:val="BlockQuote"/>
-        <w:ind w:left="432" w:right="216"/>
+        <w:ind w:left="288" w:right="0"/>
       </w:pPr>
       <w:r>
         <w:rPr>
@@ -5279,7 +5322,7 @@
     <w:p>
       <w:pPr>
         <w:pStyle w:val="BlockQuote"/>
-        <w:ind w:left="432" w:right="216"/>
+        <w:ind w:left="288" w:right="0"/>
       </w:pPr>
       <w:r>
         <w:rPr>
@@ -5295,7 +5338,7 @@
     <w:p>
       <w:pPr>
         <w:pStyle w:val="BlockQuote"/>
-        <w:ind w:left="432" w:right="216"/>
+        <w:ind w:left="288" w:right="0"/>
       </w:pPr>
       <w:r>
         <w:rPr>
@@ -5324,7 +5367,7 @@
     <w:p>
       <w:pPr>
         <w:pStyle w:val="BlockQuote"/>
-        <w:ind w:left="432" w:right="216"/>
+        <w:ind w:left="288" w:right="0"/>
       </w:pPr>
       <w:r>
         <w:rPr>
@@ -5368,7 +5411,7 @@
     <w:p>
       <w:pPr>
         <w:pStyle w:val="BlockQuote"/>
-        <w:ind w:left="432" w:right="216"/>
+        <w:ind w:left="288" w:right="0"/>
       </w:pPr>
       <w:r>
         <w:rPr>
@@ -5399,7 +5442,7 @@
     <w:p>
       <w:pPr>
         <w:pStyle w:val="BlockQuote"/>
-        <w:ind w:left="432" w:right="216"/>
+        <w:ind w:left="288" w:right="0"/>
       </w:pPr>
       <w:r>
         <w:rPr>
@@ -5803,7 +5846,7 @@
     <w:p>
       <w:pPr>
         <w:pStyle w:val="BlockQuote"/>
-        <w:ind w:left="432" w:right="216"/>
+        <w:ind w:left="288" w:right="0"/>
       </w:pPr>
       <w:r>
         <w:rPr>
@@ -5857,7 +5900,7 @@
     <w:p>
       <w:pPr>
         <w:pStyle w:val="BlockQuote"/>
-        <w:ind w:left="432" w:right="216"/>
+        <w:ind w:left="288" w:right="0"/>
       </w:pPr>
       <w:r>
         <w:rPr>
@@ -5888,7 +5931,7 @@
     <w:p>
       <w:pPr>
         <w:pStyle w:val="BlockQuote"/>
-        <w:ind w:left="432" w:right="216"/>
+        <w:ind w:left="288" w:right="0"/>
       </w:pPr>
       <w:r>
         <w:rPr>
@@ -5932,7 +5975,7 @@
     <w:p>
       <w:pPr>
         <w:pStyle w:val="BlockQuote"/>
-        <w:ind w:left="432" w:right="216"/>
+        <w:ind w:left="288" w:right="0"/>
       </w:pPr>
       <w:r>
         <w:rPr>
@@ -5961,7 +6004,7 @@
     <w:p>
       <w:pPr>
         <w:pStyle w:val="BlockQuote"/>
-        <w:ind w:left="432" w:right="216"/>
+        <w:ind w:left="288" w:right="0"/>
       </w:pPr>
       <w:r>
         <w:rPr>
@@ -5990,7 +6033,7 @@
     <w:p>
       <w:pPr>
         <w:pStyle w:val="BlockQuote"/>
-        <w:ind w:left="432" w:right="216"/>
+        <w:ind w:left="288" w:right="0"/>
       </w:pPr>
       <w:r>
         <w:rPr>
@@ -6578,7 +6621,7 @@
     <w:p>
       <w:pPr>
         <w:pStyle w:val="BlockQuote"/>
-        <w:ind w:left="432" w:right="216"/>
+        <w:ind w:left="288" w:right="0"/>
       </w:pPr>
       <w:r>
         <w:rPr>
@@ -6604,7 +6647,7 @@
     <w:p>
       <w:pPr>
         <w:pStyle w:val="BlockQuote"/>
-        <w:ind w:left="432" w:right="216"/>
+        <w:ind w:left="288" w:right="0"/>
       </w:pPr>
       <w:r>
         <w:rPr>
@@ -6630,7 +6673,7 @@
     <w:p>
       <w:pPr>
         <w:pStyle w:val="BlockQuote"/>
-        <w:ind w:left="432" w:right="216"/>
+        <w:ind w:left="288" w:right="0"/>
       </w:pPr>
       <w:r>
         <w:rPr>
@@ -6656,7 +6699,7 @@
     <w:p>
       <w:pPr>
         <w:pStyle w:val="BlockQuote"/>
-        <w:ind w:left="432" w:right="216"/>
+        <w:ind w:left="288" w:right="0"/>
       </w:pPr>
       <w:r>
         <w:rPr>
@@ -6697,6 +6740,7 @@
     <w:p>
       <w:pPr>
         <w:pStyle w:val="ListBullet"/>
+        <w:ind w:left="288"/>
       </w:pPr>
       <w:r>
         <w:rPr>
@@ -6712,6 +6756,7 @@
     <w:p>
       <w:pPr>
         <w:pStyle w:val="ListBullet"/>
+        <w:ind w:left="288"/>
       </w:pPr>
       <w:r>
         <w:rPr>
@@ -6727,6 +6772,7 @@
     <w:p>
       <w:pPr>
         <w:pStyle w:val="ListBullet"/>
+        <w:ind w:left="288"/>
       </w:pPr>
       <w:r>
         <w:rPr>
@@ -6742,6 +6788,7 @@
     <w:p>
       <w:pPr>
         <w:pStyle w:val="ListBullet"/>
+        <w:ind w:left="288"/>
       </w:pPr>
       <w:r>
         <w:rPr>
@@ -6757,6 +6804,7 @@
     <w:p>
       <w:pPr>
         <w:pStyle w:val="ListBullet"/>
+        <w:ind w:left="288"/>
       </w:pPr>
       <w:r>
         <w:rPr>
@@ -6949,6 +6997,7 @@
     <w:p>
       <w:pPr>
         <w:pStyle w:val="ListBullet"/>
+        <w:ind w:left="288"/>
       </w:pPr>
       <w:r>
         <w:rPr>
@@ -6974,6 +7023,7 @@
     <w:p>
       <w:pPr>
         <w:pStyle w:val="ListBullet"/>
+        <w:ind w:left="288"/>
       </w:pPr>
       <w:r>
         <w:rPr>
@@ -6999,6 +7049,7 @@
     <w:p>
       <w:pPr>
         <w:pStyle w:val="ListBullet"/>
+        <w:ind w:left="288"/>
       </w:pPr>
       <w:r>
         <w:rPr>
@@ -7054,7 +7105,7 @@
     <w:p>
       <w:pPr>
         <w:pStyle w:val="BlockQuote"/>
-        <w:ind w:left="432" w:right="216"/>
+        <w:ind w:left="288" w:right="0"/>
       </w:pPr>
       <w:r>
         <w:rPr>
@@ -7108,7 +7159,7 @@
     <w:p>
       <w:pPr>
         <w:pStyle w:val="BlockQuote"/>
-        <w:ind w:left="432" w:right="216"/>
+        <w:ind w:left="288" w:right="0"/>
       </w:pPr>
       <w:r>
         <w:rPr>
@@ -7162,6 +7213,7 @@
     <w:p>
       <w:pPr>
         <w:pStyle w:val="ListBullet"/>
+        <w:ind w:left="288"/>
       </w:pPr>
       <w:r>
         <w:rPr>
@@ -7187,6 +7239,7 @@
     <w:p>
       <w:pPr>
         <w:pStyle w:val="ListBullet"/>
+        <w:ind w:left="288"/>
       </w:pPr>
       <w:r>
         <w:rPr>
@@ -7212,6 +7265,7 @@
     <w:p>
       <w:pPr>
         <w:pStyle w:val="ListBullet"/>
+        <w:ind w:left="288"/>
       </w:pPr>
       <w:r>
         <w:rPr>
@@ -7237,6 +7291,7 @@
     <w:p>
       <w:pPr>
         <w:pStyle w:val="ListBullet"/>
+        <w:ind w:left="288"/>
       </w:pPr>
       <w:r>
         <w:rPr>
@@ -7275,7 +7330,7 @@
     <w:p>
       <w:pPr>
         <w:pStyle w:val="BlockQuote"/>
-        <w:ind w:left="432" w:right="216"/>
+        <w:ind w:left="288" w:right="0"/>
       </w:pPr>
       <w:r>
         <w:rPr>
@@ -7306,7 +7361,7 @@
     <w:p>
       <w:pPr>
         <w:pStyle w:val="BlockQuote"/>
-        <w:ind w:left="432" w:right="216"/>
+        <w:ind w:left="288" w:right="0"/>
       </w:pPr>
       <w:r>
         <w:rPr>
@@ -7337,6 +7392,7 @@
     <w:p>
       <w:pPr>
         <w:pStyle w:val="ListBullet"/>
+        <w:ind w:left="288"/>
       </w:pPr>
       <w:r>
         <w:rPr>
@@ -7352,6 +7408,7 @@
     <w:p>
       <w:pPr>
         <w:pStyle w:val="ListBullet"/>
+        <w:ind w:left="288"/>
       </w:pPr>
       <w:r>
         <w:rPr>
@@ -7367,6 +7424,7 @@
     <w:p>
       <w:pPr>
         <w:pStyle w:val="ListBullet"/>
+        <w:ind w:left="288"/>
       </w:pPr>
       <w:r>
         <w:rPr>
@@ -7526,7 +7584,7 @@
     <w:p>
       <w:pPr>
         <w:pStyle w:val="BlockQuote"/>
-        <w:ind w:left="432" w:right="216"/>
+        <w:ind w:left="288" w:right="0"/>
       </w:pPr>
       <w:r>
         <w:rPr>
@@ -7552,7 +7610,7 @@
     <w:p>
       <w:pPr>
         <w:pStyle w:val="BlockQuote"/>
-        <w:ind w:left="432" w:right="216"/>
+        <w:ind w:left="288" w:right="0"/>
       </w:pPr>
       <w:r>
         <w:rPr>
@@ -7578,7 +7636,7 @@
     <w:p>
       <w:pPr>
         <w:pStyle w:val="BlockQuote"/>
-        <w:ind w:left="432" w:right="216"/>
+        <w:ind w:left="288" w:right="0"/>
       </w:pPr>
       <w:r>
         <w:rPr>
@@ -7619,6 +7677,7 @@
     <w:p>
       <w:pPr>
         <w:pStyle w:val="ListBullet"/>
+        <w:ind w:left="288"/>
       </w:pPr>
       <w:r>
         <w:rPr>
@@ -7634,6 +7693,7 @@
     <w:p>
       <w:pPr>
         <w:pStyle w:val="ListBullet"/>
+        <w:ind w:left="288"/>
       </w:pPr>
       <w:r>
         <w:rPr>
@@ -7649,6 +7709,7 @@
     <w:p>
       <w:pPr>
         <w:pStyle w:val="ListBullet"/>
+        <w:ind w:left="288"/>
       </w:pPr>
       <w:r>
         <w:rPr>
@@ -7664,6 +7725,7 @@
     <w:p>
       <w:pPr>
         <w:pStyle w:val="ListBullet"/>
+        <w:ind w:left="288"/>
       </w:pPr>
       <w:r>
         <w:rPr>
@@ -7891,7 +7953,7 @@
     <w:p>
       <w:pPr>
         <w:pStyle w:val="BlockQuote"/>
-        <w:ind w:left="432" w:right="216"/>
+        <w:ind w:left="288" w:right="0"/>
       </w:pPr>
       <w:r>
         <w:rPr>
@@ -7907,7 +7969,7 @@
     <w:p>
       <w:pPr>
         <w:pStyle w:val="BlockQuote"/>
-        <w:ind w:left="432" w:right="216"/>
+        <w:ind w:left="288" w:right="0"/>
       </w:pPr>
       <w:r>
         <w:rPr>
@@ -7938,7 +8000,7 @@
     <w:p>
       <w:pPr>
         <w:pStyle w:val="BlockQuote"/>
-        <w:ind w:left="432" w:right="216"/>
+        <w:ind w:left="288" w:right="0"/>
       </w:pPr>
       <w:r>
         <w:rPr>
@@ -7969,6 +8031,7 @@
     <w:p>
       <w:pPr>
         <w:pStyle w:val="ListBullet"/>
+        <w:ind w:left="288"/>
       </w:pPr>
       <w:r>
         <w:rPr>
@@ -7984,6 +8047,7 @@
     <w:p>
       <w:pPr>
         <w:pStyle w:val="ListBullet"/>
+        <w:ind w:left="288"/>
       </w:pPr>
       <w:r>
         <w:rPr>
@@ -7999,6 +8063,7 @@
     <w:p>
       <w:pPr>
         <w:pStyle w:val="ListBullet"/>
+        <w:ind w:left="288"/>
       </w:pPr>
       <w:r>
         <w:rPr>
@@ -8014,6 +8079,7 @@
     <w:p>
       <w:pPr>
         <w:pStyle w:val="ListBullet"/>
+        <w:ind w:left="288"/>
       </w:pPr>
       <w:r>
         <w:rPr>
@@ -8498,6 +8564,7 @@
     <w:p>
       <w:pPr>
         <w:pStyle w:val="ListBullet"/>
+        <w:ind w:left="288"/>
       </w:pPr>
       <w:r>
         <w:rPr>
@@ -8513,6 +8580,7 @@
     <w:p>
       <w:pPr>
         <w:pStyle w:val="ListBullet"/>
+        <w:ind w:left="288"/>
       </w:pPr>
       <w:r>
         <w:rPr>
@@ -8528,6 +8596,7 @@
     <w:p>
       <w:pPr>
         <w:pStyle w:val="ListBullet"/>
+        <w:ind w:left="288"/>
       </w:pPr>
       <w:r>
         <w:rPr>
@@ -8543,6 +8612,7 @@
     <w:p>
       <w:pPr>
         <w:pStyle w:val="ListBullet"/>
+        <w:ind w:left="288"/>
       </w:pPr>
       <w:r>
         <w:rPr>
@@ -8584,7 +8654,7 @@
     <w:p>
       <w:pPr>
         <w:pStyle w:val="BlockQuote"/>
-        <w:ind w:left="432" w:right="216"/>
+        <w:ind w:left="288" w:right="0"/>
       </w:pPr>
       <w:r>
         <w:rPr>
@@ -8628,6 +8698,7 @@
     <w:p>
       <w:pPr>
         <w:pStyle w:val="ListBullet"/>
+        <w:ind w:left="288"/>
       </w:pPr>
       <w:r>
         <w:rPr>
@@ -8643,6 +8714,7 @@
     <w:p>
       <w:pPr>
         <w:pStyle w:val="ListBullet"/>
+        <w:ind w:left="288"/>
       </w:pPr>
       <w:r>
         <w:rPr>
@@ -8658,6 +8730,7 @@
     <w:p>
       <w:pPr>
         <w:pStyle w:val="ListBullet"/>
+        <w:ind w:left="288"/>
       </w:pPr>
       <w:r>
         <w:rPr>
@@ -8673,6 +8746,7 @@
     <w:p>
       <w:pPr>
         <w:pStyle w:val="ListBullet"/>
+        <w:ind w:left="288"/>
       </w:pPr>
       <w:r>
         <w:rPr>
@@ -8688,6 +8762,7 @@
     <w:p>
       <w:pPr>
         <w:pStyle w:val="ListBullet"/>
+        <w:ind w:left="288"/>
       </w:pPr>
       <w:r>
         <w:rPr>
@@ -9671,6 +9746,7 @@
     <w:p>
       <w:pPr>
         <w:pStyle w:val="ListBullet"/>
+        <w:ind w:left="288"/>
       </w:pPr>
       <w:r>
         <w:rPr>
@@ -9686,6 +9762,7 @@
     <w:p>
       <w:pPr>
         <w:pStyle w:val="ListBullet"/>
+        <w:ind w:left="288"/>
       </w:pPr>
       <w:r>
         <w:rPr>
@@ -9701,6 +9778,7 @@
     <w:p>
       <w:pPr>
         <w:pStyle w:val="ListBullet"/>
+        <w:ind w:left="288"/>
       </w:pPr>
       <w:r>
         <w:rPr>
@@ -9731,6 +9809,7 @@
     <w:p>
       <w:pPr>
         <w:pStyle w:val="ListBullet"/>
+        <w:ind w:left="288"/>
       </w:pPr>
       <w:r>
         <w:rPr>
@@ -9746,6 +9825,7 @@
     <w:p>
       <w:pPr>
         <w:pStyle w:val="ListBullet"/>
+        <w:ind w:left="288"/>
       </w:pPr>
       <w:r>
         <w:rPr>
@@ -9761,6 +9841,7 @@
     <w:p>
       <w:pPr>
         <w:pStyle w:val="ListBullet"/>
+        <w:ind w:left="288"/>
       </w:pPr>
       <w:r>
         <w:rPr>
@@ -9791,6 +9872,7 @@
     <w:p>
       <w:pPr>
         <w:pStyle w:val="ListBullet"/>
+        <w:ind w:left="288"/>
       </w:pPr>
       <w:r>
         <w:rPr>
@@ -9806,6 +9888,7 @@
     <w:p>
       <w:pPr>
         <w:pStyle w:val="ListBullet"/>
+        <w:ind w:left="288"/>
       </w:pPr>
       <w:r>
         <w:rPr>
@@ -9821,6 +9904,7 @@
     <w:p>
       <w:pPr>
         <w:pStyle w:val="ListBullet"/>
+        <w:ind w:left="288"/>
       </w:pPr>
       <w:r>
         <w:rPr>
@@ -9851,6 +9935,7 @@
     <w:p>
       <w:pPr>
         <w:pStyle w:val="ListBullet"/>
+        <w:ind w:left="288"/>
       </w:pPr>
       <w:r>
         <w:rPr>
@@ -9866,6 +9951,7 @@
     <w:p>
       <w:pPr>
         <w:pStyle w:val="ListBullet"/>
+        <w:ind w:left="288"/>
       </w:pPr>
       <w:r>
         <w:rPr>
@@ -9881,6 +9967,7 @@
     <w:p>
       <w:pPr>
         <w:pStyle w:val="ListBullet"/>
+        <w:ind w:left="288"/>
       </w:pPr>
       <w:r>
         <w:rPr>
@@ -9911,6 +9998,7 @@
     <w:p>
       <w:pPr>
         <w:pStyle w:val="ListBullet"/>
+        <w:ind w:left="288"/>
       </w:pPr>
       <w:r>
         <w:rPr>
@@ -9926,6 +10014,7 @@
     <w:p>
       <w:pPr>
         <w:pStyle w:val="ListBullet"/>
+        <w:ind w:left="288"/>
       </w:pPr>
       <w:r>
         <w:rPr>
@@ -9941,6 +10030,7 @@
     <w:p>
       <w:pPr>
         <w:pStyle w:val="ListBullet"/>
+        <w:ind w:left="288"/>
       </w:pPr>
       <w:r>
         <w:rPr>
@@ -10013,6 +10103,7 @@
     <w:p>
       <w:pPr>
         <w:pStyle w:val="ListBullet"/>
+        <w:ind w:left="288"/>
       </w:pPr>
       <w:r>
         <w:rPr>
@@ -10027,6 +10118,7 @@
     <w:p>
       <w:pPr>
         <w:pStyle w:val="ListBullet"/>
+        <w:ind w:left="288"/>
       </w:pPr>
       <w:r>
         <w:rPr>
@@ -10041,6 +10133,7 @@
     <w:p>
       <w:pPr>
         <w:pStyle w:val="ListBullet"/>
+        <w:ind w:left="288"/>
       </w:pPr>
       <w:r>
         <w:rPr>
@@ -10055,6 +10148,7 @@
     <w:p>
       <w:pPr>
         <w:pStyle w:val="ListBullet"/>
+        <w:ind w:left="288"/>
       </w:pPr>
       <w:r>
         <w:rPr>
@@ -10069,6 +10163,7 @@
     <w:p>
       <w:pPr>
         <w:pStyle w:val="ListBullet"/>
+        <w:ind w:left="288"/>
       </w:pPr>
       <w:r>
         <w:rPr>
@@ -10083,6 +10178,7 @@
     <w:p>
       <w:pPr>
         <w:pStyle w:val="ListBullet"/>
+        <w:ind w:left="288"/>
       </w:pPr>
       <w:r>
         <w:rPr>
@@ -10105,6 +10201,7 @@
     <w:p>
       <w:pPr>
         <w:pStyle w:val="ListBullet"/>
+        <w:ind w:left="288"/>
       </w:pPr>
       <w:r>
         <w:rPr>
@@ -10120,6 +10217,7 @@
     <w:p>
       <w:pPr>
         <w:pStyle w:val="ListBullet"/>
+        <w:ind w:left="288"/>
       </w:pPr>
       <w:r>
         <w:rPr>
@@ -10135,6 +10233,7 @@
     <w:p>
       <w:pPr>
         <w:pStyle w:val="ListBullet"/>
+        <w:ind w:left="288"/>
       </w:pPr>
       <w:r>
         <w:rPr>
@@ -10150,6 +10249,7 @@
     <w:p>
       <w:pPr>
         <w:pStyle w:val="ListBullet"/>
+        <w:ind w:left="288"/>
       </w:pPr>
       <w:r>
         <w:rPr>
@@ -10165,6 +10265,7 @@
     <w:p>
       <w:pPr>
         <w:pStyle w:val="ListBullet"/>
+        <w:ind w:left="288"/>
       </w:pPr>
       <w:r>
         <w:rPr>
@@ -10180,6 +10281,7 @@
     <w:p>
       <w:pPr>
         <w:pStyle w:val="ListBullet"/>
+        <w:ind w:left="288"/>
       </w:pPr>
       <w:r>
         <w:rPr>
@@ -11310,7 +11412,7 @@
         <w:numId w:val="1"/>
       </w:numPr>
       <w:spacing w:before="40" w:after="40" w:line="240" w:lineRule="auto"/>
-      <w:ind w:left="576" w:hanging="288"/>
+      <w:ind w:left="288" w:hanging="288"/>
       <w:contextualSpacing/>
     </w:pPr>
     <w:rPr>
@@ -22476,7 +22578,7 @@
     <w:name w:val="Block Quote"/>
     <w:pPr>
       <w:spacing w:before="80" w:after="80" w:line="240" w:lineRule="auto"/>
-      <w:ind w:left="720" w:firstLine="0"/>
+      <w:ind w:left="288" w:firstLine="0" w:right="0"/>
     </w:pPr>
     <w:rPr>
       <w:rFonts w:ascii="Georgia" w:hAnsi="Georgia"/>

</xml_diff>

<commit_message>
Fix: remove numbering.xml entirely - no more Word-generated bullets
</commit_message>
<xml_diff>
--- a/kdp-files/difficult_conversations_ebook.docx
+++ b/kdp-files/difficult_conversations_ebook.docx
@@ -10401,209 +10401,6 @@
     </w:sectPr>
   </w:body>
 </w:document>
-</file>
-
-<file path=word/numbering.xml><?xml version="1.0" encoding="utf-8"?>
-<w:numbering xmlns:wpc="http://schemas.microsoft.com/office/word/2010/wordprocessingCanvas" xmlns:mo="http://schemas.microsoft.com/office/mac/office/2008/main" xmlns:mc="http://schemas.openxmlformats.org/markup-compatibility/2006" xmlns:mv="urn:schemas-microsoft-com:mac:vml" xmlns:o="urn:schemas-microsoft-com:office:office" xmlns:r="http://schemas.openxmlformats.org/officeDocument/2006/relationships" xmlns:m="http://schemas.openxmlformats.org/officeDocument/2006/math" xmlns:v="urn:schemas-microsoft-com:vml" xmlns:wp14="http://schemas.microsoft.com/office/word/2010/wordprocessingDrawing" xmlns:wp="http://schemas.openxmlformats.org/drawingml/2006/wordprocessingDrawing" xmlns:w10="urn:schemas-microsoft-com:office:word" xmlns:w="http://schemas.openxmlformats.org/wordprocessingml/2006/main" xmlns:w14="http://schemas.microsoft.com/office/word/2010/wordml" xmlns:wpg="http://schemas.microsoft.com/office/word/2010/wordprocessingGroup" xmlns:wpi="http://schemas.microsoft.com/office/word/2010/wordprocessingInk" xmlns:wne="http://schemas.microsoft.com/office/word/2006/wordml" xmlns:wps="http://schemas.microsoft.com/office/word/2010/wordprocessingShape" mc:Ignorable="w14 wp14">
-  <w:abstractNum w:abstractNumId="0">
-    <w:nsid w:val="FFFFFF7C"/>
-    <w:multiLevelType w:val="singleLevel"/>
-    <w:tmpl w:val="C310EC42"/>
-    <w:lvl w:ilvl="0">
-      <w:start w:val="1"/>
-      <w:numFmt w:val="decimal"/>
-      <w:lvlText w:val="%1."/>
-      <w:lvlJc w:val="left"/>
-      <w:pPr>
-        <w:tabs>
-          <w:tab w:val="num" w:pos="1800"/>
-        </w:tabs>
-        <w:ind w:left="1800" w:hanging="360"/>
-      </w:pPr>
-    </w:lvl>
-  </w:abstractNum>
-  <w:abstractNum w:abstractNumId="1">
-    <w:nsid w:val="FFFFFF7D"/>
-    <w:multiLevelType w:val="singleLevel"/>
-    <w:tmpl w:val="E4089024"/>
-    <w:lvl w:ilvl="0">
-      <w:start w:val="1"/>
-      <w:numFmt w:val="decimal"/>
-      <w:lvlText w:val="%1."/>
-      <w:lvlJc w:val="left"/>
-      <w:pPr>
-        <w:tabs>
-          <w:tab w:val="num" w:pos="1440"/>
-        </w:tabs>
-        <w:ind w:left="1440" w:hanging="360"/>
-      </w:pPr>
-    </w:lvl>
-  </w:abstractNum>
-  <w:abstractNum w:abstractNumId="2">
-    <w:nsid w:val="FFFFFF7E"/>
-    <w:multiLevelType w:val="singleLevel"/>
-    <w:tmpl w:val="FB12693A"/>
-    <w:lvl w:ilvl="0">
-      <w:start w:val="1"/>
-      <w:numFmt w:val="decimal"/>
-      <w:pStyle w:val="ListNumber3"/>
-      <w:lvlText w:val="%1."/>
-      <w:lvlJc w:val="left"/>
-      <w:pPr>
-        <w:tabs>
-          <w:tab w:val="num" w:pos="1080"/>
-        </w:tabs>
-        <w:ind w:left="1080" w:hanging="360"/>
-      </w:pPr>
-    </w:lvl>
-  </w:abstractNum>
-  <w:abstractNum w:abstractNumId="3">
-    <w:nsid w:val="FFFFFF7F"/>
-    <w:multiLevelType w:val="singleLevel"/>
-    <w:tmpl w:val="38441652"/>
-    <w:lvl w:ilvl="0">
-      <w:start w:val="1"/>
-      <w:numFmt w:val="decimal"/>
-      <w:pStyle w:val="ListNumber2"/>
-      <w:lvlText w:val="%1."/>
-      <w:lvlJc w:val="left"/>
-      <w:pPr>
-        <w:tabs>
-          <w:tab w:val="num" w:pos="720"/>
-        </w:tabs>
-        <w:ind w:left="720" w:hanging="360"/>
-      </w:pPr>
-    </w:lvl>
-  </w:abstractNum>
-  <w:abstractNum w:abstractNumId="4">
-    <w:nsid w:val="FFFFFF81"/>
-    <w:multiLevelType w:val="singleLevel"/>
-    <w:tmpl w:val="171AC3A4"/>
-    <w:lvl w:ilvl="0">
-      <w:start w:val="1"/>
-      <w:numFmt w:val="bullet"/>
-      <w:lvlText w:val=""/>
-      <w:lvlJc w:val="left"/>
-      <w:pPr>
-        <w:tabs>
-          <w:tab w:val="num" w:pos="1440"/>
-        </w:tabs>
-        <w:ind w:left="1440" w:hanging="360"/>
-      </w:pPr>
-      <w:rPr>
-        <w:rFonts w:ascii="Symbol" w:hAnsi="Symbol" w:hint="default"/>
-      </w:rPr>
-    </w:lvl>
-  </w:abstractNum>
-  <w:abstractNum w:abstractNumId="5">
-    <w:nsid w:val="FFFFFF82"/>
-    <w:multiLevelType w:val="singleLevel"/>
-    <w:tmpl w:val="F3EAFDEC"/>
-    <w:lvl w:ilvl="0">
-      <w:start w:val="1"/>
-      <w:numFmt w:val="bullet"/>
-      <w:pStyle w:val="ListBullet3"/>
-      <w:lvlText w:val=""/>
-      <w:lvlJc w:val="left"/>
-      <w:pPr>
-        <w:tabs>
-          <w:tab w:val="num" w:pos="1080"/>
-        </w:tabs>
-        <w:ind w:left="1080" w:hanging="360"/>
-      </w:pPr>
-      <w:rPr>
-        <w:rFonts w:ascii="Symbol" w:hAnsi="Symbol" w:hint="default"/>
-      </w:rPr>
-    </w:lvl>
-  </w:abstractNum>
-  <w:abstractNum w:abstractNumId="6">
-    <w:nsid w:val="FFFFFF83"/>
-    <w:multiLevelType w:val="singleLevel"/>
-    <w:tmpl w:val="3D1EFFD4"/>
-    <w:lvl w:ilvl="0">
-      <w:start w:val="1"/>
-      <w:numFmt w:val="bullet"/>
-      <w:pStyle w:val="ListBullet2"/>
-      <w:lvlText w:val=""/>
-      <w:lvlJc w:val="left"/>
-      <w:pPr>
-        <w:tabs>
-          <w:tab w:val="num" w:pos="720"/>
-        </w:tabs>
-        <w:ind w:left="720" w:hanging="360"/>
-      </w:pPr>
-      <w:rPr>
-        <w:rFonts w:ascii="Symbol" w:hAnsi="Symbol" w:hint="default"/>
-      </w:rPr>
-    </w:lvl>
-  </w:abstractNum>
-  <w:abstractNum w:abstractNumId="7">
-    <w:nsid w:val="FFFFFF88"/>
-    <w:multiLevelType w:val="singleLevel"/>
-    <w:tmpl w:val="D0A62B40"/>
-    <w:lvl w:ilvl="0">
-      <w:start w:val="1"/>
-      <w:numFmt w:val="decimal"/>
-      <w:pStyle w:val="ListNumber"/>
-      <w:lvlText w:val="%1."/>
-      <w:lvlJc w:val="left"/>
-      <w:pPr>
-        <w:tabs>
-          <w:tab w:val="num" w:pos="360"/>
-        </w:tabs>
-        <w:ind w:left="360" w:hanging="360"/>
-      </w:pPr>
-    </w:lvl>
-  </w:abstractNum>
-  <w:abstractNum w:abstractNumId="8">
-    <w:nsid w:val="FFFFFF89"/>
-    <w:multiLevelType w:val="singleLevel"/>
-    <w:tmpl w:val="29761A62"/>
-    <w:lvl w:ilvl="0">
-      <w:start w:val="1"/>
-      <w:numFmt w:val="bullet"/>
-      <w:pStyle w:val="ListBullet"/>
-      <w:lvlText w:val=""/>
-      <w:lvlJc w:val="left"/>
-      <w:pPr>
-        <w:tabs>
-          <w:tab w:val="num" w:pos="360"/>
-        </w:tabs>
-        <w:ind w:left="360" w:hanging="360"/>
-      </w:pPr>
-      <w:rPr>
-        <w:rFonts w:ascii="Symbol" w:hAnsi="Symbol" w:hint="default"/>
-      </w:rPr>
-    </w:lvl>
-  </w:abstractNum>
-  <w:num w:numId="1">
-    <w:abstractNumId w:val="8"/>
-  </w:num>
-  <w:num w:numId="2">
-    <w:abstractNumId w:val="6"/>
-  </w:num>
-  <w:num w:numId="3">
-    <w:abstractNumId w:val="5"/>
-  </w:num>
-  <w:num w:numId="4">
-    <w:abstractNumId w:val="4"/>
-  </w:num>
-  <w:num w:numId="5">
-    <w:abstractNumId w:val="7"/>
-  </w:num>
-  <w:num w:numId="6">
-    <w:abstractNumId w:val="3"/>
-  </w:num>
-  <w:num w:numId="7">
-    <w:abstractNumId w:val="2"/>
-  </w:num>
-  <w:num w:numId="8">
-    <w:abstractNumId w:val="1"/>
-  </w:num>
-  <w:num w:numId="9">
-    <w:abstractNumId w:val="0"/>
-  </w:num>
-</w:numbering>
 </file>
 
 <file path=word/styles.xml><?xml version="1.0" encoding="utf-8"?>

</xml_diff>

<commit_message>
Fix: rebuild all indents from scratch at XML level - single unified indent
</commit_message>
<xml_diff>
--- a/kdp-files/difficult_conversations_ebook.docx
+++ b/kdp-files/difficult_conversations_ebook.docx
@@ -672,7 +672,7 @@
     </w:p>
     <w:p>
       <w:pPr>
-        <w:ind w:left="288" w:hanging="0"/>
+        <w:ind w:left="288"/>
       </w:pPr>
       <w:r>
         <w:rPr>
@@ -697,7 +697,7 @@
     </w:p>
     <w:p>
       <w:pPr>
-        <w:ind w:left="288" w:hanging="0"/>
+        <w:ind w:left="288"/>
       </w:pPr>
       <w:r>
         <w:rPr>
@@ -722,7 +722,7 @@
     </w:p>
     <w:p>
       <w:pPr>
-        <w:ind w:left="288" w:hanging="0"/>
+        <w:ind w:left="288"/>
       </w:pPr>
       <w:r>
         <w:rPr>
@@ -747,7 +747,7 @@
     </w:p>
     <w:p>
       <w:pPr>
-        <w:ind w:left="288" w:hanging="0"/>
+        <w:ind w:left="288"/>
       </w:pPr>
       <w:r>
         <w:rPr>
@@ -772,7 +772,7 @@
     </w:p>
     <w:p>
       <w:pPr>
-        <w:ind w:left="288" w:hanging="0"/>
+        <w:ind w:left="288"/>
       </w:pPr>
       <w:r>
         <w:rPr>
@@ -1006,7 +1006,7 @@
     </w:p>
     <w:p>
       <w:pPr>
-        <w:ind w:left="288" w:hanging="0"/>
+        <w:ind w:left="288"/>
       </w:pPr>
       <w:r>
         <w:rPr>
@@ -1031,7 +1031,7 @@
     </w:p>
     <w:p>
       <w:pPr>
-        <w:ind w:left="288" w:hanging="0"/>
+        <w:ind w:left="288"/>
       </w:pPr>
       <w:r>
         <w:rPr>
@@ -1056,7 +1056,7 @@
     </w:p>
     <w:p>
       <w:pPr>
-        <w:ind w:left="288" w:hanging="0"/>
+        <w:ind w:left="288"/>
       </w:pPr>
       <w:r>
         <w:rPr>
@@ -1081,7 +1081,7 @@
     </w:p>
     <w:p>
       <w:pPr>
-        <w:ind w:left="288" w:hanging="0"/>
+        <w:ind w:left="288"/>
       </w:pPr>
       <w:r>
         <w:rPr>
@@ -1140,7 +1140,7 @@
     </w:p>
     <w:p>
       <w:pPr>
-        <w:ind w:left="288" w:hanging="0"/>
+        <w:ind w:left="288"/>
       </w:pPr>
       <w:r>
         <w:rPr>
@@ -1165,7 +1165,7 @@
     </w:p>
     <w:p>
       <w:pPr>
-        <w:ind w:left="288" w:hanging="0"/>
+        <w:ind w:left="288"/>
       </w:pPr>
       <w:r>
         <w:rPr>
@@ -1190,7 +1190,7 @@
     </w:p>
     <w:p>
       <w:pPr>
-        <w:ind w:left="288" w:hanging="0"/>
+        <w:ind w:left="288"/>
       </w:pPr>
       <w:r>
         <w:rPr>
@@ -1215,7 +1215,7 @@
     </w:p>
     <w:p>
       <w:pPr>
-        <w:ind w:left="288" w:hanging="0"/>
+        <w:ind w:left="288"/>
       </w:pPr>
       <w:r>
         <w:rPr>
@@ -1240,7 +1240,7 @@
     </w:p>
     <w:p>
       <w:pPr>
-        <w:ind w:left="288" w:hanging="0"/>
+        <w:ind w:left="288"/>
       </w:pPr>
       <w:r>
         <w:rPr>
@@ -1469,7 +1469,7 @@
     </w:p>
     <w:p>
       <w:pPr>
-        <w:ind w:left="288" w:hanging="0"/>
+        <w:ind w:left="288"/>
       </w:pPr>
       <w:r>
         <w:rPr>
@@ -1494,7 +1494,7 @@
     </w:p>
     <w:p>
       <w:pPr>
-        <w:ind w:left="288" w:hanging="0"/>
+        <w:ind w:left="288"/>
       </w:pPr>
       <w:r>
         <w:rPr>
@@ -1539,7 +1539,7 @@
     </w:p>
     <w:p>
       <w:pPr>
-        <w:ind w:left="288" w:hanging="0"/>
+        <w:ind w:left="288"/>
       </w:pPr>
       <w:r>
         <w:rPr>
@@ -1579,7 +1579,7 @@
     </w:p>
     <w:p>
       <w:pPr>
-        <w:ind w:left="288" w:hanging="0"/>
+        <w:ind w:left="288"/>
       </w:pPr>
       <w:r>
         <w:rPr>
@@ -1594,7 +1594,7 @@
     </w:p>
     <w:p>
       <w:pPr>
-        <w:ind w:left="288" w:hanging="0"/>
+        <w:ind w:left="288"/>
       </w:pPr>
       <w:r>
         <w:rPr>
@@ -1609,7 +1609,7 @@
     </w:p>
     <w:p>
       <w:pPr>
-        <w:ind w:left="288" w:hanging="0"/>
+        <w:ind w:left="288"/>
       </w:pPr>
       <w:r>
         <w:rPr>
@@ -1673,7 +1673,7 @@
     </w:p>
     <w:p>
       <w:pPr>
-        <w:ind w:left="288" w:hanging="0"/>
+        <w:ind w:left="288"/>
       </w:pPr>
       <w:r>
         <w:rPr>
@@ -1698,7 +1698,7 @@
     </w:p>
     <w:p>
       <w:pPr>
-        <w:ind w:left="288" w:hanging="0"/>
+        <w:ind w:left="288"/>
       </w:pPr>
       <w:r>
         <w:rPr>
@@ -1723,7 +1723,7 @@
     </w:p>
     <w:p>
       <w:pPr>
-        <w:ind w:left="288" w:hanging="0"/>
+        <w:ind w:left="288"/>
       </w:pPr>
       <w:r>
         <w:rPr>
@@ -1748,7 +1748,7 @@
     </w:p>
     <w:p>
       <w:pPr>
-        <w:ind w:left="288" w:hanging="0"/>
+        <w:ind w:left="288"/>
       </w:pPr>
       <w:r>
         <w:rPr>
@@ -1895,7 +1895,7 @@
     </w:p>
     <w:p>
       <w:pPr>
-        <w:ind w:left="288" w:hanging="0"/>
+        <w:ind w:left="288"/>
       </w:pPr>
       <w:r>
         <w:rPr>
@@ -1910,7 +1910,7 @@
     </w:p>
     <w:p>
       <w:pPr>
-        <w:ind w:left="288" w:hanging="0"/>
+        <w:ind w:left="288"/>
       </w:pPr>
       <w:r>
         <w:rPr>
@@ -1925,7 +1925,7 @@
     </w:p>
     <w:p>
       <w:pPr>
-        <w:ind w:left="288" w:hanging="0"/>
+        <w:ind w:left="288"/>
       </w:pPr>
       <w:r>
         <w:rPr>
@@ -1955,7 +1955,7 @@
     </w:p>
     <w:p>
       <w:pPr>
-        <w:ind w:left="288" w:hanging="0"/>
+        <w:ind w:left="288"/>
       </w:pPr>
       <w:r>
         <w:rPr>
@@ -1970,7 +1970,7 @@
     </w:p>
     <w:p>
       <w:pPr>
-        <w:ind w:left="288" w:hanging="0"/>
+        <w:ind w:left="288"/>
       </w:pPr>
       <w:r>
         <w:rPr>
@@ -1985,7 +1985,7 @@
     </w:p>
     <w:p>
       <w:pPr>
-        <w:ind w:left="288" w:hanging="0"/>
+        <w:ind w:left="288"/>
       </w:pPr>
       <w:r>
         <w:rPr>
@@ -2338,7 +2338,7 @@
     </w:p>
     <w:p>
       <w:pPr>
-        <w:ind w:left="288" w:hanging="0"/>
+        <w:ind w:left="288"/>
       </w:pPr>
       <w:r>
         <w:rPr>
@@ -2353,7 +2353,7 @@
     </w:p>
     <w:p>
       <w:pPr>
-        <w:ind w:left="288" w:hanging="0"/>
+        <w:ind w:left="288"/>
       </w:pPr>
       <w:r>
         <w:rPr>
@@ -2368,7 +2368,7 @@
     </w:p>
     <w:p>
       <w:pPr>
-        <w:ind w:left="288" w:hanging="0"/>
+        <w:ind w:left="288"/>
       </w:pPr>
       <w:r>
         <w:rPr>
@@ -2383,7 +2383,7 @@
     </w:p>
     <w:p>
       <w:pPr>
-        <w:ind w:left="288" w:hanging="0"/>
+        <w:ind w:left="288"/>
       </w:pPr>
       <w:r>
         <w:rPr>
@@ -2557,7 +2557,7 @@
     <w:p>
       <w:pPr>
         <w:pStyle w:val="BlockQuote"/>
-        <w:ind w:left="288" w:right="0"/>
+        <w:ind w:left="288"/>
       </w:pPr>
       <w:r>
         <w:rPr>
@@ -2588,7 +2588,7 @@
     <w:p>
       <w:pPr>
         <w:pStyle w:val="BlockQuote"/>
-        <w:ind w:left="288" w:right="0"/>
+        <w:ind w:left="288"/>
       </w:pPr>
       <w:r>
         <w:rPr>
@@ -2632,7 +2632,7 @@
     <w:p>
       <w:pPr>
         <w:pStyle w:val="BlockQuote"/>
-        <w:ind w:left="288" w:right="0"/>
+        <w:ind w:left="288"/>
       </w:pPr>
       <w:r>
         <w:rPr>
@@ -2663,7 +2663,7 @@
     <w:p>
       <w:pPr>
         <w:pStyle w:val="BlockQuote"/>
-        <w:ind w:left="288" w:right="0"/>
+        <w:ind w:left="288"/>
       </w:pPr>
       <w:r>
         <w:rPr>
@@ -2694,7 +2694,7 @@
     <w:p>
       <w:pPr>
         <w:pStyle w:val="BlockQuote"/>
-        <w:ind w:left="288" w:right="0"/>
+        <w:ind w:left="288"/>
       </w:pPr>
       <w:r>
         <w:rPr>
@@ -2717,7 +2717,6 @@
     </w:p>
     <w:p>
       <w:pPr>
-        <w:pStyle w:val="Normal"/>
         <w:ind w:left="288"/>
       </w:pPr>
       <w:r>
@@ -2733,7 +2732,6 @@
     </w:p>
     <w:p>
       <w:pPr>
-        <w:pStyle w:val="Normal"/>
         <w:ind w:left="288"/>
       </w:pPr>
       <w:r>
@@ -2749,7 +2747,6 @@
     </w:p>
     <w:p>
       <w:pPr>
-        <w:pStyle w:val="Normal"/>
         <w:ind w:left="288"/>
       </w:pPr>
       <w:r>
@@ -2765,7 +2762,6 @@
     </w:p>
     <w:p>
       <w:pPr>
-        <w:pStyle w:val="Normal"/>
         <w:ind w:left="288"/>
       </w:pPr>
       <w:r>
@@ -2781,7 +2777,6 @@
     </w:p>
     <w:p>
       <w:pPr>
-        <w:pStyle w:val="Normal"/>
         <w:ind w:left="288"/>
       </w:pPr>
       <w:r>
@@ -3015,7 +3010,7 @@
     <w:p>
       <w:pPr>
         <w:pStyle w:val="BlockQuote"/>
-        <w:ind w:left="288" w:right="0"/>
+        <w:ind w:left="288"/>
       </w:pPr>
       <w:r>
         <w:rPr>
@@ -3046,7 +3041,7 @@
     <w:p>
       <w:pPr>
         <w:pStyle w:val="BlockQuote"/>
-        <w:ind w:left="288" w:right="0"/>
+        <w:ind w:left="288"/>
       </w:pPr>
       <w:r>
         <w:rPr>
@@ -3077,7 +3072,7 @@
     <w:p>
       <w:pPr>
         <w:pStyle w:val="BlockQuote"/>
-        <w:ind w:left="288" w:right="0"/>
+        <w:ind w:left="288"/>
       </w:pPr>
       <w:r>
         <w:rPr>
@@ -3108,7 +3103,7 @@
     <w:p>
       <w:pPr>
         <w:pStyle w:val="BlockQuote"/>
-        <w:ind w:left="288" w:right="0"/>
+        <w:ind w:left="288"/>
       </w:pPr>
       <w:r>
         <w:rPr>
@@ -3139,7 +3134,7 @@
     <w:p>
       <w:pPr>
         <w:pStyle w:val="BlockQuote"/>
-        <w:ind w:left="288" w:right="0"/>
+        <w:ind w:left="288"/>
       </w:pPr>
       <w:r>
         <w:rPr>
@@ -3162,7 +3157,6 @@
     </w:p>
     <w:p>
       <w:pPr>
-        <w:pStyle w:val="Normal"/>
         <w:ind w:left="288"/>
       </w:pPr>
       <w:r>
@@ -3178,7 +3172,6 @@
     </w:p>
     <w:p>
       <w:pPr>
-        <w:pStyle w:val="Normal"/>
         <w:ind w:left="288"/>
       </w:pPr>
       <w:r>
@@ -3194,7 +3187,6 @@
     </w:p>
     <w:p>
       <w:pPr>
-        <w:pStyle w:val="Normal"/>
         <w:ind w:left="288"/>
       </w:pPr>
       <w:r>
@@ -3210,7 +3202,6 @@
     </w:p>
     <w:p>
       <w:pPr>
-        <w:pStyle w:val="Normal"/>
         <w:ind w:left="288"/>
       </w:pPr>
       <w:r>
@@ -3226,7 +3217,6 @@
     </w:p>
     <w:p>
       <w:pPr>
-        <w:pStyle w:val="Normal"/>
         <w:ind w:left="288"/>
       </w:pPr>
       <w:r>
@@ -3498,7 +3488,7 @@
     <w:p>
       <w:pPr>
         <w:pStyle w:val="BlockQuote"/>
-        <w:ind w:left="288" w:right="0"/>
+        <w:ind w:left="288"/>
       </w:pPr>
       <w:r>
         <w:rPr>
@@ -3529,7 +3519,7 @@
     <w:p>
       <w:pPr>
         <w:pStyle w:val="BlockQuote"/>
-        <w:ind w:left="288" w:right="0"/>
+        <w:ind w:left="288"/>
       </w:pPr>
       <w:r>
         <w:rPr>
@@ -3567,7 +3557,7 @@
     </w:p>
     <w:p>
       <w:pPr>
-        <w:ind w:left="288" w:hanging="0"/>
+        <w:ind w:left="288"/>
       </w:pPr>
       <w:r>
         <w:rPr>
@@ -3582,7 +3572,7 @@
     </w:p>
     <w:p>
       <w:pPr>
-        <w:ind w:left="288" w:hanging="0"/>
+        <w:ind w:left="288"/>
       </w:pPr>
       <w:r>
         <w:rPr>
@@ -3597,7 +3587,7 @@
     </w:p>
     <w:p>
       <w:pPr>
-        <w:ind w:left="288" w:hanging="0"/>
+        <w:ind w:left="288"/>
       </w:pPr>
       <w:r>
         <w:rPr>
@@ -3612,7 +3602,7 @@
     </w:p>
     <w:p>
       <w:pPr>
-        <w:ind w:left="288" w:hanging="0"/>
+        <w:ind w:left="288"/>
       </w:pPr>
       <w:r>
         <w:rPr>
@@ -3627,7 +3617,7 @@
     </w:p>
     <w:p>
       <w:pPr>
-        <w:ind w:left="288" w:hanging="0"/>
+        <w:ind w:left="288"/>
       </w:pPr>
       <w:r>
         <w:rPr>
@@ -3642,7 +3632,7 @@
     </w:p>
     <w:p>
       <w:pPr>
-        <w:ind w:left="288" w:hanging="0"/>
+        <w:ind w:left="288"/>
       </w:pPr>
       <w:r>
         <w:rPr>
@@ -3658,7 +3648,7 @@
     <w:p>
       <w:pPr>
         <w:pStyle w:val="BlockQuote"/>
-        <w:ind w:left="288" w:right="0"/>
+        <w:ind w:left="288"/>
       </w:pPr>
       <w:r>
         <w:rPr>
@@ -3689,7 +3679,7 @@
     <w:p>
       <w:pPr>
         <w:pStyle w:val="BlockQuote"/>
-        <w:ind w:left="288" w:right="0"/>
+        <w:ind w:left="288"/>
       </w:pPr>
       <w:r>
         <w:rPr>
@@ -3712,7 +3702,6 @@
     </w:p>
     <w:p>
       <w:pPr>
-        <w:pStyle w:val="Normal"/>
         <w:ind w:left="288"/>
       </w:pPr>
       <w:r>
@@ -3728,7 +3717,6 @@
     </w:p>
     <w:p>
       <w:pPr>
-        <w:pStyle w:val="Normal"/>
         <w:ind w:left="288"/>
       </w:pPr>
       <w:r>
@@ -3744,7 +3732,6 @@
     </w:p>
     <w:p>
       <w:pPr>
-        <w:pStyle w:val="Normal"/>
         <w:ind w:left="288"/>
       </w:pPr>
       <w:r>
@@ -3760,7 +3747,6 @@
     </w:p>
     <w:p>
       <w:pPr>
-        <w:pStyle w:val="Normal"/>
         <w:ind w:left="288"/>
       </w:pPr>
       <w:r>
@@ -3776,7 +3762,6 @@
     </w:p>
     <w:p>
       <w:pPr>
-        <w:pStyle w:val="Normal"/>
         <w:ind w:left="288"/>
       </w:pPr>
       <w:r>
@@ -4073,7 +4058,7 @@
     <w:p>
       <w:pPr>
         <w:pStyle w:val="BlockQuote"/>
-        <w:ind w:left="288" w:right="0"/>
+        <w:ind w:left="288"/>
       </w:pPr>
       <w:r>
         <w:rPr>
@@ -4104,7 +4089,7 @@
     <w:p>
       <w:pPr>
         <w:pStyle w:val="BlockQuote"/>
-        <w:ind w:left="288" w:right="0"/>
+        <w:ind w:left="288"/>
       </w:pPr>
       <w:r>
         <w:rPr>
@@ -4135,7 +4120,7 @@
     <w:p>
       <w:pPr>
         <w:pStyle w:val="BlockQuote"/>
-        <w:ind w:left="288" w:right="0"/>
+        <w:ind w:left="288"/>
       </w:pPr>
       <w:r>
         <w:rPr>
@@ -4166,7 +4151,7 @@
     <w:p>
       <w:pPr>
         <w:pStyle w:val="BlockQuote"/>
-        <w:ind w:left="288" w:right="0"/>
+        <w:ind w:left="288"/>
       </w:pPr>
       <w:r>
         <w:rPr>
@@ -4197,7 +4182,7 @@
     <w:p>
       <w:pPr>
         <w:pStyle w:val="BlockQuote"/>
-        <w:ind w:left="288" w:right="0"/>
+        <w:ind w:left="288"/>
       </w:pPr>
       <w:r>
         <w:rPr>
@@ -4220,7 +4205,6 @@
     </w:p>
     <w:p>
       <w:pPr>
-        <w:pStyle w:val="Normal"/>
         <w:ind w:left="288"/>
       </w:pPr>
       <w:r>
@@ -4236,7 +4220,6 @@
     </w:p>
     <w:p>
       <w:pPr>
-        <w:pStyle w:val="Normal"/>
         <w:ind w:left="288"/>
       </w:pPr>
       <w:r>
@@ -4252,7 +4235,6 @@
     </w:p>
     <w:p>
       <w:pPr>
-        <w:pStyle w:val="Normal"/>
         <w:ind w:left="288"/>
       </w:pPr>
       <w:r>
@@ -4268,7 +4250,6 @@
     </w:p>
     <w:p>
       <w:pPr>
-        <w:pStyle w:val="Normal"/>
         <w:ind w:left="288"/>
       </w:pPr>
       <w:r>
@@ -4284,7 +4265,6 @@
     </w:p>
     <w:p>
       <w:pPr>
-        <w:pStyle w:val="Normal"/>
         <w:ind w:left="288"/>
       </w:pPr>
       <w:r>
@@ -4300,7 +4280,6 @@
     </w:p>
     <w:p>
       <w:pPr>
-        <w:pStyle w:val="Normal"/>
         <w:ind w:left="288"/>
       </w:pPr>
       <w:r>
@@ -4647,7 +4626,7 @@
     <w:p>
       <w:pPr>
         <w:pStyle w:val="BlockQuote"/>
-        <w:ind w:left="288" w:right="0"/>
+        <w:ind w:left="288"/>
       </w:pPr>
       <w:r>
         <w:rPr>
@@ -4691,7 +4670,7 @@
     <w:p>
       <w:pPr>
         <w:pStyle w:val="BlockQuote"/>
-        <w:ind w:left="288" w:right="0"/>
+        <w:ind w:left="288"/>
       </w:pPr>
       <w:r>
         <w:rPr>
@@ -4722,7 +4701,7 @@
     <w:p>
       <w:pPr>
         <w:pStyle w:val="BlockQuote"/>
-        <w:ind w:left="288" w:right="0"/>
+        <w:ind w:left="288"/>
       </w:pPr>
       <w:r>
         <w:rPr>
@@ -4753,7 +4732,7 @@
     <w:p>
       <w:pPr>
         <w:pStyle w:val="BlockQuote"/>
-        <w:ind w:left="288" w:right="0"/>
+        <w:ind w:left="288"/>
       </w:pPr>
       <w:r>
         <w:rPr>
@@ -4784,7 +4763,7 @@
     <w:p>
       <w:pPr>
         <w:pStyle w:val="BlockQuote"/>
-        <w:ind w:left="288" w:right="0"/>
+        <w:ind w:left="288"/>
       </w:pPr>
       <w:r>
         <w:rPr>
@@ -4807,7 +4786,6 @@
     </w:p>
     <w:p>
       <w:pPr>
-        <w:pStyle w:val="Normal"/>
         <w:ind w:left="288"/>
       </w:pPr>
       <w:r>
@@ -4823,7 +4801,6 @@
     </w:p>
     <w:p>
       <w:pPr>
-        <w:pStyle w:val="Normal"/>
         <w:ind w:left="288"/>
       </w:pPr>
       <w:r>
@@ -4839,7 +4816,6 @@
     </w:p>
     <w:p>
       <w:pPr>
-        <w:pStyle w:val="Normal"/>
         <w:ind w:left="288"/>
       </w:pPr>
       <w:r>
@@ -4855,7 +4831,6 @@
     </w:p>
     <w:p>
       <w:pPr>
-        <w:pStyle w:val="Normal"/>
         <w:ind w:left="288"/>
       </w:pPr>
       <w:r>
@@ -4871,7 +4846,6 @@
     </w:p>
     <w:p>
       <w:pPr>
-        <w:pStyle w:val="Normal"/>
         <w:ind w:left="288"/>
       </w:pPr>
       <w:r>
@@ -4887,7 +4861,6 @@
     </w:p>
     <w:p>
       <w:pPr>
-        <w:pStyle w:val="Normal"/>
         <w:ind w:left="288"/>
       </w:pPr>
       <w:r>
@@ -4937,7 +4910,7 @@
     </w:p>
     <w:p>
       <w:pPr>
-        <w:ind w:left="288" w:hanging="0"/>
+        <w:ind w:left="288"/>
       </w:pPr>
       <w:r>
         <w:rPr>
@@ -4962,7 +4935,7 @@
     </w:p>
     <w:p>
       <w:pPr>
-        <w:ind w:left="288" w:hanging="0"/>
+        <w:ind w:left="288"/>
       </w:pPr>
       <w:r>
         <w:rPr>
@@ -4987,7 +4960,7 @@
     </w:p>
     <w:p>
       <w:pPr>
-        <w:ind w:left="288" w:hanging="0"/>
+        <w:ind w:left="288"/>
       </w:pPr>
       <w:r>
         <w:rPr>
@@ -5219,7 +5192,7 @@
     <w:p>
       <w:pPr>
         <w:pStyle w:val="BlockQuote"/>
-        <w:ind w:left="288" w:right="0"/>
+        <w:ind w:left="288"/>
       </w:pPr>
       <w:r>
         <w:rPr>
@@ -5248,7 +5221,7 @@
     <w:p>
       <w:pPr>
         <w:pStyle w:val="BlockQuote"/>
-        <w:ind w:left="288" w:right="0"/>
+        <w:ind w:left="288"/>
       </w:pPr>
       <w:r>
         <w:rPr>
@@ -5279,7 +5252,7 @@
     <w:p>
       <w:pPr>
         <w:pStyle w:val="BlockQuote"/>
-        <w:ind w:left="288" w:right="0"/>
+        <w:ind w:left="288"/>
       </w:pPr>
       <w:r>
         <w:rPr>
@@ -5295,7 +5268,7 @@
     <w:p>
       <w:pPr>
         <w:pStyle w:val="BlockQuote"/>
-        <w:ind w:left="288" w:right="0"/>
+        <w:ind w:left="288"/>
       </w:pPr>
       <w:r>
         <w:rPr>
@@ -5324,7 +5297,7 @@
     <w:p>
       <w:pPr>
         <w:pStyle w:val="BlockQuote"/>
-        <w:ind w:left="288" w:right="0"/>
+        <w:ind w:left="288"/>
       </w:pPr>
       <w:r>
         <w:rPr>
@@ -5368,7 +5341,7 @@
     <w:p>
       <w:pPr>
         <w:pStyle w:val="BlockQuote"/>
-        <w:ind w:left="288" w:right="0"/>
+        <w:ind w:left="288"/>
       </w:pPr>
       <w:r>
         <w:rPr>
@@ -5399,7 +5372,7 @@
     <w:p>
       <w:pPr>
         <w:pStyle w:val="BlockQuote"/>
-        <w:ind w:left="288" w:right="0"/>
+        <w:ind w:left="288"/>
       </w:pPr>
       <w:r>
         <w:rPr>
@@ -5422,7 +5395,6 @@
     </w:p>
     <w:p>
       <w:pPr>
-        <w:pStyle w:val="Normal"/>
         <w:ind w:left="288"/>
       </w:pPr>
       <w:r>
@@ -5438,7 +5410,6 @@
     </w:p>
     <w:p>
       <w:pPr>
-        <w:pStyle w:val="Normal"/>
         <w:ind w:left="288"/>
       </w:pPr>
       <w:r>
@@ -5454,7 +5425,6 @@
     </w:p>
     <w:p>
       <w:pPr>
-        <w:pStyle w:val="Normal"/>
         <w:ind w:left="288"/>
       </w:pPr>
       <w:r>
@@ -5470,7 +5440,6 @@
     </w:p>
     <w:p>
       <w:pPr>
-        <w:pStyle w:val="Normal"/>
         <w:ind w:left="288"/>
       </w:pPr>
       <w:r>
@@ -5486,7 +5455,6 @@
     </w:p>
     <w:p>
       <w:pPr>
-        <w:pStyle w:val="Normal"/>
         <w:ind w:left="288"/>
       </w:pPr>
       <w:r>
@@ -5803,7 +5771,7 @@
     <w:p>
       <w:pPr>
         <w:pStyle w:val="BlockQuote"/>
-        <w:ind w:left="288" w:right="0"/>
+        <w:ind w:left="288"/>
       </w:pPr>
       <w:r>
         <w:rPr>
@@ -5857,7 +5825,7 @@
     <w:p>
       <w:pPr>
         <w:pStyle w:val="BlockQuote"/>
-        <w:ind w:left="288" w:right="0"/>
+        <w:ind w:left="288"/>
       </w:pPr>
       <w:r>
         <w:rPr>
@@ -5888,7 +5856,7 @@
     <w:p>
       <w:pPr>
         <w:pStyle w:val="BlockQuote"/>
-        <w:ind w:left="288" w:right="0"/>
+        <w:ind w:left="288"/>
       </w:pPr>
       <w:r>
         <w:rPr>
@@ -5932,7 +5900,7 @@
     <w:p>
       <w:pPr>
         <w:pStyle w:val="BlockQuote"/>
-        <w:ind w:left="288" w:right="0"/>
+        <w:ind w:left="288"/>
       </w:pPr>
       <w:r>
         <w:rPr>
@@ -5961,7 +5929,7 @@
     <w:p>
       <w:pPr>
         <w:pStyle w:val="BlockQuote"/>
-        <w:ind w:left="288" w:right="0"/>
+        <w:ind w:left="288"/>
       </w:pPr>
       <w:r>
         <w:rPr>
@@ -5990,7 +5958,7 @@
     <w:p>
       <w:pPr>
         <w:pStyle w:val="BlockQuote"/>
-        <w:ind w:left="288" w:right="0"/>
+        <w:ind w:left="288"/>
       </w:pPr>
       <w:r>
         <w:rPr>
@@ -6013,7 +5981,6 @@
     </w:p>
     <w:p>
       <w:pPr>
-        <w:pStyle w:val="Normal"/>
         <w:ind w:left="288"/>
       </w:pPr>
       <w:r>
@@ -6029,7 +5996,6 @@
     </w:p>
     <w:p>
       <w:pPr>
-        <w:pStyle w:val="Normal"/>
         <w:ind w:left="288"/>
       </w:pPr>
       <w:r>
@@ -6045,7 +6011,6 @@
     </w:p>
     <w:p>
       <w:pPr>
-        <w:pStyle w:val="Normal"/>
         <w:ind w:left="288"/>
       </w:pPr>
       <w:r>
@@ -6061,7 +6026,6 @@
     </w:p>
     <w:p>
       <w:pPr>
-        <w:pStyle w:val="Normal"/>
         <w:ind w:left="288"/>
       </w:pPr>
       <w:r>
@@ -6077,7 +6041,6 @@
     </w:p>
     <w:p>
       <w:pPr>
-        <w:pStyle w:val="Normal"/>
         <w:ind w:left="288"/>
       </w:pPr>
       <w:r>
@@ -6093,7 +6056,6 @@
     </w:p>
     <w:p>
       <w:pPr>
-        <w:pStyle w:val="Normal"/>
         <w:ind w:left="288"/>
       </w:pPr>
       <w:r>
@@ -6578,7 +6540,7 @@
     <w:p>
       <w:pPr>
         <w:pStyle w:val="BlockQuote"/>
-        <w:ind w:left="288" w:right="0"/>
+        <w:ind w:left="288"/>
       </w:pPr>
       <w:r>
         <w:rPr>
@@ -6604,7 +6566,7 @@
     <w:p>
       <w:pPr>
         <w:pStyle w:val="BlockQuote"/>
-        <w:ind w:left="288" w:right="0"/>
+        <w:ind w:left="288"/>
       </w:pPr>
       <w:r>
         <w:rPr>
@@ -6630,7 +6592,7 @@
     <w:p>
       <w:pPr>
         <w:pStyle w:val="BlockQuote"/>
-        <w:ind w:left="288" w:right="0"/>
+        <w:ind w:left="288"/>
       </w:pPr>
       <w:r>
         <w:rPr>
@@ -6656,7 +6618,7 @@
     <w:p>
       <w:pPr>
         <w:pStyle w:val="BlockQuote"/>
-        <w:ind w:left="288" w:right="0"/>
+        <w:ind w:left="288"/>
       </w:pPr>
       <w:r>
         <w:rPr>
@@ -6696,7 +6658,7 @@
     </w:p>
     <w:p>
       <w:pPr>
-        <w:ind w:left="288" w:hanging="0"/>
+        <w:ind w:left="288"/>
       </w:pPr>
       <w:r>
         <w:rPr>
@@ -6711,7 +6673,7 @@
     </w:p>
     <w:p>
       <w:pPr>
-        <w:ind w:left="288" w:hanging="0"/>
+        <w:ind w:left="288"/>
       </w:pPr>
       <w:r>
         <w:rPr>
@@ -6726,7 +6688,7 @@
     </w:p>
     <w:p>
       <w:pPr>
-        <w:ind w:left="288" w:hanging="0"/>
+        <w:ind w:left="288"/>
       </w:pPr>
       <w:r>
         <w:rPr>
@@ -6741,7 +6703,7 @@
     </w:p>
     <w:p>
       <w:pPr>
-        <w:ind w:left="288" w:hanging="0"/>
+        <w:ind w:left="288"/>
       </w:pPr>
       <w:r>
         <w:rPr>
@@ -6756,7 +6718,7 @@
     </w:p>
     <w:p>
       <w:pPr>
-        <w:ind w:left="288" w:hanging="0"/>
+        <w:ind w:left="288"/>
       </w:pPr>
       <w:r>
         <w:rPr>
@@ -6948,7 +6910,7 @@
     </w:p>
     <w:p>
       <w:pPr>
-        <w:ind w:left="288" w:hanging="0"/>
+        <w:ind w:left="288"/>
       </w:pPr>
       <w:r>
         <w:rPr>
@@ -6973,7 +6935,7 @@
     </w:p>
     <w:p>
       <w:pPr>
-        <w:ind w:left="288" w:hanging="0"/>
+        <w:ind w:left="288"/>
       </w:pPr>
       <w:r>
         <w:rPr>
@@ -6998,7 +6960,7 @@
     </w:p>
     <w:p>
       <w:pPr>
-        <w:ind w:left="288" w:hanging="0"/>
+        <w:ind w:left="288"/>
       </w:pPr>
       <w:r>
         <w:rPr>
@@ -7054,7 +7016,7 @@
     <w:p>
       <w:pPr>
         <w:pStyle w:val="BlockQuote"/>
-        <w:ind w:left="288" w:right="0"/>
+        <w:ind w:left="288"/>
       </w:pPr>
       <w:r>
         <w:rPr>
@@ -7108,7 +7070,7 @@
     <w:p>
       <w:pPr>
         <w:pStyle w:val="BlockQuote"/>
-        <w:ind w:left="288" w:right="0"/>
+        <w:ind w:left="288"/>
       </w:pPr>
       <w:r>
         <w:rPr>
@@ -7161,7 +7123,7 @@
     </w:p>
     <w:p>
       <w:pPr>
-        <w:ind w:left="288" w:hanging="0"/>
+        <w:ind w:left="288"/>
       </w:pPr>
       <w:r>
         <w:rPr>
@@ -7186,7 +7148,7 @@
     </w:p>
     <w:p>
       <w:pPr>
-        <w:ind w:left="288" w:hanging="0"/>
+        <w:ind w:left="288"/>
       </w:pPr>
       <w:r>
         <w:rPr>
@@ -7211,7 +7173,7 @@
     </w:p>
     <w:p>
       <w:pPr>
-        <w:ind w:left="288" w:hanging="0"/>
+        <w:ind w:left="288"/>
       </w:pPr>
       <w:r>
         <w:rPr>
@@ -7236,7 +7198,7 @@
     </w:p>
     <w:p>
       <w:pPr>
-        <w:ind w:left="288" w:hanging="0"/>
+        <w:ind w:left="288"/>
       </w:pPr>
       <w:r>
         <w:rPr>
@@ -7275,7 +7237,7 @@
     <w:p>
       <w:pPr>
         <w:pStyle w:val="BlockQuote"/>
-        <w:ind w:left="288" w:right="0"/>
+        <w:ind w:left="288"/>
       </w:pPr>
       <w:r>
         <w:rPr>
@@ -7306,7 +7268,7 @@
     <w:p>
       <w:pPr>
         <w:pStyle w:val="BlockQuote"/>
-        <w:ind w:left="288" w:right="0"/>
+        <w:ind w:left="288"/>
       </w:pPr>
       <w:r>
         <w:rPr>
@@ -7336,7 +7298,7 @@
     </w:p>
     <w:p>
       <w:pPr>
-        <w:ind w:left="288" w:hanging="0"/>
+        <w:ind w:left="288"/>
       </w:pPr>
       <w:r>
         <w:rPr>
@@ -7351,7 +7313,7 @@
     </w:p>
     <w:p>
       <w:pPr>
-        <w:ind w:left="288" w:hanging="0"/>
+        <w:ind w:left="288"/>
       </w:pPr>
       <w:r>
         <w:rPr>
@@ -7366,7 +7328,7 @@
     </w:p>
     <w:p>
       <w:pPr>
-        <w:ind w:left="288" w:hanging="0"/>
+        <w:ind w:left="288"/>
       </w:pPr>
       <w:r>
         <w:rPr>
@@ -7526,7 +7488,7 @@
     <w:p>
       <w:pPr>
         <w:pStyle w:val="BlockQuote"/>
-        <w:ind w:left="288" w:right="0"/>
+        <w:ind w:left="288"/>
       </w:pPr>
       <w:r>
         <w:rPr>
@@ -7552,7 +7514,7 @@
     <w:p>
       <w:pPr>
         <w:pStyle w:val="BlockQuote"/>
-        <w:ind w:left="288" w:right="0"/>
+        <w:ind w:left="288"/>
       </w:pPr>
       <w:r>
         <w:rPr>
@@ -7578,7 +7540,7 @@
     <w:p>
       <w:pPr>
         <w:pStyle w:val="BlockQuote"/>
-        <w:ind w:left="288" w:right="0"/>
+        <w:ind w:left="288"/>
       </w:pPr>
       <w:r>
         <w:rPr>
@@ -7618,7 +7580,7 @@
     </w:p>
     <w:p>
       <w:pPr>
-        <w:ind w:left="288" w:hanging="0"/>
+        <w:ind w:left="288"/>
       </w:pPr>
       <w:r>
         <w:rPr>
@@ -7633,7 +7595,7 @@
     </w:p>
     <w:p>
       <w:pPr>
-        <w:ind w:left="288" w:hanging="0"/>
+        <w:ind w:left="288"/>
       </w:pPr>
       <w:r>
         <w:rPr>
@@ -7648,7 +7610,7 @@
     </w:p>
     <w:p>
       <w:pPr>
-        <w:ind w:left="288" w:hanging="0"/>
+        <w:ind w:left="288"/>
       </w:pPr>
       <w:r>
         <w:rPr>
@@ -7663,7 +7625,7 @@
     </w:p>
     <w:p>
       <w:pPr>
-        <w:ind w:left="288" w:hanging="0"/>
+        <w:ind w:left="288"/>
       </w:pPr>
       <w:r>
         <w:rPr>
@@ -7891,7 +7853,7 @@
     <w:p>
       <w:pPr>
         <w:pStyle w:val="BlockQuote"/>
-        <w:ind w:left="288" w:right="0"/>
+        <w:ind w:left="288"/>
       </w:pPr>
       <w:r>
         <w:rPr>
@@ -7907,7 +7869,7 @@
     <w:p>
       <w:pPr>
         <w:pStyle w:val="BlockQuote"/>
-        <w:ind w:left="288" w:right="0"/>
+        <w:ind w:left="288"/>
       </w:pPr>
       <w:r>
         <w:rPr>
@@ -7938,7 +7900,7 @@
     <w:p>
       <w:pPr>
         <w:pStyle w:val="BlockQuote"/>
-        <w:ind w:left="288" w:right="0"/>
+        <w:ind w:left="288"/>
       </w:pPr>
       <w:r>
         <w:rPr>
@@ -7968,7 +7930,7 @@
     </w:p>
     <w:p>
       <w:pPr>
-        <w:ind w:left="288" w:hanging="0"/>
+        <w:ind w:left="288"/>
       </w:pPr>
       <w:r>
         <w:rPr>
@@ -7983,7 +7945,7 @@
     </w:p>
     <w:p>
       <w:pPr>
-        <w:ind w:left="288" w:hanging="0"/>
+        <w:ind w:left="288"/>
       </w:pPr>
       <w:r>
         <w:rPr>
@@ -7998,7 +7960,7 @@
     </w:p>
     <w:p>
       <w:pPr>
-        <w:ind w:left="288" w:hanging="0"/>
+        <w:ind w:left="288"/>
       </w:pPr>
       <w:r>
         <w:rPr>
@@ -8013,7 +7975,7 @@
     </w:p>
     <w:p>
       <w:pPr>
-        <w:ind w:left="288" w:hanging="0"/>
+        <w:ind w:left="288"/>
       </w:pPr>
       <w:r>
         <w:rPr>
@@ -8497,7 +8459,7 @@
     </w:p>
     <w:p>
       <w:pPr>
-        <w:ind w:left="288" w:hanging="0"/>
+        <w:ind w:left="288"/>
       </w:pPr>
       <w:r>
         <w:rPr>
@@ -8512,7 +8474,7 @@
     </w:p>
     <w:p>
       <w:pPr>
-        <w:ind w:left="288" w:hanging="0"/>
+        <w:ind w:left="288"/>
       </w:pPr>
       <w:r>
         <w:rPr>
@@ -8527,7 +8489,7 @@
     </w:p>
     <w:p>
       <w:pPr>
-        <w:ind w:left="288" w:hanging="0"/>
+        <w:ind w:left="288"/>
       </w:pPr>
       <w:r>
         <w:rPr>
@@ -8542,7 +8504,7 @@
     </w:p>
     <w:p>
       <w:pPr>
-        <w:ind w:left="288" w:hanging="0"/>
+        <w:ind w:left="288"/>
       </w:pPr>
       <w:r>
         <w:rPr>
@@ -8584,7 +8546,7 @@
     <w:p>
       <w:pPr>
         <w:pStyle w:val="BlockQuote"/>
-        <w:ind w:left="288" w:right="0"/>
+        <w:ind w:left="288"/>
       </w:pPr>
       <w:r>
         <w:rPr>
@@ -8627,7 +8589,7 @@
     </w:p>
     <w:p>
       <w:pPr>
-        <w:ind w:left="288" w:hanging="0"/>
+        <w:ind w:left="288"/>
       </w:pPr>
       <w:r>
         <w:rPr>
@@ -8642,7 +8604,7 @@
     </w:p>
     <w:p>
       <w:pPr>
-        <w:ind w:left="288" w:hanging="0"/>
+        <w:ind w:left="288"/>
       </w:pPr>
       <w:r>
         <w:rPr>
@@ -8657,7 +8619,7 @@
     </w:p>
     <w:p>
       <w:pPr>
-        <w:ind w:left="288" w:hanging="0"/>
+        <w:ind w:left="288"/>
       </w:pPr>
       <w:r>
         <w:rPr>
@@ -8672,7 +8634,7 @@
     </w:p>
     <w:p>
       <w:pPr>
-        <w:ind w:left="288" w:hanging="0"/>
+        <w:ind w:left="288"/>
       </w:pPr>
       <w:r>
         <w:rPr>
@@ -8687,7 +8649,7 @@
     </w:p>
     <w:p>
       <w:pPr>
-        <w:ind w:left="288" w:hanging="0"/>
+        <w:ind w:left="288"/>
       </w:pPr>
       <w:r>
         <w:rPr>
@@ -9670,7 +9632,7 @@
     </w:p>
     <w:p>
       <w:pPr>
-        <w:ind w:left="288" w:hanging="0"/>
+        <w:ind w:left="288"/>
       </w:pPr>
       <w:r>
         <w:rPr>
@@ -9685,7 +9647,7 @@
     </w:p>
     <w:p>
       <w:pPr>
-        <w:ind w:left="288" w:hanging="0"/>
+        <w:ind w:left="288"/>
       </w:pPr>
       <w:r>
         <w:rPr>
@@ -9700,7 +9662,7 @@
     </w:p>
     <w:p>
       <w:pPr>
-        <w:ind w:left="288" w:hanging="0"/>
+        <w:ind w:left="288"/>
       </w:pPr>
       <w:r>
         <w:rPr>
@@ -9730,7 +9692,7 @@
     </w:p>
     <w:p>
       <w:pPr>
-        <w:ind w:left="288" w:hanging="0"/>
+        <w:ind w:left="288"/>
       </w:pPr>
       <w:r>
         <w:rPr>
@@ -9745,7 +9707,7 @@
     </w:p>
     <w:p>
       <w:pPr>
-        <w:ind w:left="288" w:hanging="0"/>
+        <w:ind w:left="288"/>
       </w:pPr>
       <w:r>
         <w:rPr>
@@ -9760,7 +9722,7 @@
     </w:p>
     <w:p>
       <w:pPr>
-        <w:ind w:left="288" w:hanging="0"/>
+        <w:ind w:left="288"/>
       </w:pPr>
       <w:r>
         <w:rPr>
@@ -9790,7 +9752,7 @@
     </w:p>
     <w:p>
       <w:pPr>
-        <w:ind w:left="288" w:hanging="0"/>
+        <w:ind w:left="288"/>
       </w:pPr>
       <w:r>
         <w:rPr>
@@ -9805,7 +9767,7 @@
     </w:p>
     <w:p>
       <w:pPr>
-        <w:ind w:left="288" w:hanging="0"/>
+        <w:ind w:left="288"/>
       </w:pPr>
       <w:r>
         <w:rPr>
@@ -9820,7 +9782,7 @@
     </w:p>
     <w:p>
       <w:pPr>
-        <w:ind w:left="288" w:hanging="0"/>
+        <w:ind w:left="288"/>
       </w:pPr>
       <w:r>
         <w:rPr>
@@ -9850,7 +9812,7 @@
     </w:p>
     <w:p>
       <w:pPr>
-        <w:ind w:left="288" w:hanging="0"/>
+        <w:ind w:left="288"/>
       </w:pPr>
       <w:r>
         <w:rPr>
@@ -9865,7 +9827,7 @@
     </w:p>
     <w:p>
       <w:pPr>
-        <w:ind w:left="288" w:hanging="0"/>
+        <w:ind w:left="288"/>
       </w:pPr>
       <w:r>
         <w:rPr>
@@ -9880,7 +9842,7 @@
     </w:p>
     <w:p>
       <w:pPr>
-        <w:ind w:left="288" w:hanging="0"/>
+        <w:ind w:left="288"/>
       </w:pPr>
       <w:r>
         <w:rPr>
@@ -9910,7 +9872,7 @@
     </w:p>
     <w:p>
       <w:pPr>
-        <w:ind w:left="288" w:hanging="0"/>
+        <w:ind w:left="288"/>
       </w:pPr>
       <w:r>
         <w:rPr>
@@ -9925,7 +9887,7 @@
     </w:p>
     <w:p>
       <w:pPr>
-        <w:ind w:left="288" w:hanging="0"/>
+        <w:ind w:left="288"/>
       </w:pPr>
       <w:r>
         <w:rPr>
@@ -9940,7 +9902,7 @@
     </w:p>
     <w:p>
       <w:pPr>
-        <w:ind w:left="288" w:hanging="0"/>
+        <w:ind w:left="288"/>
       </w:pPr>
       <w:r>
         <w:rPr>
@@ -10012,7 +9974,7 @@
     </w:p>
     <w:p>
       <w:pPr>
-        <w:ind w:left="288" w:hanging="0"/>
+        <w:ind w:left="288"/>
       </w:pPr>
       <w:r>
         <w:rPr>
@@ -10026,7 +9988,7 @@
     </w:p>
     <w:p>
       <w:pPr>
-        <w:ind w:left="288" w:hanging="0"/>
+        <w:ind w:left="288"/>
       </w:pPr>
       <w:r>
         <w:rPr>
@@ -10040,7 +10002,7 @@
     </w:p>
     <w:p>
       <w:pPr>
-        <w:ind w:left="288" w:hanging="0"/>
+        <w:ind w:left="288"/>
       </w:pPr>
       <w:r>
         <w:rPr>
@@ -10054,7 +10016,7 @@
     </w:p>
     <w:p>
       <w:pPr>
-        <w:ind w:left="288" w:hanging="0"/>
+        <w:ind w:left="288"/>
       </w:pPr>
       <w:r>
         <w:rPr>
@@ -10068,7 +10030,7 @@
     </w:p>
     <w:p>
       <w:pPr>
-        <w:ind w:left="288" w:hanging="0"/>
+        <w:ind w:left="288"/>
       </w:pPr>
       <w:r>
         <w:rPr>
@@ -10082,7 +10044,7 @@
     </w:p>
     <w:p>
       <w:pPr>
-        <w:ind w:left="288" w:hanging="0"/>
+        <w:ind w:left="288"/>
       </w:pPr>
       <w:r>
         <w:rPr>
@@ -10104,7 +10066,7 @@
     </w:p>
     <w:p>
       <w:pPr>
-        <w:ind w:left="288" w:hanging="0"/>
+        <w:ind w:left="288"/>
       </w:pPr>
       <w:r>
         <w:rPr>
@@ -10119,7 +10081,7 @@
     </w:p>
     <w:p>
       <w:pPr>
-        <w:ind w:left="288" w:hanging="0"/>
+        <w:ind w:left="288"/>
       </w:pPr>
       <w:r>
         <w:rPr>
@@ -10134,7 +10096,7 @@
     </w:p>
     <w:p>
       <w:pPr>
-        <w:ind w:left="288" w:hanging="0"/>
+        <w:ind w:left="288"/>
       </w:pPr>
       <w:r>
         <w:rPr>
@@ -10149,7 +10111,7 @@
     </w:p>
     <w:p>
       <w:pPr>
-        <w:ind w:left="288" w:hanging="0"/>
+        <w:ind w:left="288"/>
       </w:pPr>
       <w:r>
         <w:rPr>
@@ -10164,7 +10126,7 @@
     </w:p>
     <w:p>
       <w:pPr>
-        <w:ind w:left="288" w:hanging="0"/>
+        <w:ind w:left="288"/>
       </w:pPr>
       <w:r>
         <w:rPr>
@@ -10179,7 +10141,7 @@
     </w:p>
     <w:p>
       <w:pPr>
-        <w:ind w:left="288" w:hanging="0"/>
+        <w:ind w:left="288"/>
       </w:pPr>
       <w:r>
         <w:rPr>
@@ -22273,7 +22235,7 @@
     <w:name w:val="Block Quote"/>
     <w:pPr>
       <w:spacing w:before="80" w:after="80" w:line="240" w:lineRule="auto"/>
-      <w:ind w:left="288" w:firstLine="0" w:right="0"/>
+      <w:ind w:left="288"/>
     </w:pPr>
     <w:rPr>
       <w:rFonts w:ascii="Georgia" w:hAnsi="Georgia"/>

</xml_diff>

<commit_message>
Fix: remove ALL indents - bullets/numbers/quotes flush with body text
</commit_message>
<xml_diff>
--- a/kdp-files/difficult_conversations_ebook.docx
+++ b/kdp-files/difficult_conversations_ebook.docx
@@ -5,7 +5,6 @@
     <w:p>
       <w:pPr>
         <w:spacing w:before="0" w:after="1440" w:line="240" w:lineRule="auto"/>
-        <w:ind w:firstLine="0"/>
         <w:jc w:val="center"/>
       </w:pPr>
       <w:r>
@@ -21,7 +20,6 @@
     <w:p>
       <w:pPr>
         <w:spacing w:before="0" w:after="240" w:line="240" w:lineRule="auto"/>
-        <w:ind w:firstLine="0"/>
         <w:jc w:val="center"/>
       </w:pPr>
       <w:r>
@@ -38,7 +36,6 @@
     <w:p>
       <w:pPr>
         <w:spacing w:before="0" w:after="240" w:line="240" w:lineRule="auto"/>
-        <w:ind w:firstLine="0"/>
         <w:jc w:val="center"/>
       </w:pPr>
       <w:r>
@@ -57,7 +54,6 @@
     <w:p>
       <w:pPr>
         <w:spacing w:before="0" w:after="120" w:line="240" w:lineRule="auto"/>
-        <w:ind w:firstLine="0"/>
         <w:jc w:val="center"/>
       </w:pPr>
       <w:r>
@@ -82,7 +78,6 @@
     <w:p>
       <w:pPr>
         <w:spacing w:before="0" w:after="1440" w:line="240" w:lineRule="auto"/>
-        <w:ind w:firstLine="0"/>
         <w:jc w:val="center"/>
       </w:pPr>
       <w:r>
@@ -98,7 +93,6 @@
     <w:p>
       <w:pPr>
         <w:spacing w:before="0" w:after="120" w:line="240" w:lineRule="auto"/>
-        <w:ind w:firstLine="0"/>
         <w:jc w:val="center"/>
       </w:pPr>
       <w:r>
@@ -115,7 +109,6 @@
     <w:p>
       <w:pPr>
         <w:spacing w:before="0" w:after="240" w:line="240" w:lineRule="auto"/>
-        <w:ind w:firstLine="0"/>
         <w:jc w:val="center"/>
       </w:pPr>
       <w:r>
@@ -134,7 +127,6 @@
     <w:p>
       <w:pPr>
         <w:spacing w:before="0" w:after="120" w:line="240" w:lineRule="auto"/>
-        <w:ind w:firstLine="0"/>
         <w:jc w:val="center"/>
       </w:pPr>
       <w:r>
@@ -159,7 +151,6 @@
     <w:p>
       <w:pPr>
         <w:spacing w:before="0" w:after="240"/>
-        <w:ind w:firstLine="0"/>
         <w:jc w:val="left"/>
       </w:pPr>
       <w:r>
@@ -173,9 +164,7 @@
       </w:r>
     </w:p>
     <w:p>
-      <w:pPr>
-        <w:ind w:firstLine="0"/>
-      </w:pPr>
+      <w:pPr/>
       <w:r>
         <w:rPr>
           <w:rFonts w:ascii="Georgia" w:hAnsi="Georgia"/>
@@ -198,7 +187,6 @@
     <w:p>
       <w:pPr>
         <w:spacing w:before="720" w:after="120"/>
-        <w:ind w:firstLine="0"/>
         <w:jc w:val="center"/>
       </w:pPr>
       <w:r>
@@ -671,9 +659,7 @@
       </w:r>
     </w:p>
     <w:p>
-      <w:pPr>
-        <w:ind w:left="288"/>
-      </w:pPr>
+      <w:pPr/>
       <w:r>
         <w:rPr>
           <w:rFonts w:ascii="Georgia" w:hAnsi="Georgia"/>
@@ -696,9 +682,7 @@
       </w:r>
     </w:p>
     <w:p>
-      <w:pPr>
-        <w:ind w:left="288"/>
-      </w:pPr>
+      <w:pPr/>
       <w:r>
         <w:rPr>
           <w:rFonts w:ascii="Georgia" w:hAnsi="Georgia"/>
@@ -721,9 +705,7 @@
       </w:r>
     </w:p>
     <w:p>
-      <w:pPr>
-        <w:ind w:left="288"/>
-      </w:pPr>
+      <w:pPr/>
       <w:r>
         <w:rPr>
           <w:rFonts w:ascii="Georgia" w:hAnsi="Georgia"/>
@@ -746,9 +728,7 @@
       </w:r>
     </w:p>
     <w:p>
-      <w:pPr>
-        <w:ind w:left="288"/>
-      </w:pPr>
+      <w:pPr/>
       <w:r>
         <w:rPr>
           <w:rFonts w:ascii="Georgia" w:hAnsi="Georgia"/>
@@ -771,9 +751,7 @@
       </w:r>
     </w:p>
     <w:p>
-      <w:pPr>
-        <w:ind w:left="288"/>
-      </w:pPr>
+      <w:pPr/>
       <w:r>
         <w:rPr>
           <w:rFonts w:ascii="Georgia" w:hAnsi="Georgia"/>
@@ -1005,9 +983,7 @@
       </w:r>
     </w:p>
     <w:p>
-      <w:pPr>
-        <w:ind w:left="288"/>
-      </w:pPr>
+      <w:pPr/>
       <w:r>
         <w:rPr>
           <w:rFonts w:ascii="Georgia" w:hAnsi="Georgia"/>
@@ -1030,9 +1006,7 @@
       </w:r>
     </w:p>
     <w:p>
-      <w:pPr>
-        <w:ind w:left="288"/>
-      </w:pPr>
+      <w:pPr/>
       <w:r>
         <w:rPr>
           <w:rFonts w:ascii="Georgia" w:hAnsi="Georgia"/>
@@ -1055,9 +1029,7 @@
       </w:r>
     </w:p>
     <w:p>
-      <w:pPr>
-        <w:ind w:left="288"/>
-      </w:pPr>
+      <w:pPr/>
       <w:r>
         <w:rPr>
           <w:rFonts w:ascii="Georgia" w:hAnsi="Georgia"/>
@@ -1080,9 +1052,7 @@
       </w:r>
     </w:p>
     <w:p>
-      <w:pPr>
-        <w:ind w:left="288"/>
-      </w:pPr>
+      <w:pPr/>
       <w:r>
         <w:rPr>
           <w:rFonts w:ascii="Georgia" w:hAnsi="Georgia"/>
@@ -1139,9 +1109,7 @@
       </w:r>
     </w:p>
     <w:p>
-      <w:pPr>
-        <w:ind w:left="288"/>
-      </w:pPr>
+      <w:pPr/>
       <w:r>
         <w:rPr>
           <w:rFonts w:ascii="Georgia" w:hAnsi="Georgia"/>
@@ -1164,9 +1132,7 @@
       </w:r>
     </w:p>
     <w:p>
-      <w:pPr>
-        <w:ind w:left="288"/>
-      </w:pPr>
+      <w:pPr/>
       <w:r>
         <w:rPr>
           <w:rFonts w:ascii="Georgia" w:hAnsi="Georgia"/>
@@ -1189,9 +1155,7 @@
       </w:r>
     </w:p>
     <w:p>
-      <w:pPr>
-        <w:ind w:left="288"/>
-      </w:pPr>
+      <w:pPr/>
       <w:r>
         <w:rPr>
           <w:rFonts w:ascii="Georgia" w:hAnsi="Georgia"/>
@@ -1214,9 +1178,7 @@
       </w:r>
     </w:p>
     <w:p>
-      <w:pPr>
-        <w:ind w:left="288"/>
-      </w:pPr>
+      <w:pPr/>
       <w:r>
         <w:rPr>
           <w:rFonts w:ascii="Georgia" w:hAnsi="Georgia"/>
@@ -1239,9 +1201,7 @@
       </w:r>
     </w:p>
     <w:p>
-      <w:pPr>
-        <w:ind w:left="288"/>
-      </w:pPr>
+      <w:pPr/>
       <w:r>
         <w:rPr>
           <w:rFonts w:ascii="Georgia" w:hAnsi="Georgia"/>
@@ -1311,9 +1271,7 @@
       </w:r>
     </w:p>
     <w:p>
-      <w:pPr>
-        <w:ind w:firstLine="0"/>
-      </w:pPr>
+      <w:pPr/>
       <w:r>
         <w:rPr>
           <w:rFonts w:ascii="Georgia" w:hAnsi="Georgia"/>
@@ -1326,9 +1284,7 @@
       </w:r>
     </w:p>
     <w:p>
-      <w:pPr>
-        <w:ind w:firstLine="0"/>
-      </w:pPr>
+      <w:pPr/>
       <w:r>
         <w:rPr>
           <w:rFonts w:ascii="Georgia" w:hAnsi="Georgia"/>
@@ -1341,9 +1297,7 @@
       </w:r>
     </w:p>
     <w:p>
-      <w:pPr>
-        <w:ind w:firstLine="0"/>
-      </w:pPr>
+      <w:pPr/>
       <w:r>
         <w:rPr>
           <w:rFonts w:ascii="Georgia" w:hAnsi="Georgia"/>
@@ -1356,9 +1310,7 @@
       </w:r>
     </w:p>
     <w:p>
-      <w:pPr>
-        <w:ind w:firstLine="0"/>
-      </w:pPr>
+      <w:pPr/>
       <w:r>
         <w:rPr>
           <w:rFonts w:ascii="Georgia" w:hAnsi="Georgia"/>
@@ -1371,9 +1323,7 @@
       </w:r>
     </w:p>
     <w:p>
-      <w:pPr>
-        <w:ind w:firstLine="0"/>
-      </w:pPr>
+      <w:pPr/>
       <w:r>
         <w:rPr>
           <w:rFonts w:ascii="Georgia" w:hAnsi="Georgia"/>
@@ -1453,9 +1403,7 @@
       </w:r>
     </w:p>
     <w:p>
-      <w:pPr>
-        <w:ind w:firstLine="0"/>
-      </w:pPr>
+      <w:pPr/>
       <w:r>
         <w:rPr>
           <w:rFonts w:ascii="Georgia" w:hAnsi="Georgia"/>
@@ -1468,9 +1416,7 @@
       </w:r>
     </w:p>
     <w:p>
-      <w:pPr>
-        <w:ind w:left="288"/>
-      </w:pPr>
+      <w:pPr/>
       <w:r>
         <w:rPr>
           <w:rFonts w:ascii="Georgia" w:hAnsi="Georgia"/>
@@ -1493,9 +1439,7 @@
       </w:r>
     </w:p>
     <w:p>
-      <w:pPr>
-        <w:ind w:left="288"/>
-      </w:pPr>
+      <w:pPr/>
       <w:r>
         <w:rPr>
           <w:rFonts w:ascii="Georgia" w:hAnsi="Georgia"/>
@@ -1538,9 +1482,7 @@
       </w:r>
     </w:p>
     <w:p>
-      <w:pPr>
-        <w:ind w:left="288"/>
-      </w:pPr>
+      <w:pPr/>
       <w:r>
         <w:rPr>
           <w:rFonts w:ascii="Georgia" w:hAnsi="Georgia"/>
@@ -1563,9 +1505,7 @@
       </w:r>
     </w:p>
     <w:p>
-      <w:pPr>
-        <w:ind w:firstLine="0"/>
-      </w:pPr>
+      <w:pPr/>
       <w:r>
         <w:rPr>
           <w:rFonts w:ascii="Georgia" w:hAnsi="Georgia"/>
@@ -1578,9 +1518,7 @@
       </w:r>
     </w:p>
     <w:p>
-      <w:pPr>
-        <w:ind w:left="288"/>
-      </w:pPr>
+      <w:pPr/>
       <w:r>
         <w:rPr>
           <w:rFonts w:ascii="Georgia" w:hAnsi="Georgia"/>
@@ -1593,9 +1531,7 @@
       </w:r>
     </w:p>
     <w:p>
-      <w:pPr>
-        <w:ind w:left="288"/>
-      </w:pPr>
+      <w:pPr/>
       <w:r>
         <w:rPr>
           <w:rFonts w:ascii="Georgia" w:hAnsi="Georgia"/>
@@ -1608,9 +1544,7 @@
       </w:r>
     </w:p>
     <w:p>
-      <w:pPr>
-        <w:ind w:left="288"/>
-      </w:pPr>
+      <w:pPr/>
       <w:r>
         <w:rPr>
           <w:rFonts w:ascii="Georgia" w:hAnsi="Georgia"/>
@@ -1657,9 +1591,7 @@
       </w:r>
     </w:p>
     <w:p>
-      <w:pPr>
-        <w:ind w:firstLine="0"/>
-      </w:pPr>
+      <w:pPr/>
       <w:r>
         <w:rPr>
           <w:rFonts w:ascii="Georgia" w:hAnsi="Georgia"/>
@@ -1672,9 +1604,7 @@
       </w:r>
     </w:p>
     <w:p>
-      <w:pPr>
-        <w:ind w:left="288"/>
-      </w:pPr>
+      <w:pPr/>
       <w:r>
         <w:rPr>
           <w:rFonts w:ascii="Georgia" w:hAnsi="Georgia"/>
@@ -1697,9 +1627,7 @@
       </w:r>
     </w:p>
     <w:p>
-      <w:pPr>
-        <w:ind w:left="288"/>
-      </w:pPr>
+      <w:pPr/>
       <w:r>
         <w:rPr>
           <w:rFonts w:ascii="Georgia" w:hAnsi="Georgia"/>
@@ -1722,9 +1650,7 @@
       </w:r>
     </w:p>
     <w:p>
-      <w:pPr>
-        <w:ind w:left="288"/>
-      </w:pPr>
+      <w:pPr/>
       <w:r>
         <w:rPr>
           <w:rFonts w:ascii="Georgia" w:hAnsi="Georgia"/>
@@ -1747,9 +1673,7 @@
       </w:r>
     </w:p>
     <w:p>
-      <w:pPr>
-        <w:ind w:left="288"/>
-      </w:pPr>
+      <w:pPr/>
       <w:r>
         <w:rPr>
           <w:rFonts w:ascii="Georgia" w:hAnsi="Georgia"/>
@@ -1879,9 +1803,7 @@
       </w:r>
     </w:p>
     <w:p>
-      <w:pPr>
-        <w:ind w:firstLine="0"/>
-      </w:pPr>
+      <w:pPr/>
       <w:r>
         <w:rPr>
           <w:rFonts w:ascii="Georgia" w:hAnsi="Georgia"/>
@@ -1894,9 +1816,7 @@
       </w:r>
     </w:p>
     <w:p>
-      <w:pPr>
-        <w:ind w:left="288"/>
-      </w:pPr>
+      <w:pPr/>
       <w:r>
         <w:rPr>
           <w:rFonts w:ascii="Georgia" w:hAnsi="Georgia"/>
@@ -1909,9 +1829,7 @@
       </w:r>
     </w:p>
     <w:p>
-      <w:pPr>
-        <w:ind w:left="288"/>
-      </w:pPr>
+      <w:pPr/>
       <w:r>
         <w:rPr>
           <w:rFonts w:ascii="Georgia" w:hAnsi="Georgia"/>
@@ -1924,9 +1842,7 @@
       </w:r>
     </w:p>
     <w:p>
-      <w:pPr>
-        <w:ind w:left="288"/>
-      </w:pPr>
+      <w:pPr/>
       <w:r>
         <w:rPr>
           <w:rFonts w:ascii="Georgia" w:hAnsi="Georgia"/>
@@ -1939,9 +1855,7 @@
       </w:r>
     </w:p>
     <w:p>
-      <w:pPr>
-        <w:ind w:firstLine="0"/>
-      </w:pPr>
+      <w:pPr/>
       <w:r>
         <w:rPr>
           <w:rFonts w:ascii="Georgia" w:hAnsi="Georgia"/>
@@ -1954,9 +1868,7 @@
       </w:r>
     </w:p>
     <w:p>
-      <w:pPr>
-        <w:ind w:left="288"/>
-      </w:pPr>
+      <w:pPr/>
       <w:r>
         <w:rPr>
           <w:rFonts w:ascii="Georgia" w:hAnsi="Georgia"/>
@@ -1969,9 +1881,7 @@
       </w:r>
     </w:p>
     <w:p>
-      <w:pPr>
-        <w:ind w:left="288"/>
-      </w:pPr>
+      <w:pPr/>
       <w:r>
         <w:rPr>
           <w:rFonts w:ascii="Georgia" w:hAnsi="Georgia"/>
@@ -1984,9 +1894,7 @@
       </w:r>
     </w:p>
     <w:p>
-      <w:pPr>
-        <w:ind w:left="288"/>
-      </w:pPr>
+      <w:pPr/>
       <w:r>
         <w:rPr>
           <w:rFonts w:ascii="Georgia" w:hAnsi="Georgia"/>
@@ -2135,9 +2043,7 @@
       </w:r>
     </w:p>
     <w:p>
-      <w:pPr>
-        <w:ind w:firstLine="0"/>
-      </w:pPr>
+      <w:pPr/>
       <w:r>
         <w:rPr>
           <w:rFonts w:ascii="Georgia" w:hAnsi="Georgia"/>
@@ -2150,9 +2056,7 @@
       </w:r>
     </w:p>
     <w:p>
-      <w:pPr>
-        <w:ind w:left="288"/>
-      </w:pPr>
+      <w:pPr/>
       <w:r>
         <w:rPr>
           <w:rFonts w:ascii="Georgia" w:hAnsi="Georgia"/>
@@ -2175,9 +2079,7 @@
       </w:r>
     </w:p>
     <w:p>
-      <w:pPr>
-        <w:ind w:left="288"/>
-      </w:pPr>
+      <w:pPr/>
       <w:r>
         <w:rPr>
           <w:rFonts w:ascii="Georgia" w:hAnsi="Georgia"/>
@@ -2200,9 +2102,7 @@
       </w:r>
     </w:p>
     <w:p>
-      <w:pPr>
-        <w:ind w:left="288"/>
-      </w:pPr>
+      <w:pPr/>
       <w:r>
         <w:rPr>
           <w:rFonts w:ascii="Georgia" w:hAnsi="Georgia"/>
@@ -2322,9 +2222,7 @@
       </w:r>
     </w:p>
     <w:p>
-      <w:pPr>
-        <w:ind w:firstLine="0"/>
-      </w:pPr>
+      <w:pPr/>
       <w:r>
         <w:rPr>
           <w:rFonts w:ascii="Georgia" w:hAnsi="Georgia"/>
@@ -2337,9 +2235,7 @@
       </w:r>
     </w:p>
     <w:p>
-      <w:pPr>
-        <w:ind w:left="288"/>
-      </w:pPr>
+      <w:pPr/>
       <w:r>
         <w:rPr>
           <w:rFonts w:ascii="Georgia" w:hAnsi="Georgia"/>
@@ -2352,9 +2248,7 @@
       </w:r>
     </w:p>
     <w:p>
-      <w:pPr>
-        <w:ind w:left="288"/>
-      </w:pPr>
+      <w:pPr/>
       <w:r>
         <w:rPr>
           <w:rFonts w:ascii="Georgia" w:hAnsi="Georgia"/>
@@ -2367,9 +2261,7 @@
       </w:r>
     </w:p>
     <w:p>
-      <w:pPr>
-        <w:ind w:left="288"/>
-      </w:pPr>
+      <w:pPr/>
       <w:r>
         <w:rPr>
           <w:rFonts w:ascii="Georgia" w:hAnsi="Georgia"/>
@@ -2382,9 +2274,7 @@
       </w:r>
     </w:p>
     <w:p>
-      <w:pPr>
-        <w:ind w:left="288"/>
-      </w:pPr>
+      <w:pPr/>
       <w:r>
         <w:rPr>
           <w:rFonts w:ascii="Georgia" w:hAnsi="Georgia"/>
@@ -2397,9 +2287,7 @@
       </w:r>
     </w:p>
     <w:p>
-      <w:pPr>
-        <w:ind w:firstLine="0"/>
-      </w:pPr>
+      <w:pPr/>
       <w:r>
         <w:rPr>
           <w:rFonts w:ascii="Georgia" w:hAnsi="Georgia"/>
@@ -2412,9 +2300,7 @@
       </w:r>
     </w:p>
     <w:p>
-      <w:pPr>
-        <w:ind w:left="288"/>
-      </w:pPr>
+      <w:pPr/>
       <w:r>
         <w:rPr>
           <w:rFonts w:ascii="Georgia" w:hAnsi="Georgia"/>
@@ -2427,9 +2313,7 @@
       </w:r>
     </w:p>
     <w:p>
-      <w:pPr>
-        <w:ind w:left="288"/>
-      </w:pPr>
+      <w:pPr/>
       <w:r>
         <w:rPr>
           <w:rFonts w:ascii="Georgia" w:hAnsi="Georgia"/>
@@ -2442,9 +2326,7 @@
       </w:r>
     </w:p>
     <w:p>
-      <w:pPr>
-        <w:ind w:left="288"/>
-      </w:pPr>
+      <w:pPr/>
       <w:r>
         <w:rPr>
           <w:rFonts w:ascii="Georgia" w:hAnsi="Georgia"/>
@@ -2540,9 +2422,7 @@
       </w:r>
     </w:p>
     <w:p>
-      <w:pPr>
-        <w:ind w:firstLine="0"/>
-      </w:pPr>
+      <w:pPr/>
       <w:r>
         <w:rPr>
           <w:rFonts w:ascii="Georgia" w:hAnsi="Georgia"/>
@@ -2557,7 +2437,6 @@
     <w:p>
       <w:pPr>
         <w:pStyle w:val="BlockQuote"/>
-        <w:ind w:left="288"/>
       </w:pPr>
       <w:r>
         <w:rPr>
@@ -2571,9 +2450,7 @@
       </w:r>
     </w:p>
     <w:p>
-      <w:pPr>
-        <w:ind w:firstLine="0"/>
-      </w:pPr>
+      <w:pPr/>
       <w:r>
         <w:rPr>
           <w:rFonts w:ascii="Georgia" w:hAnsi="Georgia"/>
@@ -2588,7 +2465,6 @@
     <w:p>
       <w:pPr>
         <w:pStyle w:val="BlockQuote"/>
-        <w:ind w:left="288"/>
       </w:pPr>
       <w:r>
         <w:rPr>
@@ -2602,9 +2478,7 @@
       </w:r>
     </w:p>
     <w:p>
-      <w:pPr>
-        <w:ind w:firstLine="0"/>
-      </w:pPr>
+      <w:pPr/>
       <w:r>
         <w:rPr>
           <w:rFonts w:ascii="Georgia" w:hAnsi="Georgia"/>
@@ -2632,7 +2506,6 @@
     <w:p>
       <w:pPr>
         <w:pStyle w:val="BlockQuote"/>
-        <w:ind w:left="288"/>
       </w:pPr>
       <w:r>
         <w:rPr>
@@ -2646,9 +2519,7 @@
       </w:r>
     </w:p>
     <w:p>
-      <w:pPr>
-        <w:ind w:firstLine="0"/>
-      </w:pPr>
+      <w:pPr/>
       <w:r>
         <w:rPr>
           <w:rFonts w:ascii="Georgia" w:hAnsi="Georgia"/>
@@ -2663,7 +2534,6 @@
     <w:p>
       <w:pPr>
         <w:pStyle w:val="BlockQuote"/>
-        <w:ind w:left="288"/>
       </w:pPr>
       <w:r>
         <w:rPr>
@@ -2677,9 +2547,7 @@
       </w:r>
     </w:p>
     <w:p>
-      <w:pPr>
-        <w:ind w:firstLine="0"/>
-      </w:pPr>
+      <w:pPr/>
       <w:r>
         <w:rPr>
           <w:rFonts w:ascii="Georgia" w:hAnsi="Georgia"/>
@@ -2694,7 +2562,6 @@
     <w:p>
       <w:pPr>
         <w:pStyle w:val="BlockQuote"/>
-        <w:ind w:left="288"/>
       </w:pPr>
       <w:r>
         <w:rPr>
@@ -2716,9 +2583,7 @@
       </w:r>
     </w:p>
     <w:p>
-      <w:pPr>
-        <w:ind w:left="288"/>
-      </w:pPr>
+      <w:pPr/>
       <w:r>
         <w:rPr>
           <w:rFonts w:ascii="Georgia" w:hAnsi="Georgia"/>
@@ -2731,9 +2596,7 @@
       </w:r>
     </w:p>
     <w:p>
-      <w:pPr>
-        <w:ind w:left="288"/>
-      </w:pPr>
+      <w:pPr/>
       <w:r>
         <w:rPr>
           <w:rFonts w:ascii="Georgia" w:hAnsi="Georgia"/>
@@ -2746,9 +2609,7 @@
       </w:r>
     </w:p>
     <w:p>
-      <w:pPr>
-        <w:ind w:left="288"/>
-      </w:pPr>
+      <w:pPr/>
       <w:r>
         <w:rPr>
           <w:rFonts w:ascii="Georgia" w:hAnsi="Georgia"/>
@@ -2761,9 +2622,7 @@
       </w:r>
     </w:p>
     <w:p>
-      <w:pPr>
-        <w:ind w:left="288"/>
-      </w:pPr>
+      <w:pPr/>
       <w:r>
         <w:rPr>
           <w:rFonts w:ascii="Georgia" w:hAnsi="Georgia"/>
@@ -2776,9 +2635,7 @@
       </w:r>
     </w:p>
     <w:p>
-      <w:pPr>
-        <w:ind w:left="288"/>
-      </w:pPr>
+      <w:pPr/>
       <w:r>
         <w:rPr>
           <w:rFonts w:ascii="Georgia" w:hAnsi="Georgia"/>
@@ -2856,9 +2713,7 @@
       </w:r>
     </w:p>
     <w:p>
-      <w:pPr>
-        <w:ind w:left="288"/>
-      </w:pPr>
+      <w:pPr/>
       <w:r>
         <w:rPr>
           <w:rFonts w:ascii="Georgia" w:hAnsi="Georgia"/>
@@ -2881,9 +2736,7 @@
       </w:r>
     </w:p>
     <w:p>
-      <w:pPr>
-        <w:ind w:left="288"/>
-      </w:pPr>
+      <w:pPr/>
       <w:r>
         <w:rPr>
           <w:rFonts w:ascii="Georgia" w:hAnsi="Georgia"/>
@@ -2906,9 +2759,7 @@
       </w:r>
     </w:p>
     <w:p>
-      <w:pPr>
-        <w:ind w:left="288"/>
-      </w:pPr>
+      <w:pPr/>
       <w:r>
         <w:rPr>
           <w:rFonts w:ascii="Georgia" w:hAnsi="Georgia"/>
@@ -2931,9 +2782,7 @@
       </w:r>
     </w:p>
     <w:p>
-      <w:pPr>
-        <w:ind w:left="288"/>
-      </w:pPr>
+      <w:pPr/>
       <w:r>
         <w:rPr>
           <w:rFonts w:ascii="Georgia" w:hAnsi="Georgia"/>
@@ -2993,9 +2842,7 @@
       </w:r>
     </w:p>
     <w:p>
-      <w:pPr>
-        <w:ind w:firstLine="0"/>
-      </w:pPr>
+      <w:pPr/>
       <w:r>
         <w:rPr>
           <w:rFonts w:ascii="Georgia" w:hAnsi="Georgia"/>
@@ -3010,7 +2857,6 @@
     <w:p>
       <w:pPr>
         <w:pStyle w:val="BlockQuote"/>
-        <w:ind w:left="288"/>
       </w:pPr>
       <w:r>
         <w:rPr>
@@ -3024,9 +2870,7 @@
       </w:r>
     </w:p>
     <w:p>
-      <w:pPr>
-        <w:ind w:firstLine="0"/>
-      </w:pPr>
+      <w:pPr/>
       <w:r>
         <w:rPr>
           <w:rFonts w:ascii="Georgia" w:hAnsi="Georgia"/>
@@ -3041,7 +2885,6 @@
     <w:p>
       <w:pPr>
         <w:pStyle w:val="BlockQuote"/>
-        <w:ind w:left="288"/>
       </w:pPr>
       <w:r>
         <w:rPr>
@@ -3055,9 +2898,7 @@
       </w:r>
     </w:p>
     <w:p>
-      <w:pPr>
-        <w:ind w:firstLine="0"/>
-      </w:pPr>
+      <w:pPr/>
       <w:r>
         <w:rPr>
           <w:rFonts w:ascii="Georgia" w:hAnsi="Georgia"/>
@@ -3072,7 +2913,6 @@
     <w:p>
       <w:pPr>
         <w:pStyle w:val="BlockQuote"/>
-        <w:ind w:left="288"/>
       </w:pPr>
       <w:r>
         <w:rPr>
@@ -3086,9 +2926,7 @@
       </w:r>
     </w:p>
     <w:p>
-      <w:pPr>
-        <w:ind w:firstLine="0"/>
-      </w:pPr>
+      <w:pPr/>
       <w:r>
         <w:rPr>
           <w:rFonts w:ascii="Georgia" w:hAnsi="Georgia"/>
@@ -3103,7 +2941,6 @@
     <w:p>
       <w:pPr>
         <w:pStyle w:val="BlockQuote"/>
-        <w:ind w:left="288"/>
       </w:pPr>
       <w:r>
         <w:rPr>
@@ -3117,9 +2954,7 @@
       </w:r>
     </w:p>
     <w:p>
-      <w:pPr>
-        <w:ind w:firstLine="0"/>
-      </w:pPr>
+      <w:pPr/>
       <w:r>
         <w:rPr>
           <w:rFonts w:ascii="Georgia" w:hAnsi="Georgia"/>
@@ -3134,7 +2969,6 @@
     <w:p>
       <w:pPr>
         <w:pStyle w:val="BlockQuote"/>
-        <w:ind w:left="288"/>
       </w:pPr>
       <w:r>
         <w:rPr>
@@ -3156,9 +2990,7 @@
       </w:r>
     </w:p>
     <w:p>
-      <w:pPr>
-        <w:ind w:left="288"/>
-      </w:pPr>
+      <w:pPr/>
       <w:r>
         <w:rPr>
           <w:rFonts w:ascii="Georgia" w:hAnsi="Georgia"/>
@@ -3171,9 +3003,7 @@
       </w:r>
     </w:p>
     <w:p>
-      <w:pPr>
-        <w:ind w:left="288"/>
-      </w:pPr>
+      <w:pPr/>
       <w:r>
         <w:rPr>
           <w:rFonts w:ascii="Georgia" w:hAnsi="Georgia"/>
@@ -3186,9 +3016,7 @@
       </w:r>
     </w:p>
     <w:p>
-      <w:pPr>
-        <w:ind w:left="288"/>
-      </w:pPr>
+      <w:pPr/>
       <w:r>
         <w:rPr>
           <w:rFonts w:ascii="Georgia" w:hAnsi="Georgia"/>
@@ -3201,9 +3029,7 @@
       </w:r>
     </w:p>
     <w:p>
-      <w:pPr>
-        <w:ind w:left="288"/>
-      </w:pPr>
+      <w:pPr/>
       <w:r>
         <w:rPr>
           <w:rFonts w:ascii="Georgia" w:hAnsi="Georgia"/>
@@ -3216,9 +3042,7 @@
       </w:r>
     </w:p>
     <w:p>
-      <w:pPr>
-        <w:ind w:left="288"/>
-      </w:pPr>
+      <w:pPr/>
       <w:r>
         <w:rPr>
           <w:rFonts w:ascii="Georgia" w:hAnsi="Georgia"/>
@@ -3326,9 +3150,7 @@
       </w:r>
     </w:p>
     <w:p>
-      <w:pPr>
-        <w:ind w:left="288"/>
-      </w:pPr>
+      <w:pPr/>
       <w:r>
         <w:rPr>
           <w:rFonts w:ascii="Georgia" w:hAnsi="Georgia"/>
@@ -3351,9 +3173,7 @@
       </w:r>
     </w:p>
     <w:p>
-      <w:pPr>
-        <w:ind w:left="288"/>
-      </w:pPr>
+      <w:pPr/>
       <w:r>
         <w:rPr>
           <w:rFonts w:ascii="Georgia" w:hAnsi="Georgia"/>
@@ -3376,9 +3196,7 @@
       </w:r>
     </w:p>
     <w:p>
-      <w:pPr>
-        <w:ind w:left="288"/>
-      </w:pPr>
+      <w:pPr/>
       <w:r>
         <w:rPr>
           <w:rFonts w:ascii="Georgia" w:hAnsi="Georgia"/>
@@ -3471,9 +3289,7 @@
       </w:r>
     </w:p>
     <w:p>
-      <w:pPr>
-        <w:ind w:firstLine="0"/>
-      </w:pPr>
+      <w:pPr/>
       <w:r>
         <w:rPr>
           <w:rFonts w:ascii="Georgia" w:hAnsi="Georgia"/>
@@ -3488,7 +3304,6 @@
     <w:p>
       <w:pPr>
         <w:pStyle w:val="BlockQuote"/>
-        <w:ind w:left="288"/>
       </w:pPr>
       <w:r>
         <w:rPr>
@@ -3502,9 +3317,7 @@
       </w:r>
     </w:p>
     <w:p>
-      <w:pPr>
-        <w:ind w:firstLine="0"/>
-      </w:pPr>
+      <w:pPr/>
       <w:r>
         <w:rPr>
           <w:rFonts w:ascii="Georgia" w:hAnsi="Georgia"/>
@@ -3519,7 +3332,6 @@
     <w:p>
       <w:pPr>
         <w:pStyle w:val="BlockQuote"/>
-        <w:ind w:left="288"/>
       </w:pPr>
       <w:r>
         <w:rPr>
@@ -3556,9 +3368,7 @@
       </w:r>
     </w:p>
     <w:p>
-      <w:pPr>
-        <w:ind w:left="288"/>
-      </w:pPr>
+      <w:pPr/>
       <w:r>
         <w:rPr>
           <w:rFonts w:ascii="Georgia" w:hAnsi="Georgia"/>
@@ -3571,9 +3381,7 @@
       </w:r>
     </w:p>
     <w:p>
-      <w:pPr>
-        <w:ind w:left="288"/>
-      </w:pPr>
+      <w:pPr/>
       <w:r>
         <w:rPr>
           <w:rFonts w:ascii="Georgia" w:hAnsi="Georgia"/>
@@ -3586,9 +3394,7 @@
       </w:r>
     </w:p>
     <w:p>
-      <w:pPr>
-        <w:ind w:left="288"/>
-      </w:pPr>
+      <w:pPr/>
       <w:r>
         <w:rPr>
           <w:rFonts w:ascii="Georgia" w:hAnsi="Georgia"/>
@@ -3601,9 +3407,7 @@
       </w:r>
     </w:p>
     <w:p>
-      <w:pPr>
-        <w:ind w:left="288"/>
-      </w:pPr>
+      <w:pPr/>
       <w:r>
         <w:rPr>
           <w:rFonts w:ascii="Georgia" w:hAnsi="Georgia"/>
@@ -3616,9 +3420,7 @@
       </w:r>
     </w:p>
     <w:p>
-      <w:pPr>
-        <w:ind w:left="288"/>
-      </w:pPr>
+      <w:pPr/>
       <w:r>
         <w:rPr>
           <w:rFonts w:ascii="Georgia" w:hAnsi="Georgia"/>
@@ -3631,9 +3433,7 @@
       </w:r>
     </w:p>
     <w:p>
-      <w:pPr>
-        <w:ind w:left="288"/>
-      </w:pPr>
+      <w:pPr/>
       <w:r>
         <w:rPr>
           <w:rFonts w:ascii="Georgia" w:hAnsi="Georgia"/>
@@ -3648,7 +3448,6 @@
     <w:p>
       <w:pPr>
         <w:pStyle w:val="BlockQuote"/>
-        <w:ind w:left="288"/>
       </w:pPr>
       <w:r>
         <w:rPr>
@@ -3662,9 +3461,7 @@
       </w:r>
     </w:p>
     <w:p>
-      <w:pPr>
-        <w:ind w:firstLine="0"/>
-      </w:pPr>
+      <w:pPr/>
       <w:r>
         <w:rPr>
           <w:rFonts w:ascii="Georgia" w:hAnsi="Georgia"/>
@@ -3679,7 +3476,6 @@
     <w:p>
       <w:pPr>
         <w:pStyle w:val="BlockQuote"/>
-        <w:ind w:left="288"/>
       </w:pPr>
       <w:r>
         <w:rPr>
@@ -3701,9 +3497,7 @@
       </w:r>
     </w:p>
     <w:p>
-      <w:pPr>
-        <w:ind w:left="288"/>
-      </w:pPr>
+      <w:pPr/>
       <w:r>
         <w:rPr>
           <w:rFonts w:ascii="Georgia" w:hAnsi="Georgia"/>
@@ -3716,9 +3510,7 @@
       </w:r>
     </w:p>
     <w:p>
-      <w:pPr>
-        <w:ind w:left="288"/>
-      </w:pPr>
+      <w:pPr/>
       <w:r>
         <w:rPr>
           <w:rFonts w:ascii="Georgia" w:hAnsi="Georgia"/>
@@ -3731,9 +3523,7 @@
       </w:r>
     </w:p>
     <w:p>
-      <w:pPr>
-        <w:ind w:left="288"/>
-      </w:pPr>
+      <w:pPr/>
       <w:r>
         <w:rPr>
           <w:rFonts w:ascii="Georgia" w:hAnsi="Georgia"/>
@@ -3746,9 +3536,7 @@
       </w:r>
     </w:p>
     <w:p>
-      <w:pPr>
-        <w:ind w:left="288"/>
-      </w:pPr>
+      <w:pPr/>
       <w:r>
         <w:rPr>
           <w:rFonts w:ascii="Georgia" w:hAnsi="Georgia"/>
@@ -3761,9 +3549,7 @@
       </w:r>
     </w:p>
     <w:p>
-      <w:pPr>
-        <w:ind w:left="288"/>
-      </w:pPr>
+      <w:pPr/>
       <w:r>
         <w:rPr>
           <w:rFonts w:ascii="Georgia" w:hAnsi="Georgia"/>
@@ -3904,9 +3690,7 @@
       </w:r>
     </w:p>
     <w:p>
-      <w:pPr>
-        <w:ind w:left="288"/>
-      </w:pPr>
+      <w:pPr/>
       <w:r>
         <w:rPr>
           <w:rFonts w:ascii="Georgia" w:hAnsi="Georgia"/>
@@ -3929,9 +3713,7 @@
       </w:r>
     </w:p>
     <w:p>
-      <w:pPr>
-        <w:ind w:left="288"/>
-      </w:pPr>
+      <w:pPr/>
       <w:r>
         <w:rPr>
           <w:rFonts w:ascii="Georgia" w:hAnsi="Georgia"/>
@@ -3954,9 +3736,7 @@
       </w:r>
     </w:p>
     <w:p>
-      <w:pPr>
-        <w:ind w:left="288"/>
-      </w:pPr>
+      <w:pPr/>
       <w:r>
         <w:rPr>
           <w:rFonts w:ascii="Georgia" w:hAnsi="Georgia"/>
@@ -3979,9 +3759,7 @@
       </w:r>
     </w:p>
     <w:p>
-      <w:pPr>
-        <w:ind w:left="288"/>
-      </w:pPr>
+      <w:pPr/>
       <w:r>
         <w:rPr>
           <w:rFonts w:ascii="Georgia" w:hAnsi="Georgia"/>
@@ -4041,9 +3819,7 @@
       </w:r>
     </w:p>
     <w:p>
-      <w:pPr>
-        <w:ind w:firstLine="0"/>
-      </w:pPr>
+      <w:pPr/>
       <w:r>
         <w:rPr>
           <w:rFonts w:ascii="Georgia" w:hAnsi="Georgia"/>
@@ -4058,7 +3834,6 @@
     <w:p>
       <w:pPr>
         <w:pStyle w:val="BlockQuote"/>
-        <w:ind w:left="288"/>
       </w:pPr>
       <w:r>
         <w:rPr>
@@ -4072,9 +3847,7 @@
       </w:r>
     </w:p>
     <w:p>
-      <w:pPr>
-        <w:ind w:firstLine="0"/>
-      </w:pPr>
+      <w:pPr/>
       <w:r>
         <w:rPr>
           <w:rFonts w:ascii="Georgia" w:hAnsi="Georgia"/>
@@ -4089,7 +3862,6 @@
     <w:p>
       <w:pPr>
         <w:pStyle w:val="BlockQuote"/>
-        <w:ind w:left="288"/>
       </w:pPr>
       <w:r>
         <w:rPr>
@@ -4103,9 +3875,7 @@
       </w:r>
     </w:p>
     <w:p>
-      <w:pPr>
-        <w:ind w:firstLine="0"/>
-      </w:pPr>
+      <w:pPr/>
       <w:r>
         <w:rPr>
           <w:rFonts w:ascii="Georgia" w:hAnsi="Georgia"/>
@@ -4120,7 +3890,6 @@
     <w:p>
       <w:pPr>
         <w:pStyle w:val="BlockQuote"/>
-        <w:ind w:left="288"/>
       </w:pPr>
       <w:r>
         <w:rPr>
@@ -4134,9 +3903,7 @@
       </w:r>
     </w:p>
     <w:p>
-      <w:pPr>
-        <w:ind w:firstLine="0"/>
-      </w:pPr>
+      <w:pPr/>
       <w:r>
         <w:rPr>
           <w:rFonts w:ascii="Georgia" w:hAnsi="Georgia"/>
@@ -4151,7 +3918,6 @@
     <w:p>
       <w:pPr>
         <w:pStyle w:val="BlockQuote"/>
-        <w:ind w:left="288"/>
       </w:pPr>
       <w:r>
         <w:rPr>
@@ -4165,9 +3931,7 @@
       </w:r>
     </w:p>
     <w:p>
-      <w:pPr>
-        <w:ind w:firstLine="0"/>
-      </w:pPr>
+      <w:pPr/>
       <w:r>
         <w:rPr>
           <w:rFonts w:ascii="Georgia" w:hAnsi="Georgia"/>
@@ -4182,7 +3946,6 @@
     <w:p>
       <w:pPr>
         <w:pStyle w:val="BlockQuote"/>
-        <w:ind w:left="288"/>
       </w:pPr>
       <w:r>
         <w:rPr>
@@ -4204,9 +3967,7 @@
       </w:r>
     </w:p>
     <w:p>
-      <w:pPr>
-        <w:ind w:left="288"/>
-      </w:pPr>
+      <w:pPr/>
       <w:r>
         <w:rPr>
           <w:rFonts w:ascii="Georgia" w:hAnsi="Georgia"/>
@@ -4219,9 +3980,7 @@
       </w:r>
     </w:p>
     <w:p>
-      <w:pPr>
-        <w:ind w:left="288"/>
-      </w:pPr>
+      <w:pPr/>
       <w:r>
         <w:rPr>
           <w:rFonts w:ascii="Georgia" w:hAnsi="Georgia"/>
@@ -4234,9 +3993,7 @@
       </w:r>
     </w:p>
     <w:p>
-      <w:pPr>
-        <w:ind w:left="288"/>
-      </w:pPr>
+      <w:pPr/>
       <w:r>
         <w:rPr>
           <w:rFonts w:ascii="Georgia" w:hAnsi="Georgia"/>
@@ -4249,9 +4006,7 @@
       </w:r>
     </w:p>
     <w:p>
-      <w:pPr>
-        <w:ind w:left="288"/>
-      </w:pPr>
+      <w:pPr/>
       <w:r>
         <w:rPr>
           <w:rFonts w:ascii="Georgia" w:hAnsi="Georgia"/>
@@ -4264,9 +4019,7 @@
       </w:r>
     </w:p>
     <w:p>
-      <w:pPr>
-        <w:ind w:left="288"/>
-      </w:pPr>
+      <w:pPr/>
       <w:r>
         <w:rPr>
           <w:rFonts w:ascii="Georgia" w:hAnsi="Georgia"/>
@@ -4279,9 +4032,7 @@
       </w:r>
     </w:p>
     <w:p>
-      <w:pPr>
-        <w:ind w:left="288"/>
-      </w:pPr>
+      <w:pPr/>
       <w:r>
         <w:rPr>
           <w:rFonts w:ascii="Georgia" w:hAnsi="Georgia"/>
@@ -4449,9 +4200,7 @@
       </w:r>
     </w:p>
     <w:p>
-      <w:pPr>
-        <w:ind w:left="288"/>
-      </w:pPr>
+      <w:pPr/>
       <w:r>
         <w:rPr>
           <w:rFonts w:ascii="Georgia" w:hAnsi="Georgia"/>
@@ -4474,9 +4223,7 @@
       </w:r>
     </w:p>
     <w:p>
-      <w:pPr>
-        <w:ind w:left="288"/>
-      </w:pPr>
+      <w:pPr/>
       <w:r>
         <w:rPr>
           <w:rFonts w:ascii="Georgia" w:hAnsi="Georgia"/>
@@ -4499,9 +4246,7 @@
       </w:r>
     </w:p>
     <w:p>
-      <w:pPr>
-        <w:ind w:left="288"/>
-      </w:pPr>
+      <w:pPr/>
       <w:r>
         <w:rPr>
           <w:rFonts w:ascii="Georgia" w:hAnsi="Georgia"/>
@@ -4524,9 +4269,7 @@
       </w:r>
     </w:p>
     <w:p>
-      <w:pPr>
-        <w:ind w:left="288"/>
-      </w:pPr>
+      <w:pPr/>
       <w:r>
         <w:rPr>
           <w:rFonts w:ascii="Georgia" w:hAnsi="Georgia"/>
@@ -4609,9 +4352,7 @@
       </w:r>
     </w:p>
     <w:p>
-      <w:pPr>
-        <w:ind w:firstLine="0"/>
-      </w:pPr>
+      <w:pPr/>
       <w:r>
         <w:rPr>
           <w:rFonts w:ascii="Georgia" w:hAnsi="Georgia"/>
@@ -4626,7 +4367,6 @@
     <w:p>
       <w:pPr>
         <w:pStyle w:val="BlockQuote"/>
-        <w:ind w:left="288"/>
       </w:pPr>
       <w:r>
         <w:rPr>
@@ -4653,9 +4393,7 @@
       </w:r>
     </w:p>
     <w:p>
-      <w:pPr>
-        <w:ind w:firstLine="0"/>
-      </w:pPr>
+      <w:pPr/>
       <w:r>
         <w:rPr>
           <w:rFonts w:ascii="Georgia" w:hAnsi="Georgia"/>
@@ -4670,7 +4408,6 @@
     <w:p>
       <w:pPr>
         <w:pStyle w:val="BlockQuote"/>
-        <w:ind w:left="288"/>
       </w:pPr>
       <w:r>
         <w:rPr>
@@ -4684,9 +4421,7 @@
       </w:r>
     </w:p>
     <w:p>
-      <w:pPr>
-        <w:ind w:firstLine="0"/>
-      </w:pPr>
+      <w:pPr/>
       <w:r>
         <w:rPr>
           <w:rFonts w:ascii="Georgia" w:hAnsi="Georgia"/>
@@ -4701,7 +4436,6 @@
     <w:p>
       <w:pPr>
         <w:pStyle w:val="BlockQuote"/>
-        <w:ind w:left="288"/>
       </w:pPr>
       <w:r>
         <w:rPr>
@@ -4715,9 +4449,7 @@
       </w:r>
     </w:p>
     <w:p>
-      <w:pPr>
-        <w:ind w:firstLine="0"/>
-      </w:pPr>
+      <w:pPr/>
       <w:r>
         <w:rPr>
           <w:rFonts w:ascii="Georgia" w:hAnsi="Georgia"/>
@@ -4732,7 +4464,6 @@
     <w:p>
       <w:pPr>
         <w:pStyle w:val="BlockQuote"/>
-        <w:ind w:left="288"/>
       </w:pPr>
       <w:r>
         <w:rPr>
@@ -4746,9 +4477,7 @@
       </w:r>
     </w:p>
     <w:p>
-      <w:pPr>
-        <w:ind w:firstLine="0"/>
-      </w:pPr>
+      <w:pPr/>
       <w:r>
         <w:rPr>
           <w:rFonts w:ascii="Georgia" w:hAnsi="Georgia"/>
@@ -4763,7 +4492,6 @@
     <w:p>
       <w:pPr>
         <w:pStyle w:val="BlockQuote"/>
-        <w:ind w:left="288"/>
       </w:pPr>
       <w:r>
         <w:rPr>
@@ -4785,9 +4513,7 @@
       </w:r>
     </w:p>
     <w:p>
-      <w:pPr>
-        <w:ind w:left="288"/>
-      </w:pPr>
+      <w:pPr/>
       <w:r>
         <w:rPr>
           <w:rFonts w:ascii="Georgia" w:hAnsi="Georgia"/>
@@ -4800,9 +4526,7 @@
       </w:r>
     </w:p>
     <w:p>
-      <w:pPr>
-        <w:ind w:left="288"/>
-      </w:pPr>
+      <w:pPr/>
       <w:r>
         <w:rPr>
           <w:rFonts w:ascii="Georgia" w:hAnsi="Georgia"/>
@@ -4815,9 +4539,7 @@
       </w:r>
     </w:p>
     <w:p>
-      <w:pPr>
-        <w:ind w:left="288"/>
-      </w:pPr>
+      <w:pPr/>
       <w:r>
         <w:rPr>
           <w:rFonts w:ascii="Georgia" w:hAnsi="Georgia"/>
@@ -4830,9 +4552,7 @@
       </w:r>
     </w:p>
     <w:p>
-      <w:pPr>
-        <w:ind w:left="288"/>
-      </w:pPr>
+      <w:pPr/>
       <w:r>
         <w:rPr>
           <w:rFonts w:ascii="Georgia" w:hAnsi="Georgia"/>
@@ -4845,9 +4565,7 @@
       </w:r>
     </w:p>
     <w:p>
-      <w:pPr>
-        <w:ind w:left="288"/>
-      </w:pPr>
+      <w:pPr/>
       <w:r>
         <w:rPr>
           <w:rFonts w:ascii="Georgia" w:hAnsi="Georgia"/>
@@ -4860,9 +4578,7 @@
       </w:r>
     </w:p>
     <w:p>
-      <w:pPr>
-        <w:ind w:left="288"/>
-      </w:pPr>
+      <w:pPr/>
       <w:r>
         <w:rPr>
           <w:rFonts w:ascii="Georgia" w:hAnsi="Georgia"/>
@@ -4909,9 +4625,7 @@
       </w:r>
     </w:p>
     <w:p>
-      <w:pPr>
-        <w:ind w:left="288"/>
-      </w:pPr>
+      <w:pPr/>
       <w:r>
         <w:rPr>
           <w:rFonts w:ascii="Georgia" w:hAnsi="Georgia"/>
@@ -4934,9 +4648,7 @@
       </w:r>
     </w:p>
     <w:p>
-      <w:pPr>
-        <w:ind w:left="288"/>
-      </w:pPr>
+      <w:pPr/>
       <w:r>
         <w:rPr>
           <w:rFonts w:ascii="Georgia" w:hAnsi="Georgia"/>
@@ -4959,9 +4671,7 @@
       </w:r>
     </w:p>
     <w:p>
-      <w:pPr>
-        <w:ind w:left="288"/>
-      </w:pPr>
+      <w:pPr/>
       <w:r>
         <w:rPr>
           <w:rFonts w:ascii="Georgia" w:hAnsi="Georgia"/>
@@ -5005,9 +4715,7 @@
       </w:r>
     </w:p>
     <w:p>
-      <w:pPr>
-        <w:ind w:left="288"/>
-      </w:pPr>
+      <w:pPr/>
       <w:r>
         <w:rPr>
           <w:rFonts w:ascii="Georgia" w:hAnsi="Georgia"/>
@@ -5030,9 +4738,7 @@
       </w:r>
     </w:p>
     <w:p>
-      <w:pPr>
-        <w:ind w:left="288"/>
-      </w:pPr>
+      <w:pPr/>
       <w:r>
         <w:rPr>
           <w:rFonts w:ascii="Georgia" w:hAnsi="Georgia"/>
@@ -5055,9 +4761,7 @@
       </w:r>
     </w:p>
     <w:p>
-      <w:pPr>
-        <w:ind w:left="288"/>
-      </w:pPr>
+      <w:pPr/>
       <w:r>
         <w:rPr>
           <w:rFonts w:ascii="Georgia" w:hAnsi="Georgia"/>
@@ -5100,9 +4804,7 @@
       </w:r>
     </w:p>
     <w:p>
-      <w:pPr>
-        <w:ind w:left="288"/>
-      </w:pPr>
+      <w:pPr/>
       <w:r>
         <w:rPr>
           <w:rFonts w:ascii="Georgia" w:hAnsi="Georgia"/>
@@ -5175,9 +4877,7 @@
       </w:r>
     </w:p>
     <w:p>
-      <w:pPr>
-        <w:ind w:firstLine="0"/>
-      </w:pPr>
+      <w:pPr/>
       <w:r>
         <w:rPr>
           <w:rFonts w:ascii="Georgia" w:hAnsi="Georgia"/>
@@ -5192,7 +4892,6 @@
     <w:p>
       <w:pPr>
         <w:pStyle w:val="BlockQuote"/>
-        <w:ind w:left="288"/>
       </w:pPr>
       <w:r>
         <w:rPr>
@@ -5221,7 +4920,6 @@
     <w:p>
       <w:pPr>
         <w:pStyle w:val="BlockQuote"/>
-        <w:ind w:left="288"/>
       </w:pPr>
       <w:r>
         <w:rPr>
@@ -5235,9 +4933,7 @@
       </w:r>
     </w:p>
     <w:p>
-      <w:pPr>
-        <w:ind w:firstLine="0"/>
-      </w:pPr>
+      <w:pPr/>
       <w:r>
         <w:rPr>
           <w:rFonts w:ascii="Georgia" w:hAnsi="Georgia"/>
@@ -5252,7 +4948,6 @@
     <w:p>
       <w:pPr>
         <w:pStyle w:val="BlockQuote"/>
-        <w:ind w:left="288"/>
       </w:pPr>
       <w:r>
         <w:rPr>
@@ -5268,7 +4963,6 @@
     <w:p>
       <w:pPr>
         <w:pStyle w:val="BlockQuote"/>
-        <w:ind w:left="288"/>
       </w:pPr>
       <w:r>
         <w:rPr>
@@ -5297,7 +4991,6 @@
     <w:p>
       <w:pPr>
         <w:pStyle w:val="BlockQuote"/>
-        <w:ind w:left="288"/>
       </w:pPr>
       <w:r>
         <w:rPr>
@@ -5324,9 +5017,7 @@
       </w:r>
     </w:p>
     <w:p>
-      <w:pPr>
-        <w:ind w:firstLine="0"/>
-      </w:pPr>
+      <w:pPr/>
       <w:r>
         <w:rPr>
           <w:rFonts w:ascii="Georgia" w:hAnsi="Georgia"/>
@@ -5341,7 +5032,6 @@
     <w:p>
       <w:pPr>
         <w:pStyle w:val="BlockQuote"/>
-        <w:ind w:left="288"/>
       </w:pPr>
       <w:r>
         <w:rPr>
@@ -5355,9 +5045,7 @@
       </w:r>
     </w:p>
     <w:p>
-      <w:pPr>
-        <w:ind w:firstLine="0"/>
-      </w:pPr>
+      <w:pPr/>
       <w:r>
         <w:rPr>
           <w:rFonts w:ascii="Georgia" w:hAnsi="Georgia"/>
@@ -5372,7 +5060,6 @@
     <w:p>
       <w:pPr>
         <w:pStyle w:val="BlockQuote"/>
-        <w:ind w:left="288"/>
       </w:pPr>
       <w:r>
         <w:rPr>
@@ -5394,9 +5081,7 @@
       </w:r>
     </w:p>
     <w:p>
-      <w:pPr>
-        <w:ind w:left="288"/>
-      </w:pPr>
+      <w:pPr/>
       <w:r>
         <w:rPr>
           <w:rFonts w:ascii="Georgia" w:hAnsi="Georgia"/>
@@ -5409,9 +5094,7 @@
       </w:r>
     </w:p>
     <w:p>
-      <w:pPr>
-        <w:ind w:left="288"/>
-      </w:pPr>
+      <w:pPr/>
       <w:r>
         <w:rPr>
           <w:rFonts w:ascii="Georgia" w:hAnsi="Georgia"/>
@@ -5424,9 +5107,7 @@
       </w:r>
     </w:p>
     <w:p>
-      <w:pPr>
-        <w:ind w:left="288"/>
-      </w:pPr>
+      <w:pPr/>
       <w:r>
         <w:rPr>
           <w:rFonts w:ascii="Georgia" w:hAnsi="Georgia"/>
@@ -5439,9 +5120,7 @@
       </w:r>
     </w:p>
     <w:p>
-      <w:pPr>
-        <w:ind w:left="288"/>
-      </w:pPr>
+      <w:pPr/>
       <w:r>
         <w:rPr>
           <w:rFonts w:ascii="Georgia" w:hAnsi="Georgia"/>
@@ -5454,9 +5133,7 @@
       </w:r>
     </w:p>
     <w:p>
-      <w:pPr>
-        <w:ind w:left="288"/>
-      </w:pPr>
+      <w:pPr/>
       <w:r>
         <w:rPr>
           <w:rFonts w:ascii="Georgia" w:hAnsi="Georgia"/>
@@ -5604,9 +5281,7 @@
       </w:r>
     </w:p>
     <w:p>
-      <w:pPr>
-        <w:ind w:left="288"/>
-      </w:pPr>
+      <w:pPr/>
       <w:r>
         <w:rPr>
           <w:rFonts w:ascii="Georgia" w:hAnsi="Georgia"/>
@@ -5629,9 +5304,7 @@
       </w:r>
     </w:p>
     <w:p>
-      <w:pPr>
-        <w:ind w:left="288"/>
-      </w:pPr>
+      <w:pPr/>
       <w:r>
         <w:rPr>
           <w:rFonts w:ascii="Georgia" w:hAnsi="Georgia"/>
@@ -5654,9 +5327,7 @@
       </w:r>
     </w:p>
     <w:p>
-      <w:pPr>
-        <w:ind w:left="288"/>
-      </w:pPr>
+      <w:pPr/>
       <w:r>
         <w:rPr>
           <w:rFonts w:ascii="Georgia" w:hAnsi="Georgia"/>
@@ -5679,9 +5350,7 @@
       </w:r>
     </w:p>
     <w:p>
-      <w:pPr>
-        <w:ind w:left="288"/>
-      </w:pPr>
+      <w:pPr/>
       <w:r>
         <w:rPr>
           <w:rFonts w:ascii="Georgia" w:hAnsi="Georgia"/>
@@ -5754,9 +5423,7 @@
       </w:r>
     </w:p>
     <w:p>
-      <w:pPr>
-        <w:ind w:firstLine="0"/>
-      </w:pPr>
+      <w:pPr/>
       <w:r>
         <w:rPr>
           <w:rFonts w:ascii="Georgia" w:hAnsi="Georgia"/>
@@ -5771,7 +5438,6 @@
     <w:p>
       <w:pPr>
         <w:pStyle w:val="BlockQuote"/>
-        <w:ind w:left="288"/>
       </w:pPr>
       <w:r>
         <w:rPr>
@@ -5808,9 +5474,7 @@
       </w:r>
     </w:p>
     <w:p>
-      <w:pPr>
-        <w:ind w:firstLine="0"/>
-      </w:pPr>
+      <w:pPr/>
       <w:r>
         <w:rPr>
           <w:rFonts w:ascii="Georgia" w:hAnsi="Georgia"/>
@@ -5825,7 +5489,6 @@
     <w:p>
       <w:pPr>
         <w:pStyle w:val="BlockQuote"/>
-        <w:ind w:left="288"/>
       </w:pPr>
       <w:r>
         <w:rPr>
@@ -5839,9 +5502,7 @@
       </w:r>
     </w:p>
     <w:p>
-      <w:pPr>
-        <w:ind w:firstLine="0"/>
-      </w:pPr>
+      <w:pPr/>
       <w:r>
         <w:rPr>
           <w:rFonts w:ascii="Georgia" w:hAnsi="Georgia"/>
@@ -5856,7 +5517,6 @@
     <w:p>
       <w:pPr>
         <w:pStyle w:val="BlockQuote"/>
-        <w:ind w:left="288"/>
       </w:pPr>
       <w:r>
         <w:rPr>
@@ -5870,9 +5530,7 @@
       </w:r>
     </w:p>
     <w:p>
-      <w:pPr>
-        <w:ind w:firstLine="0"/>
-      </w:pPr>
+      <w:pPr/>
       <w:r>
         <w:rPr>
           <w:rFonts w:ascii="Georgia" w:hAnsi="Georgia"/>
@@ -5900,7 +5558,6 @@
     <w:p>
       <w:pPr>
         <w:pStyle w:val="BlockQuote"/>
-        <w:ind w:left="288"/>
       </w:pPr>
       <w:r>
         <w:rPr>
@@ -5929,7 +5586,6 @@
     <w:p>
       <w:pPr>
         <w:pStyle w:val="BlockQuote"/>
-        <w:ind w:left="288"/>
       </w:pPr>
       <w:r>
         <w:rPr>
@@ -5958,7 +5614,6 @@
     <w:p>
       <w:pPr>
         <w:pStyle w:val="BlockQuote"/>
-        <w:ind w:left="288"/>
       </w:pPr>
       <w:r>
         <w:rPr>
@@ -5980,9 +5635,7 @@
       </w:r>
     </w:p>
     <w:p>
-      <w:pPr>
-        <w:ind w:left="288"/>
-      </w:pPr>
+      <w:pPr/>
       <w:r>
         <w:rPr>
           <w:rFonts w:ascii="Georgia" w:hAnsi="Georgia"/>
@@ -5995,9 +5648,7 @@
       </w:r>
     </w:p>
     <w:p>
-      <w:pPr>
-        <w:ind w:left="288"/>
-      </w:pPr>
+      <w:pPr/>
       <w:r>
         <w:rPr>
           <w:rFonts w:ascii="Georgia" w:hAnsi="Georgia"/>
@@ -6010,9 +5661,7 @@
       </w:r>
     </w:p>
     <w:p>
-      <w:pPr>
-        <w:ind w:left="288"/>
-      </w:pPr>
+      <w:pPr/>
       <w:r>
         <w:rPr>
           <w:rFonts w:ascii="Georgia" w:hAnsi="Georgia"/>
@@ -6025,9 +5674,7 @@
       </w:r>
     </w:p>
     <w:p>
-      <w:pPr>
-        <w:ind w:left="288"/>
-      </w:pPr>
+      <w:pPr/>
       <w:r>
         <w:rPr>
           <w:rFonts w:ascii="Georgia" w:hAnsi="Georgia"/>
@@ -6040,9 +5687,7 @@
       </w:r>
     </w:p>
     <w:p>
-      <w:pPr>
-        <w:ind w:left="288"/>
-      </w:pPr>
+      <w:pPr/>
       <w:r>
         <w:rPr>
           <w:rFonts w:ascii="Georgia" w:hAnsi="Georgia"/>
@@ -6055,9 +5700,7 @@
       </w:r>
     </w:p>
     <w:p>
-      <w:pPr>
-        <w:ind w:left="288"/>
-      </w:pPr>
+      <w:pPr/>
       <w:r>
         <w:rPr>
           <w:rFonts w:ascii="Georgia" w:hAnsi="Georgia"/>
@@ -6205,9 +5848,7 @@
       </w:r>
     </w:p>
     <w:p>
-      <w:pPr>
-        <w:ind w:left="288"/>
-      </w:pPr>
+      <w:pPr/>
       <w:r>
         <w:rPr>
           <w:rFonts w:ascii="Georgia" w:hAnsi="Georgia"/>
@@ -6230,9 +5871,7 @@
       </w:r>
     </w:p>
     <w:p>
-      <w:pPr>
-        <w:ind w:left="288"/>
-      </w:pPr>
+      <w:pPr/>
       <w:r>
         <w:rPr>
           <w:rFonts w:ascii="Georgia" w:hAnsi="Georgia"/>
@@ -6255,9 +5894,7 @@
       </w:r>
     </w:p>
     <w:p>
-      <w:pPr>
-        <w:ind w:left="288"/>
-      </w:pPr>
+      <w:pPr/>
       <w:r>
         <w:rPr>
           <w:rFonts w:ascii="Georgia" w:hAnsi="Georgia"/>
@@ -6280,9 +5917,7 @@
       </w:r>
     </w:p>
     <w:p>
-      <w:pPr>
-        <w:ind w:left="288"/>
-      </w:pPr>
+      <w:pPr/>
       <w:r>
         <w:rPr>
           <w:rFonts w:ascii="Georgia" w:hAnsi="Georgia"/>
@@ -6305,9 +5940,7 @@
       </w:r>
     </w:p>
     <w:p>
-      <w:pPr>
-        <w:ind w:left="288"/>
-      </w:pPr>
+      <w:pPr/>
       <w:r>
         <w:rPr>
           <w:rFonts w:ascii="Georgia" w:hAnsi="Georgia"/>
@@ -6320,9 +5953,7 @@
       </w:r>
     </w:p>
     <w:p>
-      <w:pPr>
-        <w:ind w:left="288"/>
-      </w:pPr>
+      <w:pPr/>
       <w:r>
         <w:rPr>
           <w:rFonts w:ascii="Georgia" w:hAnsi="Georgia"/>
@@ -6490,9 +6121,7 @@
       </w:r>
     </w:p>
     <w:p>
-      <w:pPr>
-        <w:ind w:firstLine="0"/>
-      </w:pPr>
+      <w:pPr/>
       <w:r>
         <w:rPr>
           <w:rFonts w:ascii="Georgia" w:hAnsi="Georgia"/>
@@ -6540,7 +6169,6 @@
     <w:p>
       <w:pPr>
         <w:pStyle w:val="BlockQuote"/>
-        <w:ind w:left="288"/>
       </w:pPr>
       <w:r>
         <w:rPr>
@@ -6566,7 +6194,6 @@
     <w:p>
       <w:pPr>
         <w:pStyle w:val="BlockQuote"/>
-        <w:ind w:left="288"/>
       </w:pPr>
       <w:r>
         <w:rPr>
@@ -6592,7 +6219,6 @@
     <w:p>
       <w:pPr>
         <w:pStyle w:val="BlockQuote"/>
-        <w:ind w:left="288"/>
       </w:pPr>
       <w:r>
         <w:rPr>
@@ -6618,7 +6244,6 @@
     <w:p>
       <w:pPr>
         <w:pStyle w:val="BlockQuote"/>
-        <w:ind w:left="288"/>
       </w:pPr>
       <w:r>
         <w:rPr>
@@ -6642,9 +6267,7 @@
       </w:r>
     </w:p>
     <w:p>
-      <w:pPr>
-        <w:ind w:firstLine="0"/>
-      </w:pPr>
+      <w:pPr/>
       <w:r>
         <w:rPr>
           <w:rFonts w:ascii="Georgia" w:hAnsi="Georgia"/>
@@ -6657,9 +6280,7 @@
       </w:r>
     </w:p>
     <w:p>
-      <w:pPr>
-        <w:ind w:left="288"/>
-      </w:pPr>
+      <w:pPr/>
       <w:r>
         <w:rPr>
           <w:rFonts w:ascii="Georgia" w:hAnsi="Georgia"/>
@@ -6672,9 +6293,7 @@
       </w:r>
     </w:p>
     <w:p>
-      <w:pPr>
-        <w:ind w:left="288"/>
-      </w:pPr>
+      <w:pPr/>
       <w:r>
         <w:rPr>
           <w:rFonts w:ascii="Georgia" w:hAnsi="Georgia"/>
@@ -6687,9 +6306,7 @@
       </w:r>
     </w:p>
     <w:p>
-      <w:pPr>
-        <w:ind w:left="288"/>
-      </w:pPr>
+      <w:pPr/>
       <w:r>
         <w:rPr>
           <w:rFonts w:ascii="Georgia" w:hAnsi="Georgia"/>
@@ -6702,9 +6319,7 @@
       </w:r>
     </w:p>
     <w:p>
-      <w:pPr>
-        <w:ind w:left="288"/>
-      </w:pPr>
+      <w:pPr/>
       <w:r>
         <w:rPr>
           <w:rFonts w:ascii="Georgia" w:hAnsi="Georgia"/>
@@ -6717,9 +6332,7 @@
       </w:r>
     </w:p>
     <w:p>
-      <w:pPr>
-        <w:ind w:left="288"/>
-      </w:pPr>
+      <w:pPr/>
       <w:r>
         <w:rPr>
           <w:rFonts w:ascii="Georgia" w:hAnsi="Georgia"/>
@@ -6732,9 +6345,7 @@
       </w:r>
     </w:p>
     <w:p>
-      <w:pPr>
-        <w:ind w:firstLine="0"/>
-      </w:pPr>
+      <w:pPr/>
       <w:r>
         <w:rPr>
           <w:rFonts w:ascii="Georgia" w:hAnsi="Georgia"/>
@@ -6773,9 +6384,7 @@
       </w:r>
     </w:p>
     <w:p>
-      <w:pPr>
-        <w:ind w:firstLine="0"/>
-      </w:pPr>
+      <w:pPr/>
       <w:r>
         <w:rPr>
           <w:rFonts w:ascii="Georgia" w:hAnsi="Georgia"/>
@@ -6788,9 +6397,7 @@
       </w:r>
     </w:p>
     <w:p>
-      <w:pPr>
-        <w:ind w:left="288"/>
-      </w:pPr>
+      <w:pPr/>
       <w:r>
         <w:rPr>
           <w:rFonts w:ascii="Georgia" w:hAnsi="Georgia"/>
@@ -6813,9 +6420,7 @@
       </w:r>
     </w:p>
     <w:p>
-      <w:pPr>
-        <w:ind w:left="288"/>
-      </w:pPr>
+      <w:pPr/>
       <w:r>
         <w:rPr>
           <w:rFonts w:ascii="Georgia" w:hAnsi="Georgia"/>
@@ -6838,9 +6443,7 @@
       </w:r>
     </w:p>
     <w:p>
-      <w:pPr>
-        <w:ind w:left="288"/>
-      </w:pPr>
+      <w:pPr/>
       <w:r>
         <w:rPr>
           <w:rFonts w:ascii="Georgia" w:hAnsi="Georgia"/>
@@ -6894,9 +6497,7 @@
       </w:r>
     </w:p>
     <w:p>
-      <w:pPr>
-        <w:ind w:firstLine="0"/>
-      </w:pPr>
+      <w:pPr/>
       <w:r>
         <w:rPr>
           <w:rFonts w:ascii="Georgia" w:hAnsi="Georgia"/>
@@ -6909,9 +6510,7 @@
       </w:r>
     </w:p>
     <w:p>
-      <w:pPr>
-        <w:ind w:left="288"/>
-      </w:pPr>
+      <w:pPr/>
       <w:r>
         <w:rPr>
           <w:rFonts w:ascii="Georgia" w:hAnsi="Georgia"/>
@@ -6934,9 +6533,7 @@
       </w:r>
     </w:p>
     <w:p>
-      <w:pPr>
-        <w:ind w:left="288"/>
-      </w:pPr>
+      <w:pPr/>
       <w:r>
         <w:rPr>
           <w:rFonts w:ascii="Georgia" w:hAnsi="Georgia"/>
@@ -6959,9 +6556,7 @@
       </w:r>
     </w:p>
     <w:p>
-      <w:pPr>
-        <w:ind w:left="288"/>
-      </w:pPr>
+      <w:pPr/>
       <w:r>
         <w:rPr>
           <w:rFonts w:ascii="Georgia" w:hAnsi="Georgia"/>
@@ -6984,9 +6579,7 @@
       </w:r>
     </w:p>
     <w:p>
-      <w:pPr>
-        <w:ind w:firstLine="0"/>
-      </w:pPr>
+      <w:pPr/>
       <w:r>
         <w:rPr>
           <w:rFonts w:ascii="Georgia" w:hAnsi="Georgia"/>
@@ -6999,9 +6592,7 @@
       </w:r>
     </w:p>
     <w:p>
-      <w:pPr>
-        <w:ind w:firstLine="0"/>
-      </w:pPr>
+      <w:pPr/>
       <w:r>
         <w:rPr>
           <w:rFonts w:ascii="Georgia" w:hAnsi="Georgia"/>
@@ -7016,7 +6607,6 @@
     <w:p>
       <w:pPr>
         <w:pStyle w:val="BlockQuote"/>
-        <w:ind w:left="288"/>
       </w:pPr>
       <w:r>
         <w:rPr>
@@ -7053,9 +6643,7 @@
       </w:r>
     </w:p>
     <w:p>
-      <w:pPr>
-        <w:ind w:firstLine="0"/>
-      </w:pPr>
+      <w:pPr/>
       <w:r>
         <w:rPr>
           <w:rFonts w:ascii="Georgia" w:hAnsi="Georgia"/>
@@ -7070,7 +6658,6 @@
     <w:p>
       <w:pPr>
         <w:pStyle w:val="BlockQuote"/>
-        <w:ind w:left="288"/>
       </w:pPr>
       <w:r>
         <w:rPr>
@@ -7107,9 +6694,7 @@
       </w:r>
     </w:p>
     <w:p>
-      <w:pPr>
-        <w:ind w:firstLine="0"/>
-      </w:pPr>
+      <w:pPr/>
       <w:r>
         <w:rPr>
           <w:rFonts w:ascii="Georgia" w:hAnsi="Georgia"/>
@@ -7122,9 +6707,7 @@
       </w:r>
     </w:p>
     <w:p>
-      <w:pPr>
-        <w:ind w:left="288"/>
-      </w:pPr>
+      <w:pPr/>
       <w:r>
         <w:rPr>
           <w:rFonts w:ascii="Georgia" w:hAnsi="Georgia"/>
@@ -7147,9 +6730,7 @@
       </w:r>
     </w:p>
     <w:p>
-      <w:pPr>
-        <w:ind w:left="288"/>
-      </w:pPr>
+      <w:pPr/>
       <w:r>
         <w:rPr>
           <w:rFonts w:ascii="Georgia" w:hAnsi="Georgia"/>
@@ -7172,9 +6753,7 @@
       </w:r>
     </w:p>
     <w:p>
-      <w:pPr>
-        <w:ind w:left="288"/>
-      </w:pPr>
+      <w:pPr/>
       <w:r>
         <w:rPr>
           <w:rFonts w:ascii="Georgia" w:hAnsi="Georgia"/>
@@ -7197,9 +6776,7 @@
       </w:r>
     </w:p>
     <w:p>
-      <w:pPr>
-        <w:ind w:left="288"/>
-      </w:pPr>
+      <w:pPr/>
       <w:r>
         <w:rPr>
           <w:rFonts w:ascii="Georgia" w:hAnsi="Georgia"/>
@@ -7237,7 +6814,6 @@
     <w:p>
       <w:pPr>
         <w:pStyle w:val="BlockQuote"/>
-        <w:ind w:left="288"/>
       </w:pPr>
       <w:r>
         <w:rPr>
@@ -7251,9 +6827,7 @@
       </w:r>
     </w:p>
     <w:p>
-      <w:pPr>
-        <w:ind w:firstLine="0"/>
-      </w:pPr>
+      <w:pPr/>
       <w:r>
         <w:rPr>
           <w:rFonts w:ascii="Georgia" w:hAnsi="Georgia"/>
@@ -7268,7 +6842,6 @@
     <w:p>
       <w:pPr>
         <w:pStyle w:val="BlockQuote"/>
-        <w:ind w:left="288"/>
       </w:pPr>
       <w:r>
         <w:rPr>
@@ -7282,9 +6855,7 @@
       </w:r>
     </w:p>
     <w:p>
-      <w:pPr>
-        <w:ind w:firstLine="0"/>
-      </w:pPr>
+      <w:pPr/>
       <w:r>
         <w:rPr>
           <w:rFonts w:ascii="Georgia" w:hAnsi="Georgia"/>
@@ -7297,9 +6868,7 @@
       </w:r>
     </w:p>
     <w:p>
-      <w:pPr>
-        <w:ind w:left="288"/>
-      </w:pPr>
+      <w:pPr/>
       <w:r>
         <w:rPr>
           <w:rFonts w:ascii="Georgia" w:hAnsi="Georgia"/>
@@ -7312,9 +6881,7 @@
       </w:r>
     </w:p>
     <w:p>
-      <w:pPr>
-        <w:ind w:left="288"/>
-      </w:pPr>
+      <w:pPr/>
       <w:r>
         <w:rPr>
           <w:rFonts w:ascii="Georgia" w:hAnsi="Georgia"/>
@@ -7327,9 +6894,7 @@
       </w:r>
     </w:p>
     <w:p>
-      <w:pPr>
-        <w:ind w:left="288"/>
-      </w:pPr>
+      <w:pPr/>
       <w:r>
         <w:rPr>
           <w:rFonts w:ascii="Georgia" w:hAnsi="Georgia"/>
@@ -7342,9 +6907,7 @@
       </w:r>
     </w:p>
     <w:p>
-      <w:pPr>
-        <w:ind w:firstLine="0"/>
-      </w:pPr>
+      <w:pPr/>
       <w:r>
         <w:rPr>
           <w:rFonts w:ascii="Georgia" w:hAnsi="Georgia"/>
@@ -7357,9 +6920,7 @@
       </w:r>
     </w:p>
     <w:p>
-      <w:pPr>
-        <w:ind w:left="288"/>
-      </w:pPr>
+      <w:pPr/>
       <w:r>
         <w:rPr>
           <w:rFonts w:ascii="Georgia" w:hAnsi="Georgia"/>
@@ -7382,9 +6943,7 @@
       </w:r>
     </w:p>
     <w:p>
-      <w:pPr>
-        <w:ind w:left="288"/>
-      </w:pPr>
+      <w:pPr/>
       <w:r>
         <w:rPr>
           <w:rFonts w:ascii="Georgia" w:hAnsi="Georgia"/>
@@ -7438,9 +6997,7 @@
       </w:r>
     </w:p>
     <w:p>
-      <w:pPr>
-        <w:ind w:firstLine="0"/>
-      </w:pPr>
+      <w:pPr/>
       <w:r>
         <w:rPr>
           <w:rFonts w:ascii="Georgia" w:hAnsi="Georgia"/>
@@ -7488,7 +7045,6 @@
     <w:p>
       <w:pPr>
         <w:pStyle w:val="BlockQuote"/>
-        <w:ind w:left="288"/>
       </w:pPr>
       <w:r>
         <w:rPr>
@@ -7514,7 +7070,6 @@
     <w:p>
       <w:pPr>
         <w:pStyle w:val="BlockQuote"/>
-        <w:ind w:left="288"/>
       </w:pPr>
       <w:r>
         <w:rPr>
@@ -7540,7 +7095,6 @@
     <w:p>
       <w:pPr>
         <w:pStyle w:val="BlockQuote"/>
-        <w:ind w:left="288"/>
       </w:pPr>
       <w:r>
         <w:rPr>
@@ -7564,9 +7118,7 @@
       </w:r>
     </w:p>
     <w:p>
-      <w:pPr>
-        <w:ind w:firstLine="0"/>
-      </w:pPr>
+      <w:pPr/>
       <w:r>
         <w:rPr>
           <w:rFonts w:ascii="Georgia" w:hAnsi="Georgia"/>
@@ -7579,9 +7131,7 @@
       </w:r>
     </w:p>
     <w:p>
-      <w:pPr>
-        <w:ind w:left="288"/>
-      </w:pPr>
+      <w:pPr/>
       <w:r>
         <w:rPr>
           <w:rFonts w:ascii="Georgia" w:hAnsi="Georgia"/>
@@ -7594,9 +7144,7 @@
       </w:r>
     </w:p>
     <w:p>
-      <w:pPr>
-        <w:ind w:left="288"/>
-      </w:pPr>
+      <w:pPr/>
       <w:r>
         <w:rPr>
           <w:rFonts w:ascii="Georgia" w:hAnsi="Georgia"/>
@@ -7609,9 +7157,7 @@
       </w:r>
     </w:p>
     <w:p>
-      <w:pPr>
-        <w:ind w:left="288"/>
-      </w:pPr>
+      <w:pPr/>
       <w:r>
         <w:rPr>
           <w:rFonts w:ascii="Georgia" w:hAnsi="Georgia"/>
@@ -7624,9 +7170,7 @@
       </w:r>
     </w:p>
     <w:p>
-      <w:pPr>
-        <w:ind w:left="288"/>
-      </w:pPr>
+      <w:pPr/>
       <w:r>
         <w:rPr>
           <w:rFonts w:ascii="Georgia" w:hAnsi="Georgia"/>
@@ -7639,9 +7183,7 @@
       </w:r>
     </w:p>
     <w:p>
-      <w:pPr>
-        <w:ind w:firstLine="0"/>
-      </w:pPr>
+      <w:pPr/>
       <w:r>
         <w:rPr>
           <w:rFonts w:ascii="Georgia" w:hAnsi="Georgia"/>
@@ -7700,9 +7242,7 @@
       </w:r>
     </w:p>
     <w:p>
-      <w:pPr>
-        <w:ind w:firstLine="0"/>
-      </w:pPr>
+      <w:pPr/>
       <w:r>
         <w:rPr>
           <w:rFonts w:ascii="Georgia" w:hAnsi="Georgia"/>
@@ -7715,9 +7255,7 @@
       </w:r>
     </w:p>
     <w:p>
-      <w:pPr>
-        <w:ind w:left="288"/>
-      </w:pPr>
+      <w:pPr/>
       <w:r>
         <w:rPr>
           <w:rFonts w:ascii="Georgia" w:hAnsi="Georgia"/>
@@ -7740,9 +7278,7 @@
       </w:r>
     </w:p>
     <w:p>
-      <w:pPr>
-        <w:ind w:left="288"/>
-      </w:pPr>
+      <w:pPr/>
       <w:r>
         <w:rPr>
           <w:rFonts w:ascii="Georgia" w:hAnsi="Georgia"/>
@@ -7765,9 +7301,7 @@
       </w:r>
     </w:p>
     <w:p>
-      <w:pPr>
-        <w:ind w:left="288"/>
-      </w:pPr>
+      <w:pPr/>
       <w:r>
         <w:rPr>
           <w:rFonts w:ascii="Georgia" w:hAnsi="Georgia"/>
@@ -7821,9 +7355,7 @@
       </w:r>
     </w:p>
     <w:p>
-      <w:pPr>
-        <w:ind w:firstLine="0"/>
-      </w:pPr>
+      <w:pPr/>
       <w:r>
         <w:rPr>
           <w:rFonts w:ascii="Georgia" w:hAnsi="Georgia"/>
@@ -7836,9 +7368,7 @@
       </w:r>
     </w:p>
     <w:p>
-      <w:pPr>
-        <w:ind w:firstLine="0"/>
-      </w:pPr>
+      <w:pPr/>
       <w:r>
         <w:rPr>
           <w:rFonts w:ascii="Georgia" w:hAnsi="Georgia"/>
@@ -7853,7 +7383,6 @@
     <w:p>
       <w:pPr>
         <w:pStyle w:val="BlockQuote"/>
-        <w:ind w:left="288"/>
       </w:pPr>
       <w:r>
         <w:rPr>
@@ -7869,7 +7398,6 @@
     <w:p>
       <w:pPr>
         <w:pStyle w:val="BlockQuote"/>
-        <w:ind w:left="288"/>
       </w:pPr>
       <w:r>
         <w:rPr>
@@ -7883,9 +7411,7 @@
       </w:r>
     </w:p>
     <w:p>
-      <w:pPr>
-        <w:ind w:firstLine="0"/>
-      </w:pPr>
+      <w:pPr/>
       <w:r>
         <w:rPr>
           <w:rFonts w:ascii="Georgia" w:hAnsi="Georgia"/>
@@ -7900,7 +7426,6 @@
     <w:p>
       <w:pPr>
         <w:pStyle w:val="BlockQuote"/>
-        <w:ind w:left="288"/>
       </w:pPr>
       <w:r>
         <w:rPr>
@@ -7914,9 +7439,7 @@
       </w:r>
     </w:p>
     <w:p>
-      <w:pPr>
-        <w:ind w:firstLine="0"/>
-      </w:pPr>
+      <w:pPr/>
       <w:r>
         <w:rPr>
           <w:rFonts w:ascii="Georgia" w:hAnsi="Georgia"/>
@@ -7929,9 +7452,7 @@
       </w:r>
     </w:p>
     <w:p>
-      <w:pPr>
-        <w:ind w:left="288"/>
-      </w:pPr>
+      <w:pPr/>
       <w:r>
         <w:rPr>
           <w:rFonts w:ascii="Georgia" w:hAnsi="Georgia"/>
@@ -7944,9 +7465,7 @@
       </w:r>
     </w:p>
     <w:p>
-      <w:pPr>
-        <w:ind w:left="288"/>
-      </w:pPr>
+      <w:pPr/>
       <w:r>
         <w:rPr>
           <w:rFonts w:ascii="Georgia" w:hAnsi="Georgia"/>
@@ -7959,9 +7478,7 @@
       </w:r>
     </w:p>
     <w:p>
-      <w:pPr>
-        <w:ind w:left="288"/>
-      </w:pPr>
+      <w:pPr/>
       <w:r>
         <w:rPr>
           <w:rFonts w:ascii="Georgia" w:hAnsi="Georgia"/>
@@ -7974,9 +7491,7 @@
       </w:r>
     </w:p>
     <w:p>
-      <w:pPr>
-        <w:ind w:left="288"/>
-      </w:pPr>
+      <w:pPr/>
       <w:r>
         <w:rPr>
           <w:rFonts w:ascii="Georgia" w:hAnsi="Georgia"/>
@@ -7989,9 +7504,7 @@
       </w:r>
     </w:p>
     <w:p>
-      <w:pPr>
-        <w:ind w:firstLine="0"/>
-      </w:pPr>
+      <w:pPr/>
       <w:r>
         <w:rPr>
           <w:rFonts w:ascii="Georgia" w:hAnsi="Georgia"/>
@@ -8090,9 +7603,7 @@
       </w:r>
     </w:p>
     <w:p>
-      <w:pPr>
-        <w:ind w:firstLine="0"/>
-      </w:pPr>
+      <w:pPr/>
       <w:r>
         <w:rPr>
           <w:rFonts w:ascii="Georgia" w:hAnsi="Georgia"/>
@@ -8105,9 +7616,7 @@
       </w:r>
     </w:p>
     <w:p>
-      <w:pPr>
-        <w:ind w:left="288"/>
-      </w:pPr>
+      <w:pPr/>
       <w:r>
         <w:rPr>
           <w:rFonts w:ascii="Georgia" w:hAnsi="Georgia"/>
@@ -8130,9 +7639,7 @@
       </w:r>
     </w:p>
     <w:p>
-      <w:pPr>
-        <w:ind w:left="288"/>
-      </w:pPr>
+      <w:pPr/>
       <w:r>
         <w:rPr>
           <w:rFonts w:ascii="Georgia" w:hAnsi="Georgia"/>
@@ -8155,9 +7662,7 @@
       </w:r>
     </w:p>
     <w:p>
-      <w:pPr>
-        <w:ind w:left="288"/>
-      </w:pPr>
+      <w:pPr/>
       <w:r>
         <w:rPr>
           <w:rFonts w:ascii="Georgia" w:hAnsi="Georgia"/>
@@ -8180,9 +7685,7 @@
       </w:r>
     </w:p>
     <w:p>
-      <w:pPr>
-        <w:ind w:left="288"/>
-      </w:pPr>
+      <w:pPr/>
       <w:r>
         <w:rPr>
           <w:rFonts w:ascii="Georgia" w:hAnsi="Georgia"/>
@@ -8228,7 +7731,6 @@
     <w:p>
       <w:pPr>
         <w:spacing w:before="120" w:after="120"/>
-        <w:ind w:firstLine="0"/>
         <w:jc w:val="center"/>
       </w:pPr>
       <w:r>
@@ -8282,7 +7784,6 @@
     <w:p>
       <w:pPr>
         <w:spacing w:before="120" w:after="120"/>
-        <w:ind w:firstLine="0"/>
         <w:jc w:val="center"/>
       </w:pPr>
       <w:r>
@@ -8336,7 +7837,6 @@
     <w:p>
       <w:pPr>
         <w:spacing w:before="120" w:after="120"/>
-        <w:ind w:firstLine="0"/>
         <w:jc w:val="center"/>
       </w:pPr>
       <w:r>
@@ -8430,9 +7930,7 @@
       </w:r>
     </w:p>
     <w:p>
-      <w:pPr>
-        <w:ind w:left="288"/>
-      </w:pPr>
+      <w:pPr/>
       <w:r>
         <w:rPr>
           <w:rFonts w:ascii="Georgia" w:hAnsi="Georgia"/>
@@ -8458,9 +7956,7 @@
       </w:r>
     </w:p>
     <w:p>
-      <w:pPr>
-        <w:ind w:left="288"/>
-      </w:pPr>
+      <w:pPr/>
       <w:r>
         <w:rPr>
           <w:rFonts w:ascii="Georgia" w:hAnsi="Georgia"/>
@@ -8473,9 +7969,7 @@
       </w:r>
     </w:p>
     <w:p>
-      <w:pPr>
-        <w:ind w:left="288"/>
-      </w:pPr>
+      <w:pPr/>
       <w:r>
         <w:rPr>
           <w:rFonts w:ascii="Georgia" w:hAnsi="Georgia"/>
@@ -8488,9 +7982,7 @@
       </w:r>
     </w:p>
     <w:p>
-      <w:pPr>
-        <w:ind w:left="288"/>
-      </w:pPr>
+      <w:pPr/>
       <w:r>
         <w:rPr>
           <w:rFonts w:ascii="Georgia" w:hAnsi="Georgia"/>
@@ -8503,9 +7995,7 @@
       </w:r>
     </w:p>
     <w:p>
-      <w:pPr>
-        <w:ind w:left="288"/>
-      </w:pPr>
+      <w:pPr/>
       <w:r>
         <w:rPr>
           <w:rFonts w:ascii="Georgia" w:hAnsi="Georgia"/>
@@ -8546,7 +8036,6 @@
     <w:p>
       <w:pPr>
         <w:pStyle w:val="BlockQuote"/>
-        <w:ind w:left="288"/>
       </w:pPr>
       <w:r>
         <w:rPr>
@@ -8560,9 +8049,7 @@
       </w:r>
     </w:p>
     <w:p>
-      <w:pPr>
-        <w:ind w:left="288"/>
-      </w:pPr>
+      <w:pPr/>
       <w:r>
         <w:rPr>
           <w:rFonts w:ascii="Georgia" w:hAnsi="Georgia"/>
@@ -8588,9 +8075,7 @@
       </w:r>
     </w:p>
     <w:p>
-      <w:pPr>
-        <w:ind w:left="288"/>
-      </w:pPr>
+      <w:pPr/>
       <w:r>
         <w:rPr>
           <w:rFonts w:ascii="Georgia" w:hAnsi="Georgia"/>
@@ -8603,9 +8088,7 @@
       </w:r>
     </w:p>
     <w:p>
-      <w:pPr>
-        <w:ind w:left="288"/>
-      </w:pPr>
+      <w:pPr/>
       <w:r>
         <w:rPr>
           <w:rFonts w:ascii="Georgia" w:hAnsi="Georgia"/>
@@ -8618,9 +8101,7 @@
       </w:r>
     </w:p>
     <w:p>
-      <w:pPr>
-        <w:ind w:left="288"/>
-      </w:pPr>
+      <w:pPr/>
       <w:r>
         <w:rPr>
           <w:rFonts w:ascii="Georgia" w:hAnsi="Georgia"/>
@@ -8633,9 +8114,7 @@
       </w:r>
     </w:p>
     <w:p>
-      <w:pPr>
-        <w:ind w:left="288"/>
-      </w:pPr>
+      <w:pPr/>
       <w:r>
         <w:rPr>
           <w:rFonts w:ascii="Georgia" w:hAnsi="Georgia"/>
@@ -8648,9 +8127,7 @@
       </w:r>
     </w:p>
     <w:p>
-      <w:pPr>
-        <w:ind w:left="288"/>
-      </w:pPr>
+      <w:pPr/>
       <w:r>
         <w:rPr>
           <w:rFonts w:ascii="Georgia" w:hAnsi="Georgia"/>
@@ -8676,9 +8153,7 @@
       </w:r>
     </w:p>
     <w:p>
-      <w:pPr>
-        <w:ind w:left="288"/>
-      </w:pPr>
+      <w:pPr/>
       <w:r>
         <w:rPr>
           <w:rFonts w:ascii="Georgia" w:hAnsi="Georgia"/>
@@ -8714,7 +8189,6 @@
     <w:p>
       <w:pPr>
         <w:spacing w:before="120" w:after="120"/>
-        <w:ind w:firstLine="0"/>
         <w:jc w:val="center"/>
       </w:pPr>
       <w:r>
@@ -9458,7 +8932,6 @@
     <w:p>
       <w:pPr>
         <w:spacing w:before="120" w:after="120"/>
-        <w:ind w:firstLine="0"/>
         <w:jc w:val="center"/>
       </w:pPr>
       <w:r>
@@ -9507,7 +8980,6 @@
     <w:p>
       <w:pPr>
         <w:spacing w:before="120" w:after="120"/>
-        <w:ind w:firstLine="0"/>
         <w:jc w:val="center"/>
       </w:pPr>
       <w:r>
@@ -9569,7 +9041,6 @@
     <w:p>
       <w:pPr>
         <w:spacing w:before="120" w:after="120"/>
-        <w:ind w:firstLine="0"/>
         <w:jc w:val="center"/>
       </w:pPr>
       <w:r>
@@ -9616,9 +9087,7 @@
       </w:r>
     </w:p>
     <w:p>
-      <w:pPr>
-        <w:ind w:firstLine="0"/>
-      </w:pPr>
+      <w:pPr/>
       <w:r>
         <w:rPr>
           <w:rFonts w:ascii="Georgia" w:hAnsi="Georgia"/>
@@ -9631,9 +9100,7 @@
       </w:r>
     </w:p>
     <w:p>
-      <w:pPr>
-        <w:ind w:left="288"/>
-      </w:pPr>
+      <w:pPr/>
       <w:r>
         <w:rPr>
           <w:rFonts w:ascii="Georgia" w:hAnsi="Georgia"/>
@@ -9646,9 +9113,7 @@
       </w:r>
     </w:p>
     <w:p>
-      <w:pPr>
-        <w:ind w:left="288"/>
-      </w:pPr>
+      <w:pPr/>
       <w:r>
         <w:rPr>
           <w:rFonts w:ascii="Georgia" w:hAnsi="Georgia"/>
@@ -9661,9 +9126,7 @@
       </w:r>
     </w:p>
     <w:p>
-      <w:pPr>
-        <w:ind w:left="288"/>
-      </w:pPr>
+      <w:pPr/>
       <w:r>
         <w:rPr>
           <w:rFonts w:ascii="Georgia" w:hAnsi="Georgia"/>
@@ -9676,9 +9139,7 @@
       </w:r>
     </w:p>
     <w:p>
-      <w:pPr>
-        <w:ind w:firstLine="0"/>
-      </w:pPr>
+      <w:pPr/>
       <w:r>
         <w:rPr>
           <w:rFonts w:ascii="Georgia" w:hAnsi="Georgia"/>
@@ -9691,9 +9152,7 @@
       </w:r>
     </w:p>
     <w:p>
-      <w:pPr>
-        <w:ind w:left="288"/>
-      </w:pPr>
+      <w:pPr/>
       <w:r>
         <w:rPr>
           <w:rFonts w:ascii="Georgia" w:hAnsi="Georgia"/>
@@ -9706,9 +9165,7 @@
       </w:r>
     </w:p>
     <w:p>
-      <w:pPr>
-        <w:ind w:left="288"/>
-      </w:pPr>
+      <w:pPr/>
       <w:r>
         <w:rPr>
           <w:rFonts w:ascii="Georgia" w:hAnsi="Georgia"/>
@@ -9721,9 +9178,7 @@
       </w:r>
     </w:p>
     <w:p>
-      <w:pPr>
-        <w:ind w:left="288"/>
-      </w:pPr>
+      <w:pPr/>
       <w:r>
         <w:rPr>
           <w:rFonts w:ascii="Georgia" w:hAnsi="Georgia"/>
@@ -9736,9 +9191,7 @@
       </w:r>
     </w:p>
     <w:p>
-      <w:pPr>
-        <w:ind w:firstLine="0"/>
-      </w:pPr>
+      <w:pPr/>
       <w:r>
         <w:rPr>
           <w:rFonts w:ascii="Georgia" w:hAnsi="Georgia"/>
@@ -9751,9 +9204,7 @@
       </w:r>
     </w:p>
     <w:p>
-      <w:pPr>
-        <w:ind w:left="288"/>
-      </w:pPr>
+      <w:pPr/>
       <w:r>
         <w:rPr>
           <w:rFonts w:ascii="Georgia" w:hAnsi="Georgia"/>
@@ -9766,9 +9217,7 @@
       </w:r>
     </w:p>
     <w:p>
-      <w:pPr>
-        <w:ind w:left="288"/>
-      </w:pPr>
+      <w:pPr/>
       <w:r>
         <w:rPr>
           <w:rFonts w:ascii="Georgia" w:hAnsi="Georgia"/>
@@ -9781,9 +9230,7 @@
       </w:r>
     </w:p>
     <w:p>
-      <w:pPr>
-        <w:ind w:left="288"/>
-      </w:pPr>
+      <w:pPr/>
       <w:r>
         <w:rPr>
           <w:rFonts w:ascii="Georgia" w:hAnsi="Georgia"/>
@@ -9796,9 +9243,7 @@
       </w:r>
     </w:p>
     <w:p>
-      <w:pPr>
-        <w:ind w:firstLine="0"/>
-      </w:pPr>
+      <w:pPr/>
       <w:r>
         <w:rPr>
           <w:rFonts w:ascii="Georgia" w:hAnsi="Georgia"/>
@@ -9811,9 +9256,7 @@
       </w:r>
     </w:p>
     <w:p>
-      <w:pPr>
-        <w:ind w:left="288"/>
-      </w:pPr>
+      <w:pPr/>
       <w:r>
         <w:rPr>
           <w:rFonts w:ascii="Georgia" w:hAnsi="Georgia"/>
@@ -9826,9 +9269,7 @@
       </w:r>
     </w:p>
     <w:p>
-      <w:pPr>
-        <w:ind w:left="288"/>
-      </w:pPr>
+      <w:pPr/>
       <w:r>
         <w:rPr>
           <w:rFonts w:ascii="Georgia" w:hAnsi="Georgia"/>
@@ -9841,9 +9282,7 @@
       </w:r>
     </w:p>
     <w:p>
-      <w:pPr>
-        <w:ind w:left="288"/>
-      </w:pPr>
+      <w:pPr/>
       <w:r>
         <w:rPr>
           <w:rFonts w:ascii="Georgia" w:hAnsi="Georgia"/>
@@ -9856,9 +9295,7 @@
       </w:r>
     </w:p>
     <w:p>
-      <w:pPr>
-        <w:ind w:firstLine="0"/>
-      </w:pPr>
+      <w:pPr/>
       <w:r>
         <w:rPr>
           <w:rFonts w:ascii="Georgia" w:hAnsi="Georgia"/>
@@ -9871,9 +9308,7 @@
       </w:r>
     </w:p>
     <w:p>
-      <w:pPr>
-        <w:ind w:left="288"/>
-      </w:pPr>
+      <w:pPr/>
       <w:r>
         <w:rPr>
           <w:rFonts w:ascii="Georgia" w:hAnsi="Georgia"/>
@@ -9886,9 +9321,7 @@
       </w:r>
     </w:p>
     <w:p>
-      <w:pPr>
-        <w:ind w:left="288"/>
-      </w:pPr>
+      <w:pPr/>
       <w:r>
         <w:rPr>
           <w:rFonts w:ascii="Georgia" w:hAnsi="Georgia"/>
@@ -9901,9 +9334,7 @@
       </w:r>
     </w:p>
     <w:p>
-      <w:pPr>
-        <w:ind w:left="288"/>
-      </w:pPr>
+      <w:pPr/>
       <w:r>
         <w:rPr>
           <w:rFonts w:ascii="Georgia" w:hAnsi="Georgia"/>
@@ -9926,7 +9357,6 @@
     <w:p>
       <w:pPr>
         <w:spacing w:before="120" w:after="120"/>
-        <w:ind w:firstLine="0"/>
         <w:jc w:val="center"/>
       </w:pPr>
       <w:r>
@@ -9973,9 +9403,7 @@
       </w:r>
     </w:p>
     <w:p>
-      <w:pPr>
-        <w:ind w:left="288"/>
-      </w:pPr>
+      <w:pPr/>
       <w:r>
         <w:rPr>
           <w:rFonts w:ascii="Georgia" w:hAnsi="Georgia"/>
@@ -9987,9 +9415,7 @@
       </w:r>
     </w:p>
     <w:p>
-      <w:pPr>
-        <w:ind w:left="288"/>
-      </w:pPr>
+      <w:pPr/>
       <w:r>
         <w:rPr>
           <w:rFonts w:ascii="Georgia" w:hAnsi="Georgia"/>
@@ -10001,9 +9427,7 @@
       </w:r>
     </w:p>
     <w:p>
-      <w:pPr>
-        <w:ind w:left="288"/>
-      </w:pPr>
+      <w:pPr/>
       <w:r>
         <w:rPr>
           <w:rFonts w:ascii="Georgia" w:hAnsi="Georgia"/>
@@ -10015,9 +9439,7 @@
       </w:r>
     </w:p>
     <w:p>
-      <w:pPr>
-        <w:ind w:left="288"/>
-      </w:pPr>
+      <w:pPr/>
       <w:r>
         <w:rPr>
           <w:rFonts w:ascii="Georgia" w:hAnsi="Georgia"/>
@@ -10029,9 +9451,7 @@
       </w:r>
     </w:p>
     <w:p>
-      <w:pPr>
-        <w:ind w:left="288"/>
-      </w:pPr>
+      <w:pPr/>
       <w:r>
         <w:rPr>
           <w:rFonts w:ascii="Georgia" w:hAnsi="Georgia"/>
@@ -10043,9 +9463,7 @@
       </w:r>
     </w:p>
     <w:p>
-      <w:pPr>
-        <w:ind w:left="288"/>
-      </w:pPr>
+      <w:pPr/>
       <w:r>
         <w:rPr>
           <w:rFonts w:ascii="Georgia" w:hAnsi="Georgia"/>
@@ -10065,9 +9483,7 @@
       </w:r>
     </w:p>
     <w:p>
-      <w:pPr>
-        <w:ind w:left="288"/>
-      </w:pPr>
+      <w:pPr/>
       <w:r>
         <w:rPr>
           <w:rFonts w:ascii="Georgia" w:hAnsi="Georgia"/>
@@ -10080,9 +9496,7 @@
       </w:r>
     </w:p>
     <w:p>
-      <w:pPr>
-        <w:ind w:left="288"/>
-      </w:pPr>
+      <w:pPr/>
       <w:r>
         <w:rPr>
           <w:rFonts w:ascii="Georgia" w:hAnsi="Georgia"/>
@@ -10095,9 +9509,7 @@
       </w:r>
     </w:p>
     <w:p>
-      <w:pPr>
-        <w:ind w:left="288"/>
-      </w:pPr>
+      <w:pPr/>
       <w:r>
         <w:rPr>
           <w:rFonts w:ascii="Georgia" w:hAnsi="Georgia"/>
@@ -10110,9 +9522,7 @@
       </w:r>
     </w:p>
     <w:p>
-      <w:pPr>
-        <w:ind w:left="288"/>
-      </w:pPr>
+      <w:pPr/>
       <w:r>
         <w:rPr>
           <w:rFonts w:ascii="Georgia" w:hAnsi="Georgia"/>
@@ -10125,9 +9535,7 @@
       </w:r>
     </w:p>
     <w:p>
-      <w:pPr>
-        <w:ind w:left="288"/>
-      </w:pPr>
+      <w:pPr/>
       <w:r>
         <w:rPr>
           <w:rFonts w:ascii="Georgia" w:hAnsi="Georgia"/>
@@ -10140,9 +9548,7 @@
       </w:r>
     </w:p>
     <w:p>
-      <w:pPr>
-        <w:ind w:left="288"/>
-      </w:pPr>
+      <w:pPr/>
       <w:r>
         <w:rPr>
           <w:rFonts w:ascii="Georgia" w:hAnsi="Georgia"/>
@@ -10165,7 +9571,6 @@
     <w:p>
       <w:pPr>
         <w:spacing w:before="120" w:after="120"/>
-        <w:ind w:firstLine="0"/>
         <w:jc w:val="center"/>
       </w:pPr>
       <w:r>
@@ -10318,9 +9723,7 @@
       </w:r>
     </w:p>
     <w:p>
-      <w:pPr>
-        <w:ind w:firstLine="0"/>
-      </w:pPr>
+      <w:pPr/>
       <w:r>
         <w:rPr>
           <w:rFonts w:ascii="Georgia" w:hAnsi="Georgia"/>
@@ -10341,9 +9744,7 @@
       </w:r>
     </w:p>
     <w:p>
-      <w:pPr>
-        <w:ind w:firstLine="0"/>
-      </w:pPr>
+      <w:pPr/>
       <w:r>
         <w:rPr>
           <w:rFonts w:ascii="Georgia" w:hAnsi="Georgia"/>
@@ -10527,7 +9928,6 @@
     <w:rsid w:val="00FC693F"/>
     <w:pPr>
       <w:spacing w:before="0" w:after="0" w:line="240" w:lineRule="auto"/>
-      <w:ind w:firstLine="288"/>
     </w:pPr>
     <w:rPr>
       <w:rFonts w:ascii="Georgia" w:hAnsi="Georgia"/>
@@ -22235,7 +21635,6 @@
     <w:name w:val="Block Quote"/>
     <w:pPr>
       <w:spacing w:before="80" w:after="80" w:line="240" w:lineRule="auto"/>
-      <w:ind w:left="288"/>
     </w:pPr>
     <w:rPr>
       <w:rFonts w:ascii="Georgia" w:hAnsi="Georgia"/>

</xml_diff>

<commit_message>
Unified indent: bullets/numbers/quotes at 0.2in left = same as body first line
</commit_message>
<xml_diff>
--- a/kdp-files/difficult_conversations_ebook.docx
+++ b/kdp-files/difficult_conversations_ebook.docx
@@ -718,7 +718,7 @@
     </w:p>
     <w:p>
       <w:pPr>
-        <w:ind w:left="0" w:firstLine="0"/>
+        <w:ind w:left="288" w:firstLine="0"/>
       </w:pPr>
       <w:r>
         <w:rPr>
@@ -743,7 +743,7 @@
     </w:p>
     <w:p>
       <w:pPr>
-        <w:ind w:left="0" w:firstLine="0"/>
+        <w:ind w:left="288" w:firstLine="0"/>
       </w:pPr>
       <w:r>
         <w:rPr>
@@ -768,7 +768,7 @@
     </w:p>
     <w:p>
       <w:pPr>
-        <w:ind w:left="0" w:firstLine="0"/>
+        <w:ind w:left="288" w:firstLine="0"/>
       </w:pPr>
       <w:r>
         <w:rPr>
@@ -793,7 +793,7 @@
     </w:p>
     <w:p>
       <w:pPr>
-        <w:ind w:left="0" w:firstLine="0"/>
+        <w:ind w:left="288" w:firstLine="0"/>
       </w:pPr>
       <w:r>
         <w:rPr>
@@ -818,7 +818,7 @@
     </w:p>
     <w:p>
       <w:pPr>
-        <w:ind w:left="0" w:firstLine="0"/>
+        <w:ind w:left="288" w:firstLine="0"/>
       </w:pPr>
       <w:r>
         <w:rPr>
@@ -1076,7 +1076,7 @@
     </w:p>
     <w:p>
       <w:pPr>
-        <w:ind w:left="0" w:firstLine="0"/>
+        <w:ind w:left="288" w:firstLine="0"/>
       </w:pPr>
       <w:r>
         <w:rPr>
@@ -1101,7 +1101,7 @@
     </w:p>
     <w:p>
       <w:pPr>
-        <w:ind w:left="0" w:firstLine="0"/>
+        <w:ind w:left="288" w:firstLine="0"/>
       </w:pPr>
       <w:r>
         <w:rPr>
@@ -1126,7 +1126,7 @@
     </w:p>
     <w:p>
       <w:pPr>
-        <w:ind w:left="0" w:firstLine="0"/>
+        <w:ind w:left="288" w:firstLine="0"/>
       </w:pPr>
       <w:r>
         <w:rPr>
@@ -1151,7 +1151,7 @@
     </w:p>
     <w:p>
       <w:pPr>
-        <w:ind w:left="0" w:firstLine="0"/>
+        <w:ind w:left="288" w:firstLine="0"/>
       </w:pPr>
       <w:r>
         <w:rPr>
@@ -1215,7 +1215,7 @@
     </w:p>
     <w:p>
       <w:pPr>
-        <w:ind w:left="0" w:firstLine="0"/>
+        <w:ind w:left="288" w:firstLine="0"/>
       </w:pPr>
       <w:r>
         <w:rPr>
@@ -1240,7 +1240,7 @@
     </w:p>
     <w:p>
       <w:pPr>
-        <w:ind w:left="0" w:firstLine="0"/>
+        <w:ind w:left="288" w:firstLine="0"/>
       </w:pPr>
       <w:r>
         <w:rPr>
@@ -1265,7 +1265,7 @@
     </w:p>
     <w:p>
       <w:pPr>
-        <w:ind w:left="0" w:firstLine="0"/>
+        <w:ind w:left="288" w:firstLine="0"/>
       </w:pPr>
       <w:r>
         <w:rPr>
@@ -1290,7 +1290,7 @@
     </w:p>
     <w:p>
       <w:pPr>
-        <w:ind w:left="0" w:firstLine="0"/>
+        <w:ind w:left="288" w:firstLine="0"/>
       </w:pPr>
       <w:r>
         <w:rPr>
@@ -1315,7 +1315,7 @@
     </w:p>
     <w:p>
       <w:pPr>
-        <w:ind w:left="0" w:firstLine="0"/>
+        <w:ind w:left="288" w:firstLine="0"/>
       </w:pPr>
       <w:r>
         <w:rPr>
@@ -1558,7 +1558,7 @@
     </w:p>
     <w:p>
       <w:pPr>
-        <w:ind w:left="0" w:firstLine="0"/>
+        <w:ind w:left="288" w:firstLine="0"/>
       </w:pPr>
       <w:r>
         <w:rPr>
@@ -1583,7 +1583,7 @@
     </w:p>
     <w:p>
       <w:pPr>
-        <w:ind w:left="0" w:firstLine="0"/>
+        <w:ind w:left="288" w:firstLine="0"/>
       </w:pPr>
       <w:r>
         <w:rPr>
@@ -1628,7 +1628,7 @@
     </w:p>
     <w:p>
       <w:pPr>
-        <w:ind w:left="0" w:firstLine="0"/>
+        <w:ind w:left="288" w:firstLine="0"/>
       </w:pPr>
       <w:r>
         <w:rPr>
@@ -1668,7 +1668,7 @@
     </w:p>
     <w:p>
       <w:pPr>
-        <w:ind w:left="0" w:firstLine="0"/>
+        <w:ind w:left="288" w:firstLine="0"/>
       </w:pPr>
       <w:r>
         <w:rPr>
@@ -1683,7 +1683,7 @@
     </w:p>
     <w:p>
       <w:pPr>
-        <w:ind w:left="0" w:firstLine="0"/>
+        <w:ind w:left="288" w:firstLine="0"/>
       </w:pPr>
       <w:r>
         <w:rPr>
@@ -1698,7 +1698,7 @@
     </w:p>
     <w:p>
       <w:pPr>
-        <w:ind w:left="0" w:firstLine="0"/>
+        <w:ind w:left="288" w:firstLine="0"/>
       </w:pPr>
       <w:r>
         <w:rPr>
@@ -1767,7 +1767,7 @@
     </w:p>
     <w:p>
       <w:pPr>
-        <w:ind w:left="0" w:firstLine="0"/>
+        <w:ind w:left="288" w:firstLine="0"/>
       </w:pPr>
       <w:r>
         <w:rPr>
@@ -1792,7 +1792,7 @@
     </w:p>
     <w:p>
       <w:pPr>
-        <w:ind w:left="0" w:firstLine="0"/>
+        <w:ind w:left="288" w:firstLine="0"/>
       </w:pPr>
       <w:r>
         <w:rPr>
@@ -1817,7 +1817,7 @@
     </w:p>
     <w:p>
       <w:pPr>
-        <w:ind w:left="0" w:firstLine="0"/>
+        <w:ind w:left="288" w:firstLine="0"/>
       </w:pPr>
       <w:r>
         <w:rPr>
@@ -1842,7 +1842,7 @@
     </w:p>
     <w:p>
       <w:pPr>
-        <w:ind w:left="0" w:firstLine="0"/>
+        <w:ind w:left="288" w:firstLine="0"/>
       </w:pPr>
       <w:r>
         <w:rPr>
@@ -1996,7 +1996,7 @@
     </w:p>
     <w:p>
       <w:pPr>
-        <w:ind w:left="0" w:firstLine="0"/>
+        <w:ind w:left="288" w:firstLine="0"/>
       </w:pPr>
       <w:r>
         <w:rPr>
@@ -2011,7 +2011,7 @@
     </w:p>
     <w:p>
       <w:pPr>
-        <w:ind w:left="0" w:firstLine="0"/>
+        <w:ind w:left="288" w:firstLine="0"/>
       </w:pPr>
       <w:r>
         <w:rPr>
@@ -2026,7 +2026,7 @@
     </w:p>
     <w:p>
       <w:pPr>
-        <w:ind w:left="0" w:firstLine="0"/>
+        <w:ind w:left="288" w:firstLine="0"/>
       </w:pPr>
       <w:r>
         <w:rPr>
@@ -2056,7 +2056,7 @@
     </w:p>
     <w:p>
       <w:pPr>
-        <w:ind w:left="0" w:firstLine="0"/>
+        <w:ind w:left="288" w:firstLine="0"/>
       </w:pPr>
       <w:r>
         <w:rPr>
@@ -2071,7 +2071,7 @@
     </w:p>
     <w:p>
       <w:pPr>
-        <w:ind w:left="0" w:firstLine="0"/>
+        <w:ind w:left="288" w:firstLine="0"/>
       </w:pPr>
       <w:r>
         <w:rPr>
@@ -2086,7 +2086,7 @@
     </w:p>
     <w:p>
       <w:pPr>
-        <w:ind w:left="0" w:firstLine="0"/>
+        <w:ind w:left="288" w:firstLine="0"/>
       </w:pPr>
       <w:r>
         <w:rPr>
@@ -2265,7 +2265,7 @@
     </w:p>
     <w:p>
       <w:pPr>
-        <w:ind w:left="0" w:firstLine="0"/>
+        <w:ind w:left="288" w:firstLine="0"/>
       </w:pPr>
       <w:r>
         <w:rPr>
@@ -2290,7 +2290,7 @@
     </w:p>
     <w:p>
       <w:pPr>
-        <w:ind w:left="0" w:firstLine="0"/>
+        <w:ind w:left="288" w:firstLine="0"/>
       </w:pPr>
       <w:r>
         <w:rPr>
@@ -2315,7 +2315,7 @@
     </w:p>
     <w:p>
       <w:pPr>
-        <w:ind w:left="0" w:firstLine="0"/>
+        <w:ind w:left="288" w:firstLine="0"/>
       </w:pPr>
       <w:r>
         <w:rPr>
@@ -2459,7 +2459,7 @@
     </w:p>
     <w:p>
       <w:pPr>
-        <w:ind w:left="0" w:firstLine="0"/>
+        <w:ind w:left="288" w:firstLine="0"/>
       </w:pPr>
       <w:r>
         <w:rPr>
@@ -2474,7 +2474,7 @@
     </w:p>
     <w:p>
       <w:pPr>
-        <w:ind w:left="0" w:firstLine="0"/>
+        <w:ind w:left="288" w:firstLine="0"/>
       </w:pPr>
       <w:r>
         <w:rPr>
@@ -2489,7 +2489,7 @@
     </w:p>
     <w:p>
       <w:pPr>
-        <w:ind w:left="0" w:firstLine="0"/>
+        <w:ind w:left="288" w:firstLine="0"/>
       </w:pPr>
       <w:r>
         <w:rPr>
@@ -2504,7 +2504,7 @@
     </w:p>
     <w:p>
       <w:pPr>
-        <w:ind w:left="0" w:firstLine="0"/>
+        <w:ind w:left="288" w:firstLine="0"/>
       </w:pPr>
       <w:r>
         <w:rPr>
@@ -2534,7 +2534,7 @@
     </w:p>
     <w:p>
       <w:pPr>
-        <w:ind w:left="0" w:firstLine="0"/>
+        <w:ind w:left="288" w:firstLine="0"/>
       </w:pPr>
       <w:r>
         <w:rPr>
@@ -2549,7 +2549,7 @@
     </w:p>
     <w:p>
       <w:pPr>
-        <w:ind w:left="0" w:firstLine="0"/>
+        <w:ind w:left="288" w:firstLine="0"/>
       </w:pPr>
       <w:r>
         <w:rPr>
@@ -2564,7 +2564,7 @@
     </w:p>
     <w:p>
       <w:pPr>
-        <w:ind w:left="0" w:firstLine="0"/>
+        <w:ind w:left="288" w:firstLine="0"/>
       </w:pPr>
       <w:r>
         <w:rPr>
@@ -2687,7 +2687,7 @@
     <w:p>
       <w:pPr>
         <w:pStyle w:val="BlockQuote"/>
-        <w:ind w:left="0" w:firstLine="0"/>
+        <w:ind w:left="288" w:firstLine="0"/>
       </w:pPr>
       <w:r>
         <w:rPr>
@@ -2718,7 +2718,7 @@
     <w:p>
       <w:pPr>
         <w:pStyle w:val="BlockQuote"/>
-        <w:ind w:left="0" w:firstLine="0"/>
+        <w:ind w:left="288" w:firstLine="0"/>
       </w:pPr>
       <w:r>
         <w:rPr>
@@ -2764,7 +2764,7 @@
     <w:p>
       <w:pPr>
         <w:pStyle w:val="BlockQuote"/>
-        <w:ind w:left="0" w:firstLine="0"/>
+        <w:ind w:left="288" w:firstLine="0"/>
       </w:pPr>
       <w:r>
         <w:rPr>
@@ -2795,7 +2795,7 @@
     <w:p>
       <w:pPr>
         <w:pStyle w:val="BlockQuote"/>
-        <w:ind w:left="0" w:firstLine="0"/>
+        <w:ind w:left="288" w:firstLine="0"/>
       </w:pPr>
       <w:r>
         <w:rPr>
@@ -2826,7 +2826,7 @@
     <w:p>
       <w:pPr>
         <w:pStyle w:val="BlockQuote"/>
-        <w:ind w:left="0" w:firstLine="0"/>
+        <w:ind w:left="288" w:firstLine="0"/>
       </w:pPr>
       <w:r>
         <w:rPr>
@@ -2850,7 +2850,7 @@
     </w:p>
     <w:p>
       <w:pPr>
-        <w:ind w:left="0" w:firstLine="0"/>
+        <w:ind w:left="288" w:firstLine="0"/>
       </w:pPr>
       <w:r>
         <w:rPr>
@@ -2865,7 +2865,7 @@
     </w:p>
     <w:p>
       <w:pPr>
-        <w:ind w:left="0" w:firstLine="0"/>
+        <w:ind w:left="288" w:firstLine="0"/>
       </w:pPr>
       <w:r>
         <w:rPr>
@@ -2880,7 +2880,7 @@
     </w:p>
     <w:p>
       <w:pPr>
-        <w:ind w:left="0" w:firstLine="0"/>
+        <w:ind w:left="288" w:firstLine="0"/>
       </w:pPr>
       <w:r>
         <w:rPr>
@@ -2895,7 +2895,7 @@
     </w:p>
     <w:p>
       <w:pPr>
-        <w:ind w:left="0" w:firstLine="0"/>
+        <w:ind w:left="288" w:firstLine="0"/>
       </w:pPr>
       <w:r>
         <w:rPr>
@@ -2910,7 +2910,7 @@
     </w:p>
     <w:p>
       <w:pPr>
-        <w:ind w:left="0" w:firstLine="0"/>
+        <w:ind w:left="288" w:firstLine="0"/>
       </w:pPr>
       <w:r>
         <w:rPr>
@@ -2998,7 +2998,7 @@
     </w:p>
     <w:p>
       <w:pPr>
-        <w:ind w:left="0" w:firstLine="0"/>
+        <w:ind w:left="288" w:firstLine="0"/>
       </w:pPr>
       <w:r>
         <w:rPr>
@@ -3023,7 +3023,7 @@
     </w:p>
     <w:p>
       <w:pPr>
-        <w:ind w:left="0" w:firstLine="0"/>
+        <w:ind w:left="288" w:firstLine="0"/>
       </w:pPr>
       <w:r>
         <w:rPr>
@@ -3048,7 +3048,7 @@
     </w:p>
     <w:p>
       <w:pPr>
-        <w:ind w:left="0" w:firstLine="0"/>
+        <w:ind w:left="288" w:firstLine="0"/>
       </w:pPr>
       <w:r>
         <w:rPr>
@@ -3073,7 +3073,7 @@
     </w:p>
     <w:p>
       <w:pPr>
-        <w:ind w:left="0" w:firstLine="0"/>
+        <w:ind w:left="288" w:firstLine="0"/>
       </w:pPr>
       <w:r>
         <w:rPr>
@@ -3156,7 +3156,7 @@
     <w:p>
       <w:pPr>
         <w:pStyle w:val="BlockQuote"/>
-        <w:ind w:left="0" w:firstLine="0"/>
+        <w:ind w:left="288" w:firstLine="0"/>
       </w:pPr>
       <w:r>
         <w:rPr>
@@ -3187,7 +3187,7 @@
     <w:p>
       <w:pPr>
         <w:pStyle w:val="BlockQuote"/>
-        <w:ind w:left="0" w:firstLine="0"/>
+        <w:ind w:left="288" w:firstLine="0"/>
       </w:pPr>
       <w:r>
         <w:rPr>
@@ -3218,7 +3218,7 @@
     <w:p>
       <w:pPr>
         <w:pStyle w:val="BlockQuote"/>
-        <w:ind w:left="0" w:firstLine="0"/>
+        <w:ind w:left="288" w:firstLine="0"/>
       </w:pPr>
       <w:r>
         <w:rPr>
@@ -3249,7 +3249,7 @@
     <w:p>
       <w:pPr>
         <w:pStyle w:val="BlockQuote"/>
-        <w:ind w:left="0" w:firstLine="0"/>
+        <w:ind w:left="288" w:firstLine="0"/>
       </w:pPr>
       <w:r>
         <w:rPr>
@@ -3280,7 +3280,7 @@
     <w:p>
       <w:pPr>
         <w:pStyle w:val="BlockQuote"/>
-        <w:ind w:left="0" w:firstLine="0"/>
+        <w:ind w:left="288" w:firstLine="0"/>
       </w:pPr>
       <w:r>
         <w:rPr>
@@ -3304,7 +3304,7 @@
     </w:p>
     <w:p>
       <w:pPr>
-        <w:ind w:left="0" w:firstLine="0"/>
+        <w:ind w:left="288" w:firstLine="0"/>
       </w:pPr>
       <w:r>
         <w:rPr>
@@ -3319,7 +3319,7 @@
     </w:p>
     <w:p>
       <w:pPr>
-        <w:ind w:left="0" w:firstLine="0"/>
+        <w:ind w:left="288" w:firstLine="0"/>
       </w:pPr>
       <w:r>
         <w:rPr>
@@ -3334,7 +3334,7 @@
     </w:p>
     <w:p>
       <w:pPr>
-        <w:ind w:left="0" w:firstLine="0"/>
+        <w:ind w:left="288" w:firstLine="0"/>
       </w:pPr>
       <w:r>
         <w:rPr>
@@ -3349,7 +3349,7 @@
     </w:p>
     <w:p>
       <w:pPr>
-        <w:ind w:left="0" w:firstLine="0"/>
+        <w:ind w:left="288" w:firstLine="0"/>
       </w:pPr>
       <w:r>
         <w:rPr>
@@ -3364,7 +3364,7 @@
     </w:p>
     <w:p>
       <w:pPr>
-        <w:ind w:left="0" w:firstLine="0"/>
+        <w:ind w:left="288" w:firstLine="0"/>
       </w:pPr>
       <w:r>
         <w:rPr>
@@ -3482,7 +3482,7 @@
     </w:p>
     <w:p>
       <w:pPr>
-        <w:ind w:left="0" w:firstLine="0"/>
+        <w:ind w:left="288" w:firstLine="0"/>
       </w:pPr>
       <w:r>
         <w:rPr>
@@ -3507,7 +3507,7 @@
     </w:p>
     <w:p>
       <w:pPr>
-        <w:ind w:left="0" w:firstLine="0"/>
+        <w:ind w:left="288" w:firstLine="0"/>
       </w:pPr>
       <w:r>
         <w:rPr>
@@ -3532,7 +3532,7 @@
     </w:p>
     <w:p>
       <w:pPr>
-        <w:ind w:left="0" w:firstLine="0"/>
+        <w:ind w:left="288" w:firstLine="0"/>
       </w:pPr>
       <w:r>
         <w:rPr>
@@ -3650,7 +3650,7 @@
     <w:p>
       <w:pPr>
         <w:pStyle w:val="BlockQuote"/>
-        <w:ind w:left="0" w:firstLine="0"/>
+        <w:ind w:left="288" w:firstLine="0"/>
       </w:pPr>
       <w:r>
         <w:rPr>
@@ -3681,7 +3681,7 @@
     <w:p>
       <w:pPr>
         <w:pStyle w:val="BlockQuote"/>
-        <w:ind w:left="0" w:firstLine="0"/>
+        <w:ind w:left="288" w:firstLine="0"/>
       </w:pPr>
       <w:r>
         <w:rPr>
@@ -3721,7 +3721,7 @@
     </w:p>
     <w:p>
       <w:pPr>
-        <w:ind w:left="0" w:firstLine="0"/>
+        <w:ind w:left="288" w:firstLine="0"/>
       </w:pPr>
       <w:r>
         <w:rPr>
@@ -3736,7 +3736,7 @@
     </w:p>
     <w:p>
       <w:pPr>
-        <w:ind w:left="0" w:firstLine="0"/>
+        <w:ind w:left="288" w:firstLine="0"/>
       </w:pPr>
       <w:r>
         <w:rPr>
@@ -3751,7 +3751,7 @@
     </w:p>
     <w:p>
       <w:pPr>
-        <w:ind w:left="0" w:firstLine="0"/>
+        <w:ind w:left="288" w:firstLine="0"/>
       </w:pPr>
       <w:r>
         <w:rPr>
@@ -3766,7 +3766,7 @@
     </w:p>
     <w:p>
       <w:pPr>
-        <w:ind w:left="0" w:firstLine="0"/>
+        <w:ind w:left="288" w:firstLine="0"/>
       </w:pPr>
       <w:r>
         <w:rPr>
@@ -3781,7 +3781,7 @@
     </w:p>
     <w:p>
       <w:pPr>
-        <w:ind w:left="0" w:firstLine="0"/>
+        <w:ind w:left="288" w:firstLine="0"/>
       </w:pPr>
       <w:r>
         <w:rPr>
@@ -3796,7 +3796,7 @@
     </w:p>
     <w:p>
       <w:pPr>
-        <w:ind w:left="0" w:firstLine="0"/>
+        <w:ind w:left="288" w:firstLine="0"/>
       </w:pPr>
       <w:r>
         <w:rPr>
@@ -3812,7 +3812,7 @@
     <w:p>
       <w:pPr>
         <w:pStyle w:val="BlockQuote"/>
-        <w:ind w:left="0" w:firstLine="0"/>
+        <w:ind w:left="288" w:firstLine="0"/>
       </w:pPr>
       <w:r>
         <w:rPr>
@@ -3843,7 +3843,7 @@
     <w:p>
       <w:pPr>
         <w:pStyle w:val="BlockQuote"/>
-        <w:ind w:left="0" w:firstLine="0"/>
+        <w:ind w:left="288" w:firstLine="0"/>
       </w:pPr>
       <w:r>
         <w:rPr>
@@ -3867,7 +3867,7 @@
     </w:p>
     <w:p>
       <w:pPr>
-        <w:ind w:left="0" w:firstLine="0"/>
+        <w:ind w:left="288" w:firstLine="0"/>
       </w:pPr>
       <w:r>
         <w:rPr>
@@ -3882,7 +3882,7 @@
     </w:p>
     <w:p>
       <w:pPr>
-        <w:ind w:left="0" w:firstLine="0"/>
+        <w:ind w:left="288" w:firstLine="0"/>
       </w:pPr>
       <w:r>
         <w:rPr>
@@ -3897,7 +3897,7 @@
     </w:p>
     <w:p>
       <w:pPr>
-        <w:ind w:left="0" w:firstLine="0"/>
+        <w:ind w:left="288" w:firstLine="0"/>
       </w:pPr>
       <w:r>
         <w:rPr>
@@ -3912,7 +3912,7 @@
     </w:p>
     <w:p>
       <w:pPr>
-        <w:ind w:left="0" w:firstLine="0"/>
+        <w:ind w:left="288" w:firstLine="0"/>
       </w:pPr>
       <w:r>
         <w:rPr>
@@ -3927,7 +3927,7 @@
     </w:p>
     <w:p>
       <w:pPr>
-        <w:ind w:left="0" w:firstLine="0"/>
+        <w:ind w:left="288" w:firstLine="0"/>
       </w:pPr>
       <w:r>
         <w:rPr>
@@ -4080,7 +4080,7 @@
     </w:p>
     <w:p>
       <w:pPr>
-        <w:ind w:left="0" w:firstLine="0"/>
+        <w:ind w:left="288" w:firstLine="0"/>
       </w:pPr>
       <w:r>
         <w:rPr>
@@ -4105,7 +4105,7 @@
     </w:p>
     <w:p>
       <w:pPr>
-        <w:ind w:left="0" w:firstLine="0"/>
+        <w:ind w:left="288" w:firstLine="0"/>
       </w:pPr>
       <w:r>
         <w:rPr>
@@ -4130,7 +4130,7 @@
     </w:p>
     <w:p>
       <w:pPr>
-        <w:ind w:left="0" w:firstLine="0"/>
+        <w:ind w:left="288" w:firstLine="0"/>
       </w:pPr>
       <w:r>
         <w:rPr>
@@ -4155,7 +4155,7 @@
     </w:p>
     <w:p>
       <w:pPr>
-        <w:ind w:left="0" w:firstLine="0"/>
+        <w:ind w:left="288" w:firstLine="0"/>
       </w:pPr>
       <w:r>
         <w:rPr>
@@ -4238,7 +4238,7 @@
     <w:p>
       <w:pPr>
         <w:pStyle w:val="BlockQuote"/>
-        <w:ind w:left="0" w:firstLine="0"/>
+        <w:ind w:left="288" w:firstLine="0"/>
       </w:pPr>
       <w:r>
         <w:rPr>
@@ -4269,7 +4269,7 @@
     <w:p>
       <w:pPr>
         <w:pStyle w:val="BlockQuote"/>
-        <w:ind w:left="0" w:firstLine="0"/>
+        <w:ind w:left="288" w:firstLine="0"/>
       </w:pPr>
       <w:r>
         <w:rPr>
@@ -4300,7 +4300,7 @@
     <w:p>
       <w:pPr>
         <w:pStyle w:val="BlockQuote"/>
-        <w:ind w:left="0" w:firstLine="0"/>
+        <w:ind w:left="288" w:firstLine="0"/>
       </w:pPr>
       <w:r>
         <w:rPr>
@@ -4331,7 +4331,7 @@
     <w:p>
       <w:pPr>
         <w:pStyle w:val="BlockQuote"/>
-        <w:ind w:left="0" w:firstLine="0"/>
+        <w:ind w:left="288" w:firstLine="0"/>
       </w:pPr>
       <w:r>
         <w:rPr>
@@ -4362,7 +4362,7 @@
     <w:p>
       <w:pPr>
         <w:pStyle w:val="BlockQuote"/>
-        <w:ind w:left="0" w:firstLine="0"/>
+        <w:ind w:left="288" w:firstLine="0"/>
       </w:pPr>
       <w:r>
         <w:rPr>
@@ -4386,7 +4386,7 @@
     </w:p>
     <w:p>
       <w:pPr>
-        <w:ind w:left="0" w:firstLine="0"/>
+        <w:ind w:left="288" w:firstLine="0"/>
       </w:pPr>
       <w:r>
         <w:rPr>
@@ -4401,7 +4401,7 @@
     </w:p>
     <w:p>
       <w:pPr>
-        <w:ind w:left="0" w:firstLine="0"/>
+        <w:ind w:left="288" w:firstLine="0"/>
       </w:pPr>
       <w:r>
         <w:rPr>
@@ -4416,7 +4416,7 @@
     </w:p>
     <w:p>
       <w:pPr>
-        <w:ind w:left="0" w:firstLine="0"/>
+        <w:ind w:left="288" w:firstLine="0"/>
       </w:pPr>
       <w:r>
         <w:rPr>
@@ -4431,7 +4431,7 @@
     </w:p>
     <w:p>
       <w:pPr>
-        <w:ind w:left="0" w:firstLine="0"/>
+        <w:ind w:left="288" w:firstLine="0"/>
       </w:pPr>
       <w:r>
         <w:rPr>
@@ -4446,7 +4446,7 @@
     </w:p>
     <w:p>
       <w:pPr>
-        <w:ind w:left="0" w:firstLine="0"/>
+        <w:ind w:left="288" w:firstLine="0"/>
       </w:pPr>
       <w:r>
         <w:rPr>
@@ -4461,7 +4461,7 @@
     </w:p>
     <w:p>
       <w:pPr>
-        <w:ind w:left="0" w:firstLine="0"/>
+        <w:ind w:left="288" w:firstLine="0"/>
       </w:pPr>
       <w:r>
         <w:rPr>
@@ -4639,7 +4639,7 @@
     </w:p>
     <w:p>
       <w:pPr>
-        <w:ind w:left="0" w:firstLine="0"/>
+        <w:ind w:left="288" w:firstLine="0"/>
       </w:pPr>
       <w:r>
         <w:rPr>
@@ -4664,7 +4664,7 @@
     </w:p>
     <w:p>
       <w:pPr>
-        <w:ind w:left="0" w:firstLine="0"/>
+        <w:ind w:left="288" w:firstLine="0"/>
       </w:pPr>
       <w:r>
         <w:rPr>
@@ -4689,7 +4689,7 @@
     </w:p>
     <w:p>
       <w:pPr>
-        <w:ind w:left="0" w:firstLine="0"/>
+        <w:ind w:left="288" w:firstLine="0"/>
       </w:pPr>
       <w:r>
         <w:rPr>
@@ -4714,7 +4714,7 @@
     </w:p>
     <w:p>
       <w:pPr>
-        <w:ind w:left="0" w:firstLine="0"/>
+        <w:ind w:left="288" w:firstLine="0"/>
       </w:pPr>
       <w:r>
         <w:rPr>
@@ -4822,7 +4822,7 @@
     <w:p>
       <w:pPr>
         <w:pStyle w:val="BlockQuote"/>
-        <w:ind w:left="0" w:firstLine="0"/>
+        <w:ind w:left="288" w:firstLine="0"/>
       </w:pPr>
       <w:r>
         <w:rPr>
@@ -4868,7 +4868,7 @@
     <w:p>
       <w:pPr>
         <w:pStyle w:val="BlockQuote"/>
-        <w:ind w:left="0" w:firstLine="0"/>
+        <w:ind w:left="288" w:firstLine="0"/>
       </w:pPr>
       <w:r>
         <w:rPr>
@@ -4899,7 +4899,7 @@
     <w:p>
       <w:pPr>
         <w:pStyle w:val="BlockQuote"/>
-        <w:ind w:left="0" w:firstLine="0"/>
+        <w:ind w:left="288" w:firstLine="0"/>
       </w:pPr>
       <w:r>
         <w:rPr>
@@ -4930,7 +4930,7 @@
     <w:p>
       <w:pPr>
         <w:pStyle w:val="BlockQuote"/>
-        <w:ind w:left="0" w:firstLine="0"/>
+        <w:ind w:left="288" w:firstLine="0"/>
       </w:pPr>
       <w:r>
         <w:rPr>
@@ -4961,7 +4961,7 @@
     <w:p>
       <w:pPr>
         <w:pStyle w:val="BlockQuote"/>
-        <w:ind w:left="0" w:firstLine="0"/>
+        <w:ind w:left="288" w:firstLine="0"/>
       </w:pPr>
       <w:r>
         <w:rPr>
@@ -4985,7 +4985,7 @@
     </w:p>
     <w:p>
       <w:pPr>
-        <w:ind w:left="0" w:firstLine="0"/>
+        <w:ind w:left="288" w:firstLine="0"/>
       </w:pPr>
       <w:r>
         <w:rPr>
@@ -5000,7 +5000,7 @@
     </w:p>
     <w:p>
       <w:pPr>
-        <w:ind w:left="0" w:firstLine="0"/>
+        <w:ind w:left="288" w:firstLine="0"/>
       </w:pPr>
       <w:r>
         <w:rPr>
@@ -5015,7 +5015,7 @@
     </w:p>
     <w:p>
       <w:pPr>
-        <w:ind w:left="0" w:firstLine="0"/>
+        <w:ind w:left="288" w:firstLine="0"/>
       </w:pPr>
       <w:r>
         <w:rPr>
@@ -5030,7 +5030,7 @@
     </w:p>
     <w:p>
       <w:pPr>
-        <w:ind w:left="0" w:firstLine="0"/>
+        <w:ind w:left="288" w:firstLine="0"/>
       </w:pPr>
       <w:r>
         <w:rPr>
@@ -5045,7 +5045,7 @@
     </w:p>
     <w:p>
       <w:pPr>
-        <w:ind w:left="0" w:firstLine="0"/>
+        <w:ind w:left="288" w:firstLine="0"/>
       </w:pPr>
       <w:r>
         <w:rPr>
@@ -5060,7 +5060,7 @@
     </w:p>
     <w:p>
       <w:pPr>
-        <w:ind w:left="0" w:firstLine="0"/>
+        <w:ind w:left="288" w:firstLine="0"/>
       </w:pPr>
       <w:r>
         <w:rPr>
@@ -5114,7 +5114,7 @@
     </w:p>
     <w:p>
       <w:pPr>
-        <w:ind w:left="0" w:firstLine="0"/>
+        <w:ind w:left="288" w:firstLine="0"/>
       </w:pPr>
       <w:r>
         <w:rPr>
@@ -5139,7 +5139,7 @@
     </w:p>
     <w:p>
       <w:pPr>
-        <w:ind w:left="0" w:firstLine="0"/>
+        <w:ind w:left="288" w:firstLine="0"/>
       </w:pPr>
       <w:r>
         <w:rPr>
@@ -5164,7 +5164,7 @@
     </w:p>
     <w:p>
       <w:pPr>
-        <w:ind w:left="0" w:firstLine="0"/>
+        <w:ind w:left="288" w:firstLine="0"/>
       </w:pPr>
       <w:r>
         <w:rPr>
@@ -5213,7 +5213,7 @@
     </w:p>
     <w:p>
       <w:pPr>
-        <w:ind w:left="0" w:firstLine="0"/>
+        <w:ind w:left="288" w:firstLine="0"/>
       </w:pPr>
       <w:r>
         <w:rPr>
@@ -5238,7 +5238,7 @@
     </w:p>
     <w:p>
       <w:pPr>
-        <w:ind w:left="0" w:firstLine="0"/>
+        <w:ind w:left="288" w:firstLine="0"/>
       </w:pPr>
       <w:r>
         <w:rPr>
@@ -5263,7 +5263,7 @@
     </w:p>
     <w:p>
       <w:pPr>
-        <w:ind w:left="0" w:firstLine="0"/>
+        <w:ind w:left="288" w:firstLine="0"/>
       </w:pPr>
       <w:r>
         <w:rPr>
@@ -5308,7 +5308,7 @@
     </w:p>
     <w:p>
       <w:pPr>
-        <w:ind w:left="0" w:firstLine="0"/>
+        <w:ind w:left="288" w:firstLine="0"/>
       </w:pPr>
       <w:r>
         <w:rPr>
@@ -5406,7 +5406,7 @@
     <w:p>
       <w:pPr>
         <w:pStyle w:val="BlockQuote"/>
-        <w:ind w:left="0" w:firstLine="0"/>
+        <w:ind w:left="288" w:firstLine="0"/>
       </w:pPr>
       <w:r>
         <w:rPr>
@@ -5437,7 +5437,7 @@
     <w:p>
       <w:pPr>
         <w:pStyle w:val="BlockQuote"/>
-        <w:ind w:left="0" w:firstLine="0"/>
+        <w:ind w:left="288" w:firstLine="0"/>
       </w:pPr>
       <w:r>
         <w:rPr>
@@ -5468,7 +5468,7 @@
     <w:p>
       <w:pPr>
         <w:pStyle w:val="BlockQuote"/>
-        <w:ind w:left="0" w:firstLine="0"/>
+        <w:ind w:left="288" w:firstLine="0"/>
       </w:pPr>
       <w:r>
         <w:rPr>
@@ -5484,7 +5484,7 @@
     <w:p>
       <w:pPr>
         <w:pStyle w:val="BlockQuote"/>
-        <w:ind w:left="0" w:firstLine="0"/>
+        <w:ind w:left="288" w:firstLine="0"/>
       </w:pPr>
       <w:r>
         <w:rPr>
@@ -5515,7 +5515,7 @@
     <w:p>
       <w:pPr>
         <w:pStyle w:val="BlockQuote"/>
-        <w:ind w:left="0" w:firstLine="0"/>
+        <w:ind w:left="288" w:firstLine="0"/>
       </w:pPr>
       <w:r>
         <w:rPr>
@@ -5561,7 +5561,7 @@
     <w:p>
       <w:pPr>
         <w:pStyle w:val="BlockQuote"/>
-        <w:ind w:left="0" w:firstLine="0"/>
+        <w:ind w:left="288" w:firstLine="0"/>
       </w:pPr>
       <w:r>
         <w:rPr>
@@ -5592,7 +5592,7 @@
     <w:p>
       <w:pPr>
         <w:pStyle w:val="BlockQuote"/>
-        <w:ind w:left="0" w:firstLine="0"/>
+        <w:ind w:left="288" w:firstLine="0"/>
       </w:pPr>
       <w:r>
         <w:rPr>
@@ -5616,7 +5616,7 @@
     </w:p>
     <w:p>
       <w:pPr>
-        <w:ind w:left="0" w:firstLine="0"/>
+        <w:ind w:left="288" w:firstLine="0"/>
       </w:pPr>
       <w:r>
         <w:rPr>
@@ -5631,7 +5631,7 @@
     </w:p>
     <w:p>
       <w:pPr>
-        <w:ind w:left="0" w:firstLine="0"/>
+        <w:ind w:left="288" w:firstLine="0"/>
       </w:pPr>
       <w:r>
         <w:rPr>
@@ -5646,7 +5646,7 @@
     </w:p>
     <w:p>
       <w:pPr>
-        <w:ind w:left="0" w:firstLine="0"/>
+        <w:ind w:left="288" w:firstLine="0"/>
       </w:pPr>
       <w:r>
         <w:rPr>
@@ -5661,7 +5661,7 @@
     </w:p>
     <w:p>
       <w:pPr>
-        <w:ind w:left="0" w:firstLine="0"/>
+        <w:ind w:left="288" w:firstLine="0"/>
       </w:pPr>
       <w:r>
         <w:rPr>
@@ -5676,7 +5676,7 @@
     </w:p>
     <w:p>
       <w:pPr>
-        <w:ind w:left="0" w:firstLine="0"/>
+        <w:ind w:left="288" w:firstLine="0"/>
       </w:pPr>
       <w:r>
         <w:rPr>
@@ -5834,7 +5834,7 @@
     </w:p>
     <w:p>
       <w:pPr>
-        <w:ind w:left="0" w:firstLine="0"/>
+        <w:ind w:left="288" w:firstLine="0"/>
       </w:pPr>
       <w:r>
         <w:rPr>
@@ -5859,7 +5859,7 @@
     </w:p>
     <w:p>
       <w:pPr>
-        <w:ind w:left="0" w:firstLine="0"/>
+        <w:ind w:left="288" w:firstLine="0"/>
       </w:pPr>
       <w:r>
         <w:rPr>
@@ -5884,7 +5884,7 @@
     </w:p>
     <w:p>
       <w:pPr>
-        <w:ind w:left="0" w:firstLine="0"/>
+        <w:ind w:left="288" w:firstLine="0"/>
       </w:pPr>
       <w:r>
         <w:rPr>
@@ -5909,7 +5909,7 @@
     </w:p>
     <w:p>
       <w:pPr>
-        <w:ind w:left="0" w:firstLine="0"/>
+        <w:ind w:left="288" w:firstLine="0"/>
       </w:pPr>
       <w:r>
         <w:rPr>
@@ -6007,7 +6007,7 @@
     <w:p>
       <w:pPr>
         <w:pStyle w:val="BlockQuote"/>
-        <w:ind w:left="0" w:firstLine="0"/>
+        <w:ind w:left="288" w:firstLine="0"/>
       </w:pPr>
       <w:r>
         <w:rPr>
@@ -6063,7 +6063,7 @@
     <w:p>
       <w:pPr>
         <w:pStyle w:val="BlockQuote"/>
-        <w:ind w:left="0" w:firstLine="0"/>
+        <w:ind w:left="288" w:firstLine="0"/>
       </w:pPr>
       <w:r>
         <w:rPr>
@@ -6094,7 +6094,7 @@
     <w:p>
       <w:pPr>
         <w:pStyle w:val="BlockQuote"/>
-        <w:ind w:left="0" w:firstLine="0"/>
+        <w:ind w:left="288" w:firstLine="0"/>
       </w:pPr>
       <w:r>
         <w:rPr>
@@ -6140,7 +6140,7 @@
     <w:p>
       <w:pPr>
         <w:pStyle w:val="BlockQuote"/>
-        <w:ind w:left="0" w:firstLine="0"/>
+        <w:ind w:left="288" w:firstLine="0"/>
       </w:pPr>
       <w:r>
         <w:rPr>
@@ -6171,7 +6171,7 @@
     <w:p>
       <w:pPr>
         <w:pStyle w:val="BlockQuote"/>
-        <w:ind w:left="0" w:firstLine="0"/>
+        <w:ind w:left="288" w:firstLine="0"/>
       </w:pPr>
       <w:r>
         <w:rPr>
@@ -6202,7 +6202,7 @@
     <w:p>
       <w:pPr>
         <w:pStyle w:val="BlockQuote"/>
-        <w:ind w:left="0" w:firstLine="0"/>
+        <w:ind w:left="288" w:firstLine="0"/>
       </w:pPr>
       <w:r>
         <w:rPr>
@@ -6226,7 +6226,7 @@
     </w:p>
     <w:p>
       <w:pPr>
-        <w:ind w:left="0" w:firstLine="0"/>
+        <w:ind w:left="288" w:firstLine="0"/>
       </w:pPr>
       <w:r>
         <w:rPr>
@@ -6241,7 +6241,7 @@
     </w:p>
     <w:p>
       <w:pPr>
-        <w:ind w:left="0" w:firstLine="0"/>
+        <w:ind w:left="288" w:firstLine="0"/>
       </w:pPr>
       <w:r>
         <w:rPr>
@@ -6256,7 +6256,7 @@
     </w:p>
     <w:p>
       <w:pPr>
-        <w:ind w:left="0" w:firstLine="0"/>
+        <w:ind w:left="288" w:firstLine="0"/>
       </w:pPr>
       <w:r>
         <w:rPr>
@@ -6271,7 +6271,7 @@
     </w:p>
     <w:p>
       <w:pPr>
-        <w:ind w:left="0" w:firstLine="0"/>
+        <w:ind w:left="288" w:firstLine="0"/>
       </w:pPr>
       <w:r>
         <w:rPr>
@@ -6286,7 +6286,7 @@
     </w:p>
     <w:p>
       <w:pPr>
-        <w:ind w:left="0" w:firstLine="0"/>
+        <w:ind w:left="288" w:firstLine="0"/>
       </w:pPr>
       <w:r>
         <w:rPr>
@@ -6301,7 +6301,7 @@
     </w:p>
     <w:p>
       <w:pPr>
-        <w:ind w:left="0" w:firstLine="0"/>
+        <w:ind w:left="288" w:firstLine="0"/>
       </w:pPr>
       <w:r>
         <w:rPr>
@@ -6459,7 +6459,7 @@
     </w:p>
     <w:p>
       <w:pPr>
-        <w:ind w:left="0" w:firstLine="0"/>
+        <w:ind w:left="288" w:firstLine="0"/>
       </w:pPr>
       <w:r>
         <w:rPr>
@@ -6484,7 +6484,7 @@
     </w:p>
     <w:p>
       <w:pPr>
-        <w:ind w:left="0" w:firstLine="0"/>
+        <w:ind w:left="288" w:firstLine="0"/>
       </w:pPr>
       <w:r>
         <w:rPr>
@@ -6509,7 +6509,7 @@
     </w:p>
     <w:p>
       <w:pPr>
-        <w:ind w:left="0" w:firstLine="0"/>
+        <w:ind w:left="288" w:firstLine="0"/>
       </w:pPr>
       <w:r>
         <w:rPr>
@@ -6534,7 +6534,7 @@
     </w:p>
     <w:p>
       <w:pPr>
-        <w:ind w:left="0" w:firstLine="0"/>
+        <w:ind w:left="288" w:firstLine="0"/>
       </w:pPr>
       <w:r>
         <w:rPr>
@@ -6559,7 +6559,7 @@
     </w:p>
     <w:p>
       <w:pPr>
-        <w:ind w:left="0" w:firstLine="0"/>
+        <w:ind w:left="288" w:firstLine="0"/>
       </w:pPr>
       <w:r>
         <w:rPr>
@@ -6574,7 +6574,7 @@
     </w:p>
     <w:p>
       <w:pPr>
-        <w:ind w:left="0" w:firstLine="0"/>
+        <w:ind w:left="288" w:firstLine="0"/>
       </w:pPr>
       <w:r>
         <w:rPr>
@@ -6812,7 +6812,7 @@
     <w:p>
       <w:pPr>
         <w:pStyle w:val="BlockQuote"/>
-        <w:ind w:left="0" w:firstLine="0"/>
+        <w:ind w:left="288" w:firstLine="0"/>
       </w:pPr>
       <w:r>
         <w:rPr>
@@ -6838,7 +6838,7 @@
     <w:p>
       <w:pPr>
         <w:pStyle w:val="BlockQuote"/>
-        <w:ind w:left="0" w:firstLine="0"/>
+        <w:ind w:left="288" w:firstLine="0"/>
       </w:pPr>
       <w:r>
         <w:rPr>
@@ -6864,7 +6864,7 @@
     <w:p>
       <w:pPr>
         <w:pStyle w:val="BlockQuote"/>
-        <w:ind w:left="0" w:firstLine="0"/>
+        <w:ind w:left="288" w:firstLine="0"/>
       </w:pPr>
       <w:r>
         <w:rPr>
@@ -6890,7 +6890,7 @@
     <w:p>
       <w:pPr>
         <w:pStyle w:val="BlockQuote"/>
-        <w:ind w:left="0" w:firstLine="0"/>
+        <w:ind w:left="288" w:firstLine="0"/>
       </w:pPr>
       <w:r>
         <w:rPr>
@@ -6930,7 +6930,7 @@
     </w:p>
     <w:p>
       <w:pPr>
-        <w:ind w:left="0" w:firstLine="0"/>
+        <w:ind w:left="288" w:firstLine="0"/>
       </w:pPr>
       <w:r>
         <w:rPr>
@@ -6945,7 +6945,7 @@
     </w:p>
     <w:p>
       <w:pPr>
-        <w:ind w:left="0" w:firstLine="0"/>
+        <w:ind w:left="288" w:firstLine="0"/>
       </w:pPr>
       <w:r>
         <w:rPr>
@@ -6960,7 +6960,7 @@
     </w:p>
     <w:p>
       <w:pPr>
-        <w:ind w:left="0" w:firstLine="0"/>
+        <w:ind w:left="288" w:firstLine="0"/>
       </w:pPr>
       <w:r>
         <w:rPr>
@@ -6975,7 +6975,7 @@
     </w:p>
     <w:p>
       <w:pPr>
-        <w:ind w:left="0" w:firstLine="0"/>
+        <w:ind w:left="288" w:firstLine="0"/>
       </w:pPr>
       <w:r>
         <w:rPr>
@@ -6990,7 +6990,7 @@
     </w:p>
     <w:p>
       <w:pPr>
-        <w:ind w:left="0" w:firstLine="0"/>
+        <w:ind w:left="288" w:firstLine="0"/>
       </w:pPr>
       <w:r>
         <w:rPr>
@@ -7065,7 +7065,7 @@
     </w:p>
     <w:p>
       <w:pPr>
-        <w:ind w:left="0" w:firstLine="0"/>
+        <w:ind w:left="288" w:firstLine="0"/>
       </w:pPr>
       <w:r>
         <w:rPr>
@@ -7090,7 +7090,7 @@
     </w:p>
     <w:p>
       <w:pPr>
-        <w:ind w:left="0" w:firstLine="0"/>
+        <w:ind w:left="288" w:firstLine="0"/>
       </w:pPr>
       <w:r>
         <w:rPr>
@@ -7115,7 +7115,7 @@
     </w:p>
     <w:p>
       <w:pPr>
-        <w:ind w:left="0" w:firstLine="0"/>
+        <w:ind w:left="288" w:firstLine="0"/>
       </w:pPr>
       <w:r>
         <w:rPr>
@@ -7189,7 +7189,7 @@
     </w:p>
     <w:p>
       <w:pPr>
-        <w:ind w:left="0" w:firstLine="0"/>
+        <w:ind w:left="288" w:firstLine="0"/>
       </w:pPr>
       <w:r>
         <w:rPr>
@@ -7214,7 +7214,7 @@
     </w:p>
     <w:p>
       <w:pPr>
-        <w:ind w:left="0" w:firstLine="0"/>
+        <w:ind w:left="288" w:firstLine="0"/>
       </w:pPr>
       <w:r>
         <w:rPr>
@@ -7239,7 +7239,7 @@
     </w:p>
     <w:p>
       <w:pPr>
-        <w:ind w:left="0" w:firstLine="0"/>
+        <w:ind w:left="288" w:firstLine="0"/>
       </w:pPr>
       <w:r>
         <w:rPr>
@@ -7295,7 +7295,7 @@
     <w:p>
       <w:pPr>
         <w:pStyle w:val="BlockQuote"/>
-        <w:ind w:left="0" w:firstLine="0"/>
+        <w:ind w:left="288" w:firstLine="0"/>
       </w:pPr>
       <w:r>
         <w:rPr>
@@ -7351,7 +7351,7 @@
     <w:p>
       <w:pPr>
         <w:pStyle w:val="BlockQuote"/>
-        <w:ind w:left="0" w:firstLine="0"/>
+        <w:ind w:left="288" w:firstLine="0"/>
       </w:pPr>
       <w:r>
         <w:rPr>
@@ -7406,7 +7406,7 @@
     </w:p>
     <w:p>
       <w:pPr>
-        <w:ind w:left="0" w:firstLine="0"/>
+        <w:ind w:left="288" w:firstLine="0"/>
       </w:pPr>
       <w:r>
         <w:rPr>
@@ -7431,7 +7431,7 @@
     </w:p>
     <w:p>
       <w:pPr>
-        <w:ind w:left="0" w:firstLine="0"/>
+        <w:ind w:left="288" w:firstLine="0"/>
       </w:pPr>
       <w:r>
         <w:rPr>
@@ -7456,7 +7456,7 @@
     </w:p>
     <w:p>
       <w:pPr>
-        <w:ind w:left="0" w:firstLine="0"/>
+        <w:ind w:left="288" w:firstLine="0"/>
       </w:pPr>
       <w:r>
         <w:rPr>
@@ -7481,7 +7481,7 @@
     </w:p>
     <w:p>
       <w:pPr>
-        <w:ind w:left="0" w:firstLine="0"/>
+        <w:ind w:left="288" w:firstLine="0"/>
       </w:pPr>
       <w:r>
         <w:rPr>
@@ -7522,7 +7522,7 @@
     <w:p>
       <w:pPr>
         <w:pStyle w:val="BlockQuote"/>
-        <w:ind w:left="0" w:firstLine="0"/>
+        <w:ind w:left="288" w:firstLine="0"/>
       </w:pPr>
       <w:r>
         <w:rPr>
@@ -7553,7 +7553,7 @@
     <w:p>
       <w:pPr>
         <w:pStyle w:val="BlockQuote"/>
-        <w:ind w:left="0" w:firstLine="0"/>
+        <w:ind w:left="288" w:firstLine="0"/>
       </w:pPr>
       <w:r>
         <w:rPr>
@@ -7583,7 +7583,7 @@
     </w:p>
     <w:p>
       <w:pPr>
-        <w:ind w:left="0" w:firstLine="0"/>
+        <w:ind w:left="288" w:firstLine="0"/>
       </w:pPr>
       <w:r>
         <w:rPr>
@@ -7598,7 +7598,7 @@
     </w:p>
     <w:p>
       <w:pPr>
-        <w:ind w:left="0" w:firstLine="0"/>
+        <w:ind w:left="288" w:firstLine="0"/>
       </w:pPr>
       <w:r>
         <w:rPr>
@@ -7613,7 +7613,7 @@
     </w:p>
     <w:p>
       <w:pPr>
-        <w:ind w:left="0" w:firstLine="0"/>
+        <w:ind w:left="288" w:firstLine="0"/>
       </w:pPr>
       <w:r>
         <w:rPr>
@@ -7643,7 +7643,7 @@
     </w:p>
     <w:p>
       <w:pPr>
-        <w:ind w:left="0" w:firstLine="0"/>
+        <w:ind w:left="288" w:firstLine="0"/>
       </w:pPr>
       <w:r>
         <w:rPr>
@@ -7668,7 +7668,7 @@
     </w:p>
     <w:p>
       <w:pPr>
-        <w:ind w:left="0" w:firstLine="0"/>
+        <w:ind w:left="288" w:firstLine="0"/>
       </w:pPr>
       <w:r>
         <w:rPr>
@@ -7778,7 +7778,7 @@
     <w:p>
       <w:pPr>
         <w:pStyle w:val="BlockQuote"/>
-        <w:ind w:left="0" w:firstLine="0"/>
+        <w:ind w:left="288" w:firstLine="0"/>
       </w:pPr>
       <w:r>
         <w:rPr>
@@ -7804,7 +7804,7 @@
     <w:p>
       <w:pPr>
         <w:pStyle w:val="BlockQuote"/>
-        <w:ind w:left="0" w:firstLine="0"/>
+        <w:ind w:left="288" w:firstLine="0"/>
       </w:pPr>
       <w:r>
         <w:rPr>
@@ -7830,7 +7830,7 @@
     <w:p>
       <w:pPr>
         <w:pStyle w:val="BlockQuote"/>
-        <w:ind w:left="0" w:firstLine="0"/>
+        <w:ind w:left="288" w:firstLine="0"/>
       </w:pPr>
       <w:r>
         <w:rPr>
@@ -7870,7 +7870,7 @@
     </w:p>
     <w:p>
       <w:pPr>
-        <w:ind w:left="0" w:firstLine="0"/>
+        <w:ind w:left="288" w:firstLine="0"/>
       </w:pPr>
       <w:r>
         <w:rPr>
@@ -7885,7 +7885,7 @@
     </w:p>
     <w:p>
       <w:pPr>
-        <w:ind w:left="0" w:firstLine="0"/>
+        <w:ind w:left="288" w:firstLine="0"/>
       </w:pPr>
       <w:r>
         <w:rPr>
@@ -7900,7 +7900,7 @@
     </w:p>
     <w:p>
       <w:pPr>
-        <w:ind w:left="0" w:firstLine="0"/>
+        <w:ind w:left="288" w:firstLine="0"/>
       </w:pPr>
       <w:r>
         <w:rPr>
@@ -7915,7 +7915,7 @@
     </w:p>
     <w:p>
       <w:pPr>
-        <w:ind w:left="0" w:firstLine="0"/>
+        <w:ind w:left="288" w:firstLine="0"/>
       </w:pPr>
       <w:r>
         <w:rPr>
@@ -8010,7 +8010,7 @@
     </w:p>
     <w:p>
       <w:pPr>
-        <w:ind w:left="0" w:firstLine="0"/>
+        <w:ind w:left="288" w:firstLine="0"/>
       </w:pPr>
       <w:r>
         <w:rPr>
@@ -8035,7 +8035,7 @@
     </w:p>
     <w:p>
       <w:pPr>
-        <w:ind w:left="0" w:firstLine="0"/>
+        <w:ind w:left="288" w:firstLine="0"/>
       </w:pPr>
       <w:r>
         <w:rPr>
@@ -8060,7 +8060,7 @@
     </w:p>
     <w:p>
       <w:pPr>
-        <w:ind w:left="0" w:firstLine="0"/>
+        <w:ind w:left="288" w:firstLine="0"/>
       </w:pPr>
       <w:r>
         <w:rPr>
@@ -8150,7 +8150,7 @@
     <w:p>
       <w:pPr>
         <w:pStyle w:val="BlockQuote"/>
-        <w:ind w:left="0" w:firstLine="0"/>
+        <w:ind w:left="288" w:firstLine="0"/>
       </w:pPr>
       <w:r>
         <w:rPr>
@@ -8166,7 +8166,7 @@
     <w:p>
       <w:pPr>
         <w:pStyle w:val="BlockQuote"/>
-        <w:ind w:left="0" w:firstLine="0"/>
+        <w:ind w:left="288" w:firstLine="0"/>
       </w:pPr>
       <w:r>
         <w:rPr>
@@ -8197,7 +8197,7 @@
     <w:p>
       <w:pPr>
         <w:pStyle w:val="BlockQuote"/>
-        <w:ind w:left="0" w:firstLine="0"/>
+        <w:ind w:left="288" w:firstLine="0"/>
       </w:pPr>
       <w:r>
         <w:rPr>
@@ -8227,7 +8227,7 @@
     </w:p>
     <w:p>
       <w:pPr>
-        <w:ind w:left="0" w:firstLine="0"/>
+        <w:ind w:left="288" w:firstLine="0"/>
       </w:pPr>
       <w:r>
         <w:rPr>
@@ -8242,7 +8242,7 @@
     </w:p>
     <w:p>
       <w:pPr>
-        <w:ind w:left="0" w:firstLine="0"/>
+        <w:ind w:left="288" w:firstLine="0"/>
       </w:pPr>
       <w:r>
         <w:rPr>
@@ -8257,7 +8257,7 @@
     </w:p>
     <w:p>
       <w:pPr>
-        <w:ind w:left="0" w:firstLine="0"/>
+        <w:ind w:left="288" w:firstLine="0"/>
       </w:pPr>
       <w:r>
         <w:rPr>
@@ -8272,7 +8272,7 @@
     </w:p>
     <w:p>
       <w:pPr>
-        <w:ind w:left="0" w:firstLine="0"/>
+        <w:ind w:left="288" w:firstLine="0"/>
       </w:pPr>
       <w:r>
         <w:rPr>
@@ -8407,7 +8407,7 @@
     </w:p>
     <w:p>
       <w:pPr>
-        <w:ind w:left="0" w:firstLine="0"/>
+        <w:ind w:left="288" w:firstLine="0"/>
       </w:pPr>
       <w:r>
         <w:rPr>
@@ -8432,7 +8432,7 @@
     </w:p>
     <w:p>
       <w:pPr>
-        <w:ind w:left="0" w:firstLine="0"/>
+        <w:ind w:left="288" w:firstLine="0"/>
       </w:pPr>
       <w:r>
         <w:rPr>
@@ -8457,7 +8457,7 @@
     </w:p>
     <w:p>
       <w:pPr>
-        <w:ind w:left="0" w:firstLine="0"/>
+        <w:ind w:left="288" w:firstLine="0"/>
       </w:pPr>
       <w:r>
         <w:rPr>
@@ -8482,7 +8482,7 @@
     </w:p>
     <w:p>
       <w:pPr>
-        <w:ind w:left="0" w:firstLine="0"/>
+        <w:ind w:left="288" w:firstLine="0"/>
       </w:pPr>
       <w:r>
         <w:rPr>
@@ -8747,7 +8747,7 @@
     </w:p>
     <w:p>
       <w:pPr>
-        <w:ind w:left="0" w:firstLine="0"/>
+        <w:ind w:left="288" w:firstLine="0"/>
       </w:pPr>
       <w:r>
         <w:rPr>
@@ -8777,7 +8777,7 @@
     </w:p>
     <w:p>
       <w:pPr>
-        <w:ind w:left="0" w:firstLine="0"/>
+        <w:ind w:left="288" w:firstLine="0"/>
       </w:pPr>
       <w:r>
         <w:rPr>
@@ -8792,7 +8792,7 @@
     </w:p>
     <w:p>
       <w:pPr>
-        <w:ind w:left="0" w:firstLine="0"/>
+        <w:ind w:left="288" w:firstLine="0"/>
       </w:pPr>
       <w:r>
         <w:rPr>
@@ -8807,7 +8807,7 @@
     </w:p>
     <w:p>
       <w:pPr>
-        <w:ind w:left="0" w:firstLine="0"/>
+        <w:ind w:left="288" w:firstLine="0"/>
       </w:pPr>
       <w:r>
         <w:rPr>
@@ -8822,7 +8822,7 @@
     </w:p>
     <w:p>
       <w:pPr>
-        <w:ind w:left="0" w:firstLine="0"/>
+        <w:ind w:left="288" w:firstLine="0"/>
       </w:pPr>
       <w:r>
         <w:rPr>
@@ -8868,7 +8868,7 @@
     <w:p>
       <w:pPr>
         <w:pStyle w:val="BlockQuote"/>
-        <w:ind w:left="0" w:firstLine="0"/>
+        <w:ind w:left="288" w:firstLine="0"/>
       </w:pPr>
       <w:r>
         <w:rPr>
@@ -8883,7 +8883,7 @@
     </w:p>
     <w:p>
       <w:pPr>
-        <w:ind w:left="0" w:firstLine="0"/>
+        <w:ind w:left="288" w:firstLine="0"/>
       </w:pPr>
       <w:r>
         <w:rPr>
@@ -8913,7 +8913,7 @@
     </w:p>
     <w:p>
       <w:pPr>
-        <w:ind w:left="0" w:firstLine="0"/>
+        <w:ind w:left="288" w:firstLine="0"/>
       </w:pPr>
       <w:r>
         <w:rPr>
@@ -8928,7 +8928,7 @@
     </w:p>
     <w:p>
       <w:pPr>
-        <w:ind w:left="0" w:firstLine="0"/>
+        <w:ind w:left="288" w:firstLine="0"/>
       </w:pPr>
       <w:r>
         <w:rPr>
@@ -8943,7 +8943,7 @@
     </w:p>
     <w:p>
       <w:pPr>
-        <w:ind w:left="0" w:firstLine="0"/>
+        <w:ind w:left="288" w:firstLine="0"/>
       </w:pPr>
       <w:r>
         <w:rPr>
@@ -8958,7 +8958,7 @@
     </w:p>
     <w:p>
       <w:pPr>
-        <w:ind w:left="0" w:firstLine="0"/>
+        <w:ind w:left="288" w:firstLine="0"/>
       </w:pPr>
       <w:r>
         <w:rPr>
@@ -8973,7 +8973,7 @@
     </w:p>
     <w:p>
       <w:pPr>
-        <w:ind w:left="0" w:firstLine="0"/>
+        <w:ind w:left="288" w:firstLine="0"/>
       </w:pPr>
       <w:r>
         <w:rPr>
@@ -9003,7 +9003,7 @@
     </w:p>
     <w:p>
       <w:pPr>
-        <w:ind w:left="0" w:firstLine="0"/>
+        <w:ind w:left="288" w:firstLine="0"/>
       </w:pPr>
       <w:r>
         <w:rPr>
@@ -10027,7 +10027,7 @@
     </w:p>
     <w:p>
       <w:pPr>
-        <w:ind w:left="0" w:firstLine="0"/>
+        <w:ind w:left="288" w:firstLine="0"/>
       </w:pPr>
       <w:r>
         <w:rPr>
@@ -10042,7 +10042,7 @@
     </w:p>
     <w:p>
       <w:pPr>
-        <w:ind w:left="0" w:firstLine="0"/>
+        <w:ind w:left="288" w:firstLine="0"/>
       </w:pPr>
       <w:r>
         <w:rPr>
@@ -10057,7 +10057,7 @@
     </w:p>
     <w:p>
       <w:pPr>
-        <w:ind w:left="0" w:firstLine="0"/>
+        <w:ind w:left="288" w:firstLine="0"/>
       </w:pPr>
       <w:r>
         <w:rPr>
@@ -10087,7 +10087,7 @@
     </w:p>
     <w:p>
       <w:pPr>
-        <w:ind w:left="0" w:firstLine="0"/>
+        <w:ind w:left="288" w:firstLine="0"/>
       </w:pPr>
       <w:r>
         <w:rPr>
@@ -10102,7 +10102,7 @@
     </w:p>
     <w:p>
       <w:pPr>
-        <w:ind w:left="0" w:firstLine="0"/>
+        <w:ind w:left="288" w:firstLine="0"/>
       </w:pPr>
       <w:r>
         <w:rPr>
@@ -10117,7 +10117,7 @@
     </w:p>
     <w:p>
       <w:pPr>
-        <w:ind w:left="0" w:firstLine="0"/>
+        <w:ind w:left="288" w:firstLine="0"/>
       </w:pPr>
       <w:r>
         <w:rPr>
@@ -10147,7 +10147,7 @@
     </w:p>
     <w:p>
       <w:pPr>
-        <w:ind w:left="0" w:firstLine="0"/>
+        <w:ind w:left="288" w:firstLine="0"/>
       </w:pPr>
       <w:r>
         <w:rPr>
@@ -10162,7 +10162,7 @@
     </w:p>
     <w:p>
       <w:pPr>
-        <w:ind w:left="0" w:firstLine="0"/>
+        <w:ind w:left="288" w:firstLine="0"/>
       </w:pPr>
       <w:r>
         <w:rPr>
@@ -10177,7 +10177,7 @@
     </w:p>
     <w:p>
       <w:pPr>
-        <w:ind w:left="0" w:firstLine="0"/>
+        <w:ind w:left="288" w:firstLine="0"/>
       </w:pPr>
       <w:r>
         <w:rPr>
@@ -10207,7 +10207,7 @@
     </w:p>
     <w:p>
       <w:pPr>
-        <w:ind w:left="0" w:firstLine="0"/>
+        <w:ind w:left="288" w:firstLine="0"/>
       </w:pPr>
       <w:r>
         <w:rPr>
@@ -10222,7 +10222,7 @@
     </w:p>
     <w:p>
       <w:pPr>
-        <w:ind w:left="0" w:firstLine="0"/>
+        <w:ind w:left="288" w:firstLine="0"/>
       </w:pPr>
       <w:r>
         <w:rPr>
@@ -10237,7 +10237,7 @@
     </w:p>
     <w:p>
       <w:pPr>
-        <w:ind w:left="0" w:firstLine="0"/>
+        <w:ind w:left="288" w:firstLine="0"/>
       </w:pPr>
       <w:r>
         <w:rPr>
@@ -10267,7 +10267,7 @@
     </w:p>
     <w:p>
       <w:pPr>
-        <w:ind w:left="0" w:firstLine="0"/>
+        <w:ind w:left="288" w:firstLine="0"/>
       </w:pPr>
       <w:r>
         <w:rPr>
@@ -10282,7 +10282,7 @@
     </w:p>
     <w:p>
       <w:pPr>
-        <w:ind w:left="0" w:firstLine="0"/>
+        <w:ind w:left="288" w:firstLine="0"/>
       </w:pPr>
       <w:r>
         <w:rPr>
@@ -10297,7 +10297,7 @@
     </w:p>
     <w:p>
       <w:pPr>
-        <w:ind w:left="0" w:firstLine="0"/>
+        <w:ind w:left="288" w:firstLine="0"/>
       </w:pPr>
       <w:r>
         <w:rPr>
@@ -10371,7 +10371,7 @@
     </w:p>
     <w:p>
       <w:pPr>
-        <w:ind w:left="0" w:firstLine="0"/>
+        <w:ind w:left="288" w:firstLine="0"/>
       </w:pPr>
       <w:r>
         <w:rPr>
@@ -10385,7 +10385,7 @@
     </w:p>
     <w:p>
       <w:pPr>
-        <w:ind w:left="0" w:firstLine="0"/>
+        <w:ind w:left="288" w:firstLine="0"/>
       </w:pPr>
       <w:r>
         <w:rPr>
@@ -10399,7 +10399,7 @@
     </w:p>
     <w:p>
       <w:pPr>
-        <w:ind w:left="0" w:firstLine="0"/>
+        <w:ind w:left="288" w:firstLine="0"/>
       </w:pPr>
       <w:r>
         <w:rPr>
@@ -10413,7 +10413,7 @@
     </w:p>
     <w:p>
       <w:pPr>
-        <w:ind w:left="0" w:firstLine="0"/>
+        <w:ind w:left="288" w:firstLine="0"/>
       </w:pPr>
       <w:r>
         <w:rPr>
@@ -10427,7 +10427,7 @@
     </w:p>
     <w:p>
       <w:pPr>
-        <w:ind w:left="0" w:firstLine="0"/>
+        <w:ind w:left="288" w:firstLine="0"/>
       </w:pPr>
       <w:r>
         <w:rPr>
@@ -10441,7 +10441,7 @@
     </w:p>
     <w:p>
       <w:pPr>
-        <w:ind w:left="0" w:firstLine="0"/>
+        <w:ind w:left="288" w:firstLine="0"/>
       </w:pPr>
       <w:r>
         <w:rPr>
@@ -10464,7 +10464,7 @@
     </w:p>
     <w:p>
       <w:pPr>
-        <w:ind w:left="0" w:firstLine="0"/>
+        <w:ind w:left="288" w:firstLine="0"/>
       </w:pPr>
       <w:r>
         <w:rPr>
@@ -10479,7 +10479,7 @@
     </w:p>
     <w:p>
       <w:pPr>
-        <w:ind w:left="0" w:firstLine="0"/>
+        <w:ind w:left="288" w:firstLine="0"/>
       </w:pPr>
       <w:r>
         <w:rPr>
@@ -10494,7 +10494,7 @@
     </w:p>
     <w:p>
       <w:pPr>
-        <w:ind w:left="0" w:firstLine="0"/>
+        <w:ind w:left="288" w:firstLine="0"/>
       </w:pPr>
       <w:r>
         <w:rPr>
@@ -10509,7 +10509,7 @@
     </w:p>
     <w:p>
       <w:pPr>
-        <w:ind w:left="0" w:firstLine="0"/>
+        <w:ind w:left="288" w:firstLine="0"/>
       </w:pPr>
       <w:r>
         <w:rPr>
@@ -10524,7 +10524,7 @@
     </w:p>
     <w:p>
       <w:pPr>
-        <w:ind w:left="0" w:firstLine="0"/>
+        <w:ind w:left="288" w:firstLine="0"/>
       </w:pPr>
       <w:r>
         <w:rPr>
@@ -10539,7 +10539,7 @@
     </w:p>
     <w:p>
       <w:pPr>
-        <w:ind w:left="0" w:firstLine="0"/>
+        <w:ind w:left="288" w:firstLine="0"/>
       </w:pPr>
       <w:r>
         <w:rPr>

</xml_diff>

<commit_message>
Replace all table images with formatted text - readable on all Kindle sizes
</commit_message>
<xml_diff>
--- a/kdp-files/difficult_conversations_ebook.docx
+++ b/kdp-files/difficult_conversations_ebook.docx
@@ -8531,44 +8531,399 @@
     </w:p>
     <w:p>
       <w:pPr>
-        <w:spacing w:before="120" w:after="120"/>
-        <w:jc w:val="center"/>
         <w:ind w:left="0" w:firstLine="0"/>
-      </w:pPr>
-      <w:r>
-        <w:drawing>
-          <wp:inline xmlns:a="http://schemas.openxmlformats.org/drawingml/2006/main" xmlns:pic="http://schemas.openxmlformats.org/drawingml/2006/picture">
-            <wp:extent cx="4572000" cy="1703070"/>
-            <wp:docPr id="1" name="Picture 1"/>
-            <wp:cNvGraphicFramePr>
-              <a:graphicFrameLocks noChangeAspect="1"/>
-            </wp:cNvGraphicFramePr>
-            <a:graphic>
-              <a:graphicData uri="http://schemas.openxmlformats.org/drawingml/2006/picture">
-                <pic:pic>
-                  <pic:nvPicPr>
-                    <pic:cNvPr id="0" name="neurological_comparison.png"/>
-                    <pic:cNvPicPr/>
-                  </pic:nvPicPr>
-                  <pic:blipFill>
-                    <a:blip r:embed="rId11"/>
-                    <a:stretch>
-                      <a:fillRect/>
-                    </a:stretch>
-                  </pic:blipFill>
-                  <pic:spPr>
-                    <a:xfrm>
-                      <a:off x="0" y="0"/>
-                      <a:ext cx="4572000" cy="1703070"/>
-                    </a:xfrm>
-                    <a:prstGeom prst="rect"/>
-                  </pic:spPr>
-                </pic:pic>
-              </a:graphicData>
-            </a:graphic>
-          </wp:inline>
-        </w:drawing>
-      </w:r>
+        <w:spacing w:before="40" w:after="40"/>
+      </w:pPr>
+      <w:r>
+        <w:rPr>
+          <w:sz w:val="24"/>
+          <w:b/>
+        </w:rPr>
+        <w:t xml:space="preserve">IN-PERSON</w:t>
+      </w:r>
+    </w:p>
+    <w:p>
+      <w:pPr>
+        <w:ind w:left="288" w:firstLine="0"/>
+        <w:spacing w:before="20" w:after="20"/>
+      </w:pPr>
+      <w:r>
+        <w:rPr>
+          <w:b/>
+          <w:sz w:val="24"/>
+        </w:rPr>
+        <w:t xml:space="preserve">Mirror neurons: </w:t>
+      </w:r>
+      <w:r>
+        <w:rPr>
+          <w:sz w:val="24"/>
+        </w:rPr>
+        <w:t xml:space="preserve">High (strong mirroring response)</w:t>
+      </w:r>
+    </w:p>
+    <w:p>
+      <w:pPr>
+        <w:ind w:left="288" w:firstLine="0"/>
+        <w:spacing w:before="20" w:after="20"/>
+      </w:pPr>
+      <w:r>
+        <w:rPr>
+          <w:b/>
+          <w:sz w:val="24"/>
+        </w:rPr>
+        <w:t xml:space="preserve">Social buffering: </w:t>
+      </w:r>
+      <w:r>
+        <w:rPr>
+          <w:sz w:val="24"/>
+        </w:rPr>
+        <w:t xml:space="preserve">High (tone, touch, presence)</w:t>
+      </w:r>
+    </w:p>
+    <w:p>
+      <w:pPr>
+        <w:ind w:left="288" w:firstLine="0"/>
+        <w:spacing w:before="20" w:after="20"/>
+      </w:pPr>
+      <w:r>
+        <w:rPr>
+          <w:b/>
+          <w:sz w:val="24"/>
+        </w:rPr>
+        <w:t xml:space="preserve">Threat modulation: </w:t>
+      </w:r>
+      <w:r>
+        <w:rPr>
+          <w:sz w:val="24"/>
+        </w:rPr>
+        <w:t xml:space="preserve">Rapid (real-time cues)</w:t>
+      </w:r>
+    </w:p>
+    <w:p>
+      <w:pPr>
+        <w:ind w:left="288" w:firstLine="0"/>
+        <w:spacing w:before="20" w:after="20"/>
+      </w:pPr>
+      <w:r>
+        <w:rPr>
+          <w:b/>
+          <w:sz w:val="24"/>
+        </w:rPr>
+        <w:t xml:space="preserve">Processing: </w:t>
+      </w:r>
+      <w:r>
+        <w:rPr>
+          <w:sz w:val="24"/>
+        </w:rPr>
+        <w:t xml:space="preserve">Episodic + emotional</w:t>
+      </w:r>
+    </w:p>
+    <w:p>
+      <w:pPr>
+        <w:ind w:left="288" w:firstLine="0"/>
+        <w:spacing w:before="20" w:after="20"/>
+      </w:pPr>
+      <w:r>
+        <w:rPr>
+          <w:b/>
+          <w:sz w:val="24"/>
+        </w:rPr>
+        <w:t xml:space="preserve">Negativity bias: </w:t>
+      </w:r>
+      <w:r>
+        <w:rPr>
+          <w:sz w:val="24"/>
+        </w:rPr>
+        <w:t xml:space="preserve">Baseline</w:t>
+      </w:r>
+    </w:p>
+    <w:p>
+      <w:pPr>
+        <w:ind w:left="288" w:firstLine="0"/>
+        <w:spacing w:before="20" w:after="20"/>
+      </w:pPr>
+      <w:r>
+        <w:rPr>
+          <w:b/>
+          <w:sz w:val="24"/>
+        </w:rPr>
+        <w:t xml:space="preserve">PFC load: </w:t>
+      </w:r>
+      <w:r>
+        <w:rPr>
+          <w:sz w:val="24"/>
+        </w:rPr>
+        <w:t xml:space="preserve">Moderate</w:t>
+      </w:r>
+    </w:p>
+    <w:p>
+      <w:pPr>
+        <w:spacing w:before="60" w:after="60"/>
+      </w:pPr>
+    </w:p>
+    <w:p>
+      <w:pPr>
+        <w:ind w:left="0" w:firstLine="0"/>
+        <w:spacing w:before="40" w:after="40"/>
+      </w:pPr>
+      <w:r>
+        <w:rPr>
+          <w:sz w:val="24"/>
+          <w:b/>
+        </w:rPr>
+        <w:t xml:space="preserve">VIDEO CALL</w:t>
+      </w:r>
+    </w:p>
+    <w:p>
+      <w:pPr>
+        <w:ind w:left="288" w:firstLine="0"/>
+        <w:spacing w:before="20" w:after="20"/>
+      </w:pPr>
+      <w:r>
+        <w:rPr>
+          <w:b/>
+          <w:sz w:val="24"/>
+        </w:rPr>
+        <w:t xml:space="preserve">Mirror neurons: </w:t>
+      </w:r>
+      <w:r>
+        <w:rPr>
+          <w:sz w:val="24"/>
+        </w:rPr>
+        <w:t xml:space="preserve">Reduced compared to in-person</w:t>
+      </w:r>
+    </w:p>
+    <w:p>
+      <w:pPr>
+        <w:ind w:left="288" w:firstLine="0"/>
+        <w:spacing w:before="20" w:after="20"/>
+      </w:pPr>
+      <w:r>
+        <w:rPr>
+          <w:b/>
+          <w:sz w:val="24"/>
+        </w:rPr>
+        <w:t xml:space="preserve">Social buffering: </w:t>
+      </w:r>
+      <w:r>
+        <w:rPr>
+          <w:sz w:val="24"/>
+        </w:rPr>
+        <w:t xml:space="preserve">Moderate (tone, face only)</w:t>
+      </w:r>
+    </w:p>
+    <w:p>
+      <w:pPr>
+        <w:ind w:left="288" w:firstLine="0"/>
+        <w:spacing w:before="20" w:after="20"/>
+      </w:pPr>
+      <w:r>
+        <w:rPr>
+          <w:b/>
+          <w:sz w:val="24"/>
+        </w:rPr>
+        <w:t xml:space="preserve">Threat modulation: </w:t>
+      </w:r>
+      <w:r>
+        <w:rPr>
+          <w:sz w:val="24"/>
+        </w:rPr>
+        <w:t xml:space="preserve">Slower and less precise (lag, reduced cues)</w:t>
+      </w:r>
+    </w:p>
+    <w:p>
+      <w:pPr>
+        <w:ind w:left="288" w:firstLine="0"/>
+        <w:spacing w:before="20" w:after="20"/>
+      </w:pPr>
+      <w:r>
+        <w:rPr>
+          <w:b/>
+          <w:sz w:val="24"/>
+        </w:rPr>
+        <w:t xml:space="preserve">Processing: </w:t>
+      </w:r>
+      <w:r>
+        <w:rPr>
+          <w:sz w:val="24"/>
+        </w:rPr>
+        <w:t xml:space="preserve">Episodic but fatigued</w:t>
+      </w:r>
+    </w:p>
+    <w:p>
+      <w:pPr>
+        <w:ind w:left="288" w:firstLine="0"/>
+        <w:spacing w:before="20" w:after="20"/>
+      </w:pPr>
+      <w:r>
+        <w:rPr>
+          <w:b/>
+          <w:sz w:val="24"/>
+        </w:rPr>
+        <w:t xml:space="preserve">Negativity bias: </w:t>
+      </w:r>
+      <w:r>
+        <w:rPr>
+          <w:sz w:val="24"/>
+        </w:rPr>
+        <w:t xml:space="preserve">Elevated (less nonverbal reassurance)</w:t>
+      </w:r>
+    </w:p>
+    <w:p>
+      <w:pPr>
+        <w:ind w:left="288" w:firstLine="0"/>
+        <w:spacing w:before="20" w:after="20"/>
+      </w:pPr>
+      <w:r>
+        <w:rPr>
+          <w:b/>
+          <w:sz w:val="24"/>
+        </w:rPr>
+        <w:t xml:space="preserve">PFC load: </w:t>
+      </w:r>
+      <w:r>
+        <w:rPr>
+          <w:sz w:val="24"/>
+        </w:rPr>
+        <w:t xml:space="preserve">High (video call fatigue)</w:t>
+      </w:r>
+    </w:p>
+    <w:p>
+      <w:pPr>
+        <w:spacing w:before="60" w:after="60"/>
+      </w:pPr>
+    </w:p>
+    <w:p>
+      <w:pPr>
+        <w:ind w:left="0" w:firstLine="0"/>
+        <w:spacing w:before="40" w:after="40"/>
+      </w:pPr>
+      <w:r>
+        <w:rPr>
+          <w:sz w:val="24"/>
+          <w:b/>
+        </w:rPr>
+        <w:t xml:space="preserve">ASYNC MESSAGE</w:t>
+      </w:r>
+    </w:p>
+    <w:p>
+      <w:pPr>
+        <w:ind w:left="288" w:firstLine="0"/>
+        <w:spacing w:before="20" w:after="20"/>
+      </w:pPr>
+      <w:r>
+        <w:rPr>
+          <w:b/>
+          <w:sz w:val="24"/>
+        </w:rPr>
+        <w:t xml:space="preserve">Mirror neurons: </w:t>
+      </w:r>
+      <w:r>
+        <w:rPr>
+          <w:sz w:val="24"/>
+        </w:rPr>
+        <w:t xml:space="preserve">Minimal (no motor mirroring)</w:t>
+      </w:r>
+    </w:p>
+    <w:p>
+      <w:pPr>
+        <w:ind w:left="288" w:firstLine="0"/>
+        <w:spacing w:before="20" w:after="20"/>
+      </w:pPr>
+      <w:r>
+        <w:rPr>
+          <w:b/>
+          <w:sz w:val="24"/>
+        </w:rPr>
+        <w:t xml:space="preserve">Social buffering: </w:t>
+      </w:r>
+      <w:r>
+        <w:rPr>
+          <w:sz w:val="24"/>
+        </w:rPr>
+        <w:t xml:space="preserve">Zero</w:t>
+      </w:r>
+    </w:p>
+    <w:p>
+      <w:pPr>
+        <w:ind w:left="288" w:firstLine="0"/>
+        <w:spacing w:before="20" w:after="20"/>
+      </w:pPr>
+      <w:r>
+        <w:rPr>
+          <w:b/>
+          <w:sz w:val="24"/>
+        </w:rPr>
+        <w:t xml:space="preserve">Threat modulation: </w:t>
+      </w:r>
+      <w:r>
+        <w:rPr>
+          <w:sz w:val="24"/>
+        </w:rPr>
+        <w:t xml:space="preserve">No real-time modulation</w:t>
+      </w:r>
+    </w:p>
+    <w:p>
+      <w:pPr>
+        <w:ind w:left="288" w:firstLine="0"/>
+        <w:spacing w:before="20" w:after="20"/>
+      </w:pPr>
+      <w:r>
+        <w:rPr>
+          <w:b/>
+          <w:sz w:val="24"/>
+        </w:rPr>
+        <w:t xml:space="preserve">Processing: </w:t>
+      </w:r>
+      <w:r>
+        <w:rPr>
+          <w:sz w:val="24"/>
+        </w:rPr>
+        <w:t xml:space="preserve">Semantic-leaning (re-readable, revisitable)</w:t>
+      </w:r>
+    </w:p>
+    <w:p>
+      <w:pPr>
+        <w:ind w:left="288" w:firstLine="0"/>
+        <w:spacing w:before="20" w:after="20"/>
+      </w:pPr>
+      <w:r>
+        <w:rPr>
+          <w:b/>
+          <w:sz w:val="24"/>
+        </w:rPr>
+        <w:t xml:space="preserve">Negativity bias: </w:t>
+      </w:r>
+      <w:r>
+        <w:rPr>
+          <w:sz w:val="24"/>
+        </w:rPr>
+        <w:t xml:space="preserve">Highest (no tone or face; people reread negatives)</w:t>
+      </w:r>
+    </w:p>
+    <w:p>
+      <w:pPr>
+        <w:ind w:left="288" w:firstLine="0"/>
+        <w:spacing w:before="20" w:after="20"/>
+      </w:pPr>
+      <w:r>
+        <w:rPr>
+          <w:b/>
+          <w:sz w:val="24"/>
+        </w:rPr>
+        <w:t xml:space="preserve">PFC load: </w:t>
+      </w:r>
+      <w:r>
+        <w:rPr>
+          <w:sz w:val="24"/>
+        </w:rPr>
+        <w:t xml:space="preserve">Variable (lower in the moment, no co-regulation)</w:t>
+      </w:r>
+    </w:p>
+    <w:p>
+      <w:pPr>
+        <w:spacing w:before="60" w:after="60"/>
+      </w:pPr>
     </w:p>
     <w:p>
       <w:pPr>
@@ -8587,44 +8942,451 @@
     </w:p>
     <w:p>
       <w:pPr>
-        <w:spacing w:before="120" w:after="120"/>
-        <w:jc w:val="center"/>
         <w:ind w:left="0" w:firstLine="0"/>
-      </w:pPr>
-      <w:r>
-        <w:drawing>
-          <wp:inline xmlns:a="http://schemas.openxmlformats.org/drawingml/2006/main" xmlns:pic="http://schemas.openxmlformats.org/drawingml/2006/picture">
-            <wp:extent cx="4572000" cy="1703070"/>
-            <wp:docPr id="2" name="Picture 2"/>
-            <wp:cNvGraphicFramePr>
-              <a:graphicFrameLocks noChangeAspect="1"/>
-            </wp:cNvGraphicFramePr>
-            <a:graphic>
-              <a:graphicData uri="http://schemas.openxmlformats.org/drawingml/2006/picture">
-                <pic:pic>
-                  <pic:nvPicPr>
-                    <pic:cNvPr id="0" name="manager_phrases.png"/>
-                    <pic:cNvPicPr/>
-                  </pic:nvPicPr>
-                  <pic:blipFill>
-                    <a:blip r:embed="rId12"/>
-                    <a:stretch>
-                      <a:fillRect/>
-                    </a:stretch>
-                  </pic:blipFill>
-                  <pic:spPr>
-                    <a:xfrm>
-                      <a:off x="0" y="0"/>
-                      <a:ext cx="4572000" cy="1703070"/>
-                    </a:xfrm>
-                    <a:prstGeom prst="rect"/>
-                  </pic:spPr>
-                </pic:pic>
-              </a:graphicData>
-            </a:graphic>
-          </wp:inline>
-        </w:drawing>
-      </w:r>
+        <w:spacing w:before="40" w:after="40"/>
+      </w:pPr>
+      <w:r>
+        <w:rPr>
+          <w:sz w:val="24"/>
+          <w:b/>
+        </w:rPr>
+        <w:t xml:space="preserve">"We need to talk."</w:t>
+      </w:r>
+    </w:p>
+    <w:p>
+      <w:pPr>
+        <w:ind w:left="288" w:firstLine="0"/>
+        <w:spacing w:before="20" w:after="20"/>
+      </w:pPr>
+      <w:r>
+        <w:rPr>
+          <w:b/>
+          <w:sz w:val="24"/>
+        </w:rPr>
+        <w:t xml:space="preserve">Brain trigger: </w:t>
+      </w:r>
+      <w:r>
+        <w:rPr>
+          <w:sz w:val="24"/>
+        </w:rPr>
+        <w:t xml:space="preserve">Maximum uncertainty threat</w:t>
+      </w:r>
+    </w:p>
+    <w:p>
+      <w:pPr>
+        <w:ind w:left="288" w:firstLine="0"/>
+        <w:spacing w:before="20" w:after="20"/>
+      </w:pPr>
+      <w:r>
+        <w:rPr>
+          <w:b/>
+          <w:sz w:val="24"/>
+        </w:rPr>
+        <w:t xml:space="preserve">Say instead: </w:t>
+      </w:r>
+      <w:r>
+        <w:rPr>
+          <w:sz w:val="24"/>
+        </w:rPr>
+        <w:t xml:space="preserve">"I'd like to discuss the Henderson project - nothing urgent"</w:t>
+      </w:r>
+    </w:p>
+    <w:p>
+      <w:pPr>
+        <w:spacing w:before="60" w:after="60"/>
+      </w:pPr>
+    </w:p>
+    <w:p>
+      <w:pPr>
+        <w:ind w:left="0" w:firstLine="0"/>
+        <w:spacing w:before="40" w:after="40"/>
+      </w:pPr>
+      <w:r>
+        <w:rPr>
+          <w:sz w:val="24"/>
+          <w:b/>
+        </w:rPr>
+        <w:t xml:space="preserve">"Per my last email..."</w:t>
+      </w:r>
+    </w:p>
+    <w:p>
+      <w:pPr>
+        <w:ind w:left="288" w:firstLine="0"/>
+        <w:spacing w:before="20" w:after="20"/>
+      </w:pPr>
+      <w:r>
+        <w:rPr>
+          <w:b/>
+          <w:sz w:val="24"/>
+        </w:rPr>
+        <w:t xml:space="preserve">Brain trigger: </w:t>
+      </w:r>
+      <w:r>
+        <w:rPr>
+          <w:sz w:val="24"/>
+        </w:rPr>
+        <w:t xml:space="preserve">Reads as passive aggression, status + relatedness threat</w:t>
+      </w:r>
+    </w:p>
+    <w:p>
+      <w:pPr>
+        <w:ind w:left="288" w:firstLine="0"/>
+        <w:spacing w:before="20" w:after="20"/>
+      </w:pPr>
+      <w:r>
+        <w:rPr>
+          <w:b/>
+          <w:sz w:val="24"/>
+        </w:rPr>
+        <w:t xml:space="preserve">Say instead: </w:t>
+      </w:r>
+      <w:r>
+        <w:rPr>
+          <w:sz w:val="24"/>
+        </w:rPr>
+        <w:t xml:space="preserve">"I want to make sure we're aligned on the timeline"</w:t>
+      </w:r>
+    </w:p>
+    <w:p>
+      <w:pPr>
+        <w:spacing w:before="60" w:after="60"/>
+      </w:pPr>
+    </w:p>
+    <w:p>
+      <w:pPr>
+        <w:ind w:left="0" w:firstLine="0"/>
+        <w:spacing w:before="40" w:after="40"/>
+      </w:pPr>
+      <w:r>
+        <w:rPr>
+          <w:sz w:val="24"/>
+          <w:b/>
+        </w:rPr>
+        <w:t xml:space="preserve">"This is unacceptable."</w:t>
+      </w:r>
+    </w:p>
+    <w:p>
+      <w:pPr>
+        <w:ind w:left="288" w:firstLine="0"/>
+        <w:spacing w:before="20" w:after="20"/>
+      </w:pPr>
+      <w:r>
+        <w:rPr>
+          <w:b/>
+          <w:sz w:val="24"/>
+        </w:rPr>
+        <w:t xml:space="preserve">Brain trigger: </w:t>
+      </w:r>
+      <w:r>
+        <w:rPr>
+          <w:sz w:val="24"/>
+        </w:rPr>
+        <w:t xml:space="preserve">Global judgment triggers identity-level defense</w:t>
+      </w:r>
+    </w:p>
+    <w:p>
+      <w:pPr>
+        <w:ind w:left="288" w:firstLine="0"/>
+        <w:spacing w:before="20" w:after="20"/>
+      </w:pPr>
+      <w:r>
+        <w:rPr>
+          <w:b/>
+          <w:sz w:val="24"/>
+        </w:rPr>
+        <w:t xml:space="preserve">Say instead: </w:t>
+      </w:r>
+      <w:r>
+        <w:rPr>
+          <w:sz w:val="24"/>
+        </w:rPr>
+        <w:t xml:space="preserve">"This specific outcome didn't meet the standard we need"</w:t>
+      </w:r>
+    </w:p>
+    <w:p>
+      <w:pPr>
+        <w:spacing w:before="60" w:after="60"/>
+      </w:pPr>
+    </w:p>
+    <w:p>
+      <w:pPr>
+        <w:ind w:left="0" w:firstLine="0"/>
+        <w:spacing w:before="40" w:after="40"/>
+      </w:pPr>
+      <w:r>
+        <w:rPr>
+          <w:sz w:val="24"/>
+          <w:b/>
+        </w:rPr>
+        <w:t xml:space="preserve">"Everyone else manages to..."</w:t>
+      </w:r>
+    </w:p>
+    <w:p>
+      <w:pPr>
+        <w:ind w:left="288" w:firstLine="0"/>
+        <w:spacing w:before="20" w:after="20"/>
+      </w:pPr>
+      <w:r>
+        <w:rPr>
+          <w:b/>
+          <w:sz w:val="24"/>
+        </w:rPr>
+        <w:t xml:space="preserve">Brain trigger: </w:t>
+      </w:r>
+      <w:r>
+        <w:rPr>
+          <w:sz w:val="24"/>
+        </w:rPr>
+        <w:t xml:space="preserve">Social comparison activates social pain</w:t>
+      </w:r>
+    </w:p>
+    <w:p>
+      <w:pPr>
+        <w:ind w:left="288" w:firstLine="0"/>
+        <w:spacing w:before="20" w:after="20"/>
+      </w:pPr>
+      <w:r>
+        <w:rPr>
+          <w:b/>
+          <w:sz w:val="24"/>
+        </w:rPr>
+        <w:t xml:space="preserve">Say instead: </w:t>
+      </w:r>
+      <w:r>
+        <w:rPr>
+          <w:sz w:val="24"/>
+        </w:rPr>
+        <w:t xml:space="preserve">"The expectation for this role is..."</w:t>
+      </w:r>
+    </w:p>
+    <w:p>
+      <w:pPr>
+        <w:spacing w:before="60" w:after="60"/>
+      </w:pPr>
+    </w:p>
+    <w:p>
+      <w:pPr>
+        <w:ind w:left="0" w:firstLine="0"/>
+        <w:spacing w:before="40" w:after="40"/>
+      </w:pPr>
+      <w:r>
+        <w:rPr>
+          <w:sz w:val="24"/>
+          <w:b/>
+        </w:rPr>
+        <w:t xml:space="preserve">"I'm disappointed."</w:t>
+      </w:r>
+    </w:p>
+    <w:p>
+      <w:pPr>
+        <w:ind w:left="288" w:firstLine="0"/>
+        <w:spacing w:before="20" w:after="20"/>
+      </w:pPr>
+      <w:r>
+        <w:rPr>
+          <w:b/>
+          <w:sz w:val="24"/>
+        </w:rPr>
+        <w:t xml:space="preserve">Brain trigger: </w:t>
+      </w:r>
+      <w:r>
+        <w:rPr>
+          <w:sz w:val="24"/>
+        </w:rPr>
+        <w:t xml:space="preserve">Parental framing triggers shame, not learning</w:t>
+      </w:r>
+    </w:p>
+    <w:p>
+      <w:pPr>
+        <w:ind w:left="288" w:firstLine="0"/>
+        <w:spacing w:before="20" w:after="20"/>
+      </w:pPr>
+      <w:r>
+        <w:rPr>
+          <w:b/>
+          <w:sz w:val="24"/>
+        </w:rPr>
+        <w:t xml:space="preserve">Say instead: </w:t>
+      </w:r>
+      <w:r>
+        <w:rPr>
+          <w:sz w:val="24"/>
+        </w:rPr>
+        <w:t xml:space="preserve">"The outcome wasn't what we needed. Let's figure out why"</w:t>
+      </w:r>
+    </w:p>
+    <w:p>
+      <w:pPr>
+        <w:spacing w:before="60" w:after="60"/>
+      </w:pPr>
+    </w:p>
+    <w:p>
+      <w:pPr>
+        <w:ind w:left="0" w:firstLine="0"/>
+        <w:spacing w:before="40" w:after="40"/>
+      </w:pPr>
+      <w:r>
+        <w:rPr>
+          <w:sz w:val="24"/>
+          <w:b/>
+        </w:rPr>
+        <w:t xml:space="preserve">"You need to..."</w:t>
+      </w:r>
+    </w:p>
+    <w:p>
+      <w:pPr>
+        <w:ind w:left="288" w:firstLine="0"/>
+        <w:spacing w:before="20" w:after="20"/>
+      </w:pPr>
+      <w:r>
+        <w:rPr>
+          <w:b/>
+          <w:sz w:val="24"/>
+        </w:rPr>
+        <w:t xml:space="preserve">Brain trigger: </w:t>
+      </w:r>
+      <w:r>
+        <w:rPr>
+          <w:sz w:val="24"/>
+        </w:rPr>
+        <w:t xml:space="preserve">"Need" + "you" = command that threatens autonomy</w:t>
+      </w:r>
+    </w:p>
+    <w:p>
+      <w:pPr>
+        <w:ind w:left="288" w:firstLine="0"/>
+        <w:spacing w:before="20" w:after="20"/>
+      </w:pPr>
+      <w:r>
+        <w:rPr>
+          <w:b/>
+          <w:sz w:val="24"/>
+        </w:rPr>
+        <w:t xml:space="preserve">Say instead: </w:t>
+      </w:r>
+      <w:r>
+        <w:rPr>
+          <w:sz w:val="24"/>
+        </w:rPr>
+        <w:t xml:space="preserve">"Here's what success looks like..."</w:t>
+      </w:r>
+    </w:p>
+    <w:p>
+      <w:pPr>
+        <w:spacing w:before="60" w:after="60"/>
+      </w:pPr>
+    </w:p>
+    <w:p>
+      <w:pPr>
+        <w:ind w:left="0" w:firstLine="0"/>
+        <w:spacing w:before="40" w:after="40"/>
+      </w:pPr>
+      <w:r>
+        <w:rPr>
+          <w:sz w:val="24"/>
+          <w:b/>
+        </w:rPr>
+        <w:t xml:space="preserve">"Let's take this offline."</w:t>
+      </w:r>
+    </w:p>
+    <w:p>
+      <w:pPr>
+        <w:ind w:left="288" w:firstLine="0"/>
+        <w:spacing w:before="20" w:after="20"/>
+      </w:pPr>
+      <w:r>
+        <w:rPr>
+          <w:b/>
+          <w:sz w:val="24"/>
+        </w:rPr>
+        <w:t xml:space="preserve">Brain trigger: </w:t>
+      </w:r>
+      <w:r>
+        <w:rPr>
+          <w:sz w:val="24"/>
+        </w:rPr>
+        <w:t xml:space="preserve">In public channels, signals "you're in trouble"</w:t>
+      </w:r>
+    </w:p>
+    <w:p>
+      <w:pPr>
+        <w:ind w:left="288" w:firstLine="0"/>
+        <w:spacing w:before="20" w:after="20"/>
+      </w:pPr>
+      <w:r>
+        <w:rPr>
+          <w:b/>
+          <w:sz w:val="24"/>
+        </w:rPr>
+        <w:t xml:space="preserve">Say instead: </w:t>
+      </w:r>
+      <w:r>
+        <w:rPr>
+          <w:sz w:val="24"/>
+        </w:rPr>
+        <w:t xml:space="preserve">DM directly: "Can we hop on a quick call about this?"</w:t>
+      </w:r>
+    </w:p>
+    <w:p>
+      <w:pPr>
+        <w:spacing w:before="60" w:after="60"/>
+      </w:pPr>
+    </w:p>
+    <w:p>
+      <w:pPr>
+        <w:ind w:left="0" w:firstLine="0"/>
+        <w:spacing w:before="40" w:after="40"/>
+      </w:pPr>
+      <w:r>
+        <w:rPr>
+          <w:sz w:val="24"/>
+          <w:b/>
+        </w:rPr>
+        <w:t xml:space="preserve">"Just to be clear..."</w:t>
+      </w:r>
+    </w:p>
+    <w:p>
+      <w:pPr>
+        <w:ind w:left="288" w:firstLine="0"/>
+        <w:spacing w:before="20" w:after="20"/>
+      </w:pPr>
+      <w:r>
+        <w:rPr>
+          <w:b/>
+          <w:sz w:val="24"/>
+        </w:rPr>
+        <w:t xml:space="preserve">Brain trigger: </w:t>
+      </w:r>
+      <w:r>
+        <w:rPr>
+          <w:sz w:val="24"/>
+        </w:rPr>
+        <w:t xml:space="preserve">Implies they were wrong - status threat</w:t>
+      </w:r>
+    </w:p>
+    <w:p>
+      <w:pPr>
+        <w:ind w:left="288" w:firstLine="0"/>
+        <w:spacing w:before="20" w:after="20"/>
+      </w:pPr>
+      <w:r>
+        <w:rPr>
+          <w:b/>
+          <w:sz w:val="24"/>
+        </w:rPr>
+        <w:t xml:space="preserve">Say instead: </w:t>
+      </w:r>
+      <w:r>
+        <w:rPr>
+          <w:sz w:val="24"/>
+        </w:rPr>
+        <w:t xml:space="preserve">"I want to make sure we're on the same page..."</w:t>
+      </w:r>
+    </w:p>
+    <w:p>
+      <w:pPr>
+        <w:spacing w:before="60" w:after="60"/>
+      </w:pPr>
     </w:p>
     <w:p>
       <w:pPr>
@@ -8643,44 +9405,336 @@
     </w:p>
     <w:p>
       <w:pPr>
-        <w:spacing w:before="120" w:after="120"/>
-        <w:jc w:val="center"/>
         <w:ind w:left="0" w:firstLine="0"/>
-      </w:pPr>
-      <w:r>
-        <w:drawing>
-          <wp:inline xmlns:a="http://schemas.openxmlformats.org/drawingml/2006/main" xmlns:pic="http://schemas.openxmlformats.org/drawingml/2006/picture">
-            <wp:extent cx="4572000" cy="2004060"/>
-            <wp:docPr id="3" name="Picture 3"/>
-            <wp:cNvGraphicFramePr>
-              <a:graphicFrameLocks noChangeAspect="1"/>
-            </wp:cNvGraphicFramePr>
-            <a:graphic>
-              <a:graphicData uri="http://schemas.openxmlformats.org/drawingml/2006/picture">
-                <pic:pic>
-                  <pic:nvPicPr>
-                    <pic:cNvPr id="0" name="remote_decision_matrix.png"/>
-                    <pic:cNvPicPr/>
-                  </pic:nvPicPr>
-                  <pic:blipFill>
-                    <a:blip r:embed="rId13"/>
-                    <a:stretch>
-                      <a:fillRect/>
-                    </a:stretch>
-                  </pic:blipFill>
-                  <pic:spPr>
-                    <a:xfrm>
-                      <a:off x="0" y="0"/>
-                      <a:ext cx="4572000" cy="2004060"/>
-                    </a:xfrm>
-                    <a:prstGeom prst="rect"/>
-                  </pic:spPr>
-                </pic:pic>
-              </a:graphicData>
-            </a:graphic>
-          </wp:inline>
-        </w:drawing>
-      </w:r>
+        <w:spacing w:before="40" w:after="40"/>
+      </w:pPr>
+      <w:r>
+        <w:rPr>
+          <w:sz w:val="24"/>
+          <w:b/>
+        </w:rPr>
+        <w:t xml:space="preserve">Performance improvement</w:t>
+      </w:r>
+    </w:p>
+    <w:p>
+      <w:pPr>
+        <w:ind w:left="288" w:firstLine="0"/>
+        <w:spacing w:before="20" w:after="20"/>
+      </w:pPr>
+      <w:r>
+        <w:rPr>
+          <w:b/>
+          <w:sz w:val="24"/>
+        </w:rPr>
+        <w:t xml:space="preserve">Best medium: </w:t>
+      </w:r>
+      <w:r>
+        <w:rPr>
+          <w:sz w:val="24"/>
+        </w:rPr>
+        <w:t xml:space="preserve">Video (camera on) - needs real-time empathy cues</w:t>
+      </w:r>
+    </w:p>
+    <w:p>
+      <w:pPr>
+        <w:spacing w:before="60" w:after="60"/>
+      </w:pPr>
+    </w:p>
+    <w:p>
+      <w:pPr>
+        <w:ind w:left="0" w:firstLine="0"/>
+        <w:spacing w:before="40" w:after="40"/>
+      </w:pPr>
+      <w:r>
+        <w:rPr>
+          <w:sz w:val="24"/>
+          <w:b/>
+        </w:rPr>
+        <w:t xml:space="preserve">Quick corrective feedback</w:t>
+      </w:r>
+    </w:p>
+    <w:p>
+      <w:pPr>
+        <w:ind w:left="288" w:firstLine="0"/>
+        <w:spacing w:before="20" w:after="20"/>
+      </w:pPr>
+      <w:r>
+        <w:rPr>
+          <w:b/>
+          <w:sz w:val="24"/>
+        </w:rPr>
+        <w:t xml:space="preserve">Best medium: </w:t>
+      </w:r>
+      <w:r>
+        <w:rPr>
+          <w:sz w:val="24"/>
+        </w:rPr>
+        <w:t xml:space="preserve">Async (Slack/Teams) - low severity, preserves autonomy</w:t>
+      </w:r>
+    </w:p>
+    <w:p>
+      <w:pPr>
+        <w:spacing w:before="60" w:after="60"/>
+      </w:pPr>
+    </w:p>
+    <w:p>
+      <w:pPr>
+        <w:ind w:left="0" w:firstLine="0"/>
+        <w:spacing w:before="40" w:after="40"/>
+      </w:pPr>
+      <w:r>
+        <w:rPr>
+          <w:sz w:val="24"/>
+          <w:b/>
+        </w:rPr>
+        <w:t xml:space="preserve">Termination</w:t>
+      </w:r>
+    </w:p>
+    <w:p>
+      <w:pPr>
+        <w:ind w:left="288" w:firstLine="0"/>
+        <w:spacing w:before="20" w:after="20"/>
+      </w:pPr>
+      <w:r>
+        <w:rPr>
+          <w:b/>
+          <w:sz w:val="24"/>
+        </w:rPr>
+        <w:t xml:space="preserve">Best medium: </w:t>
+      </w:r>
+      <w:r>
+        <w:rPr>
+          <w:sz w:val="24"/>
+        </w:rPr>
+        <w:t xml:space="preserve">Video with HR - requires presence and immediate support</w:t>
+      </w:r>
+    </w:p>
+    <w:p>
+      <w:pPr>
+        <w:spacing w:before="60" w:after="60"/>
+      </w:pPr>
+    </w:p>
+    <w:p>
+      <w:pPr>
+        <w:ind w:left="0" w:firstLine="0"/>
+        <w:spacing w:before="40" w:after="40"/>
+      </w:pPr>
+      <w:r>
+        <w:rPr>
+          <w:sz w:val="24"/>
+          <w:b/>
+        </w:rPr>
+        <w:t xml:space="preserve">Burnout check-in</w:t>
+      </w:r>
+    </w:p>
+    <w:p>
+      <w:pPr>
+        <w:ind w:left="288" w:firstLine="0"/>
+        <w:spacing w:before="20" w:after="20"/>
+      </w:pPr>
+      <w:r>
+        <w:rPr>
+          <w:b/>
+          <w:sz w:val="24"/>
+        </w:rPr>
+        <w:t xml:space="preserve">Best medium: </w:t>
+      </w:r>
+      <w:r>
+        <w:rPr>
+          <w:sz w:val="24"/>
+        </w:rPr>
+        <w:t xml:space="preserve">Phone call (no video) - removes self-monitoring burden</w:t>
+      </w:r>
+    </w:p>
+    <w:p>
+      <w:pPr>
+        <w:spacing w:before="60" w:after="60"/>
+      </w:pPr>
+    </w:p>
+    <w:p>
+      <w:pPr>
+        <w:ind w:left="0" w:firstLine="0"/>
+        <w:spacing w:before="40" w:after="40"/>
+      </w:pPr>
+      <w:r>
+        <w:rPr>
+          <w:sz w:val="24"/>
+          <w:b/>
+        </w:rPr>
+        <w:t xml:space="preserve">Team conflict mediation</w:t>
+      </w:r>
+    </w:p>
+    <w:p>
+      <w:pPr>
+        <w:ind w:left="288" w:firstLine="0"/>
+        <w:spacing w:before="20" w:after="20"/>
+      </w:pPr>
+      <w:r>
+        <w:rPr>
+          <w:b/>
+          <w:sz w:val="24"/>
+        </w:rPr>
+        <w:t xml:space="preserve">Best medium: </w:t>
+      </w:r>
+      <w:r>
+        <w:rPr>
+          <w:sz w:val="24"/>
+        </w:rPr>
+        <w:t xml:space="preserve">Video (all cameras on) - needs visible body language</w:t>
+      </w:r>
+    </w:p>
+    <w:p>
+      <w:pPr>
+        <w:spacing w:before="60" w:after="60"/>
+      </w:pPr>
+    </w:p>
+    <w:p>
+      <w:pPr>
+        <w:ind w:left="0" w:firstLine="0"/>
+        <w:spacing w:before="40" w:after="40"/>
+      </w:pPr>
+      <w:r>
+        <w:rPr>
+          <w:sz w:val="24"/>
+          <w:b/>
+        </w:rPr>
+        <w:t xml:space="preserve">Written performance review</w:t>
+      </w:r>
+    </w:p>
+    <w:p>
+      <w:pPr>
+        <w:ind w:left="288" w:firstLine="0"/>
+        <w:spacing w:before="20" w:after="20"/>
+      </w:pPr>
+      <w:r>
+        <w:rPr>
+          <w:b/>
+          <w:sz w:val="24"/>
+        </w:rPr>
+        <w:t xml:space="preserve">Best medium: </w:t>
+      </w:r>
+      <w:r>
+        <w:rPr>
+          <w:sz w:val="24"/>
+        </w:rPr>
+        <w:t xml:space="preserve">Document + follow-up video - brain needs time, then connection</w:t>
+      </w:r>
+    </w:p>
+    <w:p>
+      <w:pPr>
+        <w:spacing w:before="60" w:after="60"/>
+      </w:pPr>
+    </w:p>
+    <w:p>
+      <w:pPr>
+        <w:ind w:left="0" w:firstLine="0"/>
+        <w:spacing w:before="40" w:after="40"/>
+      </w:pPr>
+      <w:r>
+        <w:rPr>
+          <w:sz w:val="24"/>
+          <w:b/>
+        </w:rPr>
+        <w:t xml:space="preserve">Salary/promotion news</w:t>
+      </w:r>
+    </w:p>
+    <w:p>
+      <w:pPr>
+        <w:ind w:left="288" w:firstLine="0"/>
+        <w:spacing w:before="20" w:after="20"/>
+      </w:pPr>
+      <w:r>
+        <w:rPr>
+          <w:b/>
+          <w:sz w:val="24"/>
+        </w:rPr>
+        <w:t xml:space="preserve">Best medium: </w:t>
+      </w:r>
+      <w:r>
+        <w:rPr>
+          <w:sz w:val="24"/>
+        </w:rPr>
+        <w:t xml:space="preserve">Video 1:1 - high emotional stakes require real-time calibration</w:t>
+      </w:r>
+    </w:p>
+    <w:p>
+      <w:pPr>
+        <w:spacing w:before="60" w:after="60"/>
+      </w:pPr>
+    </w:p>
+    <w:p>
+      <w:pPr>
+        <w:ind w:left="0" w:firstLine="0"/>
+        <w:spacing w:before="40" w:after="40"/>
+      </w:pPr>
+      <w:r>
+        <w:rPr>
+          <w:sz w:val="24"/>
+          <w:b/>
+        </w:rPr>
+        <w:t xml:space="preserve">Camera-off intervention</w:t>
+      </w:r>
+    </w:p>
+    <w:p>
+      <w:pPr>
+        <w:ind w:left="288" w:firstLine="0"/>
+        <w:spacing w:before="20" w:after="20"/>
+      </w:pPr>
+      <w:r>
+        <w:rPr>
+          <w:b/>
+          <w:sz w:val="24"/>
+        </w:rPr>
+        <w:t xml:space="preserve">Best medium: </w:t>
+      </w:r>
+      <w:r>
+        <w:rPr>
+          <w:sz w:val="24"/>
+        </w:rPr>
+        <w:t xml:space="preserve">Team meeting (cameras optional) - model, don't mandate</w:t>
+      </w:r>
+    </w:p>
+    <w:p>
+      <w:pPr>
+        <w:spacing w:before="60" w:after="60"/>
+      </w:pPr>
+    </w:p>
+    <w:p>
+      <w:pPr>
+        <w:ind w:left="0" w:firstLine="0"/>
+        <w:spacing w:before="40" w:after="40"/>
+      </w:pPr>
+      <w:r>
+        <w:rPr>
+          <w:sz w:val="24"/>
+          <w:b/>
+        </w:rPr>
+        <w:t xml:space="preserve">Positive recognition</w:t>
+      </w:r>
+    </w:p>
+    <w:p>
+      <w:pPr>
+        <w:ind w:left="288" w:firstLine="0"/>
+        <w:spacing w:before="20" w:after="20"/>
+      </w:pPr>
+      <w:r>
+        <w:rPr>
+          <w:b/>
+          <w:sz w:val="24"/>
+        </w:rPr>
+        <w:t xml:space="preserve">Best medium: </w:t>
+      </w:r>
+      <w:r>
+        <w:rPr>
+          <w:sz w:val="24"/>
+        </w:rPr>
+        <w:t xml:space="preserve">Public async (team channel) - amplifies status reward</w:t>
+      </w:r>
+    </w:p>
+    <w:p>
+      <w:pPr>
+        <w:spacing w:before="60" w:after="60"/>
+      </w:pPr>
     </w:p>
     <w:p>
       <w:pPr>
@@ -9042,44 +10096,378 @@
     </w:p>
     <w:p>
       <w:pPr>
-        <w:spacing w:before="120" w:after="120"/>
-        <w:jc w:val="center"/>
         <w:ind w:left="0" w:firstLine="0"/>
-      </w:pPr>
-      <w:r>
-        <w:drawing>
-          <wp:inline xmlns:a="http://schemas.openxmlformats.org/drawingml/2006/main" xmlns:pic="http://schemas.openxmlformats.org/drawingml/2006/picture">
-            <wp:extent cx="4572000" cy="1550670"/>
-            <wp:docPr id="4" name="Picture 4"/>
-            <wp:cNvGraphicFramePr>
-              <a:graphicFrameLocks noChangeAspect="1"/>
-            </wp:cNvGraphicFramePr>
-            <a:graphic>
-              <a:graphicData uri="http://schemas.openxmlformats.org/drawingml/2006/picture">
-                <pic:pic>
-                  <pic:nvPicPr>
-                    <pic:cNvPr id="0" name="followup_cadence.png"/>
-                    <pic:cNvPicPr/>
-                  </pic:nvPicPr>
-                  <pic:blipFill>
-                    <a:blip r:embed="rId14"/>
-                    <a:stretch>
-                      <a:fillRect/>
-                    </a:stretch>
-                  </pic:blipFill>
-                  <pic:spPr>
-                    <a:xfrm>
-                      <a:off x="0" y="0"/>
-                      <a:ext cx="4572000" cy="1550670"/>
-                    </a:xfrm>
-                    <a:prstGeom prst="rect"/>
-                  </pic:spPr>
-                </pic:pic>
-              </a:graphicData>
-            </a:graphic>
-          </wp:inline>
-        </w:drawing>
-      </w:r>
+        <w:spacing w:before="40" w:after="40"/>
+      </w:pPr>
+      <w:r>
+        <w:rPr>
+          <w:sz w:val="24"/>
+          <w:b/>
+        </w:rPr>
+        <w:t xml:space="preserve">Performance Improvement</w:t>
+      </w:r>
+    </w:p>
+    <w:p>
+      <w:pPr>
+        <w:ind w:left="288" w:firstLine="0"/>
+        <w:spacing w:before="20" w:after="20"/>
+      </w:pPr>
+      <w:r>
+        <w:rPr>
+          <w:b/>
+          <w:sz w:val="24"/>
+        </w:rPr>
+        <w:t xml:space="preserve">First 24h: </w:t>
+      </w:r>
+      <w:r>
+        <w:rPr>
+          <w:sz w:val="24"/>
+        </w:rPr>
+        <w:t xml:space="preserve">Email summary of discussion and agreed plan</w:t>
+      </w:r>
+    </w:p>
+    <w:p>
+      <w:pPr>
+        <w:ind w:left="288" w:firstLine="0"/>
+        <w:spacing w:before="20" w:after="20"/>
+      </w:pPr>
+      <w:r>
+        <w:rPr>
+          <w:b/>
+          <w:sz w:val="24"/>
+        </w:rPr>
+        <w:t xml:space="preserve">Ongoing: </w:t>
+      </w:r>
+      <w:r>
+        <w:rPr>
+          <w:sz w:val="24"/>
+        </w:rPr>
+        <w:t xml:space="preserve">Weekly 15-min check-ins for 30 days</w:t>
+      </w:r>
+    </w:p>
+    <w:p>
+      <w:pPr>
+        <w:ind w:left="288" w:firstLine="0"/>
+        <w:spacing w:before="20" w:after="20"/>
+      </w:pPr>
+      <w:r>
+        <w:rPr>
+          <w:b/>
+          <w:sz w:val="24"/>
+        </w:rPr>
+        <w:t xml:space="preserve">Review: </w:t>
+      </w:r>
+      <w:r>
+        <w:rPr>
+          <w:sz w:val="24"/>
+        </w:rPr>
+        <w:t xml:space="preserve">30-day formal review - celebrate or escalate</w:t>
+      </w:r>
+    </w:p>
+    <w:p>
+      <w:pPr>
+        <w:spacing w:before="60" w:after="60"/>
+      </w:pPr>
+    </w:p>
+    <w:p>
+      <w:pPr>
+        <w:ind w:left="0" w:firstLine="0"/>
+        <w:spacing w:before="40" w:after="40"/>
+      </w:pPr>
+      <w:r>
+        <w:rPr>
+          <w:sz w:val="24"/>
+          <w:b/>
+        </w:rPr>
+        <w:t xml:space="preserve">Negative Feedback</w:t>
+      </w:r>
+    </w:p>
+    <w:p>
+      <w:pPr>
+        <w:ind w:left="288" w:firstLine="0"/>
+        <w:spacing w:before="20" w:after="20"/>
+      </w:pPr>
+      <w:r>
+        <w:rPr>
+          <w:b/>
+          <w:sz w:val="24"/>
+        </w:rPr>
+        <w:t xml:space="preserve">First 24h: </w:t>
+      </w:r>
+      <w:r>
+        <w:rPr>
+          <w:sz w:val="24"/>
+        </w:rPr>
+        <w:t xml:space="preserve">Informal check-in next morning</w:t>
+      </w:r>
+    </w:p>
+    <w:p>
+      <w:pPr>
+        <w:ind w:left="288" w:firstLine="0"/>
+        <w:spacing w:before="20" w:after="20"/>
+      </w:pPr>
+      <w:r>
+        <w:rPr>
+          <w:b/>
+          <w:sz w:val="24"/>
+        </w:rPr>
+        <w:t xml:space="preserve">Ongoing: </w:t>
+      </w:r>
+      <w:r>
+        <w:rPr>
+          <w:sz w:val="24"/>
+        </w:rPr>
+        <w:t xml:space="preserve">Before next similar event, offer prep support</w:t>
+      </w:r>
+    </w:p>
+    <w:p>
+      <w:pPr>
+        <w:ind w:left="288" w:firstLine="0"/>
+        <w:spacing w:before="20" w:after="20"/>
+      </w:pPr>
+      <w:r>
+        <w:rPr>
+          <w:b/>
+          <w:sz w:val="24"/>
+        </w:rPr>
+        <w:t xml:space="preserve">Review: </w:t>
+      </w:r>
+      <w:r>
+        <w:rPr>
+          <w:sz w:val="24"/>
+        </w:rPr>
+        <w:t xml:space="preserve">After next event, acknowledge improvement</w:t>
+      </w:r>
+    </w:p>
+    <w:p>
+      <w:pPr>
+        <w:spacing w:before="60" w:after="60"/>
+      </w:pPr>
+    </w:p>
+    <w:p>
+      <w:pPr>
+        <w:ind w:left="0" w:firstLine="0"/>
+        <w:spacing w:before="40" w:after="40"/>
+      </w:pPr>
+      <w:r>
+        <w:rPr>
+          <w:sz w:val="24"/>
+          <w:b/>
+        </w:rPr>
+        <w:t xml:space="preserve">Attendance/Behavior</w:t>
+      </w:r>
+    </w:p>
+    <w:p>
+      <w:pPr>
+        <w:ind w:left="288" w:firstLine="0"/>
+        <w:spacing w:before="20" w:after="20"/>
+      </w:pPr>
+      <w:r>
+        <w:rPr>
+          <w:b/>
+          <w:sz w:val="24"/>
+        </w:rPr>
+        <w:t xml:space="preserve">First week: </w:t>
+      </w:r>
+      <w:r>
+        <w:rPr>
+          <w:sz w:val="24"/>
+        </w:rPr>
+        <w:t xml:space="preserve">Accommodation plan if applicable</w:t>
+      </w:r>
+    </w:p>
+    <w:p>
+      <w:pPr>
+        <w:ind w:left="288" w:firstLine="0"/>
+        <w:spacing w:before="20" w:after="20"/>
+      </w:pPr>
+      <w:r>
+        <w:rPr>
+          <w:b/>
+          <w:sz w:val="24"/>
+        </w:rPr>
+        <w:t xml:space="preserve">Week 2: </w:t>
+      </w:r>
+      <w:r>
+        <w:rPr>
+          <w:sz w:val="24"/>
+        </w:rPr>
+        <w:t xml:space="preserve">Check-in: "How's the new schedule?"</w:t>
+      </w:r>
+    </w:p>
+    <w:p>
+      <w:pPr>
+        <w:ind w:left="288" w:firstLine="0"/>
+        <w:spacing w:before="20" w:after="20"/>
+      </w:pPr>
+      <w:r>
+        <w:rPr>
+          <w:b/>
+          <w:sz w:val="24"/>
+        </w:rPr>
+        <w:t xml:space="preserve">Week 4: </w:t>
+      </w:r>
+      <w:r>
+        <w:rPr>
+          <w:sz w:val="24"/>
+        </w:rPr>
+        <w:t xml:space="preserve">Formal review - continue support or PIP</w:t>
+      </w:r>
+    </w:p>
+    <w:p>
+      <w:pPr>
+        <w:spacing w:before="60" w:after="60"/>
+      </w:pPr>
+    </w:p>
+    <w:p>
+      <w:pPr>
+        <w:ind w:left="0" w:firstLine="0"/>
+        <w:spacing w:before="40" w:after="40"/>
+      </w:pPr>
+      <w:r>
+        <w:rPr>
+          <w:sz w:val="24"/>
+          <w:b/>
+        </w:rPr>
+        <w:t xml:space="preserve">Burnout Check-in</w:t>
+      </w:r>
+    </w:p>
+    <w:p>
+      <w:pPr>
+        <w:ind w:left="288" w:firstLine="0"/>
+        <w:spacing w:before="20" w:after="20"/>
+      </w:pPr>
+      <w:r>
+        <w:rPr>
+          <w:b/>
+          <w:sz w:val="24"/>
+        </w:rPr>
+        <w:t xml:space="preserve">Same day: </w:t>
+      </w:r>
+      <w:r>
+        <w:rPr>
+          <w:sz w:val="24"/>
+        </w:rPr>
+        <w:t xml:space="preserve">Send EAP information</w:t>
+      </w:r>
+    </w:p>
+    <w:p>
+      <w:pPr>
+        <w:ind w:left="288" w:firstLine="0"/>
+        <w:spacing w:before="20" w:after="20"/>
+      </w:pPr>
+      <w:r>
+        <w:rPr>
+          <w:b/>
+          <w:sz w:val="24"/>
+        </w:rPr>
+        <w:t xml:space="preserve">Week 1: </w:t>
+      </w:r>
+      <w:r>
+        <w:rPr>
+          <w:sz w:val="24"/>
+        </w:rPr>
+        <w:t xml:space="preserve">Light check-in: "How are you doing?"</w:t>
+      </w:r>
+    </w:p>
+    <w:p>
+      <w:pPr>
+        <w:ind w:left="288" w:firstLine="0"/>
+        <w:spacing w:before="20" w:after="20"/>
+      </w:pPr>
+      <w:r>
+        <w:rPr>
+          <w:b/>
+          <w:sz w:val="24"/>
+        </w:rPr>
+        <w:t xml:space="preserve">Ongoing: </w:t>
+      </w:r>
+      <w:r>
+        <w:rPr>
+          <w:sz w:val="24"/>
+        </w:rPr>
+        <w:t xml:space="preserve">Watch for improvement or deterioration</w:t>
+      </w:r>
+    </w:p>
+    <w:p>
+      <w:pPr>
+        <w:spacing w:before="60" w:after="60"/>
+      </w:pPr>
+    </w:p>
+    <w:p>
+      <w:pPr>
+        <w:ind w:left="0" w:firstLine="0"/>
+        <w:spacing w:before="40" w:after="40"/>
+      </w:pPr>
+      <w:r>
+        <w:rPr>
+          <w:sz w:val="24"/>
+          <w:b/>
+        </w:rPr>
+        <w:t xml:space="preserve">Termination</w:t>
+      </w:r>
+    </w:p>
+    <w:p>
+      <w:pPr>
+        <w:ind w:left="288" w:firstLine="0"/>
+        <w:spacing w:before="20" w:after="20"/>
+      </w:pPr>
+      <w:r>
+        <w:rPr>
+          <w:b/>
+          <w:sz w:val="24"/>
+        </w:rPr>
+        <w:t xml:space="preserve">Same day: </w:t>
+      </w:r>
+      <w:r>
+        <w:rPr>
+          <w:sz w:val="24"/>
+        </w:rPr>
+        <w:t xml:space="preserve">Brief team promptly; provide logistics in writing</w:t>
+      </w:r>
+    </w:p>
+    <w:p>
+      <w:pPr>
+        <w:ind w:left="288" w:firstLine="0"/>
+        <w:spacing w:before="20" w:after="20"/>
+      </w:pPr>
+      <w:r>
+        <w:rPr>
+          <w:b/>
+          <w:sz w:val="24"/>
+        </w:rPr>
+        <w:t xml:space="preserve">Week 1-2: </w:t>
+      </w:r>
+      <w:r>
+        <w:rPr>
+          <w:sz w:val="24"/>
+        </w:rPr>
+        <w:t xml:space="preserve">Monitor remaining team for survivor anxiety</w:t>
+      </w:r>
+    </w:p>
+    <w:p>
+      <w:pPr>
+        <w:ind w:left="288" w:firstLine="0"/>
+        <w:spacing w:before="20" w:after="20"/>
+      </w:pPr>
+      <w:r>
+        <w:rPr>
+          <w:b/>
+          <w:sz w:val="24"/>
+        </w:rPr>
+        <w:t xml:space="preserve">Ongoing: </w:t>
+      </w:r>
+      <w:r>
+        <w:rPr>
+          <w:sz w:val="24"/>
+        </w:rPr>
+        <w:t xml:space="preserve">1:1s with team members who need to process</w:t>
+      </w:r>
+    </w:p>
+    <w:p>
+      <w:pPr>
+        <w:spacing w:before="60" w:after="60"/>
+      </w:pPr>
     </w:p>
     <w:p>
       <w:pPr>
@@ -9847,44 +11235,188 @@
     </w:p>
     <w:p>
       <w:pPr>
-        <w:spacing w:before="120" w:after="120"/>
-        <w:jc w:val="center"/>
         <w:ind w:left="0" w:firstLine="0"/>
-      </w:pPr>
-      <w:r>
-        <w:drawing>
-          <wp:inline xmlns:a="http://schemas.openxmlformats.org/drawingml/2006/main" xmlns:pic="http://schemas.openxmlformats.org/drawingml/2006/picture">
-            <wp:extent cx="4572000" cy="1249680"/>
-            <wp:docPr id="5" name="Picture 5"/>
-            <wp:cNvGraphicFramePr>
-              <a:graphicFrameLocks noChangeAspect="1"/>
-            </wp:cNvGraphicFramePr>
-            <a:graphic>
-              <a:graphicData uri="http://schemas.openxmlformats.org/drawingml/2006/picture">
-                <pic:pic>
-                  <pic:nvPicPr>
-                    <pic:cNvPr id="0" name="clear_framework.png"/>
-                    <pic:cNvPicPr/>
-                  </pic:nvPicPr>
-                  <pic:blipFill>
-                    <a:blip r:embed="rId15"/>
-                    <a:stretch>
-                      <a:fillRect/>
-                    </a:stretch>
-                  </pic:blipFill>
-                  <pic:spPr>
-                    <a:xfrm>
-                      <a:off x="0" y="0"/>
-                      <a:ext cx="4572000" cy="1249680"/>
-                    </a:xfrm>
-                    <a:prstGeom prst="rect"/>
-                  </pic:spPr>
-                </pic:pic>
-              </a:graphicData>
-            </a:graphic>
-          </wp:inline>
-        </w:drawing>
-      </w:r>
+        <w:spacing w:before="40" w:after="40"/>
+      </w:pPr>
+      <w:r>
+        <w:rPr>
+          <w:sz w:val="24"/>
+          <w:b/>
+        </w:rPr>
+        <w:t xml:space="preserve">C - CALM</w:t>
+      </w:r>
+    </w:p>
+    <w:p>
+      <w:pPr>
+        <w:ind w:left="288" w:firstLine="0"/>
+        <w:spacing w:before="20" w:after="20"/>
+      </w:pPr>
+      <w:r>
+        <w:rPr>
+          <w:b/>
+          <w:sz w:val="24"/>
+        </w:rPr>
+        <w:t xml:space="preserve"/>
+      </w:r>
+      <w:r>
+        <w:rPr>
+          <w:sz w:val="24"/>
+        </w:rPr>
+        <w:t xml:space="preserve">Regulate yourself first. Box breathing, affect labeling, physical grounding.</w:t>
+      </w:r>
+    </w:p>
+    <w:p>
+      <w:pPr>
+        <w:spacing w:before="60" w:after="60"/>
+      </w:pPr>
+    </w:p>
+    <w:p>
+      <w:pPr>
+        <w:ind w:left="0" w:firstLine="0"/>
+        <w:spacing w:before="40" w:after="40"/>
+      </w:pPr>
+      <w:r>
+        <w:rPr>
+          <w:sz w:val="24"/>
+          <w:b/>
+        </w:rPr>
+        <w:t xml:space="preserve">L - LISTEN</w:t>
+      </w:r>
+    </w:p>
+    <w:p>
+      <w:pPr>
+        <w:ind w:left="288" w:firstLine="0"/>
+        <w:spacing w:before="20" w:after="20"/>
+      </w:pPr>
+      <w:r>
+        <w:rPr>
+          <w:b/>
+          <w:sz w:val="24"/>
+        </w:rPr>
+        <w:t xml:space="preserve"/>
+      </w:r>
+      <w:r>
+        <w:rPr>
+          <w:sz w:val="24"/>
+        </w:rPr>
+        <w:t xml:space="preserve">Listen to understand, not to respond. Reflect back. Use silence.</w:t>
+      </w:r>
+    </w:p>
+    <w:p>
+      <w:pPr>
+        <w:spacing w:before="60" w:after="60"/>
+      </w:pPr>
+    </w:p>
+    <w:p>
+      <w:pPr>
+        <w:ind w:left="0" w:firstLine="0"/>
+        <w:spacing w:before="40" w:after="40"/>
+      </w:pPr>
+      <w:r>
+        <w:rPr>
+          <w:sz w:val="24"/>
+          <w:b/>
+        </w:rPr>
+        <w:t xml:space="preserve">E - EMPATHIZE</w:t>
+      </w:r>
+    </w:p>
+    <w:p>
+      <w:pPr>
+        <w:ind w:left="288" w:firstLine="0"/>
+        <w:spacing w:before="20" w:after="20"/>
+      </w:pPr>
+      <w:r>
+        <w:rPr>
+          <w:b/>
+          <w:sz w:val="24"/>
+        </w:rPr>
+        <w:t xml:space="preserve"/>
+      </w:r>
+      <w:r>
+        <w:rPr>
+          <w:sz w:val="24"/>
+        </w:rPr>
+        <w:t xml:space="preserve">Validate without agreeing. "I can see why you'd feel that way."</w:t>
+      </w:r>
+    </w:p>
+    <w:p>
+      <w:pPr>
+        <w:spacing w:before="60" w:after="60"/>
+      </w:pPr>
+    </w:p>
+    <w:p>
+      <w:pPr>
+        <w:ind w:left="0" w:firstLine="0"/>
+        <w:spacing w:before="40" w:after="40"/>
+      </w:pPr>
+      <w:r>
+        <w:rPr>
+          <w:sz w:val="24"/>
+          <w:b/>
+        </w:rPr>
+        <w:t xml:space="preserve">A - ASSERT</w:t>
+      </w:r>
+    </w:p>
+    <w:p>
+      <w:pPr>
+        <w:ind w:left="288" w:firstLine="0"/>
+        <w:spacing w:before="20" w:after="20"/>
+      </w:pPr>
+      <w:r>
+        <w:rPr>
+          <w:b/>
+          <w:sz w:val="24"/>
+        </w:rPr>
+        <w:t xml:space="preserve"/>
+      </w:r>
+      <w:r>
+        <w:rPr>
+          <w:sz w:val="24"/>
+        </w:rPr>
+        <w:t xml:space="preserve">State reality clearly and kindly. Use the Third Story approach.</w:t>
+      </w:r>
+    </w:p>
+    <w:p>
+      <w:pPr>
+        <w:spacing w:before="60" w:after="60"/>
+      </w:pPr>
+    </w:p>
+    <w:p>
+      <w:pPr>
+        <w:ind w:left="0" w:firstLine="0"/>
+        <w:spacing w:before="40" w:after="40"/>
+      </w:pPr>
+      <w:r>
+        <w:rPr>
+          <w:sz w:val="24"/>
+          <w:b/>
+        </w:rPr>
+        <w:t xml:space="preserve">R - RESOLVE</w:t>
+      </w:r>
+    </w:p>
+    <w:p>
+      <w:pPr>
+        <w:ind w:left="288" w:firstLine="0"/>
+        <w:spacing w:before="20" w:after="20"/>
+      </w:pPr>
+      <w:r>
+        <w:rPr>
+          <w:b/>
+          <w:sz w:val="24"/>
+        </w:rPr>
+        <w:t xml:space="preserve"/>
+      </w:r>
+      <w:r>
+        <w:rPr>
+          <w:sz w:val="24"/>
+        </w:rPr>
+        <w:t xml:space="preserve">Co-create next steps. Preserve autonomy. Express confidence.</w:t>
+      </w:r>
+    </w:p>
+    <w:p>
+      <w:pPr>
+        <w:spacing w:before="60" w:after="60"/>
+      </w:pPr>
     </w:p>
     <w:p>
       <w:pPr>
@@ -9897,44 +11429,283 @@
     </w:p>
     <w:p>
       <w:pPr>
-        <w:spacing w:before="120" w:after="120"/>
-        <w:jc w:val="center"/>
         <w:ind w:left="0" w:firstLine="0"/>
-      </w:pPr>
-      <w:r>
-        <w:drawing>
-          <wp:inline xmlns:a="http://schemas.openxmlformats.org/drawingml/2006/main" xmlns:pic="http://schemas.openxmlformats.org/drawingml/2006/picture">
-            <wp:extent cx="4572000" cy="1249680"/>
-            <wp:docPr id="6" name="Picture 6"/>
-            <wp:cNvGraphicFramePr>
-              <a:graphicFrameLocks noChangeAspect="1"/>
-            </wp:cNvGraphicFramePr>
-            <a:graphic>
-              <a:graphicData uri="http://schemas.openxmlformats.org/drawingml/2006/picture">
-                <pic:pic>
-                  <pic:nvPicPr>
-                    <pic:cNvPr id="0" name="scarf_model.png"/>
-                    <pic:cNvPicPr/>
-                  </pic:nvPicPr>
-                  <pic:blipFill>
-                    <a:blip r:embed="rId16"/>
-                    <a:stretch>
-                      <a:fillRect/>
-                    </a:stretch>
-                  </pic:blipFill>
-                  <pic:spPr>
-                    <a:xfrm>
-                      <a:off x="0" y="0"/>
-                      <a:ext cx="4572000" cy="1249680"/>
-                    </a:xfrm>
-                    <a:prstGeom prst="rect"/>
-                  </pic:spPr>
-                </pic:pic>
-              </a:graphicData>
-            </a:graphic>
-          </wp:inline>
-        </w:drawing>
-      </w:r>
+        <w:spacing w:before="40" w:after="40"/>
+      </w:pPr>
+      <w:r>
+        <w:rPr>
+          <w:sz w:val="24"/>
+          <w:b/>
+        </w:rPr>
+        <w:t xml:space="preserve">Status</w:t>
+      </w:r>
+    </w:p>
+    <w:p>
+      <w:pPr>
+        <w:ind w:left="288" w:firstLine="0"/>
+        <w:spacing w:before="20" w:after="20"/>
+      </w:pPr>
+      <w:r>
+        <w:rPr>
+          <w:b/>
+          <w:sz w:val="24"/>
+        </w:rPr>
+        <w:t xml:space="preserve">Threatened when: </w:t>
+      </w:r>
+      <w:r>
+        <w:rPr>
+          <w:sz w:val="24"/>
+        </w:rPr>
+        <w:t xml:space="preserve">Criticized, compared to others</w:t>
+      </w:r>
+    </w:p>
+    <w:p>
+      <w:pPr>
+        <w:ind w:left="288" w:firstLine="0"/>
+        <w:spacing w:before="20" w:after="20"/>
+      </w:pPr>
+      <w:r>
+        <w:rPr>
+          <w:b/>
+          <w:sz w:val="24"/>
+        </w:rPr>
+        <w:t xml:space="preserve">Protect it by: </w:t>
+      </w:r>
+      <w:r>
+        <w:rPr>
+          <w:sz w:val="24"/>
+        </w:rPr>
+        <w:t xml:space="preserve">Focus on behavior, not character; acknowledge strengths</w:t>
+      </w:r>
+    </w:p>
+    <w:p>
+      <w:pPr>
+        <w:spacing w:before="60" w:after="60"/>
+      </w:pPr>
+    </w:p>
+    <w:p>
+      <w:pPr>
+        <w:ind w:left="0" w:firstLine="0"/>
+        <w:spacing w:before="40" w:after="40"/>
+      </w:pPr>
+      <w:r>
+        <w:rPr>
+          <w:sz w:val="24"/>
+          <w:b/>
+        </w:rPr>
+        <w:t xml:space="preserve">Certainty</w:t>
+      </w:r>
+    </w:p>
+    <w:p>
+      <w:pPr>
+        <w:ind w:left="288" w:firstLine="0"/>
+        <w:spacing w:before="20" w:after="20"/>
+      </w:pPr>
+      <w:r>
+        <w:rPr>
+          <w:b/>
+          <w:sz w:val="24"/>
+        </w:rPr>
+        <w:t xml:space="preserve">Threatened when: </w:t>
+      </w:r>
+      <w:r>
+        <w:rPr>
+          <w:sz w:val="24"/>
+        </w:rPr>
+        <w:t xml:space="preserve">Outcome is unclear or surprising</w:t>
+      </w:r>
+    </w:p>
+    <w:p>
+      <w:pPr>
+        <w:ind w:left="288" w:firstLine="0"/>
+        <w:spacing w:before="20" w:after="20"/>
+      </w:pPr>
+      <w:r>
+        <w:rPr>
+          <w:b/>
+          <w:sz w:val="24"/>
+        </w:rPr>
+        <w:t xml:space="preserve">Protect it by: </w:t>
+      </w:r>
+      <w:r>
+        <w:rPr>
+          <w:sz w:val="24"/>
+        </w:rPr>
+        <w:t xml:space="preserve">Preview the conversation topic; be specific about next steps</w:t>
+      </w:r>
+    </w:p>
+    <w:p>
+      <w:pPr>
+        <w:spacing w:before="60" w:after="60"/>
+      </w:pPr>
+    </w:p>
+    <w:p>
+      <w:pPr>
+        <w:ind w:left="0" w:firstLine="0"/>
+        <w:spacing w:before="40" w:after="40"/>
+      </w:pPr>
+      <w:r>
+        <w:rPr>
+          <w:sz w:val="24"/>
+          <w:b/>
+        </w:rPr>
+        <w:t xml:space="preserve">Autonomy</w:t>
+      </w:r>
+    </w:p>
+    <w:p>
+      <w:pPr>
+        <w:ind w:left="288" w:firstLine="0"/>
+        <w:spacing w:before="20" w:after="20"/>
+      </w:pPr>
+      <w:r>
+        <w:rPr>
+          <w:b/>
+          <w:sz w:val="24"/>
+        </w:rPr>
+        <w:t xml:space="preserve">Threatened when: </w:t>
+      </w:r>
+      <w:r>
+        <w:rPr>
+          <w:sz w:val="24"/>
+        </w:rPr>
+        <w:t xml:space="preserve">Told what to do without input</w:t>
+      </w:r>
+    </w:p>
+    <w:p>
+      <w:pPr>
+        <w:ind w:left="288" w:firstLine="0"/>
+        <w:spacing w:before="20" w:after="20"/>
+      </w:pPr>
+      <w:r>
+        <w:rPr>
+          <w:b/>
+          <w:sz w:val="24"/>
+        </w:rPr>
+        <w:t xml:space="preserve">Protect it by: </w:t>
+      </w:r>
+      <w:r>
+        <w:rPr>
+          <w:sz w:val="24"/>
+        </w:rPr>
+        <w:t xml:space="preserve">Ask for their ideas; co-create the plan</w:t>
+      </w:r>
+    </w:p>
+    <w:p>
+      <w:pPr>
+        <w:spacing w:before="60" w:after="60"/>
+      </w:pPr>
+    </w:p>
+    <w:p>
+      <w:pPr>
+        <w:ind w:left="0" w:firstLine="0"/>
+        <w:spacing w:before="40" w:after="40"/>
+      </w:pPr>
+      <w:r>
+        <w:rPr>
+          <w:sz w:val="24"/>
+          <w:b/>
+        </w:rPr>
+        <w:t xml:space="preserve">Relatedness</w:t>
+      </w:r>
+    </w:p>
+    <w:p>
+      <w:pPr>
+        <w:ind w:left="288" w:firstLine="0"/>
+        <w:spacing w:before="20" w:after="20"/>
+      </w:pPr>
+      <w:r>
+        <w:rPr>
+          <w:b/>
+          <w:sz w:val="24"/>
+        </w:rPr>
+        <w:t xml:space="preserve">Threatened when: </w:t>
+      </w:r>
+      <w:r>
+        <w:rPr>
+          <w:sz w:val="24"/>
+        </w:rPr>
+        <w:t xml:space="preserve">Feeling isolated or adversarial</w:t>
+      </w:r>
+    </w:p>
+    <w:p>
+      <w:pPr>
+        <w:ind w:left="288" w:firstLine="0"/>
+        <w:spacing w:before="20" w:after="20"/>
+      </w:pPr>
+      <w:r>
+        <w:rPr>
+          <w:b/>
+          <w:sz w:val="24"/>
+        </w:rPr>
+        <w:t xml:space="preserve">Protect it by: </w:t>
+      </w:r>
+      <w:r>
+        <w:rPr>
+          <w:sz w:val="24"/>
+        </w:rPr>
+        <w:t xml:space="preserve">Show genuine care; use "we" language</w:t>
+      </w:r>
+    </w:p>
+    <w:p>
+      <w:pPr>
+        <w:spacing w:before="60" w:after="60"/>
+      </w:pPr>
+    </w:p>
+    <w:p>
+      <w:pPr>
+        <w:ind w:left="0" w:firstLine="0"/>
+        <w:spacing w:before="40" w:after="40"/>
+      </w:pPr>
+      <w:r>
+        <w:rPr>
+          <w:sz w:val="24"/>
+          <w:b/>
+        </w:rPr>
+        <w:t xml:space="preserve">Fairness</w:t>
+      </w:r>
+    </w:p>
+    <w:p>
+      <w:pPr>
+        <w:ind w:left="288" w:firstLine="0"/>
+        <w:spacing w:before="20" w:after="20"/>
+      </w:pPr>
+      <w:r>
+        <w:rPr>
+          <w:b/>
+          <w:sz w:val="24"/>
+        </w:rPr>
+        <w:t xml:space="preserve">Threatened when: </w:t>
+      </w:r>
+      <w:r>
+        <w:rPr>
+          <w:sz w:val="24"/>
+        </w:rPr>
+        <w:t xml:space="preserve">Perceiving unequal treatment</w:t>
+      </w:r>
+    </w:p>
+    <w:p>
+      <w:pPr>
+        <w:ind w:left="288" w:firstLine="0"/>
+        <w:spacing w:before="20" w:after="20"/>
+      </w:pPr>
+      <w:r>
+        <w:rPr>
+          <w:b/>
+          <w:sz w:val="24"/>
+        </w:rPr>
+        <w:t xml:space="preserve">Protect it by: </w:t>
+      </w:r>
+      <w:r>
+        <w:rPr>
+          <w:sz w:val="24"/>
+        </w:rPr>
+        <w:t xml:space="preserve">Be transparent about reasoning; apply standards consistently</w:t>
+      </w:r>
+    </w:p>
+    <w:p>
+      <w:pPr>
+        <w:spacing w:before="60" w:after="60"/>
+      </w:pPr>
     </w:p>
     <w:p>
       <w:pPr>
@@ -9962,44 +11733,228 @@
     </w:p>
     <w:p>
       <w:pPr>
-        <w:spacing w:before="120" w:after="120"/>
-        <w:jc w:val="center"/>
         <w:ind w:left="0" w:firstLine="0"/>
-      </w:pPr>
-      <w:r>
-        <w:drawing>
-          <wp:inline xmlns:a="http://schemas.openxmlformats.org/drawingml/2006/main" xmlns:pic="http://schemas.openxmlformats.org/drawingml/2006/picture">
-            <wp:extent cx="4572000" cy="948690"/>
-            <wp:docPr id="7" name="Picture 7"/>
-            <wp:cNvGraphicFramePr>
-              <a:graphicFrameLocks noChangeAspect="1"/>
-            </wp:cNvGraphicFramePr>
-            <a:graphic>
-              <a:graphicData uri="http://schemas.openxmlformats.org/drawingml/2006/picture">
-                <pic:pic>
-                  <pic:nvPicPr>
-                    <pic:cNvPr id="0" name="polyvagal_states.png"/>
-                    <pic:cNvPicPr/>
-                  </pic:nvPicPr>
-                  <pic:blipFill>
-                    <a:blip r:embed="rId17"/>
-                    <a:stretch>
-                      <a:fillRect/>
-                    </a:stretch>
-                  </pic:blipFill>
-                  <pic:spPr>
-                    <a:xfrm>
-                      <a:off x="0" y="0"/>
-                      <a:ext cx="4572000" cy="948690"/>
-                    </a:xfrm>
-                    <a:prstGeom prst="rect"/>
-                  </pic:spPr>
-                </pic:pic>
-              </a:graphicData>
-            </a:graphic>
-          </wp:inline>
-        </w:drawing>
-      </w:r>
+        <w:spacing w:before="40" w:after="40"/>
+      </w:pPr>
+      <w:r>
+        <w:rPr>
+          <w:sz w:val="24"/>
+          <w:b/>
+        </w:rPr>
+        <w:t xml:space="preserve">VENTRAL VAGAL (engaged)</w:t>
+      </w:r>
+    </w:p>
+    <w:p>
+      <w:pPr>
+        <w:ind w:left="288" w:firstLine="0"/>
+        <w:spacing w:before="20" w:after="20"/>
+      </w:pPr>
+      <w:r>
+        <w:rPr>
+          <w:b/>
+          <w:sz w:val="24"/>
+        </w:rPr>
+        <w:t xml:space="preserve">What you see: </w:t>
+      </w:r>
+      <w:r>
+        <w:rPr>
+          <w:sz w:val="24"/>
+        </w:rPr>
+        <w:t xml:space="preserve">Eye contact, expressive face, responsive, asking questions</w:t>
+      </w:r>
+    </w:p>
+    <w:p>
+      <w:pPr>
+        <w:ind w:left="288" w:firstLine="0"/>
+        <w:spacing w:before="20" w:after="20"/>
+      </w:pPr>
+      <w:r>
+        <w:rPr>
+          <w:b/>
+          <w:sz w:val="24"/>
+        </w:rPr>
+        <w:t xml:space="preserve">What's happening: </w:t>
+      </w:r>
+      <w:r>
+        <w:rPr>
+          <w:sz w:val="24"/>
+        </w:rPr>
+        <w:t xml:space="preserve">Social engagement system active; they can hear you</w:t>
+      </w:r>
+    </w:p>
+    <w:p>
+      <w:pPr>
+        <w:ind w:left="288" w:firstLine="0"/>
+        <w:spacing w:before="20" w:after="20"/>
+      </w:pPr>
+      <w:r>
+        <w:rPr>
+          <w:b/>
+          <w:sz w:val="24"/>
+        </w:rPr>
+        <w:t xml:space="preserve">Your move: </w:t>
+      </w:r>
+      <w:r>
+        <w:rPr>
+          <w:sz w:val="24"/>
+        </w:rPr>
+        <w:t xml:space="preserve">Continue - this is the productive zone</w:t>
+      </w:r>
+    </w:p>
+    <w:p>
+      <w:pPr>
+        <w:spacing w:before="60" w:after="60"/>
+      </w:pPr>
+    </w:p>
+    <w:p>
+      <w:pPr>
+        <w:ind w:left="0" w:firstLine="0"/>
+        <w:spacing w:before="40" w:after="40"/>
+      </w:pPr>
+      <w:r>
+        <w:rPr>
+          <w:sz w:val="24"/>
+          <w:b/>
+        </w:rPr>
+        <w:t xml:space="preserve">SYMPATHETIC (fight/flight)</w:t>
+      </w:r>
+    </w:p>
+    <w:p>
+      <w:pPr>
+        <w:ind w:left="288" w:firstLine="0"/>
+        <w:spacing w:before="20" w:after="20"/>
+      </w:pPr>
+      <w:r>
+        <w:rPr>
+          <w:b/>
+          <w:sz w:val="24"/>
+        </w:rPr>
+        <w:t xml:space="preserve">What you see: </w:t>
+      </w:r>
+      <w:r>
+        <w:rPr>
+          <w:sz w:val="24"/>
+        </w:rPr>
+        <w:t xml:space="preserve">Defensive, arguing, fidgeting, raised voice, wanting to leave</w:t>
+      </w:r>
+    </w:p>
+    <w:p>
+      <w:pPr>
+        <w:ind w:left="288" w:firstLine="0"/>
+        <w:spacing w:before="20" w:after="20"/>
+      </w:pPr>
+      <w:r>
+        <w:rPr>
+          <w:b/>
+          <w:sz w:val="24"/>
+        </w:rPr>
+        <w:t xml:space="preserve">What's happening: </w:t>
+      </w:r>
+      <w:r>
+        <w:rPr>
+          <w:sz w:val="24"/>
+        </w:rPr>
+        <w:t xml:space="preserve">Threat detected; stress hormones flooding</w:t>
+      </w:r>
+    </w:p>
+    <w:p>
+      <w:pPr>
+        <w:ind w:left="288" w:firstLine="0"/>
+        <w:spacing w:before="20" w:after="20"/>
+      </w:pPr>
+      <w:r>
+        <w:rPr>
+          <w:b/>
+          <w:sz w:val="24"/>
+        </w:rPr>
+        <w:t xml:space="preserve">Your move: </w:t>
+      </w:r>
+      <w:r>
+        <w:rPr>
+          <w:sz w:val="24"/>
+        </w:rPr>
+        <w:t xml:space="preserve">Slow down. Empathize. "I can see this is hitting hard."</w:t>
+      </w:r>
+    </w:p>
+    <w:p>
+      <w:pPr>
+        <w:spacing w:before="60" w:after="60"/>
+      </w:pPr>
+    </w:p>
+    <w:p>
+      <w:pPr>
+        <w:ind w:left="0" w:firstLine="0"/>
+        <w:spacing w:before="40" w:after="40"/>
+      </w:pPr>
+      <w:r>
+        <w:rPr>
+          <w:sz w:val="24"/>
+          <w:b/>
+        </w:rPr>
+        <w:t xml:space="preserve">DORSAL VAGAL (shutdown)</w:t>
+      </w:r>
+    </w:p>
+    <w:p>
+      <w:pPr>
+        <w:ind w:left="288" w:firstLine="0"/>
+        <w:spacing w:before="20" w:after="20"/>
+      </w:pPr>
+      <w:r>
+        <w:rPr>
+          <w:b/>
+          <w:sz w:val="24"/>
+        </w:rPr>
+        <w:t xml:space="preserve">What you see: </w:t>
+      </w:r>
+      <w:r>
+        <w:rPr>
+          <w:sz w:val="24"/>
+        </w:rPr>
+        <w:t xml:space="preserve">Blank stare, flat voice, nodding to everything, going quiet</w:t>
+      </w:r>
+    </w:p>
+    <w:p>
+      <w:pPr>
+        <w:ind w:left="288" w:firstLine="0"/>
+        <w:spacing w:before="20" w:after="20"/>
+      </w:pPr>
+      <w:r>
+        <w:rPr>
+          <w:b/>
+          <w:sz w:val="24"/>
+        </w:rPr>
+        <w:t xml:space="preserve">What's happening: </w:t>
+      </w:r>
+      <w:r>
+        <w:rPr>
+          <w:sz w:val="24"/>
+        </w:rPr>
+        <w:t xml:space="preserve">Freeze/collapse; they've disconnected</w:t>
+      </w:r>
+    </w:p>
+    <w:p>
+      <w:pPr>
+        <w:ind w:left="288" w:firstLine="0"/>
+        <w:spacing w:before="20" w:after="20"/>
+      </w:pPr>
+      <w:r>
+        <w:rPr>
+          <w:b/>
+          <w:sz w:val="24"/>
+        </w:rPr>
+        <w:t xml:space="preserve">Your move: </w:t>
+      </w:r>
+      <w:r>
+        <w:rPr>
+          <w:sz w:val="24"/>
+        </w:rPr>
+        <w:t xml:space="preserve">Pause the conversation. "Let's take a break."</w:t>
+      </w:r>
+    </w:p>
+    <w:p>
+      <w:pPr>
+        <w:spacing w:before="60" w:after="60"/>
+      </w:pPr>
     </w:p>
     <w:p>
       <w:pPr>
@@ -10321,44 +12276,225 @@
     </w:p>
     <w:p>
       <w:pPr>
-        <w:spacing w:before="120" w:after="120"/>
-        <w:jc w:val="center"/>
         <w:ind w:left="0" w:firstLine="0"/>
-      </w:pPr>
-      <w:r>
-        <w:drawing>
-          <wp:inline xmlns:a="http://schemas.openxmlformats.org/drawingml/2006/main" xmlns:pic="http://schemas.openxmlformats.org/drawingml/2006/picture">
-            <wp:extent cx="4572000" cy="1550670"/>
-            <wp:docPr id="8" name="Picture 8"/>
-            <wp:cNvGraphicFramePr>
-              <a:graphicFrameLocks noChangeAspect="1"/>
-            </wp:cNvGraphicFramePr>
-            <a:graphic>
-              <a:graphicData uri="http://schemas.openxmlformats.org/drawingml/2006/picture">
-                <pic:pic>
-                  <pic:nvPicPr>
-                    <pic:cNvPr id="0" name="phrases_to_eliminate.png"/>
-                    <pic:cNvPicPr/>
-                  </pic:nvPicPr>
-                  <pic:blipFill>
-                    <a:blip r:embed="rId18"/>
-                    <a:stretch>
-                      <a:fillRect/>
-                    </a:stretch>
-                  </pic:blipFill>
-                  <pic:spPr>
-                    <a:xfrm>
-                      <a:off x="0" y="0"/>
-                      <a:ext cx="4572000" cy="1550670"/>
-                    </a:xfrm>
-                    <a:prstGeom prst="rect"/>
-                  </pic:spPr>
-                </pic:pic>
-              </a:graphicData>
-            </a:graphic>
-          </wp:inline>
-        </w:drawing>
-      </w:r>
+        <w:spacing w:before="40" w:after="40"/>
+      </w:pPr>
+      <w:r>
+        <w:rPr>
+          <w:sz w:val="24"/>
+          <w:b/>
+        </w:rPr>
+        <w:t xml:space="preserve">"We need to talk"</w:t>
+      </w:r>
+    </w:p>
+    <w:p>
+      <w:pPr>
+        <w:ind w:left="288" w:firstLine="0"/>
+        <w:spacing w:before="20" w:after="20"/>
+      </w:pPr>
+      <w:r>
+        <w:rPr>
+          <w:b/>
+          <w:sz w:val="24"/>
+        </w:rPr>
+        <w:t xml:space="preserve">Say instead: </w:t>
+      </w:r>
+      <w:r>
+        <w:rPr>
+          <w:sz w:val="24"/>
+        </w:rPr>
+        <w:t xml:space="preserve">"I want to discuss [topic] - nothing urgent"</w:t>
+      </w:r>
+    </w:p>
+    <w:p>
+      <w:pPr>
+        <w:spacing w:before="60" w:after="60"/>
+      </w:pPr>
+    </w:p>
+    <w:p>
+      <w:pPr>
+        <w:ind w:left="0" w:firstLine="0"/>
+        <w:spacing w:before="40" w:after="40"/>
+      </w:pPr>
+      <w:r>
+        <w:rPr>
+          <w:sz w:val="24"/>
+          <w:b/>
+        </w:rPr>
+        <w:t xml:space="preserve">"You always / you never"</w:t>
+      </w:r>
+    </w:p>
+    <w:p>
+      <w:pPr>
+        <w:ind w:left="288" w:firstLine="0"/>
+        <w:spacing w:before="20" w:after="20"/>
+      </w:pPr>
+      <w:r>
+        <w:rPr>
+          <w:b/>
+          <w:sz w:val="24"/>
+        </w:rPr>
+        <w:t xml:space="preserve">Say instead: </w:t>
+      </w:r>
+      <w:r>
+        <w:rPr>
+          <w:sz w:val="24"/>
+        </w:rPr>
+        <w:t xml:space="preserve">"I've noticed [specific behavior] in [timeframe]"</w:t>
+      </w:r>
+    </w:p>
+    <w:p>
+      <w:pPr>
+        <w:spacing w:before="60" w:after="60"/>
+      </w:pPr>
+    </w:p>
+    <w:p>
+      <w:pPr>
+        <w:ind w:left="0" w:firstLine="0"/>
+        <w:spacing w:before="40" w:after="40"/>
+      </w:pPr>
+      <w:r>
+        <w:rPr>
+          <w:sz w:val="24"/>
+          <w:b/>
+        </w:rPr>
+        <w:t xml:space="preserve">"Don't take this personally"</w:t>
+      </w:r>
+    </w:p>
+    <w:p>
+      <w:pPr>
+        <w:ind w:left="288" w:firstLine="0"/>
+        <w:spacing w:before="20" w:after="20"/>
+      </w:pPr>
+      <w:r>
+        <w:rPr>
+          <w:b/>
+          <w:sz w:val="24"/>
+        </w:rPr>
+        <w:t xml:space="preserve">Say instead: </w:t>
+      </w:r>
+      <w:r>
+        <w:rPr>
+          <w:sz w:val="24"/>
+        </w:rPr>
+        <w:t xml:space="preserve">"This is about the work, and I want to help"</w:t>
+      </w:r>
+    </w:p>
+    <w:p>
+      <w:pPr>
+        <w:spacing w:before="60" w:after="60"/>
+      </w:pPr>
+    </w:p>
+    <w:p>
+      <w:pPr>
+        <w:ind w:left="0" w:firstLine="0"/>
+        <w:spacing w:before="40" w:after="40"/>
+      </w:pPr>
+      <w:r>
+        <w:rPr>
+          <w:sz w:val="24"/>
+          <w:b/>
+        </w:rPr>
+        <w:t xml:space="preserve">"I'm disappointed in you"</w:t>
+      </w:r>
+    </w:p>
+    <w:p>
+      <w:pPr>
+        <w:ind w:left="288" w:firstLine="0"/>
+        <w:spacing w:before="20" w:after="20"/>
+      </w:pPr>
+      <w:r>
+        <w:rPr>
+          <w:b/>
+          <w:sz w:val="24"/>
+        </w:rPr>
+        <w:t xml:space="preserve">Say instead: </w:t>
+      </w:r>
+      <w:r>
+        <w:rPr>
+          <w:sz w:val="24"/>
+        </w:rPr>
+        <w:t xml:space="preserve">"The outcome wasn't what we needed"</w:t>
+      </w:r>
+    </w:p>
+    <w:p>
+      <w:pPr>
+        <w:spacing w:before="60" w:after="60"/>
+      </w:pPr>
+    </w:p>
+    <w:p>
+      <w:pPr>
+        <w:ind w:left="0" w:firstLine="0"/>
+        <w:spacing w:before="40" w:after="40"/>
+      </w:pPr>
+      <w:r>
+        <w:rPr>
+          <w:sz w:val="24"/>
+          <w:b/>
+        </w:rPr>
+        <w:t xml:space="preserve">"Everyone else manages to..."</w:t>
+      </w:r>
+    </w:p>
+    <w:p>
+      <w:pPr>
+        <w:ind w:left="288" w:firstLine="0"/>
+        <w:spacing w:before="20" w:after="20"/>
+      </w:pPr>
+      <w:r>
+        <w:rPr>
+          <w:b/>
+          <w:sz w:val="24"/>
+        </w:rPr>
+        <w:t xml:space="preserve">Say instead: </w:t>
+      </w:r>
+      <w:r>
+        <w:rPr>
+          <w:sz w:val="24"/>
+        </w:rPr>
+        <w:t xml:space="preserve">"The standard for this role is..."</w:t>
+      </w:r>
+    </w:p>
+    <w:p>
+      <w:pPr>
+        <w:spacing w:before="60" w:after="60"/>
+      </w:pPr>
+    </w:p>
+    <w:p>
+      <w:pPr>
+        <w:ind w:left="0" w:firstLine="0"/>
+        <w:spacing w:before="40" w:after="40"/>
+      </w:pPr>
+      <w:r>
+        <w:rPr>
+          <w:sz w:val="24"/>
+          <w:b/>
+        </w:rPr>
+        <w:t xml:space="preserve">"It's not a big deal, but..."</w:t>
+      </w:r>
+    </w:p>
+    <w:p>
+      <w:pPr>
+        <w:ind w:left="288" w:firstLine="0"/>
+        <w:spacing w:before="20" w:after="20"/>
+      </w:pPr>
+      <w:r>
+        <w:rPr>
+          <w:b/>
+          <w:sz w:val="24"/>
+        </w:rPr>
+        <w:t xml:space="preserve">Say instead: </w:t>
+      </w:r>
+      <w:r>
+        <w:rPr>
+          <w:sz w:val="24"/>
+        </w:rPr>
+        <w:t xml:space="preserve">"I want to flag something while it's small"</w:t>
+      </w:r>
+    </w:p>
+    <w:p>
+      <w:pPr>
+        <w:spacing w:before="60" w:after="60"/>
+      </w:pPr>
     </w:p>
     <w:p>
       <w:pPr>
@@ -10563,44 +12699,299 @@
     </w:p>
     <w:p>
       <w:pPr>
-        <w:spacing w:before="120" w:after="120"/>
-        <w:jc w:val="center"/>
         <w:ind w:left="0" w:firstLine="0"/>
-      </w:pPr>
-      <w:r>
-        <w:drawing>
-          <wp:inline xmlns:a="http://schemas.openxmlformats.org/drawingml/2006/main" xmlns:pic="http://schemas.openxmlformats.org/drawingml/2006/picture">
-            <wp:extent cx="4572000" cy="1703070"/>
-            <wp:docPr id="9" name="Picture 9"/>
-            <wp:cNvGraphicFramePr>
-              <a:graphicFrameLocks noChangeAspect="1"/>
-            </wp:cNvGraphicFramePr>
-            <a:graphic>
-              <a:graphicData uri="http://schemas.openxmlformats.org/drawingml/2006/picture">
-                <pic:pic>
-                  <pic:nvPicPr>
-                    <pic:cNvPr id="0" name="conversation_decision_guide.png"/>
-                    <pic:cNvPicPr/>
-                  </pic:nvPicPr>
-                  <pic:blipFill>
-                    <a:blip r:embed="rId19"/>
-                    <a:stretch>
-                      <a:fillRect/>
-                    </a:stretch>
-                  </pic:blipFill>
-                  <pic:spPr>
-                    <a:xfrm>
-                      <a:off x="0" y="0"/>
-                      <a:ext cx="4572000" cy="1703070"/>
-                    </a:xfrm>
-                    <a:prstGeom prst="rect"/>
-                  </pic:spPr>
-                </pic:pic>
-              </a:graphicData>
-            </a:graphic>
-          </wp:inline>
-        </w:drawing>
-      </w:r>
+        <w:spacing w:before="40" w:after="40"/>
+      </w:pPr>
+      <w:r>
+        <w:rPr>
+          <w:sz w:val="24"/>
+          <w:b/>
+        </w:rPr>
+        <w:t xml:space="preserve">Repeated missed deadlines, declining quality over 2+ weeks</w:t>
+      </w:r>
+    </w:p>
+    <w:p>
+      <w:pPr>
+        <w:ind w:left="288" w:firstLine="0"/>
+        <w:spacing w:before="20" w:after="20"/>
+      </w:pPr>
+      <w:r>
+        <w:rPr>
+          <w:b/>
+          <w:sz w:val="24"/>
+        </w:rPr>
+        <w:t xml:space="preserve">Use: </w:t>
+      </w:r>
+      <w:r>
+        <w:rPr>
+          <w:sz w:val="24"/>
+        </w:rPr>
+        <w:t xml:space="preserve">Performance Improvement (Ch. 3) - 30-day plan + weekly check-ins</w:t>
+      </w:r>
+    </w:p>
+    <w:p>
+      <w:pPr>
+        <w:spacing w:before="60" w:after="60"/>
+      </w:pPr>
+    </w:p>
+    <w:p>
+      <w:pPr>
+        <w:ind w:left="0" w:firstLine="0"/>
+        <w:spacing w:before="40" w:after="40"/>
+      </w:pPr>
+      <w:r>
+        <w:rPr>
+          <w:sz w:val="24"/>
+          <w:b/>
+        </w:rPr>
+        <w:t xml:space="preserve">Single event: bad presentation, client complaint, error</w:t>
+      </w:r>
+    </w:p>
+    <w:p>
+      <w:pPr>
+        <w:ind w:left="288" w:firstLine="0"/>
+        <w:spacing w:before="20" w:after="20"/>
+      </w:pPr>
+      <w:r>
+        <w:rPr>
+          <w:b/>
+          <w:sz w:val="24"/>
+        </w:rPr>
+        <w:t xml:space="preserve">Use: </w:t>
+      </w:r>
+      <w:r>
+        <w:rPr>
+          <w:sz w:val="24"/>
+        </w:rPr>
+        <w:t xml:space="preserve">Negative Feedback (Ch. 4) - specific behavior + reappraisal</w:t>
+      </w:r>
+    </w:p>
+    <w:p>
+      <w:pPr>
+        <w:spacing w:before="60" w:after="60"/>
+      </w:pPr>
+    </w:p>
+    <w:p>
+      <w:pPr>
+        <w:ind w:left="0" w:firstLine="0"/>
+        <w:spacing w:before="40" w:after="40"/>
+      </w:pPr>
+      <w:r>
+        <w:rPr>
+          <w:sz w:val="24"/>
+          <w:b/>
+        </w:rPr>
+        <w:t xml:space="preserve">Missing standups, offline during core hours, disruptive tone</w:t>
+      </w:r>
+    </w:p>
+    <w:p>
+      <w:pPr>
+        <w:ind w:left="288" w:firstLine="0"/>
+        <w:spacing w:before="20" w:after="20"/>
+      </w:pPr>
+      <w:r>
+        <w:rPr>
+          <w:b/>
+          <w:sz w:val="24"/>
+        </w:rPr>
+        <w:t xml:space="preserve">Use: </w:t>
+      </w:r>
+      <w:r>
+        <w:rPr>
+          <w:sz w:val="24"/>
+        </w:rPr>
+        <w:t xml:space="preserve">Attendance &amp; Behavior (Ch. 5) - curiosity before correction</w:t>
+      </w:r>
+    </w:p>
+    <w:p>
+      <w:pPr>
+        <w:spacing w:before="60" w:after="60"/>
+      </w:pPr>
+    </w:p>
+    <w:p>
+      <w:pPr>
+        <w:ind w:left="0" w:firstLine="0"/>
+        <w:spacing w:before="40" w:after="40"/>
+      </w:pPr>
+      <w:r>
+        <w:rPr>
+          <w:sz w:val="24"/>
+          <w:b/>
+        </w:rPr>
+        <w:t xml:space="preserve">Employee asks for raise/promotion, answer is no</w:t>
+      </w:r>
+    </w:p>
+    <w:p>
+      <w:pPr>
+        <w:ind w:left="288" w:firstLine="0"/>
+        <w:spacing w:before="20" w:after="20"/>
+      </w:pPr>
+      <w:r>
+        <w:rPr>
+          <w:b/>
+          <w:sz w:val="24"/>
+        </w:rPr>
+        <w:t xml:space="preserve">Use: </w:t>
+      </w:r>
+      <w:r>
+        <w:rPr>
+          <w:sz w:val="24"/>
+        </w:rPr>
+        <w:t xml:space="preserve">Salary &amp; Promotion (Ch. 6) - "not yet" + development roadmap</w:t>
+      </w:r>
+    </w:p>
+    <w:p>
+      <w:pPr>
+        <w:spacing w:before="60" w:after="60"/>
+      </w:pPr>
+    </w:p>
+    <w:p>
+      <w:pPr>
+        <w:ind w:left="0" w:firstLine="0"/>
+        <w:spacing w:before="40" w:after="40"/>
+      </w:pPr>
+      <w:r>
+        <w:rPr>
+          <w:sz w:val="24"/>
+          <w:b/>
+        </w:rPr>
+        <w:t xml:space="preserve">Decision is final, HR involved, logistics ready</w:t>
+      </w:r>
+    </w:p>
+    <w:p>
+      <w:pPr>
+        <w:ind w:left="288" w:firstLine="0"/>
+        <w:spacing w:before="20" w:after="20"/>
+      </w:pPr>
+      <w:r>
+        <w:rPr>
+          <w:b/>
+          <w:sz w:val="24"/>
+        </w:rPr>
+        <w:t xml:space="preserve">Use: </w:t>
+      </w:r>
+      <w:r>
+        <w:rPr>
+          <w:sz w:val="24"/>
+        </w:rPr>
+        <w:t xml:space="preserve">Letting Someone Go (Ch. 7) - direct in 30 seconds + dignity</w:t>
+      </w:r>
+    </w:p>
+    <w:p>
+      <w:pPr>
+        <w:spacing w:before="60" w:after="60"/>
+      </w:pPr>
+    </w:p>
+    <w:p>
+      <w:pPr>
+        <w:ind w:left="0" w:firstLine="0"/>
+        <w:spacing w:before="40" w:after="40"/>
+      </w:pPr>
+      <w:r>
+        <w:rPr>
+          <w:sz w:val="24"/>
+          <w:b/>
+        </w:rPr>
+        <w:t xml:space="preserve">Two team members in conflict, affecting others</w:t>
+      </w:r>
+    </w:p>
+    <w:p>
+      <w:pPr>
+        <w:ind w:left="288" w:firstLine="0"/>
+        <w:spacing w:before="20" w:after="20"/>
+      </w:pPr>
+      <w:r>
+        <w:rPr>
+          <w:b/>
+          <w:sz w:val="24"/>
+        </w:rPr>
+        <w:t xml:space="preserve">Use: </w:t>
+      </w:r>
+      <w:r>
+        <w:rPr>
+          <w:sz w:val="24"/>
+        </w:rPr>
+        <w:t xml:space="preserve">Team Conflict (Ch. 8) - individual pre-talks + mediated session</w:t>
+      </w:r>
+    </w:p>
+    <w:p>
+      <w:pPr>
+        <w:spacing w:before="60" w:after="60"/>
+      </w:pPr>
+    </w:p>
+    <w:p>
+      <w:pPr>
+        <w:ind w:left="0" w:firstLine="0"/>
+        <w:spacing w:before="40" w:after="40"/>
+      </w:pPr>
+      <w:r>
+        <w:rPr>
+          <w:sz w:val="24"/>
+          <w:b/>
+        </w:rPr>
+        <w:t xml:space="preserve">Withdrawal, flat affect, declining energy, cynicism</w:t>
+      </w:r>
+    </w:p>
+    <w:p>
+      <w:pPr>
+        <w:ind w:left="288" w:firstLine="0"/>
+        <w:spacing w:before="20" w:after="20"/>
+      </w:pPr>
+      <w:r>
+        <w:rPr>
+          <w:b/>
+          <w:sz w:val="24"/>
+        </w:rPr>
+        <w:t xml:space="preserve">Use: </w:t>
+      </w:r>
+      <w:r>
+        <w:rPr>
+          <w:sz w:val="24"/>
+        </w:rPr>
+        <w:t xml:space="preserve">Burnout Check-in (Ch. 9) - "How are you really doing?"</w:t>
+      </w:r>
+    </w:p>
+    <w:p>
+      <w:pPr>
+        <w:spacing w:before="60" w:after="60"/>
+      </w:pPr>
+    </w:p>
+    <w:p>
+      <w:pPr>
+        <w:ind w:left="0" w:firstLine="0"/>
+        <w:spacing w:before="40" w:after="40"/>
+      </w:pPr>
+      <w:r>
+        <w:rPr>
+          <w:sz w:val="24"/>
+          <w:b/>
+        </w:rPr>
+        <w:t xml:space="preserve">Any of the above, but team is remote/hybrid</w:t>
+      </w:r>
+    </w:p>
+    <w:p>
+      <w:pPr>
+        <w:ind w:left="288" w:firstLine="0"/>
+        <w:spacing w:before="20" w:after="20"/>
+      </w:pPr>
+      <w:r>
+        <w:rPr>
+          <w:b/>
+          <w:sz w:val="24"/>
+        </w:rPr>
+        <w:t xml:space="preserve">Use: </w:t>
+      </w:r>
+      <w:r>
+        <w:rPr>
+          <w:sz w:val="24"/>
+        </w:rPr>
+        <w:t xml:space="preserve">Remote &amp; Hybrid Scripts (Ch. 10) - choose: async / video / written</w:t>
+      </w:r>
+    </w:p>
+    <w:p>
+      <w:pPr>
+        <w:spacing w:before="60" w:after="60"/>
+      </w:pPr>
     </w:p>
     <w:p>
       <w:pPr>

</xml_diff>

<commit_message>
Bold on correct phrases: Say instead, Protect it by, Your move
</commit_message>
<xml_diff>
--- a/kdp-files/difficult_conversations_ebook.docx
+++ b/kdp-files/difficult_conversations_ebook.docx
@@ -8549,13 +8549,14 @@
       </w:pPr>
       <w:r>
         <w:rPr>
-          <w:b/>
+          <w:b w:val="0"/>
           <w:sz w:val="24"/>
         </w:rPr>
         <w:t xml:space="preserve">Mirror neurons: </w:t>
       </w:r>
       <w:r>
         <w:rPr>
+          <w:b w:val="0"/>
           <w:sz w:val="24"/>
         </w:rPr>
         <w:t xml:space="preserve">High (strong mirroring response)</w:t>
@@ -8568,13 +8569,14 @@
       </w:pPr>
       <w:r>
         <w:rPr>
-          <w:b/>
+          <w:b w:val="0"/>
           <w:sz w:val="24"/>
         </w:rPr>
         <w:t xml:space="preserve">Social buffering: </w:t>
       </w:r>
       <w:r>
         <w:rPr>
+          <w:b w:val="0"/>
           <w:sz w:val="24"/>
         </w:rPr>
         <w:t xml:space="preserve">High (tone, touch, presence)</w:t>
@@ -8587,13 +8589,14 @@
       </w:pPr>
       <w:r>
         <w:rPr>
-          <w:b/>
+          <w:b w:val="0"/>
           <w:sz w:val="24"/>
         </w:rPr>
         <w:t xml:space="preserve">Threat modulation: </w:t>
       </w:r>
       <w:r>
         <w:rPr>
+          <w:b w:val="0"/>
           <w:sz w:val="24"/>
         </w:rPr>
         <w:t xml:space="preserve">Rapid (real-time cues)</w:t>
@@ -8606,13 +8609,14 @@
       </w:pPr>
       <w:r>
         <w:rPr>
-          <w:b/>
+          <w:b w:val="0"/>
           <w:sz w:val="24"/>
         </w:rPr>
         <w:t xml:space="preserve">Processing: </w:t>
       </w:r>
       <w:r>
         <w:rPr>
+          <w:b w:val="0"/>
           <w:sz w:val="24"/>
         </w:rPr>
         <w:t xml:space="preserve">Episodic + emotional</w:t>
@@ -8625,13 +8629,14 @@
       </w:pPr>
       <w:r>
         <w:rPr>
-          <w:b/>
+          <w:b w:val="0"/>
           <w:sz w:val="24"/>
         </w:rPr>
         <w:t xml:space="preserve">Negativity bias: </w:t>
       </w:r>
       <w:r>
         <w:rPr>
+          <w:b w:val="0"/>
           <w:sz w:val="24"/>
         </w:rPr>
         <w:t xml:space="preserve">Baseline</w:t>
@@ -8644,13 +8649,14 @@
       </w:pPr>
       <w:r>
         <w:rPr>
-          <w:b/>
+          <w:b w:val="0"/>
           <w:sz w:val="24"/>
         </w:rPr>
         <w:t xml:space="preserve">PFC load: </w:t>
       </w:r>
       <w:r>
         <w:rPr>
+          <w:b w:val="0"/>
           <w:sz w:val="24"/>
         </w:rPr>
         <w:t xml:space="preserve">Moderate</w:t>
@@ -8681,13 +8687,14 @@
       </w:pPr>
       <w:r>
         <w:rPr>
-          <w:b/>
+          <w:b w:val="0"/>
           <w:sz w:val="24"/>
         </w:rPr>
         <w:t xml:space="preserve">Mirror neurons: </w:t>
       </w:r>
       <w:r>
         <w:rPr>
+          <w:b w:val="0"/>
           <w:sz w:val="24"/>
         </w:rPr>
         <w:t xml:space="preserve">Reduced compared to in-person</w:t>
@@ -8700,13 +8707,14 @@
       </w:pPr>
       <w:r>
         <w:rPr>
-          <w:b/>
+          <w:b w:val="0"/>
           <w:sz w:val="24"/>
         </w:rPr>
         <w:t xml:space="preserve">Social buffering: </w:t>
       </w:r>
       <w:r>
         <w:rPr>
+          <w:b w:val="0"/>
           <w:sz w:val="24"/>
         </w:rPr>
         <w:t xml:space="preserve">Moderate (tone, face only)</w:t>
@@ -8719,13 +8727,14 @@
       </w:pPr>
       <w:r>
         <w:rPr>
-          <w:b/>
+          <w:b w:val="0"/>
           <w:sz w:val="24"/>
         </w:rPr>
         <w:t xml:space="preserve">Threat modulation: </w:t>
       </w:r>
       <w:r>
         <w:rPr>
+          <w:b w:val="0"/>
           <w:sz w:val="24"/>
         </w:rPr>
         <w:t xml:space="preserve">Slower and less precise (lag, reduced cues)</w:t>
@@ -8738,13 +8747,14 @@
       </w:pPr>
       <w:r>
         <w:rPr>
-          <w:b/>
+          <w:b w:val="0"/>
           <w:sz w:val="24"/>
         </w:rPr>
         <w:t xml:space="preserve">Processing: </w:t>
       </w:r>
       <w:r>
         <w:rPr>
+          <w:b w:val="0"/>
           <w:sz w:val="24"/>
         </w:rPr>
         <w:t xml:space="preserve">Episodic but fatigued</w:t>
@@ -8757,13 +8767,14 @@
       </w:pPr>
       <w:r>
         <w:rPr>
-          <w:b/>
+          <w:b w:val="0"/>
           <w:sz w:val="24"/>
         </w:rPr>
         <w:t xml:space="preserve">Negativity bias: </w:t>
       </w:r>
       <w:r>
         <w:rPr>
+          <w:b w:val="0"/>
           <w:sz w:val="24"/>
         </w:rPr>
         <w:t xml:space="preserve">Elevated (less nonverbal reassurance)</w:t>
@@ -8776,13 +8787,14 @@
       </w:pPr>
       <w:r>
         <w:rPr>
-          <w:b/>
+          <w:b w:val="0"/>
           <w:sz w:val="24"/>
         </w:rPr>
         <w:t xml:space="preserve">PFC load: </w:t>
       </w:r>
       <w:r>
         <w:rPr>
+          <w:b w:val="0"/>
           <w:sz w:val="24"/>
         </w:rPr>
         <w:t xml:space="preserve">High (video call fatigue)</w:t>
@@ -8813,13 +8825,14 @@
       </w:pPr>
       <w:r>
         <w:rPr>
-          <w:b/>
+          <w:b w:val="0"/>
           <w:sz w:val="24"/>
         </w:rPr>
         <w:t xml:space="preserve">Mirror neurons: </w:t>
       </w:r>
       <w:r>
         <w:rPr>
+          <w:b w:val="0"/>
           <w:sz w:val="24"/>
         </w:rPr>
         <w:t xml:space="preserve">Minimal (no motor mirroring)</w:t>
@@ -8832,13 +8845,14 @@
       </w:pPr>
       <w:r>
         <w:rPr>
-          <w:b/>
+          <w:b w:val="0"/>
           <w:sz w:val="24"/>
         </w:rPr>
         <w:t xml:space="preserve">Social buffering: </w:t>
       </w:r>
       <w:r>
         <w:rPr>
+          <w:b w:val="0"/>
           <w:sz w:val="24"/>
         </w:rPr>
         <w:t xml:space="preserve">Zero</w:t>
@@ -8851,13 +8865,14 @@
       </w:pPr>
       <w:r>
         <w:rPr>
-          <w:b/>
+          <w:b w:val="0"/>
           <w:sz w:val="24"/>
         </w:rPr>
         <w:t xml:space="preserve">Threat modulation: </w:t>
       </w:r>
       <w:r>
         <w:rPr>
+          <w:b w:val="0"/>
           <w:sz w:val="24"/>
         </w:rPr>
         <w:t xml:space="preserve">No real-time modulation</w:t>
@@ -8870,13 +8885,14 @@
       </w:pPr>
       <w:r>
         <w:rPr>
-          <w:b/>
+          <w:b w:val="0"/>
           <w:sz w:val="24"/>
         </w:rPr>
         <w:t xml:space="preserve">Processing: </w:t>
       </w:r>
       <w:r>
         <w:rPr>
+          <w:b w:val="0"/>
           <w:sz w:val="24"/>
         </w:rPr>
         <w:t xml:space="preserve">Semantic-leaning (re-readable, revisitable)</w:t>
@@ -8889,13 +8905,14 @@
       </w:pPr>
       <w:r>
         <w:rPr>
-          <w:b/>
+          <w:b w:val="0"/>
           <w:sz w:val="24"/>
         </w:rPr>
         <w:t xml:space="preserve">Negativity bias: </w:t>
       </w:r>
       <w:r>
         <w:rPr>
+          <w:b w:val="0"/>
           <w:sz w:val="24"/>
         </w:rPr>
         <w:t xml:space="preserve">Highest (no tone or face; people reread negatives)</w:t>
@@ -8908,13 +8925,14 @@
       </w:pPr>
       <w:r>
         <w:rPr>
-          <w:b/>
+          <w:b w:val="0"/>
           <w:sz w:val="24"/>
         </w:rPr>
         <w:t xml:space="preserve">PFC load: </w:t>
       </w:r>
       <w:r>
         <w:rPr>
+          <w:b w:val="0"/>
           <w:sz w:val="24"/>
         </w:rPr>
         <w:t xml:space="preserve">Variable (lower in the moment, no co-regulation)</w:t>
@@ -8960,13 +8978,14 @@
       </w:pPr>
       <w:r>
         <w:rPr>
-          <w:b/>
+          <w:b w:val="0"/>
           <w:sz w:val="24"/>
         </w:rPr>
         <w:t xml:space="preserve">Brain trigger: </w:t>
       </w:r>
       <w:r>
         <w:rPr>
+          <w:b w:val="0"/>
           <w:sz w:val="24"/>
         </w:rPr>
         <w:t xml:space="preserve">Maximum uncertainty threat</w:t>
@@ -8979,13 +8998,14 @@
       </w:pPr>
       <w:r>
         <w:rPr>
+          <w:b w:val="0"/>
+          <w:sz w:val="24"/>
+        </w:rPr>
+        <w:t xml:space="preserve">Say instead: </w:t>
+      </w:r>
+      <w:r>
+        <w:rPr>
           <w:b/>
-          <w:sz w:val="24"/>
-        </w:rPr>
-        <w:t xml:space="preserve">Say instead: </w:t>
-      </w:r>
-      <w:r>
-        <w:rPr>
           <w:sz w:val="24"/>
         </w:rPr>
         <w:t xml:space="preserve">"I'd like to discuss the Henderson project - nothing urgent"</w:t>
@@ -9016,13 +9036,14 @@
       </w:pPr>
       <w:r>
         <w:rPr>
-          <w:b/>
+          <w:b w:val="0"/>
           <w:sz w:val="24"/>
         </w:rPr>
         <w:t xml:space="preserve">Brain trigger: </w:t>
       </w:r>
       <w:r>
         <w:rPr>
+          <w:b w:val="0"/>
           <w:sz w:val="24"/>
         </w:rPr>
         <w:t xml:space="preserve">Reads as passive aggression, status + relatedness threat</w:t>
@@ -9035,13 +9056,14 @@
       </w:pPr>
       <w:r>
         <w:rPr>
+          <w:b w:val="0"/>
+          <w:sz w:val="24"/>
+        </w:rPr>
+        <w:t xml:space="preserve">Say instead: </w:t>
+      </w:r>
+      <w:r>
+        <w:rPr>
           <w:b/>
-          <w:sz w:val="24"/>
-        </w:rPr>
-        <w:t xml:space="preserve">Say instead: </w:t>
-      </w:r>
-      <w:r>
-        <w:rPr>
           <w:sz w:val="24"/>
         </w:rPr>
         <w:t xml:space="preserve">"I want to make sure we're aligned on the timeline"</w:t>
@@ -9072,13 +9094,14 @@
       </w:pPr>
       <w:r>
         <w:rPr>
-          <w:b/>
+          <w:b w:val="0"/>
           <w:sz w:val="24"/>
         </w:rPr>
         <w:t xml:space="preserve">Brain trigger: </w:t>
       </w:r>
       <w:r>
         <w:rPr>
+          <w:b w:val="0"/>
           <w:sz w:val="24"/>
         </w:rPr>
         <w:t xml:space="preserve">Global judgment triggers identity-level defense</w:t>
@@ -9091,13 +9114,14 @@
       </w:pPr>
       <w:r>
         <w:rPr>
+          <w:b w:val="0"/>
+          <w:sz w:val="24"/>
+        </w:rPr>
+        <w:t xml:space="preserve">Say instead: </w:t>
+      </w:r>
+      <w:r>
+        <w:rPr>
           <w:b/>
-          <w:sz w:val="24"/>
-        </w:rPr>
-        <w:t xml:space="preserve">Say instead: </w:t>
-      </w:r>
-      <w:r>
-        <w:rPr>
           <w:sz w:val="24"/>
         </w:rPr>
         <w:t xml:space="preserve">"This specific outcome didn't meet the standard we need"</w:t>
@@ -9128,13 +9152,14 @@
       </w:pPr>
       <w:r>
         <w:rPr>
-          <w:b/>
+          <w:b w:val="0"/>
           <w:sz w:val="24"/>
         </w:rPr>
         <w:t xml:space="preserve">Brain trigger: </w:t>
       </w:r>
       <w:r>
         <w:rPr>
+          <w:b w:val="0"/>
           <w:sz w:val="24"/>
         </w:rPr>
         <w:t xml:space="preserve">Social comparison activates social pain</w:t>
@@ -9147,13 +9172,14 @@
       </w:pPr>
       <w:r>
         <w:rPr>
+          <w:b w:val="0"/>
+          <w:sz w:val="24"/>
+        </w:rPr>
+        <w:t xml:space="preserve">Say instead: </w:t>
+      </w:r>
+      <w:r>
+        <w:rPr>
           <w:b/>
-          <w:sz w:val="24"/>
-        </w:rPr>
-        <w:t xml:space="preserve">Say instead: </w:t>
-      </w:r>
-      <w:r>
-        <w:rPr>
           <w:sz w:val="24"/>
         </w:rPr>
         <w:t xml:space="preserve">"The expectation for this role is..."</w:t>
@@ -9184,13 +9210,14 @@
       </w:pPr>
       <w:r>
         <w:rPr>
-          <w:b/>
+          <w:b w:val="0"/>
           <w:sz w:val="24"/>
         </w:rPr>
         <w:t xml:space="preserve">Brain trigger: </w:t>
       </w:r>
       <w:r>
         <w:rPr>
+          <w:b w:val="0"/>
           <w:sz w:val="24"/>
         </w:rPr>
         <w:t xml:space="preserve">Parental framing triggers shame, not learning</w:t>
@@ -9203,13 +9230,14 @@
       </w:pPr>
       <w:r>
         <w:rPr>
+          <w:b w:val="0"/>
+          <w:sz w:val="24"/>
+        </w:rPr>
+        <w:t xml:space="preserve">Say instead: </w:t>
+      </w:r>
+      <w:r>
+        <w:rPr>
           <w:b/>
-          <w:sz w:val="24"/>
-        </w:rPr>
-        <w:t xml:space="preserve">Say instead: </w:t>
-      </w:r>
-      <w:r>
-        <w:rPr>
           <w:sz w:val="24"/>
         </w:rPr>
         <w:t xml:space="preserve">"The outcome wasn't what we needed. Let's figure out why"</w:t>
@@ -9240,13 +9268,14 @@
       </w:pPr>
       <w:r>
         <w:rPr>
-          <w:b/>
+          <w:b w:val="0"/>
           <w:sz w:val="24"/>
         </w:rPr>
         <w:t xml:space="preserve">Brain trigger: </w:t>
       </w:r>
       <w:r>
         <w:rPr>
+          <w:b w:val="0"/>
           <w:sz w:val="24"/>
         </w:rPr>
         <w:t xml:space="preserve">"Need" + "you" = command that threatens autonomy</w:t>
@@ -9259,13 +9288,14 @@
       </w:pPr>
       <w:r>
         <w:rPr>
+          <w:b w:val="0"/>
+          <w:sz w:val="24"/>
+        </w:rPr>
+        <w:t xml:space="preserve">Say instead: </w:t>
+      </w:r>
+      <w:r>
+        <w:rPr>
           <w:b/>
-          <w:sz w:val="24"/>
-        </w:rPr>
-        <w:t xml:space="preserve">Say instead: </w:t>
-      </w:r>
-      <w:r>
-        <w:rPr>
           <w:sz w:val="24"/>
         </w:rPr>
         <w:t xml:space="preserve">"Here's what success looks like..."</w:t>
@@ -9296,13 +9326,14 @@
       </w:pPr>
       <w:r>
         <w:rPr>
-          <w:b/>
+          <w:b w:val="0"/>
           <w:sz w:val="24"/>
         </w:rPr>
         <w:t xml:space="preserve">Brain trigger: </w:t>
       </w:r>
       <w:r>
         <w:rPr>
+          <w:b w:val="0"/>
           <w:sz w:val="24"/>
         </w:rPr>
         <w:t xml:space="preserve">In public channels, signals "you're in trouble"</w:t>
@@ -9315,13 +9346,14 @@
       </w:pPr>
       <w:r>
         <w:rPr>
+          <w:b w:val="0"/>
+          <w:sz w:val="24"/>
+        </w:rPr>
+        <w:t xml:space="preserve">Say instead: </w:t>
+      </w:r>
+      <w:r>
+        <w:rPr>
           <w:b/>
-          <w:sz w:val="24"/>
-        </w:rPr>
-        <w:t xml:space="preserve">Say instead: </w:t>
-      </w:r>
-      <w:r>
-        <w:rPr>
           <w:sz w:val="24"/>
         </w:rPr>
         <w:t xml:space="preserve">DM directly: "Can we hop on a quick call about this?"</w:t>
@@ -9352,13 +9384,14 @@
       </w:pPr>
       <w:r>
         <w:rPr>
-          <w:b/>
+          <w:b w:val="0"/>
           <w:sz w:val="24"/>
         </w:rPr>
         <w:t xml:space="preserve">Brain trigger: </w:t>
       </w:r>
       <w:r>
         <w:rPr>
+          <w:b w:val="0"/>
           <w:sz w:val="24"/>
         </w:rPr>
         <w:t xml:space="preserve">Implies they were wrong - status threat</w:t>
@@ -9371,13 +9404,14 @@
       </w:pPr>
       <w:r>
         <w:rPr>
+          <w:b w:val="0"/>
+          <w:sz w:val="24"/>
+        </w:rPr>
+        <w:t xml:space="preserve">Say instead: </w:t>
+      </w:r>
+      <w:r>
+        <w:rPr>
           <w:b/>
-          <w:sz w:val="24"/>
-        </w:rPr>
-        <w:t xml:space="preserve">Say instead: </w:t>
-      </w:r>
-      <w:r>
-        <w:rPr>
           <w:sz w:val="24"/>
         </w:rPr>
         <w:t xml:space="preserve">"I want to make sure we're on the same page..."</w:t>
@@ -9423,13 +9457,14 @@
       </w:pPr>
       <w:r>
         <w:rPr>
-          <w:b/>
+          <w:b w:val="0"/>
           <w:sz w:val="24"/>
         </w:rPr>
         <w:t xml:space="preserve">Best medium: </w:t>
       </w:r>
       <w:r>
         <w:rPr>
+          <w:b w:val="0"/>
           <w:sz w:val="24"/>
         </w:rPr>
         <w:t xml:space="preserve">Video (camera on) - needs real-time empathy cues</w:t>
@@ -9460,13 +9495,14 @@
       </w:pPr>
       <w:r>
         <w:rPr>
-          <w:b/>
+          <w:b w:val="0"/>
           <w:sz w:val="24"/>
         </w:rPr>
         <w:t xml:space="preserve">Best medium: </w:t>
       </w:r>
       <w:r>
         <w:rPr>
+          <w:b w:val="0"/>
           <w:sz w:val="24"/>
         </w:rPr>
         <w:t xml:space="preserve">Async (Slack/Teams) - low severity, preserves autonomy</w:t>
@@ -9497,13 +9533,14 @@
       </w:pPr>
       <w:r>
         <w:rPr>
-          <w:b/>
+          <w:b w:val="0"/>
           <w:sz w:val="24"/>
         </w:rPr>
         <w:t xml:space="preserve">Best medium: </w:t>
       </w:r>
       <w:r>
         <w:rPr>
+          <w:b w:val="0"/>
           <w:sz w:val="24"/>
         </w:rPr>
         <w:t xml:space="preserve">Video with HR - requires presence and immediate support</w:t>
@@ -9534,13 +9571,14 @@
       </w:pPr>
       <w:r>
         <w:rPr>
-          <w:b/>
+          <w:b w:val="0"/>
           <w:sz w:val="24"/>
         </w:rPr>
         <w:t xml:space="preserve">Best medium: </w:t>
       </w:r>
       <w:r>
         <w:rPr>
+          <w:b w:val="0"/>
           <w:sz w:val="24"/>
         </w:rPr>
         <w:t xml:space="preserve">Phone call (no video) - removes self-monitoring burden</w:t>
@@ -9571,13 +9609,14 @@
       </w:pPr>
       <w:r>
         <w:rPr>
-          <w:b/>
+          <w:b w:val="0"/>
           <w:sz w:val="24"/>
         </w:rPr>
         <w:t xml:space="preserve">Best medium: </w:t>
       </w:r>
       <w:r>
         <w:rPr>
+          <w:b w:val="0"/>
           <w:sz w:val="24"/>
         </w:rPr>
         <w:t xml:space="preserve">Video (all cameras on) - needs visible body language</w:t>
@@ -9608,13 +9647,14 @@
       </w:pPr>
       <w:r>
         <w:rPr>
-          <w:b/>
+          <w:b w:val="0"/>
           <w:sz w:val="24"/>
         </w:rPr>
         <w:t xml:space="preserve">Best medium: </w:t>
       </w:r>
       <w:r>
         <w:rPr>
+          <w:b w:val="0"/>
           <w:sz w:val="24"/>
         </w:rPr>
         <w:t xml:space="preserve">Document + follow-up video - brain needs time, then connection</w:t>
@@ -9645,13 +9685,14 @@
       </w:pPr>
       <w:r>
         <w:rPr>
-          <w:b/>
+          <w:b w:val="0"/>
           <w:sz w:val="24"/>
         </w:rPr>
         <w:t xml:space="preserve">Best medium: </w:t>
       </w:r>
       <w:r>
         <w:rPr>
+          <w:b w:val="0"/>
           <w:sz w:val="24"/>
         </w:rPr>
         <w:t xml:space="preserve">Video 1:1 - high emotional stakes require real-time calibration</w:t>
@@ -9682,13 +9723,14 @@
       </w:pPr>
       <w:r>
         <w:rPr>
-          <w:b/>
+          <w:b w:val="0"/>
           <w:sz w:val="24"/>
         </w:rPr>
         <w:t xml:space="preserve">Best medium: </w:t>
       </w:r>
       <w:r>
         <w:rPr>
+          <w:b w:val="0"/>
           <w:sz w:val="24"/>
         </w:rPr>
         <w:t xml:space="preserve">Team meeting (cameras optional) - model, don't mandate</w:t>
@@ -9719,13 +9761,14 @@
       </w:pPr>
       <w:r>
         <w:rPr>
-          <w:b/>
+          <w:b w:val="0"/>
           <w:sz w:val="24"/>
         </w:rPr>
         <w:t xml:space="preserve">Best medium: </w:t>
       </w:r>
       <w:r>
         <w:rPr>
+          <w:b w:val="0"/>
           <w:sz w:val="24"/>
         </w:rPr>
         <w:t xml:space="preserve">Public async (team channel) - amplifies status reward</w:t>
@@ -10114,13 +10157,14 @@
       </w:pPr>
       <w:r>
         <w:rPr>
-          <w:b/>
+          <w:b w:val="0"/>
           <w:sz w:val="24"/>
         </w:rPr>
         <w:t xml:space="preserve">First 24h: </w:t>
       </w:r>
       <w:r>
         <w:rPr>
+          <w:b w:val="0"/>
           <w:sz w:val="24"/>
         </w:rPr>
         <w:t xml:space="preserve">Email summary of discussion and agreed plan</w:t>
@@ -10133,13 +10177,14 @@
       </w:pPr>
       <w:r>
         <w:rPr>
-          <w:b/>
+          <w:b w:val="0"/>
           <w:sz w:val="24"/>
         </w:rPr>
         <w:t xml:space="preserve">Ongoing: </w:t>
       </w:r>
       <w:r>
         <w:rPr>
+          <w:b w:val="0"/>
           <w:sz w:val="24"/>
         </w:rPr>
         <w:t xml:space="preserve">Weekly 15-min check-ins for 30 days</w:t>
@@ -10152,13 +10197,14 @@
       </w:pPr>
       <w:r>
         <w:rPr>
-          <w:b/>
+          <w:b w:val="0"/>
           <w:sz w:val="24"/>
         </w:rPr>
         <w:t xml:space="preserve">Review: </w:t>
       </w:r>
       <w:r>
         <w:rPr>
+          <w:b w:val="0"/>
           <w:sz w:val="24"/>
         </w:rPr>
         <w:t xml:space="preserve">30-day formal review - celebrate or escalate</w:t>
@@ -10189,13 +10235,14 @@
       </w:pPr>
       <w:r>
         <w:rPr>
-          <w:b/>
+          <w:b w:val="0"/>
           <w:sz w:val="24"/>
         </w:rPr>
         <w:t xml:space="preserve">First 24h: </w:t>
       </w:r>
       <w:r>
         <w:rPr>
+          <w:b w:val="0"/>
           <w:sz w:val="24"/>
         </w:rPr>
         <w:t xml:space="preserve">Informal check-in next morning</w:t>
@@ -10208,13 +10255,14 @@
       </w:pPr>
       <w:r>
         <w:rPr>
-          <w:b/>
+          <w:b w:val="0"/>
           <w:sz w:val="24"/>
         </w:rPr>
         <w:t xml:space="preserve">Ongoing: </w:t>
       </w:r>
       <w:r>
         <w:rPr>
+          <w:b w:val="0"/>
           <w:sz w:val="24"/>
         </w:rPr>
         <w:t xml:space="preserve">Before next similar event, offer prep support</w:t>
@@ -10227,13 +10275,14 @@
       </w:pPr>
       <w:r>
         <w:rPr>
-          <w:b/>
+          <w:b w:val="0"/>
           <w:sz w:val="24"/>
         </w:rPr>
         <w:t xml:space="preserve">Review: </w:t>
       </w:r>
       <w:r>
         <w:rPr>
+          <w:b w:val="0"/>
           <w:sz w:val="24"/>
         </w:rPr>
         <w:t xml:space="preserve">After next event, acknowledge improvement</w:t>
@@ -10264,13 +10313,14 @@
       </w:pPr>
       <w:r>
         <w:rPr>
-          <w:b/>
+          <w:b w:val="0"/>
           <w:sz w:val="24"/>
         </w:rPr>
         <w:t xml:space="preserve">First week: </w:t>
       </w:r>
       <w:r>
         <w:rPr>
+          <w:b w:val="0"/>
           <w:sz w:val="24"/>
         </w:rPr>
         <w:t xml:space="preserve">Accommodation plan if applicable</w:t>
@@ -10283,13 +10333,14 @@
       </w:pPr>
       <w:r>
         <w:rPr>
-          <w:b/>
+          <w:b w:val="0"/>
           <w:sz w:val="24"/>
         </w:rPr>
         <w:t xml:space="preserve">Week 2: </w:t>
       </w:r>
       <w:r>
         <w:rPr>
+          <w:b w:val="0"/>
           <w:sz w:val="24"/>
         </w:rPr>
         <w:t xml:space="preserve">Check-in: "How's the new schedule?"</w:t>
@@ -10302,13 +10353,14 @@
       </w:pPr>
       <w:r>
         <w:rPr>
-          <w:b/>
+          <w:b w:val="0"/>
           <w:sz w:val="24"/>
         </w:rPr>
         <w:t xml:space="preserve">Week 4: </w:t>
       </w:r>
       <w:r>
         <w:rPr>
+          <w:b w:val="0"/>
           <w:sz w:val="24"/>
         </w:rPr>
         <w:t xml:space="preserve">Formal review - continue support or PIP</w:t>
@@ -10339,13 +10391,14 @@
       </w:pPr>
       <w:r>
         <w:rPr>
-          <w:b/>
+          <w:b w:val="0"/>
           <w:sz w:val="24"/>
         </w:rPr>
         <w:t xml:space="preserve">Same day: </w:t>
       </w:r>
       <w:r>
         <w:rPr>
+          <w:b w:val="0"/>
           <w:sz w:val="24"/>
         </w:rPr>
         <w:t xml:space="preserve">Send EAP information</w:t>
@@ -10358,13 +10411,14 @@
       </w:pPr>
       <w:r>
         <w:rPr>
-          <w:b/>
+          <w:b w:val="0"/>
           <w:sz w:val="24"/>
         </w:rPr>
         <w:t xml:space="preserve">Week 1: </w:t>
       </w:r>
       <w:r>
         <w:rPr>
+          <w:b w:val="0"/>
           <w:sz w:val="24"/>
         </w:rPr>
         <w:t xml:space="preserve">Light check-in: "How are you doing?"</w:t>
@@ -10377,13 +10431,14 @@
       </w:pPr>
       <w:r>
         <w:rPr>
-          <w:b/>
+          <w:b w:val="0"/>
           <w:sz w:val="24"/>
         </w:rPr>
         <w:t xml:space="preserve">Ongoing: </w:t>
       </w:r>
       <w:r>
         <w:rPr>
+          <w:b w:val="0"/>
           <w:sz w:val="24"/>
         </w:rPr>
         <w:t xml:space="preserve">Watch for improvement or deterioration</w:t>
@@ -10414,13 +10469,14 @@
       </w:pPr>
       <w:r>
         <w:rPr>
-          <w:b/>
+          <w:b w:val="0"/>
           <w:sz w:val="24"/>
         </w:rPr>
         <w:t xml:space="preserve">Same day: </w:t>
       </w:r>
       <w:r>
         <w:rPr>
+          <w:b w:val="0"/>
           <w:sz w:val="24"/>
         </w:rPr>
         <w:t xml:space="preserve">Brief team promptly; provide logistics in writing</w:t>
@@ -10433,13 +10489,14 @@
       </w:pPr>
       <w:r>
         <w:rPr>
-          <w:b/>
+          <w:b w:val="0"/>
           <w:sz w:val="24"/>
         </w:rPr>
         <w:t xml:space="preserve">Week 1-2: </w:t>
       </w:r>
       <w:r>
         <w:rPr>
+          <w:b w:val="0"/>
           <w:sz w:val="24"/>
         </w:rPr>
         <w:t xml:space="preserve">Monitor remaining team for survivor anxiety</w:t>
@@ -10452,13 +10509,14 @@
       </w:pPr>
       <w:r>
         <w:rPr>
-          <w:b/>
+          <w:b w:val="0"/>
           <w:sz w:val="24"/>
         </w:rPr>
         <w:t xml:space="preserve">Ongoing: </w:t>
       </w:r>
       <w:r>
         <w:rPr>
+          <w:b w:val="0"/>
           <w:sz w:val="24"/>
         </w:rPr>
         <w:t xml:space="preserve">1:1s with team members who need to process</w:t>
@@ -11447,13 +11505,14 @@
       </w:pPr>
       <w:r>
         <w:rPr>
-          <w:b/>
+          <w:b w:val="0"/>
           <w:sz w:val="24"/>
         </w:rPr>
         <w:t xml:space="preserve">Threatened when: </w:t>
       </w:r>
       <w:r>
         <w:rPr>
+          <w:b w:val="0"/>
           <w:sz w:val="24"/>
         </w:rPr>
         <w:t xml:space="preserve">Criticized, compared to others</w:t>
@@ -11466,13 +11525,14 @@
       </w:pPr>
       <w:r>
         <w:rPr>
+          <w:b w:val="0"/>
+          <w:sz w:val="24"/>
+        </w:rPr>
+        <w:t xml:space="preserve">Protect it by: </w:t>
+      </w:r>
+      <w:r>
+        <w:rPr>
           <w:b/>
-          <w:sz w:val="24"/>
-        </w:rPr>
-        <w:t xml:space="preserve">Protect it by: </w:t>
-      </w:r>
-      <w:r>
-        <w:rPr>
           <w:sz w:val="24"/>
         </w:rPr>
         <w:t xml:space="preserve">Focus on behavior, not character; acknowledge strengths</w:t>
@@ -11503,13 +11563,14 @@
       </w:pPr>
       <w:r>
         <w:rPr>
-          <w:b/>
+          <w:b w:val="0"/>
           <w:sz w:val="24"/>
         </w:rPr>
         <w:t xml:space="preserve">Threatened when: </w:t>
       </w:r>
       <w:r>
         <w:rPr>
+          <w:b w:val="0"/>
           <w:sz w:val="24"/>
         </w:rPr>
         <w:t xml:space="preserve">Outcome is unclear or surprising</w:t>
@@ -11522,13 +11583,14 @@
       </w:pPr>
       <w:r>
         <w:rPr>
+          <w:b w:val="0"/>
+          <w:sz w:val="24"/>
+        </w:rPr>
+        <w:t xml:space="preserve">Protect it by: </w:t>
+      </w:r>
+      <w:r>
+        <w:rPr>
           <w:b/>
-          <w:sz w:val="24"/>
-        </w:rPr>
-        <w:t xml:space="preserve">Protect it by: </w:t>
-      </w:r>
-      <w:r>
-        <w:rPr>
           <w:sz w:val="24"/>
         </w:rPr>
         <w:t xml:space="preserve">Preview the conversation topic; be specific about next steps</w:t>
@@ -11559,13 +11621,14 @@
       </w:pPr>
       <w:r>
         <w:rPr>
-          <w:b/>
+          <w:b w:val="0"/>
           <w:sz w:val="24"/>
         </w:rPr>
         <w:t xml:space="preserve">Threatened when: </w:t>
       </w:r>
       <w:r>
         <w:rPr>
+          <w:b w:val="0"/>
           <w:sz w:val="24"/>
         </w:rPr>
         <w:t xml:space="preserve">Told what to do without input</w:t>
@@ -11578,13 +11641,14 @@
       </w:pPr>
       <w:r>
         <w:rPr>
+          <w:b w:val="0"/>
+          <w:sz w:val="24"/>
+        </w:rPr>
+        <w:t xml:space="preserve">Protect it by: </w:t>
+      </w:r>
+      <w:r>
+        <w:rPr>
           <w:b/>
-          <w:sz w:val="24"/>
-        </w:rPr>
-        <w:t xml:space="preserve">Protect it by: </w:t>
-      </w:r>
-      <w:r>
-        <w:rPr>
           <w:sz w:val="24"/>
         </w:rPr>
         <w:t xml:space="preserve">Ask for their ideas; co-create the plan</w:t>
@@ -11615,13 +11679,14 @@
       </w:pPr>
       <w:r>
         <w:rPr>
-          <w:b/>
+          <w:b w:val="0"/>
           <w:sz w:val="24"/>
         </w:rPr>
         <w:t xml:space="preserve">Threatened when: </w:t>
       </w:r>
       <w:r>
         <w:rPr>
+          <w:b w:val="0"/>
           <w:sz w:val="24"/>
         </w:rPr>
         <w:t xml:space="preserve">Feeling isolated or adversarial</w:t>
@@ -11634,13 +11699,14 @@
       </w:pPr>
       <w:r>
         <w:rPr>
+          <w:b w:val="0"/>
+          <w:sz w:val="24"/>
+        </w:rPr>
+        <w:t xml:space="preserve">Protect it by: </w:t>
+      </w:r>
+      <w:r>
+        <w:rPr>
           <w:b/>
-          <w:sz w:val="24"/>
-        </w:rPr>
-        <w:t xml:space="preserve">Protect it by: </w:t>
-      </w:r>
-      <w:r>
-        <w:rPr>
           <w:sz w:val="24"/>
         </w:rPr>
         <w:t xml:space="preserve">Show genuine care; use "we" language</w:t>
@@ -11671,13 +11737,14 @@
       </w:pPr>
       <w:r>
         <w:rPr>
-          <w:b/>
+          <w:b w:val="0"/>
           <w:sz w:val="24"/>
         </w:rPr>
         <w:t xml:space="preserve">Threatened when: </w:t>
       </w:r>
       <w:r>
         <w:rPr>
+          <w:b w:val="0"/>
           <w:sz w:val="24"/>
         </w:rPr>
         <w:t xml:space="preserve">Perceiving unequal treatment</w:t>
@@ -11690,13 +11757,14 @@
       </w:pPr>
       <w:r>
         <w:rPr>
+          <w:b w:val="0"/>
+          <w:sz w:val="24"/>
+        </w:rPr>
+        <w:t xml:space="preserve">Protect it by: </w:t>
+      </w:r>
+      <w:r>
+        <w:rPr>
           <w:b/>
-          <w:sz w:val="24"/>
-        </w:rPr>
-        <w:t xml:space="preserve">Protect it by: </w:t>
-      </w:r>
-      <w:r>
-        <w:rPr>
           <w:sz w:val="24"/>
         </w:rPr>
         <w:t xml:space="preserve">Be transparent about reasoning; apply standards consistently</w:t>
@@ -11751,13 +11819,14 @@
       </w:pPr>
       <w:r>
         <w:rPr>
-          <w:b/>
+          <w:b w:val="0"/>
           <w:sz w:val="24"/>
         </w:rPr>
         <w:t xml:space="preserve">What you see: </w:t>
       </w:r>
       <w:r>
         <w:rPr>
+          <w:b w:val="0"/>
           <w:sz w:val="24"/>
         </w:rPr>
         <w:t xml:space="preserve">Eye contact, expressive face, responsive, asking questions</w:t>
@@ -11770,13 +11839,14 @@
       </w:pPr>
       <w:r>
         <w:rPr>
-          <w:b/>
+          <w:b w:val="0"/>
           <w:sz w:val="24"/>
         </w:rPr>
         <w:t xml:space="preserve">What's happening: </w:t>
       </w:r>
       <w:r>
         <w:rPr>
+          <w:b w:val="0"/>
           <w:sz w:val="24"/>
         </w:rPr>
         <w:t xml:space="preserve">Social engagement system active; they can hear you</w:t>
@@ -11789,13 +11859,14 @@
       </w:pPr>
       <w:r>
         <w:rPr>
+          <w:b w:val="0"/>
+          <w:sz w:val="24"/>
+        </w:rPr>
+        <w:t xml:space="preserve">Your move: </w:t>
+      </w:r>
+      <w:r>
+        <w:rPr>
           <w:b/>
-          <w:sz w:val="24"/>
-        </w:rPr>
-        <w:t xml:space="preserve">Your move: </w:t>
-      </w:r>
-      <w:r>
-        <w:rPr>
           <w:sz w:val="24"/>
         </w:rPr>
         <w:t xml:space="preserve">Continue - this is the productive zone</w:t>
@@ -11826,13 +11897,14 @@
       </w:pPr>
       <w:r>
         <w:rPr>
-          <w:b/>
+          <w:b w:val="0"/>
           <w:sz w:val="24"/>
         </w:rPr>
         <w:t xml:space="preserve">What you see: </w:t>
       </w:r>
       <w:r>
         <w:rPr>
+          <w:b w:val="0"/>
           <w:sz w:val="24"/>
         </w:rPr>
         <w:t xml:space="preserve">Defensive, arguing, fidgeting, raised voice, wanting to leave</w:t>
@@ -11845,13 +11917,14 @@
       </w:pPr>
       <w:r>
         <w:rPr>
-          <w:b/>
+          <w:b w:val="0"/>
           <w:sz w:val="24"/>
         </w:rPr>
         <w:t xml:space="preserve">What's happening: </w:t>
       </w:r>
       <w:r>
         <w:rPr>
+          <w:b w:val="0"/>
           <w:sz w:val="24"/>
         </w:rPr>
         <w:t xml:space="preserve">Threat detected; stress hormones flooding</w:t>
@@ -11864,13 +11937,14 @@
       </w:pPr>
       <w:r>
         <w:rPr>
+          <w:b w:val="0"/>
+          <w:sz w:val="24"/>
+        </w:rPr>
+        <w:t xml:space="preserve">Your move: </w:t>
+      </w:r>
+      <w:r>
+        <w:rPr>
           <w:b/>
-          <w:sz w:val="24"/>
-        </w:rPr>
-        <w:t xml:space="preserve">Your move: </w:t>
-      </w:r>
-      <w:r>
-        <w:rPr>
           <w:sz w:val="24"/>
         </w:rPr>
         <w:t xml:space="preserve">Slow down. Empathize. "I can see this is hitting hard."</w:t>
@@ -11901,13 +11975,14 @@
       </w:pPr>
       <w:r>
         <w:rPr>
-          <w:b/>
+          <w:b w:val="0"/>
           <w:sz w:val="24"/>
         </w:rPr>
         <w:t xml:space="preserve">What you see: </w:t>
       </w:r>
       <w:r>
         <w:rPr>
+          <w:b w:val="0"/>
           <w:sz w:val="24"/>
         </w:rPr>
         <w:t xml:space="preserve">Blank stare, flat voice, nodding to everything, going quiet</w:t>
@@ -11920,13 +11995,14 @@
       </w:pPr>
       <w:r>
         <w:rPr>
-          <w:b/>
+          <w:b w:val="0"/>
           <w:sz w:val="24"/>
         </w:rPr>
         <w:t xml:space="preserve">What's happening: </w:t>
       </w:r>
       <w:r>
         <w:rPr>
+          <w:b w:val="0"/>
           <w:sz w:val="24"/>
         </w:rPr>
         <w:t xml:space="preserve">Freeze/collapse; they've disconnected</w:t>
@@ -11939,13 +12015,14 @@
       </w:pPr>
       <w:r>
         <w:rPr>
+          <w:b w:val="0"/>
+          <w:sz w:val="24"/>
+        </w:rPr>
+        <w:t xml:space="preserve">Your move: </w:t>
+      </w:r>
+      <w:r>
+        <w:rPr>
           <w:b/>
-          <w:sz w:val="24"/>
-        </w:rPr>
-        <w:t xml:space="preserve">Your move: </w:t>
-      </w:r>
-      <w:r>
-        <w:rPr>
           <w:sz w:val="24"/>
         </w:rPr>
         <w:t xml:space="preserve">Pause the conversation. "Let's take a break."</w:t>
@@ -12294,13 +12371,14 @@
       </w:pPr>
       <w:r>
         <w:rPr>
+          <w:b w:val="0"/>
+          <w:sz w:val="24"/>
+        </w:rPr>
+        <w:t xml:space="preserve">Say instead: </w:t>
+      </w:r>
+      <w:r>
+        <w:rPr>
           <w:b/>
-          <w:sz w:val="24"/>
-        </w:rPr>
-        <w:t xml:space="preserve">Say instead: </w:t>
-      </w:r>
-      <w:r>
-        <w:rPr>
           <w:sz w:val="24"/>
         </w:rPr>
         <w:t xml:space="preserve">"I want to discuss [topic] - nothing urgent"</w:t>
@@ -12331,13 +12409,14 @@
       </w:pPr>
       <w:r>
         <w:rPr>
+          <w:b w:val="0"/>
+          <w:sz w:val="24"/>
+        </w:rPr>
+        <w:t xml:space="preserve">Say instead: </w:t>
+      </w:r>
+      <w:r>
+        <w:rPr>
           <w:b/>
-          <w:sz w:val="24"/>
-        </w:rPr>
-        <w:t xml:space="preserve">Say instead: </w:t>
-      </w:r>
-      <w:r>
-        <w:rPr>
           <w:sz w:val="24"/>
         </w:rPr>
         <w:t xml:space="preserve">"I've noticed [specific behavior] in [timeframe]"</w:t>
@@ -12368,13 +12447,14 @@
       </w:pPr>
       <w:r>
         <w:rPr>
+          <w:b w:val="0"/>
+          <w:sz w:val="24"/>
+        </w:rPr>
+        <w:t xml:space="preserve">Say instead: </w:t>
+      </w:r>
+      <w:r>
+        <w:rPr>
           <w:b/>
-          <w:sz w:val="24"/>
-        </w:rPr>
-        <w:t xml:space="preserve">Say instead: </w:t>
-      </w:r>
-      <w:r>
-        <w:rPr>
           <w:sz w:val="24"/>
         </w:rPr>
         <w:t xml:space="preserve">"This is about the work, and I want to help"</w:t>
@@ -12405,13 +12485,14 @@
       </w:pPr>
       <w:r>
         <w:rPr>
+          <w:b w:val="0"/>
+          <w:sz w:val="24"/>
+        </w:rPr>
+        <w:t xml:space="preserve">Say instead: </w:t>
+      </w:r>
+      <w:r>
+        <w:rPr>
           <w:b/>
-          <w:sz w:val="24"/>
-        </w:rPr>
-        <w:t xml:space="preserve">Say instead: </w:t>
-      </w:r>
-      <w:r>
-        <w:rPr>
           <w:sz w:val="24"/>
         </w:rPr>
         <w:t xml:space="preserve">"The outcome wasn't what we needed"</w:t>
@@ -12442,13 +12523,14 @@
       </w:pPr>
       <w:r>
         <w:rPr>
+          <w:b w:val="0"/>
+          <w:sz w:val="24"/>
+        </w:rPr>
+        <w:t xml:space="preserve">Say instead: </w:t>
+      </w:r>
+      <w:r>
+        <w:rPr>
           <w:b/>
-          <w:sz w:val="24"/>
-        </w:rPr>
-        <w:t xml:space="preserve">Say instead: </w:t>
-      </w:r>
-      <w:r>
-        <w:rPr>
           <w:sz w:val="24"/>
         </w:rPr>
         <w:t xml:space="preserve">"The standard for this role is..."</w:t>
@@ -12479,13 +12561,14 @@
       </w:pPr>
       <w:r>
         <w:rPr>
+          <w:b w:val="0"/>
+          <w:sz w:val="24"/>
+        </w:rPr>
+        <w:t xml:space="preserve">Say instead: </w:t>
+      </w:r>
+      <w:r>
+        <w:rPr>
           <w:b/>
-          <w:sz w:val="24"/>
-        </w:rPr>
-        <w:t xml:space="preserve">Say instead: </w:t>
-      </w:r>
-      <w:r>
-        <w:rPr>
           <w:sz w:val="24"/>
         </w:rPr>
         <w:t xml:space="preserve">"I want to flag something while it's small"</w:t>
@@ -12717,13 +12800,14 @@
       </w:pPr>
       <w:r>
         <w:rPr>
+          <w:b w:val="0"/>
+          <w:sz w:val="24"/>
+        </w:rPr>
+        <w:t xml:space="preserve">Use: </w:t>
+      </w:r>
+      <w:r>
+        <w:rPr>
           <w:b/>
-          <w:sz w:val="24"/>
-        </w:rPr>
-        <w:t xml:space="preserve">Use: </w:t>
-      </w:r>
-      <w:r>
-        <w:rPr>
           <w:sz w:val="24"/>
         </w:rPr>
         <w:t xml:space="preserve">Performance Improvement (Ch. 3) - 30-day plan + weekly check-ins</w:t>
@@ -12754,13 +12838,14 @@
       </w:pPr>
       <w:r>
         <w:rPr>
+          <w:b w:val="0"/>
+          <w:sz w:val="24"/>
+        </w:rPr>
+        <w:t xml:space="preserve">Use: </w:t>
+      </w:r>
+      <w:r>
+        <w:rPr>
           <w:b/>
-          <w:sz w:val="24"/>
-        </w:rPr>
-        <w:t xml:space="preserve">Use: </w:t>
-      </w:r>
-      <w:r>
-        <w:rPr>
           <w:sz w:val="24"/>
         </w:rPr>
         <w:t xml:space="preserve">Negative Feedback (Ch. 4) - specific behavior + reappraisal</w:t>
@@ -12791,13 +12876,14 @@
       </w:pPr>
       <w:r>
         <w:rPr>
+          <w:b w:val="0"/>
+          <w:sz w:val="24"/>
+        </w:rPr>
+        <w:t xml:space="preserve">Use: </w:t>
+      </w:r>
+      <w:r>
+        <w:rPr>
           <w:b/>
-          <w:sz w:val="24"/>
-        </w:rPr>
-        <w:t xml:space="preserve">Use: </w:t>
-      </w:r>
-      <w:r>
-        <w:rPr>
           <w:sz w:val="24"/>
         </w:rPr>
         <w:t xml:space="preserve">Attendance &amp; Behavior (Ch. 5) - curiosity before correction</w:t>
@@ -12828,13 +12914,14 @@
       </w:pPr>
       <w:r>
         <w:rPr>
+          <w:b w:val="0"/>
+          <w:sz w:val="24"/>
+        </w:rPr>
+        <w:t xml:space="preserve">Use: </w:t>
+      </w:r>
+      <w:r>
+        <w:rPr>
           <w:b/>
-          <w:sz w:val="24"/>
-        </w:rPr>
-        <w:t xml:space="preserve">Use: </w:t>
-      </w:r>
-      <w:r>
-        <w:rPr>
           <w:sz w:val="24"/>
         </w:rPr>
         <w:t xml:space="preserve">Salary &amp; Promotion (Ch. 6) - "not yet" + development roadmap</w:t>
@@ -12865,13 +12952,14 @@
       </w:pPr>
       <w:r>
         <w:rPr>
+          <w:b w:val="0"/>
+          <w:sz w:val="24"/>
+        </w:rPr>
+        <w:t xml:space="preserve">Use: </w:t>
+      </w:r>
+      <w:r>
+        <w:rPr>
           <w:b/>
-          <w:sz w:val="24"/>
-        </w:rPr>
-        <w:t xml:space="preserve">Use: </w:t>
-      </w:r>
-      <w:r>
-        <w:rPr>
           <w:sz w:val="24"/>
         </w:rPr>
         <w:t xml:space="preserve">Letting Someone Go (Ch. 7) - direct in 30 seconds + dignity</w:t>
@@ -12902,13 +12990,14 @@
       </w:pPr>
       <w:r>
         <w:rPr>
+          <w:b w:val="0"/>
+          <w:sz w:val="24"/>
+        </w:rPr>
+        <w:t xml:space="preserve">Use: </w:t>
+      </w:r>
+      <w:r>
+        <w:rPr>
           <w:b/>
-          <w:sz w:val="24"/>
-        </w:rPr>
-        <w:t xml:space="preserve">Use: </w:t>
-      </w:r>
-      <w:r>
-        <w:rPr>
           <w:sz w:val="24"/>
         </w:rPr>
         <w:t xml:space="preserve">Team Conflict (Ch. 8) - individual pre-talks + mediated session</w:t>
@@ -12939,13 +13028,14 @@
       </w:pPr>
       <w:r>
         <w:rPr>
+          <w:b w:val="0"/>
+          <w:sz w:val="24"/>
+        </w:rPr>
+        <w:t xml:space="preserve">Use: </w:t>
+      </w:r>
+      <w:r>
+        <w:rPr>
           <w:b/>
-          <w:sz w:val="24"/>
-        </w:rPr>
-        <w:t xml:space="preserve">Use: </w:t>
-      </w:r>
-      <w:r>
-        <w:rPr>
           <w:sz w:val="24"/>
         </w:rPr>
         <w:t xml:space="preserve">Burnout Check-in (Ch. 9) - "How are you really doing?"</w:t>
@@ -12976,13 +13066,14 @@
       </w:pPr>
       <w:r>
         <w:rPr>
+          <w:b w:val="0"/>
+          <w:sz w:val="24"/>
+        </w:rPr>
+        <w:t xml:space="preserve">Use: </w:t>
+      </w:r>
+      <w:r>
+        <w:rPr>
           <w:b/>
-          <w:sz w:val="24"/>
-        </w:rPr>
-        <w:t xml:space="preserve">Use: </w:t>
-      </w:r>
-      <w:r>
-        <w:rPr>
           <w:sz w:val="24"/>
         </w:rPr>
         <w:t xml:space="preserve">Remote &amp; Hybrid Scripts (Ch. 10) - choose: async / video / written</w:t>

</xml_diff>

<commit_message>
Polyvagal: observation first (What you see as header), then State name
</commit_message>
<xml_diff>
--- a/kdp-files/difficult_conversations_ebook.docx
+++ b/kdp-files/difficult_conversations_ebook.docx
@@ -11809,7 +11809,7 @@
           <w:sz w:val="24"/>
           <w:b/>
         </w:rPr>
-        <w:t xml:space="preserve">VENTRAL VAGAL (engaged)</w:t>
+        <w:t>Eye contact, expressive face, responsive, asking questions</w:t>
       </w:r>
     </w:p>
     <w:p>
@@ -11822,14 +11822,14 @@
           <w:b w:val="0"/>
           <w:sz w:val="24"/>
         </w:rPr>
-        <w:t xml:space="preserve">What you see: </w:t>
-      </w:r>
-      <w:r>
-        <w:rPr>
-          <w:b w:val="0"/>
-          <w:sz w:val="24"/>
-        </w:rPr>
-        <w:t xml:space="preserve">Eye contact, expressive face, responsive, asking questions</w:t>
+        <w:t xml:space="preserve">State: </w:t>
+      </w:r>
+      <w:r>
+        <w:rPr>
+          <w:b w:val="0"/>
+          <w:sz w:val="24"/>
+        </w:rPr>
+        <w:t>Ventral Vagal (engaged)</w:t>
       </w:r>
     </w:p>
     <w:p>
@@ -11887,7 +11887,7 @@
           <w:sz w:val="24"/>
           <w:b/>
         </w:rPr>
-        <w:t xml:space="preserve">SYMPATHETIC (fight/flight)</w:t>
+        <w:t>Defensive, arguing, fidgeting, raised voice, wanting to leave</w:t>
       </w:r>
     </w:p>
     <w:p>
@@ -11900,14 +11900,14 @@
           <w:b w:val="0"/>
           <w:sz w:val="24"/>
         </w:rPr>
-        <w:t xml:space="preserve">What you see: </w:t>
-      </w:r>
-      <w:r>
-        <w:rPr>
-          <w:b w:val="0"/>
-          <w:sz w:val="24"/>
-        </w:rPr>
-        <w:t xml:space="preserve">Defensive, arguing, fidgeting, raised voice, wanting to leave</w:t>
+        <w:t xml:space="preserve">State: </w:t>
+      </w:r>
+      <w:r>
+        <w:rPr>
+          <w:b w:val="0"/>
+          <w:sz w:val="24"/>
+        </w:rPr>
+        <w:t>Sympathetic (fight/flight)</w:t>
       </w:r>
     </w:p>
     <w:p>
@@ -11965,7 +11965,7 @@
           <w:sz w:val="24"/>
           <w:b/>
         </w:rPr>
-        <w:t xml:space="preserve">DORSAL VAGAL (shutdown)</w:t>
+        <w:t>Blank stare, flat voice, nodding to everything, going quiet</w:t>
       </w:r>
     </w:p>
     <w:p>
@@ -11978,14 +11978,14 @@
           <w:b w:val="0"/>
           <w:sz w:val="24"/>
         </w:rPr>
-        <w:t xml:space="preserve">What you see: </w:t>
-      </w:r>
-      <w:r>
-        <w:rPr>
-          <w:b w:val="0"/>
-          <w:sz w:val="24"/>
-        </w:rPr>
-        <w:t xml:space="preserve">Blank stare, flat voice, nodding to everything, going quiet</w:t>
+        <w:t xml:space="preserve">State: </w:t>
+      </w:r>
+      <w:r>
+        <w:rPr>
+          <w:b w:val="0"/>
+          <w:sz w:val="24"/>
+        </w:rPr>
+        <w:t>Dorsal Vagal (shutdown)</w:t>
       </w:r>
     </w:p>
     <w:p>

</xml_diff>

<commit_message>
Fix Decision Guide: situations bold, Use lines normal
</commit_message>
<xml_diff>
--- a/kdp-files/difficult_conversations_ebook.docx
+++ b/kdp-files/difficult_conversations_ebook.docx
@@ -12807,7 +12807,7 @@
       </w:r>
       <w:r>
         <w:rPr>
-          <w:b/>
+          <w:b w:val="0"/>
           <w:sz w:val="24"/>
         </w:rPr>
         <w:t xml:space="preserve">Performance Improvement (Ch. 3) - 30-day plan + weekly check-ins</w:t>
@@ -12845,7 +12845,7 @@
       </w:r>
       <w:r>
         <w:rPr>
-          <w:b/>
+          <w:b w:val="0"/>
           <w:sz w:val="24"/>
         </w:rPr>
         <w:t xml:space="preserve">Negative Feedback (Ch. 4) - specific behavior + reappraisal</w:t>
@@ -12883,7 +12883,7 @@
       </w:r>
       <w:r>
         <w:rPr>
-          <w:b/>
+          <w:b w:val="0"/>
           <w:sz w:val="24"/>
         </w:rPr>
         <w:t xml:space="preserve">Attendance &amp; Behavior (Ch. 5) - curiosity before correction</w:t>
@@ -12921,7 +12921,7 @@
       </w:r>
       <w:r>
         <w:rPr>
-          <w:b/>
+          <w:b w:val="0"/>
           <w:sz w:val="24"/>
         </w:rPr>
         <w:t xml:space="preserve">Salary &amp; Promotion (Ch. 6) - "not yet" + development roadmap</w:t>
@@ -12959,7 +12959,7 @@
       </w:r>
       <w:r>
         <w:rPr>
-          <w:b/>
+          <w:b w:val="0"/>
           <w:sz w:val="24"/>
         </w:rPr>
         <w:t xml:space="preserve">Letting Someone Go (Ch. 7) - direct in 30 seconds + dignity</w:t>
@@ -12997,7 +12997,7 @@
       </w:r>
       <w:r>
         <w:rPr>
-          <w:b/>
+          <w:b w:val="0"/>
           <w:sz w:val="24"/>
         </w:rPr>
         <w:t xml:space="preserve">Team Conflict (Ch. 8) - individual pre-talks + mediated session</w:t>
@@ -13035,7 +13035,7 @@
       </w:r>
       <w:r>
         <w:rPr>
-          <w:b/>
+          <w:b w:val="0"/>
           <w:sz w:val="24"/>
         </w:rPr>
         <w:t xml:space="preserve">Burnout Check-in (Ch. 9) - "How are you really doing?"</w:t>
@@ -13073,7 +13073,7 @@
       </w:r>
       <w:r>
         <w:rPr>
-          <w:b/>
+          <w:b w:val="0"/>
           <w:sz w:val="24"/>
         </w:rPr>
         <w:t xml:space="preserve">Remote &amp; Hybrid Scripts (Ch. 10) - choose: async / video / written</w:t>

</xml_diff>

<commit_message>
eBook: replace cross marks with AVOID: text (Kindle-safe)
</commit_message>
<xml_diff>
--- a/kdp-files/difficult_conversations_ebook.docx
+++ b/kdp-files/difficult_conversations_ebook.docx
@@ -2860,7 +2860,7 @@
           <w:color w:val="333333"/>
           <w:sz w:val="24"/>
         </w:rPr>
-        <w:t>❌ "You've really been dropping the ball lately." → Character judgment, triggers shame.</w:t>
+        <w:t>AVOID: "You've really been dropping the ball lately." → Character judgment, triggers shame.</w:t>
       </w:r>
     </w:p>
     <w:p>
@@ -2875,7 +2875,7 @@
           <w:color w:val="333333"/>
           <w:sz w:val="24"/>
         </w:rPr>
-        <w:t>❌ "Everyone on the team has noticed." → Social threat, implies gossip.</w:t>
+        <w:t>AVOID: "Everyone on the team has noticed." → Social threat, implies gossip.</w:t>
       </w:r>
     </w:p>
     <w:p>
@@ -2890,7 +2890,7 @@
           <w:color w:val="333333"/>
           <w:sz w:val="24"/>
         </w:rPr>
-        <w:t>❌ "I don't know what's going on with you." → Sounds like you've given up.</w:t>
+        <w:t>AVOID: "I don't know what's going on with you." → Sounds like you've given up.</w:t>
       </w:r>
     </w:p>
     <w:p>
@@ -2905,7 +2905,7 @@
           <w:color w:val="333333"/>
           <w:sz w:val="24"/>
         </w:rPr>
-        <w:t>❌ "This is your last chance." → Unless it literally is a final warning with HR documentation. Empty threats destroy trust.</w:t>
+        <w:t>AVOID: "This is your last chance." → Unless it literally is a final warning with HR documentation. Empty threats destroy trust.</w:t>
       </w:r>
     </w:p>
     <w:p>
@@ -2920,7 +2920,7 @@
           <w:color w:val="333333"/>
           <w:sz w:val="24"/>
         </w:rPr>
-        <w:t>❌ "I'm not sure you're cut out for this role." → Nuclear-level status threat. Almost impossible to recover from.</w:t>
+        <w:t>AVOID: "I'm not sure you're cut out for this role." → Nuclear-level status threat. Almost impossible to recover from.</w:t>
       </w:r>
     </w:p>
     <w:p>
@@ -3314,7 +3314,7 @@
           <w:color w:val="333333"/>
           <w:sz w:val="24"/>
         </w:rPr>
-        <w:t>❌ "That presentation was a disaster." → Global, catastrophic language. Triggers shame spiral.</w:t>
+        <w:t>AVOID: "That presentation was a disaster." → Global, catastrophic language. Triggers shame spiral.</w:t>
       </w:r>
     </w:p>
     <w:p>
@@ -3329,7 +3329,7 @@
           <w:color w:val="333333"/>
           <w:sz w:val="24"/>
         </w:rPr>
-        <w:t>❌ "The client was really upset." → Amplifying third-party disapproval feels like social exile.</w:t>
+        <w:t>AVOID: "The client was really upset." → Amplifying third-party disapproval feels like social exile.</w:t>
       </w:r>
     </w:p>
     <w:p>
@@ -3344,7 +3344,7 @@
           <w:color w:val="333333"/>
           <w:sz w:val="24"/>
         </w:rPr>
-        <w:t>❌ "You should have been more prepared." → Hindsight judgment. They already know.</w:t>
+        <w:t>AVOID: "You should have been more prepared." → Hindsight judgment. They already know.</w:t>
       </w:r>
     </w:p>
     <w:p>
@@ -3359,7 +3359,7 @@
           <w:color w:val="333333"/>
           <w:sz w:val="24"/>
         </w:rPr>
-        <w:t>❌ "I'm disappointed in you." → "In you" makes it about identity, not behavior. Say "in the outcome" if you must.</w:t>
+        <w:t>AVOID: "I'm disappointed in you." → "In you" makes it about identity, not behavior. Say "in the outcome" if you must.</w:t>
       </w:r>
     </w:p>
     <w:p>
@@ -3374,7 +3374,7 @@
           <w:color w:val="333333"/>
           <w:sz w:val="24"/>
         </w:rPr>
-        <w:t>❌ Starting with a compliment sandwich ("Great energy, but...") → People see through it. It makes every future compliment suspect.</w:t>
+        <w:t>AVOID: Starting with a compliment sandwich ("Great energy, but...") → People see through it. It makes every future compliment suspect.</w:t>
       </w:r>
     </w:p>
     <w:p>
@@ -3877,7 +3877,7 @@
           <w:color w:val="333333"/>
           <w:sz w:val="24"/>
         </w:rPr>
-        <w:t>❌ "Are you even committed to this job?" → Questioning someone's commitment is a profound status and identity threat.</w:t>
+        <w:t>AVOID: "Are you even committed to this job?" → Questioning someone's commitment is a profound status and identity threat.</w:t>
       </w:r>
     </w:p>
     <w:p>
@@ -3892,7 +3892,7 @@
           <w:color w:val="333333"/>
           <w:sz w:val="24"/>
         </w:rPr>
-        <w:t>❌ "Other people have complained about you." → Anonymous criticism feels like betrayal. If there are complaints, own the feedback as the manager.</w:t>
+        <w:t>AVOID: "Other people have complained about you." → Anonymous criticism feels like betrayal. If there are complaints, own the feedback as the manager.</w:t>
       </w:r>
     </w:p>
     <w:p>
@@ -3907,7 +3907,7 @@
           <w:color w:val="333333"/>
           <w:sz w:val="24"/>
         </w:rPr>
-        <w:t>❌ "You need to be here at 9, period." → Starting with the demand before understanding the context makes you an adversary, not a partner.</w:t>
+        <w:t>AVOID: "You need to be here at 9, period." → Starting with the demand before understanding the context makes you an adversary, not a partner.</w:t>
       </w:r>
     </w:p>
     <w:p>
@@ -3922,7 +3922,7 @@
           <w:color w:val="333333"/>
           <w:sz w:val="24"/>
         </w:rPr>
-        <w:t>❌ "I've been keeping track." → Makes it sound like surveillance. Say "I've noticed" — it's softer and equally honest.</w:t>
+        <w:t>AVOID: "I've been keeping track." → Makes it sound like surveillance. Say "I've noticed" — it's softer and equally honest.</w:t>
       </w:r>
     </w:p>
     <w:p>
@@ -3937,7 +3937,7 @@
           <w:color w:val="333333"/>
           <w:sz w:val="24"/>
         </w:rPr>
-        <w:t>❌ "This is really unfair to the rest of the team." → Guilt-based manipulation. State the impact neutrally.</w:t>
+        <w:t>AVOID: "This is really unfair to the rest of the team." → Guilt-based manipulation. State the impact neutrally.</w:t>
       </w:r>
     </w:p>
     <w:p>
@@ -4396,7 +4396,7 @@
           <w:color w:val="333333"/>
           <w:sz w:val="24"/>
         </w:rPr>
-        <w:t>❌ "It's not in the budget." (Full stop, with no further context.) → Feels like a wall, not an explanation.</w:t>
+        <w:t>AVOID: "It's not in the budget." (Full stop, with no further context.) → Feels like a wall, not an explanation.</w:t>
       </w:r>
     </w:p>
     <w:p>
@@ -4411,7 +4411,7 @@
           <w:color w:val="333333"/>
           <w:sz w:val="24"/>
         </w:rPr>
-        <w:t>❌ "Maybe next year." → Vague. Creates uncertainty, which the brain processes as threat.</w:t>
+        <w:t>AVOID: "Maybe next year." → Vague. Creates uncertainty, which the brain processes as threat.</w:t>
       </w:r>
     </w:p>
     <w:p>
@@ -4426,7 +4426,7 @@
           <w:color w:val="333333"/>
           <w:sz w:val="24"/>
         </w:rPr>
-        <w:t>❌ "You're doing great, it's just timing." → If they're "doing great," why no promotion? This creates cognitive dissonance.</w:t>
+        <w:t>AVOID: "You're doing great, it's just timing." → If they're "doing great," why no promotion? This creates cognitive dissonance.</w:t>
       </w:r>
     </w:p>
     <w:p>
@@ -4441,7 +4441,7 @@
           <w:color w:val="333333"/>
           <w:sz w:val="24"/>
         </w:rPr>
-        <w:t>❌ "Lots of people don't get promoted this cycle." → Minimizing. They don't care about lots of people right now.</w:t>
+        <w:t>AVOID: "Lots of people don't get promoted this cycle." → Minimizing. They don't care about lots of people right now.</w:t>
       </w:r>
     </w:p>
     <w:p>
@@ -4456,7 +4456,7 @@
           <w:color w:val="333333"/>
           <w:sz w:val="24"/>
         </w:rPr>
-        <w:t>❌ "You should be grateful for what you have." → Patronizing and tone-deaf. Shuts down the conversation immediately.</w:t>
+        <w:t>AVOID: "You should be grateful for what you have." → Patronizing and tone-deaf. Shuts down the conversation immediately.</w:t>
       </w:r>
     </w:p>
     <w:p>
@@ -4471,7 +4471,7 @@
           <w:color w:val="333333"/>
           <w:sz w:val="24"/>
         </w:rPr>
-        <w:t>❌ "I fought for you but leadership said no." → Throwing leadership under the bus undermines the organization and your own authority.</w:t>
+        <w:t>AVOID: "I fought for you but leadership said no." → Throwing leadership under the bus undermines the organization and your own authority.</w:t>
       </w:r>
     </w:p>
     <w:p>
@@ -4995,7 +4995,7 @@
           <w:color w:val="333333"/>
           <w:sz w:val="24"/>
         </w:rPr>
-        <w:t>❌ "This is really hard for me too." → It's exponentially harder for them. Don't center your discomfort.</w:t>
+        <w:t>AVOID: "This is really hard for me too." → It's exponentially harder for them. Don't center your discomfort.</w:t>
       </w:r>
     </w:p>
     <w:p>
@@ -5010,7 +5010,7 @@
           <w:color w:val="333333"/>
           <w:sz w:val="24"/>
         </w:rPr>
-        <w:t>❌ "We're going in a different direction." → Corporate jargon that dehumanizes the moment. Be real.</w:t>
+        <w:t>AVOID: "We're going in a different direction." → Corporate jargon that dehumanizes the moment. Be real.</w:t>
       </w:r>
     </w:p>
     <w:p>
@@ -5025,7 +5025,7 @@
           <w:color w:val="333333"/>
           <w:sz w:val="24"/>
         </w:rPr>
-        <w:t>❌ "I'm sure you'll land on your feet." → Premature optimism. They haven't processed the loss yet.</w:t>
+        <w:t>AVOID: "I'm sure you'll land on your feet." → Premature optimism. They haven't processed the loss yet.</w:t>
       </w:r>
     </w:p>
     <w:p>
@@ -5040,7 +5040,7 @@
           <w:color w:val="333333"/>
           <w:sz w:val="24"/>
         </w:rPr>
-        <w:t>❌ "If it were up to me..." → You're the manager. As far as they're concerned, it was up to you. Don't deflect.</w:t>
+        <w:t>AVOID: "If it were up to me..." → You're the manager. As far as they're concerned, it was up to you. Don't deflect.</w:t>
       </w:r>
     </w:p>
     <w:p>
@@ -5055,7 +5055,7 @@
           <w:color w:val="333333"/>
           <w:sz w:val="24"/>
         </w:rPr>
-        <w:t>❌ "We can still be friends." → Inappropriate. The power dynamic makes this uncomfortable.</w:t>
+        <w:t>AVOID: "We can still be friends." → Inappropriate. The power dynamic makes this uncomfortable.</w:t>
       </w:r>
     </w:p>
     <w:p>
@@ -5070,7 +5070,7 @@
           <w:color w:val="333333"/>
           <w:sz w:val="24"/>
         </w:rPr>
-        <w:t>❌ Any criticism of their work in this moment. → The feedback phase is over. This is not a teaching moment. This is a human moment.</w:t>
+        <w:t>AVOID: Any criticism of their work in this moment. → The feedback phase is over. This is not a teaching moment. This is a human moment.</w:t>
       </w:r>
     </w:p>
     <w:p>
@@ -5626,7 +5626,7 @@
           <w:color w:val="333333"/>
           <w:sz w:val="24"/>
         </w:rPr>
-        <w:t>❌ "You two need to figure this out." → Abdicating your role. They've already tried and failed.</w:t>
+        <w:t>AVOID: "You two need to figure this out." → Abdicating your role. They've already tried and failed.</w:t>
       </w:r>
     </w:p>
     <w:p>
@@ -5641,7 +5641,7 @@
           <w:color w:val="333333"/>
           <w:sz w:val="24"/>
         </w:rPr>
-        <w:t>❌ "I'm sure it's a misunderstanding." → Minimizing. The conflict is real to them.</w:t>
+        <w:t>AVOID: "I'm sure it's a misunderstanding." → Minimizing. The conflict is real to them.</w:t>
       </w:r>
     </w:p>
     <w:p>
@@ -5656,7 +5656,7 @@
           <w:color w:val="333333"/>
           <w:sz w:val="24"/>
         </w:rPr>
-        <w:t>❌ "Taylor says you did X — is that true?" → Playing prosecutor. This isn't a deposition.</w:t>
+        <w:t>AVOID: "Taylor says you did X — is that true?" → Playing prosecutor. This isn't a deposition.</w:t>
       </w:r>
     </w:p>
     <w:p>
@@ -5671,7 +5671,7 @@
           <w:color w:val="333333"/>
           <w:sz w:val="24"/>
         </w:rPr>
-        <w:t>❌ "Who started this?" → Irrelevant and childish framing. It doesn't matter who started it.</w:t>
+        <w:t>AVOID: "Who started this?" → Irrelevant and childish framing. It doesn't matter who started it.</w:t>
       </w:r>
     </w:p>
     <w:p>
@@ -5686,7 +5686,7 @@
           <w:color w:val="333333"/>
           <w:sz w:val="24"/>
         </w:rPr>
-        <w:t>❌ "You're both professionals, act like it." → Shaming. This guarantees the conflict goes underground instead of resolving.</w:t>
+        <w:t>AVOID: "You're both professionals, act like it." → Shaming. This guarantees the conflict goes underground instead of resolving.</w:t>
       </w:r>
     </w:p>
     <w:p>
@@ -6236,7 +6236,7 @@
           <w:color w:val="333333"/>
           <w:sz w:val="24"/>
         </w:rPr>
-        <w:t>❌ "You seem off." → Vague and slightly clinical. Makes them feel observed like a specimen.</w:t>
+        <w:t>AVOID: "You seem off." → Vague and slightly clinical. Makes them feel observed like a specimen.</w:t>
       </w:r>
     </w:p>
     <w:p>
@@ -6251,7 +6251,7 @@
           <w:color w:val="333333"/>
           <w:sz w:val="24"/>
         </w:rPr>
-        <w:t>❌ "Is everything okay at home?" → Too invasive. Let them volunteer personal details.</w:t>
+        <w:t>AVOID: "Is everything okay at home?" → Too invasive. Let them volunteer personal details.</w:t>
       </w:r>
     </w:p>
     <w:p>
@@ -6266,7 +6266,7 @@
           <w:color w:val="333333"/>
           <w:sz w:val="24"/>
         </w:rPr>
-        <w:t>❌ "You need to take better care of yourself." → Patronizing. They know. That's like telling someone with insomnia to just sleep.</w:t>
+        <w:t>AVOID: "You need to take better care of yourself." → Patronizing. They know. That's like telling someone with insomnia to just sleep.</w:t>
       </w:r>
     </w:p>
     <w:p>
@@ -6281,7 +6281,7 @@
           <w:color w:val="333333"/>
           <w:sz w:val="24"/>
         </w:rPr>
-        <w:t>❌ "We all go through tough times." → Minimizing. This dismisses their specific experience.</w:t>
+        <w:t>AVOID: "We all go through tough times." → Minimizing. This dismisses their specific experience.</w:t>
       </w:r>
     </w:p>
     <w:p>
@@ -6296,7 +6296,7 @@
           <w:color w:val="333333"/>
           <w:sz w:val="24"/>
         </w:rPr>
-        <w:t>❌ "I need you at 100%." → Makes it about your needs, not theirs. This is the opposite of what this conversation should be.</w:t>
+        <w:t>AVOID: "I need you at 100%." → Makes it about your needs, not theirs. This is the opposite of what this conversation should be.</w:t>
       </w:r>
     </w:p>
     <w:p>
@@ -6311,7 +6311,7 @@
           <w:color w:val="333333"/>
           <w:sz w:val="24"/>
         </w:rPr>
-        <w:t>❌ "You're not going to have a breakdown on me, are you?" → Just... no.</w:t>
+        <w:t>AVOID: "You're not going to have a breakdown on me, are you?" → Just... no.</w:t>
       </w:r>
     </w:p>
     <w:p>

</xml_diff>

<commit_message>
eBook: add Table of Contents page before Chapter 1
</commit_message>
<xml_diff>
--- a/kdp-files/difficult_conversations_ebook.docx
+++ b/kdp-files/difficult_conversations_ebook.docx
@@ -221,6 +221,190 @@
         <w:spacing w:before="0" w:after="0"/>
         <w:ind w:left="0" w:firstLine="0"/>
       </w:pPr>
+      <w:r>
+        <w:br w:type="page"/>
+      </w:r>
+    </w:p>
+    <w:p>
+      <w:pPr>
+        <w:pStyle w:val="Heading1"/>
+        <w:jc w:val="center"/>
+      </w:pPr>
+      <w:r>
+        <w:t>Contents</w:t>
+      </w:r>
+    </w:p>
+    <w:p/>
+    <w:p>
+      <w:pPr>
+        <w:ind w:left="0" w:firstLine="0"/>
+        <w:spacing w:after="80"/>
+      </w:pPr>
+      <w:r>
+        <w:rPr>
+          <w:sz w:val="24"/>
+          <w:rFonts w:ascii="Georgia" w:hAnsi="Georgia"/>
+        </w:rPr>
+        <w:t>Chapter 1: Introduction</w:t>
+      </w:r>
+    </w:p>
+    <w:p>
+      <w:pPr>
+        <w:ind w:left="0" w:firstLine="0"/>
+        <w:spacing w:after="80"/>
+      </w:pPr>
+      <w:r>
+        <w:rPr>
+          <w:sz w:val="24"/>
+          <w:rFonts w:ascii="Georgia" w:hAnsi="Georgia"/>
+        </w:rPr>
+        <w:t>Chapter 2: The CLEAR Framework</w:t>
+      </w:r>
+    </w:p>
+    <w:p>
+      <w:pPr>
+        <w:ind w:left="0" w:firstLine="0"/>
+        <w:spacing w:after="80"/>
+      </w:pPr>
+      <w:r>
+        <w:rPr>
+          <w:sz w:val="24"/>
+          <w:rFonts w:ascii="Georgia" w:hAnsi="Georgia"/>
+        </w:rPr>
+        <w:t>Chapter 3: Script — The Performance Improvement Conversation</w:t>
+      </w:r>
+    </w:p>
+    <w:p>
+      <w:pPr>
+        <w:ind w:left="0" w:firstLine="0"/>
+        <w:spacing w:after="80"/>
+      </w:pPr>
+      <w:r>
+        <w:rPr>
+          <w:sz w:val="24"/>
+          <w:rFonts w:ascii="Georgia" w:hAnsi="Georgia"/>
+        </w:rPr>
+        <w:t>Chapter 4: Script — Delivering Negative Feedback</w:t>
+      </w:r>
+    </w:p>
+    <w:p>
+      <w:pPr>
+        <w:ind w:left="0" w:firstLine="0"/>
+        <w:spacing w:after="80"/>
+      </w:pPr>
+      <w:r>
+        <w:rPr>
+          <w:sz w:val="24"/>
+          <w:rFonts w:ascii="Georgia" w:hAnsi="Georgia"/>
+        </w:rPr>
+        <w:t>Chapter 5: Script — Addressing Attendance and Behavior Issues</w:t>
+      </w:r>
+    </w:p>
+    <w:p>
+      <w:pPr>
+        <w:ind w:left="0" w:firstLine="0"/>
+        <w:spacing w:after="80"/>
+      </w:pPr>
+      <w:r>
+        <w:rPr>
+          <w:sz w:val="24"/>
+          <w:rFonts w:ascii="Georgia" w:hAnsi="Georgia"/>
+        </w:rPr>
+        <w:t>Chapter 6: Script — Salary and Promotion Disappointment</w:t>
+      </w:r>
+    </w:p>
+    <w:p>
+      <w:pPr>
+        <w:ind w:left="0" w:firstLine="0"/>
+        <w:spacing w:after="80"/>
+      </w:pPr>
+      <w:r>
+        <w:rPr>
+          <w:sz w:val="24"/>
+          <w:rFonts w:ascii="Georgia" w:hAnsi="Georgia"/>
+        </w:rPr>
+        <w:t>Chapter 7: Script — Letting Someone Go</w:t>
+      </w:r>
+    </w:p>
+    <w:p>
+      <w:pPr>
+        <w:ind w:left="0" w:firstLine="0"/>
+        <w:spacing w:after="80"/>
+      </w:pPr>
+      <w:r>
+        <w:rPr>
+          <w:sz w:val="24"/>
+          <w:rFonts w:ascii="Georgia" w:hAnsi="Georgia"/>
+        </w:rPr>
+        <w:t>Chapter 8: Script — Addressing Team Conflict</w:t>
+      </w:r>
+    </w:p>
+    <w:p>
+      <w:pPr>
+        <w:ind w:left="0" w:firstLine="0"/>
+        <w:spacing w:after="80"/>
+      </w:pPr>
+      <w:r>
+        <w:rPr>
+          <w:sz w:val="24"/>
+          <w:rFonts w:ascii="Georgia" w:hAnsi="Georgia"/>
+        </w:rPr>
+        <w:t>Chapter 9: Script — The "Are You OK?" Burnout Check-in</w:t>
+      </w:r>
+    </w:p>
+    <w:p>
+      <w:pPr>
+        <w:ind w:left="0" w:firstLine="0"/>
+        <w:spacing w:after="80"/>
+      </w:pPr>
+      <w:r>
+        <w:rPr>
+          <w:sz w:val="24"/>
+          <w:rFonts w:ascii="Georgia" w:hAnsi="Georgia"/>
+        </w:rPr>
+        <w:t>Chapter 10: Scripts for Remote and Hybrid Teams</w:t>
+      </w:r>
+    </w:p>
+    <w:p>
+      <w:pPr>
+        <w:ind w:left="0" w:firstLine="0"/>
+        <w:spacing w:after="80"/>
+      </w:pPr>
+      <w:r>
+        <w:rPr>
+          <w:sz w:val="24"/>
+          <w:rFonts w:ascii="Georgia" w:hAnsi="Georgia"/>
+        </w:rPr>
+        <w:t>Chapter 11: After the Conversation</w:t>
+      </w:r>
+    </w:p>
+    <w:p>
+      <w:pPr>
+        <w:ind w:left="0" w:firstLine="0"/>
+        <w:spacing w:after="80"/>
+      </w:pPr>
+      <w:r>
+        <w:rPr>
+          <w:sz w:val="24"/>
+          <w:rFonts w:ascii="Georgia" w:hAnsi="Georgia"/>
+        </w:rPr>
+        <w:t>Chapter 12: Common Mistakes and How to Avoid Them</w:t>
+      </w:r>
+    </w:p>
+    <w:p>
+      <w:pPr>
+        <w:ind w:left="0" w:firstLine="0"/>
+        <w:spacing w:after="80"/>
+      </w:pPr>
+      <w:r>
+        <w:rPr>
+          <w:sz w:val="24"/>
+          <w:rFonts w:ascii="Georgia" w:hAnsi="Georgia"/>
+        </w:rPr>
+        <w:t>Chapter 13: Quick Reference Card</w:t>
+      </w:r>
+    </w:p>
+    <w:p>
       <w:r>
         <w:br w:type="page"/>
       </w:r>

</xml_diff>